<commit_message>
Implementacion de la Funcion Auditoria - Cambios en bitacora
</commit_message>
<xml_diff>
--- a/docs/BorradorInforme(Convertir en PDF AL TERMINAR).docx
+++ b/docs/BorradorInforme(Convertir en PDF AL TERMINAR).docx
@@ -604,6 +604,7 @@
     </w:p>
     <w:p>
       <w:pPr>
+        <w:ind w:left="708"/>
         <w:rPr>
           <w:b/>
           <w:bCs/>
@@ -618,6 +619,9 @@
       </w:r>
     </w:p>
     <w:p>
+      <w:pPr>
+        <w:ind w:left="708"/>
+      </w:pPr>
       <w:r>
         <w:rPr>
           <w:b/>
@@ -627,6 +631,9 @@
       </w:r>
     </w:p>
     <w:p>
+      <w:pPr>
+        <w:ind w:left="708"/>
+      </w:pPr>
       <w:r>
         <w:t>Durante la implementación de la función encargada de determinar el color del semáforo a partir de un tiempo Unix (</w:t>
       </w:r>
@@ -640,17 +647,30 @@
       </w:r>
     </w:p>
     <w:p>
+      <w:pPr>
+        <w:ind w:left="708"/>
+      </w:pPr>
       <w:r>
         <w:t>La consigna especificaba las duraciones de cada estado (rojo = 90 s, amarillo = 6 s, verde = 120 s), pero no indicaba desde qué momento debía comenzar a contarse el primer ciclo.</w:t>
       </w:r>
     </w:p>
     <w:p>
+      <w:pPr>
+        <w:ind w:left="708"/>
+      </w:pPr>
       <w:r>
         <w:t>Inicialmente la implementación fue dejada incompleta hasta confirmar la interpretación correcta del requerimiento.</w:t>
       </w:r>
     </w:p>
-    <w:p/>
-    <w:p>
+    <w:p>
+      <w:pPr>
+        <w:ind w:left="708"/>
+      </w:pPr>
+    </w:p>
+    <w:p>
+      <w:pPr>
+        <w:ind w:left="708"/>
+      </w:pPr>
       <w:r>
         <w:rPr>
           <w:b/>
@@ -660,6 +680,9 @@
       </w:r>
     </w:p>
     <w:p>
+      <w:pPr>
+        <w:ind w:left="708"/>
+      </w:pPr>
       <w:r>
         <w:t xml:space="preserve">La especificación indicaba que la entrada era un tiempo Unix, pero no establecía un instante de referencia para el comienzo del ciclo del semáforo. Sin este dato, el mismo </w:t>
       </w:r>
@@ -673,6 +696,9 @@
       </w:r>
     </w:p>
     <w:p>
+      <w:pPr>
+        <w:ind w:left="708"/>
+      </w:pPr>
       <w:r>
         <w:rPr>
           <w:b/>
@@ -682,21 +708,33 @@
       </w:r>
     </w:p>
     <w:p>
+      <w:pPr>
+        <w:ind w:left="708"/>
+      </w:pPr>
       <w:r>
         <w:t>Se consultó al profesor para determinar si debía asumirse que el semáforo comenzaba en el instante 0 del tiempo Unix y si el ciclo debía repetirse indefinidamente.</w:t>
       </w:r>
     </w:p>
     <w:p>
+      <w:pPr>
+        <w:ind w:left="708"/>
+      </w:pPr>
       <w:r>
         <w:t>La respuesta fue:</w:t>
       </w:r>
     </w:p>
     <w:p>
+      <w:pPr>
+        <w:ind w:left="708"/>
+      </w:pPr>
       <w:r>
         <w:t>"Con respecto al tiempo, ustedes decidan desde qué fecha empieza a funcionar. Sí, se asume un ciclo continuo."</w:t>
       </w:r>
     </w:p>
     <w:p>
+      <w:pPr>
+        <w:ind w:left="708"/>
+      </w:pPr>
       <w:r>
         <w:rPr>
           <w:b/>
@@ -706,28 +744,35 @@
       </w:r>
     </w:p>
     <w:p>
+      <w:pPr>
+        <w:ind w:left="708"/>
+      </w:pPr>
       <w:r>
         <w:t>Se decidió utilizar el instante 0 como referencia inicial por ser el origen natural del tiempo Unix y porque permite que el algoritmo funcione correctamente para cualquier entero recibido como parámetro.</w:t>
       </w:r>
     </w:p>
     <w:p>
-      <w:r>
+      <w:pPr>
+        <w:ind w:left="708"/>
+      </w:pPr>
+      <w:r>
+        <w:lastRenderedPageBreak/>
         <w:t>Además, se mantuvo la secuencia de estados definida previamente para el semáforo:</w:t>
       </w:r>
     </w:p>
     <w:p>
       <w:pPr>
-        <w:rPr>
-          <w:b/>
-          <w:bCs/>
-        </w:rPr>
-      </w:pPr>
-      <w:r>
-        <w:rPr>
-          <w:b/>
-          <w:bCs/>
-        </w:rPr>
-        <w:lastRenderedPageBreak/>
+        <w:ind w:left="708"/>
+        <w:rPr>
+          <w:b/>
+          <w:bCs/>
+        </w:rPr>
+      </w:pPr>
+      <w:r>
+        <w:rPr>
+          <w:b/>
+          <w:bCs/>
+        </w:rPr>
         <w:t>rojo -&gt; verde</w:t>
       </w:r>
       <w:r>
@@ -778,11 +823,17 @@
       </w:r>
     </w:p>
     <w:p>
+      <w:pPr>
+        <w:ind w:left="708"/>
+      </w:pPr>
       <w:r>
         <w:t>y no el orden en que los colores aparecían mencionados dentro de la consigna.</w:t>
       </w:r>
     </w:p>
     <w:p>
+      <w:pPr>
+        <w:ind w:left="708"/>
+      </w:pPr>
       <w:r>
         <w:t xml:space="preserve">De esta forma, el color correspondiente a cualquier </w:t>
       </w:r>
@@ -824,6 +875,7 @@
       </w:pPr>
       <w:r>
         <w:rPr>
+          <w:noProof/>
           <w:lang w:val="es-ES"/>
         </w:rPr>
         <w:drawing>
@@ -870,6 +922,7 @@
       </w:r>
       <w:r>
         <w:rPr>
+          <w:noProof/>
           <w:lang w:val="es-ES"/>
         </w:rPr>
         <w:drawing>
@@ -915,6 +968,218 @@
           <w:noProof/>
         </w:rPr>
       </w:pPr>
+      <w:r>
+        <w:rPr>
+          <w:b/>
+          <w:bCs/>
+          <w:noProof/>
+        </w:rPr>
+        <w:t>3</w:t>
+      </w:r>
+      <w:r>
+        <w:rPr>
+          <w:b/>
+          <w:bCs/>
+          <w:noProof/>
+        </w:rPr>
+        <w:t>. Diseño de la interfaz de la función auditoria</w:t>
+      </w:r>
+    </w:p>
+    <w:p>
+      <w:pPr>
+        <w:rPr>
+          <w:noProof/>
+        </w:rPr>
+      </w:pPr>
+      <w:r>
+        <w:rPr>
+          <w:b/>
+          <w:bCs/>
+          <w:noProof/>
+        </w:rPr>
+        <w:t>Descripción del problema</w:t>
+      </w:r>
+      <w:r>
+        <w:rPr>
+          <w:noProof/>
+        </w:rPr>
+        <w:t xml:space="preserve"> Al implementar auditoria surgió la duda de qué argumentos debía recibir para poder registrar el cambio de estado correctamente.</w:t>
+      </w:r>
+    </w:p>
+    <w:p>
+      <w:pPr>
+        <w:rPr>
+          <w:noProof/>
+        </w:rPr>
+      </w:pPr>
+      <w:r>
+        <w:rPr>
+          <w:b/>
+          <w:bCs/>
+          <w:noProof/>
+        </w:rPr>
+        <w:t>Causa</w:t>
+      </w:r>
+      <w:r>
+        <w:rPr>
+          <w:noProof/>
+        </w:rPr>
+        <w:t xml:space="preserve"> La primera idea fue pasarle dos timestamps, time-anterior y time-actual, y que la función consultara timer con cada uno para comparar los colores. Funcionaba, pero se sentía redundante.</w:t>
+      </w:r>
+    </w:p>
+    <w:p>
+      <w:pPr>
+        <w:rPr>
+          <w:noProof/>
+        </w:rPr>
+      </w:pPr>
+      <w:r>
+        <w:rPr>
+          <w:b/>
+          <w:bCs/>
+          <w:noProof/>
+        </w:rPr>
+        <w:t>Proceso de depuración</w:t>
+      </w:r>
+      <w:r>
+        <w:rPr>
+          <w:noProof/>
+        </w:rPr>
+        <w:t xml:space="preserve"> Pensándolo un poco más, el semáforo cambia en instantes determinados que ya conocemos gracias a timer. Si evaluamos (timer t) y (timer (- t 1)) y los colores difieren, ese es exactamente el momento del cambio. Como timer es pura y el ciclo es predecible, el color anterior siempre se puede obtener restando 1 al timestamp actual, sin necesidad de que el caller lo calcule por su cuenta.</w:t>
+      </w:r>
+    </w:p>
+    <w:p>
+      <w:pPr>
+        <w:rPr>
+          <w:noProof/>
+        </w:rPr>
+      </w:pPr>
+      <w:r>
+        <w:rPr>
+          <w:b/>
+          <w:bCs/>
+          <w:noProof/>
+        </w:rPr>
+        <w:lastRenderedPageBreak/>
+        <w:t>Solución</w:t>
+      </w:r>
+      <w:r>
+        <w:rPr>
+          <w:noProof/>
+        </w:rPr>
+        <w:t xml:space="preserve"> Se simplificó la interfaz para que auditoria reciba solo el timestamp actual. El color anterior se deriva internamente con (- timestamp 1), y la función solo imprime cuando detecta un cambio real. Menos argumentos, misma información</w:t>
+      </w:r>
+    </w:p>
+    <w:p>
+      <w:pPr>
+        <w:rPr>
+          <w:b/>
+          <w:bCs/>
+          <w:noProof/>
+        </w:rPr>
+      </w:pPr>
+      <w:r>
+        <w:rPr>
+          <w:b/>
+          <w:bCs/>
+          <w:noProof/>
+        </w:rPr>
+        <w:t>Captura del Codigo Anterior y del Codigo Actual</w:t>
+      </w:r>
+    </w:p>
+    <w:p>
+      <w:pPr>
+        <w:rPr>
+          <w:lang w:val="es-ES"/>
+        </w:rPr>
+      </w:pPr>
+      <w:r>
+        <w:rPr>
+          <w:lang w:val="es-ES"/>
+        </w:rPr>
+        <w:drawing>
+          <wp:inline distT="0" distB="0" distL="0" distR="0" wp14:anchorId="4CE7FFC5" wp14:editId="5880E088">
+            <wp:extent cx="5400040" cy="2731770"/>
+            <wp:effectExtent l="0" t="0" r="0" b="0"/>
+            <wp:docPr id="7841785" name="Imagen 1"/>
+            <wp:cNvGraphicFramePr>
+              <a:graphicFrameLocks xmlns:a="http://schemas.openxmlformats.org/drawingml/2006/main" noChangeAspect="1"/>
+            </wp:cNvGraphicFramePr>
+            <a:graphic xmlns:a="http://schemas.openxmlformats.org/drawingml/2006/main">
+              <a:graphicData uri="http://schemas.openxmlformats.org/drawingml/2006/picture">
+                <pic:pic xmlns:pic="http://schemas.openxmlformats.org/drawingml/2006/picture">
+                  <pic:nvPicPr>
+                    <pic:cNvPr id="7841785" name=""/>
+                    <pic:cNvPicPr/>
+                  </pic:nvPicPr>
+                  <pic:blipFill>
+                    <a:blip r:embed="rId10"/>
+                    <a:stretch>
+                      <a:fillRect/>
+                    </a:stretch>
+                  </pic:blipFill>
+                  <pic:spPr>
+                    <a:xfrm>
+                      <a:off x="0" y="0"/>
+                      <a:ext cx="5400040" cy="2731770"/>
+                    </a:xfrm>
+                    <a:prstGeom prst="rect">
+                      <a:avLst/>
+                    </a:prstGeom>
+                  </pic:spPr>
+                </pic:pic>
+              </a:graphicData>
+            </a:graphic>
+          </wp:inline>
+        </w:drawing>
+      </w:r>
+    </w:p>
+    <w:p>
+      <w:pPr>
+        <w:rPr>
+          <w:lang w:val="es-ES"/>
+        </w:rPr>
+      </w:pPr>
+      <w:r>
+        <w:rPr>
+          <w:lang w:val="es-ES"/>
+        </w:rPr>
+        <w:drawing>
+          <wp:inline distT="0" distB="0" distL="0" distR="0" wp14:anchorId="1EE84E77" wp14:editId="37829FBA">
+            <wp:extent cx="5400040" cy="1932940"/>
+            <wp:effectExtent l="0" t="0" r="0" b="0"/>
+            <wp:docPr id="2111855714" name="Imagen 1"/>
+            <wp:cNvGraphicFramePr>
+              <a:graphicFrameLocks xmlns:a="http://schemas.openxmlformats.org/drawingml/2006/main" noChangeAspect="1"/>
+            </wp:cNvGraphicFramePr>
+            <a:graphic xmlns:a="http://schemas.openxmlformats.org/drawingml/2006/main">
+              <a:graphicData uri="http://schemas.openxmlformats.org/drawingml/2006/picture">
+                <pic:pic xmlns:pic="http://schemas.openxmlformats.org/drawingml/2006/picture">
+                  <pic:nvPicPr>
+                    <pic:cNvPr id="2111855714" name=""/>
+                    <pic:cNvPicPr/>
+                  </pic:nvPicPr>
+                  <pic:blipFill>
+                    <a:blip r:embed="rId11"/>
+                    <a:stretch>
+                      <a:fillRect/>
+                    </a:stretch>
+                  </pic:blipFill>
+                  <pic:spPr>
+                    <a:xfrm>
+                      <a:off x="0" y="0"/>
+                      <a:ext cx="5400040" cy="1932940"/>
+                    </a:xfrm>
+                    <a:prstGeom prst="rect">
+                      <a:avLst/>
+                    </a:prstGeom>
+                  </pic:spPr>
+                </pic:pic>
+              </a:graphicData>
+            </a:graphic>
+          </wp:inline>
+        </w:drawing>
+      </w:r>
     </w:p>
     <w:p>
       <w:pPr>

</xml_diff>

<commit_message>
Implementacion Quicklisp - Actualizacion de la Bitacora con Quicklisp
</commit_message>
<xml_diff>
--- a/docs/BorradorInforme(Convertir en PDF AL TERMINAR).docx
+++ b/docs/BorradorInforme(Convertir en PDF AL TERMINAR).docx
@@ -4,6 +4,7 @@
   <w:body>
     <w:p>
       <w:pPr>
+        <w:jc w:val="both"/>
         <w:rPr>
           <w:b/>
           <w:bCs/>
@@ -21,20 +22,24 @@
     </w:p>
     <w:p>
       <w:pPr>
-        <w:rPr>
-          <w:b/>
-          <w:bCs/>
-        </w:rPr>
-      </w:pPr>
-      <w:r>
-        <w:rPr>
-          <w:b/>
-          <w:bCs/>
-        </w:rPr>
-        <w:t>Error 1: Interpretación incorrecta de las transiciones válidas del semáforo</w:t>
-      </w:r>
-    </w:p>
-    <w:p>
+        <w:jc w:val="both"/>
+        <w:rPr>
+          <w:b/>
+          <w:bCs/>
+        </w:rPr>
+      </w:pPr>
+      <w:r>
+        <w:rPr>
+          <w:b/>
+          <w:bCs/>
+        </w:rPr>
+        <w:t>1: Interpretación incorrecta de las transiciones válidas del semáforo</w:t>
+      </w:r>
+    </w:p>
+    <w:p>
+      <w:pPr>
+        <w:jc w:val="both"/>
+      </w:pPr>
       <w:r>
         <w:rPr>
           <w:b/>
@@ -44,6 +49,9 @@
       </w:r>
     </w:p>
     <w:p>
+      <w:pPr>
+        <w:jc w:val="both"/>
+      </w:pPr>
       <w:r>
         <w:t xml:space="preserve">Al implementar la función </w:t>
       </w:r>
@@ -95,6 +103,9 @@
       </w:r>
     </w:p>
     <w:p>
+      <w:pPr>
+        <w:jc w:val="both"/>
+      </w:pPr>
       <w:r>
         <w:t>Inicialmente se asumió que cualquier cambio entre los colores rojo, amarillo y verde era válido, por lo que no existía un criterio claro para determinar cuándo retornar '</w:t>
       </w:r>
@@ -108,6 +119,9 @@
       </w:r>
     </w:p>
     <w:p>
+      <w:pPr>
+        <w:jc w:val="both"/>
+      </w:pPr>
       <w:r>
         <w:rPr>
           <w:b/>
@@ -117,35 +131,39 @@
       </w:r>
     </w:p>
     <w:p>
+      <w:pPr>
+        <w:jc w:val="both"/>
+      </w:pPr>
       <w:r>
         <w:t xml:space="preserve">La ambigüedad provenía de una interpretación incompleta de los requisitos funcionales. La especificación mencionaba transiciones </w:t>
       </w:r>
+      <w:r>
+        <w:t>inválidas,</w:t>
+      </w:r>
+      <w:r>
+        <w:t xml:space="preserve"> pero no describía la secuencia permitida de estados. En términos técnicos, sin una estructura condicional (</w:t>
+      </w:r>
+      <w:proofErr w:type="spellStart"/>
       <w:proofErr w:type="gramStart"/>
       <w:r>
-        <w:t>inválidas</w:t>
-      </w:r>
+        <w:t>cond</w:t>
+      </w:r>
+      <w:proofErr w:type="spellEnd"/>
       <w:proofErr w:type="gramEnd"/>
       <w:r>
-        <w:t xml:space="preserve"> pero no describía la secuencia permitida de estados. En términos técnicos, sin una estructura condicional (</w:t>
-      </w:r>
-      <w:proofErr w:type="spellStart"/>
-      <w:r>
-        <w:t>cond</w:t>
-      </w:r>
-      <w:proofErr w:type="spellEnd"/>
-      <w:r>
-        <w:t xml:space="preserve"> o </w:t>
-      </w:r>
-      <w:proofErr w:type="spellStart"/>
-      <w:r>
-        <w:t>if</w:t>
-      </w:r>
-      <w:proofErr w:type="spellEnd"/>
+        <w:t xml:space="preserve"> </w:t>
+      </w:r>
+      <w:r>
+        <w:t>por ejemplo</w:t>
+      </w:r>
       <w:r>
         <w:t>) que validara el par (color-actual, cambiar-a), la función era incapaz de discriminar entre una transición válida e inválida, haciendo imposible implementar el retorno correcto.</w:t>
       </w:r>
     </w:p>
     <w:p>
+      <w:pPr>
+        <w:jc w:val="both"/>
+      </w:pPr>
       <w:r>
         <w:rPr>
           <w:b/>
@@ -155,6 +173,9 @@
       </w:r>
     </w:p>
     <w:p>
+      <w:pPr>
+        <w:jc w:val="both"/>
+      </w:pPr>
       <w:r>
         <w:t xml:space="preserve">Se consultó al profesor mediante </w:t>
       </w:r>
@@ -175,16 +196,25 @@
       </w:r>
     </w:p>
     <w:p>
+      <w:pPr>
+        <w:jc w:val="both"/>
+      </w:pPr>
       <w:r>
         <w:t xml:space="preserve"> La respuesta fue:</w:t>
       </w:r>
     </w:p>
     <w:p>
+      <w:pPr>
+        <w:jc w:val="both"/>
+      </w:pPr>
       <w:r>
         <w:t>"Al ser un semáforo vial, hay solo una secuencia cíclica válida."</w:t>
       </w:r>
     </w:p>
     <w:p>
+      <w:pPr>
+        <w:jc w:val="both"/>
+      </w:pPr>
       <w:r>
         <w:t>A partir de esta aclaración, y asumiendo en rigor que los únicos colores posibles como entrada son rojo, amarillo y verde, se descartó la hipótesis de entradas arbitrarias y se establecieron las siguientes como las únicas transiciones permitidas:</w:t>
       </w:r>
@@ -251,6 +281,9 @@
       </w:r>
     </w:p>
     <w:p>
+      <w:pPr>
+        <w:jc w:val="both"/>
+      </w:pPr>
       <w:r>
         <w:lastRenderedPageBreak/>
         <w:t>Cualquier otra combinación debía considerarse inválida y disparar el retorno de '</w:t>
@@ -265,6 +298,9 @@
       </w:r>
     </w:p>
     <w:p>
+      <w:pPr>
+        <w:jc w:val="both"/>
+      </w:pPr>
       <w:r>
         <w:rPr>
           <w:b/>
@@ -274,6 +310,9 @@
       </w:r>
     </w:p>
     <w:p>
+      <w:pPr>
+        <w:jc w:val="both"/>
+      </w:pPr>
       <w:r>
         <w:t>Se redefinió la función para verificar explícitamente la secuencia cíclica del semáforo y devolver '</w:t>
       </w:r>
@@ -288,6 +327,7 @@
     </w:p>
     <w:p>
       <w:pPr>
+        <w:jc w:val="both"/>
         <w:rPr>
           <w:b/>
           <w:bCs/>
@@ -303,14 +343,7 @@
     </w:p>
     <w:p>
       <w:pPr>
-        <w:rPr>
-          <w:b/>
-          <w:bCs/>
-        </w:rPr>
-      </w:pPr>
-    </w:p>
-    <w:p>
-      <w:pPr>
+        <w:jc w:val="both"/>
         <w:rPr>
           <w:b/>
           <w:bCs/>
@@ -326,6 +359,7 @@
     </w:p>
     <w:p>
       <w:pPr>
+        <w:jc w:val="both"/>
         <w:rPr>
           <w:b/>
           <w:bCs/>
@@ -336,7 +370,7 @@
           <w:noProof/>
         </w:rPr>
         <w:drawing>
-          <wp:anchor distT="0" distB="0" distL="114300" distR="114300" simplePos="0" relativeHeight="251658240" behindDoc="1" locked="0" layoutInCell="1" allowOverlap="1" wp14:anchorId="29573EB2" wp14:editId="7DF9C939">
+          <wp:anchor distT="0" distB="0" distL="114300" distR="114300" simplePos="0" relativeHeight="251658240" behindDoc="1" locked="0" layoutInCell="1" allowOverlap="1" wp14:anchorId="29573EB2" wp14:editId="6113B40A">
             <wp:simplePos x="0" y="0"/>
             <wp:positionH relativeFrom="column">
               <wp:posOffset>161925</wp:posOffset>
@@ -345,7 +379,7 @@
               <wp:posOffset>144145</wp:posOffset>
             </wp:positionV>
             <wp:extent cx="5400040" cy="2820670"/>
-            <wp:effectExtent l="0" t="0" r="0" b="0"/>
+            <wp:effectExtent l="19050" t="19050" r="10160" b="17780"/>
             <wp:wrapTopAndBottom/>
             <wp:docPr id="601116526" name="Imagen 1"/>
             <wp:cNvGraphicFramePr>
@@ -359,7 +393,7 @@
                     <pic:cNvPicPr/>
                   </pic:nvPicPr>
                   <pic:blipFill>
-                    <a:blip r:embed="rId4">
+                    <a:blip r:embed="rId5">
                       <a:extLst>
                         <a:ext uri="{28A0092B-C50C-407E-A947-70E740481C1C}">
                           <a14:useLocalDpi xmlns:a14="http://schemas.microsoft.com/office/drawing/2010/main" val="0"/>
@@ -378,6 +412,11 @@
                     <a:prstGeom prst="rect">
                       <a:avLst/>
                     </a:prstGeom>
+                    <a:ln>
+                      <a:solidFill>
+                        <a:srgbClr val="C00000"/>
+                      </a:solidFill>
+                    </a:ln>
                   </pic:spPr>
                 </pic:pic>
               </a:graphicData>
@@ -401,8 +440,17 @@
       </w:r>
     </w:p>
     <w:p>
-      <w:r>
-        <w:t xml:space="preserve">  </w:t>
+      <w:pPr>
+        <w:jc w:val="both"/>
+      </w:pPr>
+      <w:r>
+        <w:t xml:space="preserve"> </w:t>
+      </w:r>
+      <w:r>
+        <w:tab/>
+      </w:r>
+      <w:r>
+        <w:t xml:space="preserve"> </w:t>
       </w:r>
       <w:r>
         <w:rPr>
@@ -424,7 +472,7 @@
                     <pic:cNvPicPr/>
                   </pic:nvPicPr>
                   <pic:blipFill rotWithShape="1">
-                    <a:blip r:embed="rId5"/>
+                    <a:blip r:embed="rId6"/>
                     <a:srcRect l="4112"/>
                     <a:stretch>
                       <a:fillRect/>
@@ -454,6 +502,9 @@
         </w:drawing>
       </w:r>
       <w:r>
+        <w:tab/>
+      </w:r>
+      <w:r>
         <w:rPr>
           <w:noProof/>
         </w:rPr>
@@ -473,7 +524,7 @@
                     <pic:cNvPicPr/>
                   </pic:nvPicPr>
                   <pic:blipFill rotWithShape="1">
-                    <a:blip r:embed="rId6"/>
+                    <a:blip r:embed="rId7"/>
                     <a:srcRect b="35193"/>
                     <a:stretch>
                       <a:fillRect/>
@@ -505,17 +556,17 @@
     </w:p>
     <w:p>
       <w:pPr>
-        <w:rPr>
-          <w:b/>
-          <w:bCs/>
-        </w:rPr>
-      </w:pPr>
-      <w:r>
-        <w:rPr>
-          <w:b/>
-          <w:bCs/>
-        </w:rPr>
-        <w:lastRenderedPageBreak/>
+        <w:jc w:val="both"/>
+        <w:rPr>
+          <w:b/>
+          <w:bCs/>
+        </w:rPr>
+      </w:pPr>
+      <w:r>
+        <w:rPr>
+          <w:b/>
+          <w:bCs/>
+        </w:rPr>
         <w:t>Captura d</w:t>
       </w:r>
       <w:r>
@@ -549,6 +600,7 @@
     </w:p>
     <w:p>
       <w:pPr>
+        <w:jc w:val="both"/>
         <w:rPr>
           <w:lang w:val="es-ES"/>
         </w:rPr>
@@ -558,6 +610,7 @@
           <w:noProof/>
           <w:lang w:val="es-ES"/>
         </w:rPr>
+        <w:lastRenderedPageBreak/>
         <w:drawing>
           <wp:inline distT="0" distB="0" distL="0" distR="0" wp14:anchorId="1DB4084F" wp14:editId="188C2FC2">
             <wp:extent cx="5400040" cy="972185"/>
@@ -574,7 +627,7 @@
                     <pic:cNvPicPr/>
                   </pic:nvPicPr>
                   <pic:blipFill>
-                    <a:blip r:embed="rId7"/>
+                    <a:blip r:embed="rId8"/>
                     <a:stretch>
                       <a:fillRect/>
                     </a:stretch>
@@ -597,6 +650,7 @@
     </w:p>
     <w:p>
       <w:pPr>
+        <w:jc w:val="both"/>
         <w:rPr>
           <w:lang w:val="es-ES"/>
         </w:rPr>
@@ -604,6 +658,165 @@
     </w:p>
     <w:p>
       <w:pPr>
+        <w:jc w:val="both"/>
+        <w:rPr>
+          <w:b/>
+          <w:bCs/>
+        </w:rPr>
+      </w:pPr>
+      <w:r>
+        <w:rPr>
+          <w:b/>
+          <w:bCs/>
+        </w:rPr>
+        <w:t>2:</w:t>
+      </w:r>
+      <w:r>
+        <w:rPr>
+          <w:b/>
+          <w:bCs/>
+        </w:rPr>
+        <w:t xml:space="preserve"> Ambigüedad en el origen temporal del ciclo del semáforo</w:t>
+      </w:r>
+    </w:p>
+    <w:p>
+      <w:pPr>
+        <w:jc w:val="both"/>
+      </w:pPr>
+      <w:r>
+        <w:rPr>
+          <w:b/>
+          <w:bCs/>
+        </w:rPr>
+        <w:t>Descripción del problema</w:t>
+      </w:r>
+    </w:p>
+    <w:p>
+      <w:pPr>
+        <w:jc w:val="both"/>
+      </w:pPr>
+      <w:r>
+        <w:t>Durante la implementación de la función encargada de determinar el color del semáforo a partir de un tiempo Unix (</w:t>
+      </w:r>
+      <w:proofErr w:type="spellStart"/>
+      <w:r>
+        <w:t>epoch</w:t>
+      </w:r>
+      <w:proofErr w:type="spellEnd"/>
+      <w:r>
+        <w:t>), surgió una duda respecto al instante inicial del ciclo.</w:t>
+      </w:r>
+    </w:p>
+    <w:p>
+      <w:pPr>
+        <w:jc w:val="both"/>
+      </w:pPr>
+      <w:r>
+        <w:t>La consigna especificaba las duraciones de cada estado (rojo = 90 s, amarillo = 6 s, verde = 120 s), pero no indicaba desde qué momento debía comenzar a contarse el primer ciclo.</w:t>
+      </w:r>
+    </w:p>
+    <w:p>
+      <w:pPr>
+        <w:jc w:val="both"/>
+      </w:pPr>
+      <w:r>
+        <w:t>Inicialmente la implementación fue dejada incompleta hasta confirmar la interpretación correcta del requerimiento.</w:t>
+      </w:r>
+    </w:p>
+    <w:p>
+      <w:pPr>
+        <w:jc w:val="both"/>
+      </w:pPr>
+      <w:r>
+        <w:rPr>
+          <w:b/>
+          <w:bCs/>
+        </w:rPr>
+        <w:t>Causa</w:t>
+      </w:r>
+    </w:p>
+    <w:p>
+      <w:pPr>
+        <w:jc w:val="both"/>
+      </w:pPr>
+      <w:r>
+        <w:t xml:space="preserve">La especificación indicaba que la entrada era un tiempo Unix, pero no establecía un instante de referencia para el comienzo del ciclo del semáforo. Sin este dato, el mismo </w:t>
+      </w:r>
+      <w:proofErr w:type="spellStart"/>
+      <w:r>
+        <w:t>timestamp</w:t>
+      </w:r>
+      <w:proofErr w:type="spellEnd"/>
+      <w:r>
+        <w:t xml:space="preserve"> podía asociarse a colores distintos según la fecha elegida como inicio.</w:t>
+      </w:r>
+    </w:p>
+    <w:p>
+      <w:pPr>
+        <w:jc w:val="both"/>
+      </w:pPr>
+      <w:r>
+        <w:rPr>
+          <w:b/>
+          <w:bCs/>
+        </w:rPr>
+        <w:t>Proceso de depuración</w:t>
+      </w:r>
+    </w:p>
+    <w:p>
+      <w:pPr>
+        <w:jc w:val="both"/>
+      </w:pPr>
+      <w:r>
+        <w:t>Se consultó al profesor para determinar si debía asumirse que el semáforo comenzaba en el instante 0 del tiempo Unix y si el ciclo debía repetirse indefinidamente.</w:t>
+      </w:r>
+    </w:p>
+    <w:p>
+      <w:pPr>
+        <w:jc w:val="both"/>
+      </w:pPr>
+      <w:r>
+        <w:t>La respuesta fue:</w:t>
+      </w:r>
+    </w:p>
+    <w:p>
+      <w:pPr>
+        <w:jc w:val="both"/>
+      </w:pPr>
+      <w:r>
+        <w:t>"Con respecto al tiempo, ustedes decidan desde qué fecha empieza a funcionar. Sí, se asume un ciclo continuo."</w:t>
+      </w:r>
+    </w:p>
+    <w:p>
+      <w:pPr>
+        <w:jc w:val="both"/>
+      </w:pPr>
+      <w:r>
+        <w:rPr>
+          <w:b/>
+          <w:bCs/>
+        </w:rPr>
+        <w:t>Solución</w:t>
+      </w:r>
+    </w:p>
+    <w:p>
+      <w:pPr>
+        <w:jc w:val="both"/>
+      </w:pPr>
+      <w:r>
+        <w:t>Se decidió utilizar el instante 0 como referencia inicial por ser el origen natural del tiempo Unix y porque permite que el algoritmo funcione correctamente para cualquier entero recibido como parámetro.</w:t>
+      </w:r>
+    </w:p>
+    <w:p>
+      <w:pPr>
+        <w:jc w:val="both"/>
+      </w:pPr>
+      <w:r>
+        <w:t>Además, se mantuvo la secuencia de estados definida previamente para el semáforo:</w:t>
+      </w:r>
+    </w:p>
+    <w:p>
+      <w:pPr>
         <w:ind w:left="708"/>
         <w:rPr>
           <w:b/>
@@ -615,76 +828,70 @@
           <w:b/>
           <w:bCs/>
         </w:rPr>
-        <w:t>2. Ambigüedad en el origen temporal del ciclo del semáforo</w:t>
-      </w:r>
-    </w:p>
-    <w:p>
-      <w:pPr>
-        <w:ind w:left="708"/>
-      </w:pPr>
-      <w:r>
-        <w:rPr>
-          <w:b/>
-          <w:bCs/>
-        </w:rPr>
-        <w:t>Descripción del problema</w:t>
-      </w:r>
-    </w:p>
-    <w:p>
-      <w:pPr>
-        <w:ind w:left="708"/>
-      </w:pPr>
-      <w:r>
-        <w:t>Durante la implementación de la función encargada de determinar el color del semáforo a partir de un tiempo Unix (</w:t>
-      </w:r>
-      <w:proofErr w:type="spellStart"/>
-      <w:r>
-        <w:t>epoch</w:t>
-      </w:r>
-      <w:proofErr w:type="spellEnd"/>
-      <w:r>
-        <w:t>), surgió una duda respecto al instante inicial del ciclo.</w:t>
-      </w:r>
-    </w:p>
-    <w:p>
-      <w:pPr>
-        <w:ind w:left="708"/>
-      </w:pPr>
-      <w:r>
-        <w:t>La consigna especificaba las duraciones de cada estado (rojo = 90 s, amarillo = 6 s, verde = 120 s), pero no indicaba desde qué momento debía comenzar a contarse el primer ciclo.</w:t>
-      </w:r>
-    </w:p>
-    <w:p>
-      <w:pPr>
-        <w:ind w:left="708"/>
-      </w:pPr>
-      <w:r>
-        <w:t>Inicialmente la implementación fue dejada incompleta hasta confirmar la interpretación correcta del requerimiento.</w:t>
-      </w:r>
-    </w:p>
-    <w:p>
-      <w:pPr>
-        <w:ind w:left="708"/>
-      </w:pPr>
-    </w:p>
-    <w:p>
-      <w:pPr>
-        <w:ind w:left="708"/>
-      </w:pPr>
-      <w:r>
-        <w:rPr>
-          <w:b/>
-          <w:bCs/>
-        </w:rPr>
-        <w:t>Causa</w:t>
-      </w:r>
-    </w:p>
-    <w:p>
-      <w:pPr>
-        <w:ind w:left="708"/>
-      </w:pPr>
-      <w:r>
-        <w:t xml:space="preserve">La especificación indicaba que la entrada era un tiempo Unix, pero no establecía un instante de referencia para el comienzo del ciclo del semáforo. Sin este dato, el mismo </w:t>
+        <w:t>rojo -&gt; verde</w:t>
+      </w:r>
+      <w:r>
+        <w:rPr>
+          <w:b/>
+          <w:bCs/>
+        </w:rPr>
+        <w:br/>
+      </w:r>
+      <w:proofErr w:type="spellStart"/>
+      <w:r>
+        <w:rPr>
+          <w:b/>
+          <w:bCs/>
+        </w:rPr>
+        <w:t>verde</w:t>
+      </w:r>
+      <w:proofErr w:type="spellEnd"/>
+      <w:r>
+        <w:rPr>
+          <w:b/>
+          <w:bCs/>
+        </w:rPr>
+        <w:t xml:space="preserve"> -&gt; amarillo</w:t>
+      </w:r>
+      <w:r>
+        <w:rPr>
+          <w:b/>
+          <w:bCs/>
+        </w:rPr>
+        <w:br/>
+      </w:r>
+      <w:proofErr w:type="spellStart"/>
+      <w:r>
+        <w:rPr>
+          <w:b/>
+          <w:bCs/>
+        </w:rPr>
+        <w:t>amarillo</w:t>
+      </w:r>
+      <w:proofErr w:type="spellEnd"/>
+      <w:r>
+        <w:rPr>
+          <w:b/>
+          <w:bCs/>
+        </w:rPr>
+        <w:t xml:space="preserve"> -&gt; rojo</w:t>
+      </w:r>
+    </w:p>
+    <w:p>
+      <w:pPr>
+        <w:jc w:val="both"/>
+      </w:pPr>
+      <w:r>
+        <w:lastRenderedPageBreak/>
+        <w:t>y no el orden en que los colores aparecían mencionados dentro de la consigna.</w:t>
+      </w:r>
+    </w:p>
+    <w:p>
+      <w:pPr>
+        <w:jc w:val="both"/>
+      </w:pPr>
+      <w:r>
+        <w:t xml:space="preserve">De esta forma, el color correspondiente a cualquier </w:t>
       </w:r>
       <w:proofErr w:type="spellStart"/>
       <w:r>
@@ -692,162 +899,12 @@
       </w:r>
       <w:proofErr w:type="spellEnd"/>
       <w:r>
-        <w:t xml:space="preserve"> podía asociarse a colores distintos según la fecha elegida como inicio.</w:t>
-      </w:r>
-    </w:p>
-    <w:p>
-      <w:pPr>
-        <w:ind w:left="708"/>
-      </w:pPr>
-      <w:r>
-        <w:rPr>
-          <w:b/>
-          <w:bCs/>
-        </w:rPr>
-        <w:t>Proceso de depuración</w:t>
-      </w:r>
-    </w:p>
-    <w:p>
-      <w:pPr>
-        <w:ind w:left="708"/>
-      </w:pPr>
-      <w:r>
-        <w:t>Se consultó al profesor para determinar si debía asumirse que el semáforo comenzaba en el instante 0 del tiempo Unix y si el ciclo debía repetirse indefinidamente.</w:t>
-      </w:r>
-    </w:p>
-    <w:p>
-      <w:pPr>
-        <w:ind w:left="708"/>
-      </w:pPr>
-      <w:r>
-        <w:t>La respuesta fue:</w:t>
-      </w:r>
-    </w:p>
-    <w:p>
-      <w:pPr>
-        <w:ind w:left="708"/>
-      </w:pPr>
-      <w:r>
-        <w:t>"Con respecto al tiempo, ustedes decidan desde qué fecha empieza a funcionar. Sí, se asume un ciclo continuo."</w:t>
-      </w:r>
-    </w:p>
-    <w:p>
-      <w:pPr>
-        <w:ind w:left="708"/>
-      </w:pPr>
-      <w:r>
-        <w:rPr>
-          <w:b/>
-          <w:bCs/>
-        </w:rPr>
-        <w:t>Solución</w:t>
-      </w:r>
-    </w:p>
-    <w:p>
-      <w:pPr>
-        <w:ind w:left="708"/>
-      </w:pPr>
-      <w:r>
-        <w:t>Se decidió utilizar el instante 0 como referencia inicial por ser el origen natural del tiempo Unix y porque permite que el algoritmo funcione correctamente para cualquier entero recibido como parámetro.</w:t>
-      </w:r>
-    </w:p>
-    <w:p>
-      <w:pPr>
-        <w:ind w:left="708"/>
-      </w:pPr>
-      <w:r>
-        <w:lastRenderedPageBreak/>
-        <w:t>Además, se mantuvo la secuencia de estados definida previamente para el semáforo:</w:t>
-      </w:r>
-    </w:p>
-    <w:p>
-      <w:pPr>
-        <w:ind w:left="708"/>
-        <w:rPr>
-          <w:b/>
-          <w:bCs/>
-        </w:rPr>
-      </w:pPr>
-      <w:r>
-        <w:rPr>
-          <w:b/>
-          <w:bCs/>
-        </w:rPr>
-        <w:t>rojo -&gt; verde</w:t>
-      </w:r>
-      <w:r>
-        <w:rPr>
-          <w:b/>
-          <w:bCs/>
-        </w:rPr>
-        <w:br/>
-      </w:r>
-      <w:proofErr w:type="spellStart"/>
-      <w:r>
-        <w:rPr>
-          <w:b/>
-          <w:bCs/>
-        </w:rPr>
-        <w:t>verde</w:t>
-      </w:r>
-      <w:proofErr w:type="spellEnd"/>
-      <w:r>
-        <w:rPr>
-          <w:b/>
-          <w:bCs/>
-        </w:rPr>
-        <w:t xml:space="preserve"> -&gt; amarillo</w:t>
-      </w:r>
-      <w:r>
-        <w:rPr>
-          <w:b/>
-          <w:bCs/>
-        </w:rPr>
-        <w:br/>
-      </w:r>
-      <w:proofErr w:type="spellStart"/>
-      <w:r>
-        <w:rPr>
-          <w:b/>
-          <w:bCs/>
-        </w:rPr>
-        <w:t>amarillo</w:t>
-      </w:r>
-      <w:proofErr w:type="spellEnd"/>
-      <w:r>
-        <w:rPr>
-          <w:b/>
-          <w:bCs/>
-        </w:rPr>
-        <w:t xml:space="preserve"> -&gt; rojo</w:t>
-      </w:r>
-    </w:p>
-    <w:p>
-      <w:pPr>
-        <w:ind w:left="708"/>
-      </w:pPr>
-      <w:r>
-        <w:t>y no el orden en que los colores aparecían mencionados dentro de la consigna.</w:t>
-      </w:r>
-    </w:p>
-    <w:p>
-      <w:pPr>
-        <w:ind w:left="708"/>
-      </w:pPr>
-      <w:r>
-        <w:t xml:space="preserve">De esta forma, el color correspondiente a cualquier </w:t>
-      </w:r>
-      <w:proofErr w:type="spellStart"/>
-      <w:r>
-        <w:t>timestamp</w:t>
-      </w:r>
-      <w:proofErr w:type="spellEnd"/>
-      <w:r>
         <w:t xml:space="preserve"> se obtiene calculando el resto de la división entre el tiempo recibido y la duración total del ciclo, evaluando luego en qué tramo del ciclo se encuentra dicho instante.</w:t>
       </w:r>
     </w:p>
     <w:p>
       <w:pPr>
+        <w:jc w:val="both"/>
         <w:rPr>
           <w:lang w:val="es-ES"/>
         </w:rPr>
@@ -869,6 +926,7 @@
     </w:p>
     <w:p>
       <w:pPr>
+        <w:jc w:val="both"/>
         <w:rPr>
           <w:noProof/>
         </w:rPr>
@@ -894,7 +952,7 @@
                     <pic:cNvPicPr/>
                   </pic:nvPicPr>
                   <pic:blipFill>
-                    <a:blip r:embed="rId8"/>
+                    <a:blip r:embed="rId9"/>
                     <a:stretch>
                       <a:fillRect/>
                     </a:stretch>
@@ -923,6 +981,12 @@
       <w:r>
         <w:rPr>
           <w:noProof/>
+        </w:rPr>
+        <w:tab/>
+      </w:r>
+      <w:r>
+        <w:rPr>
+          <w:noProof/>
           <w:lang w:val="es-ES"/>
         </w:rPr>
         <w:drawing>
@@ -941,7 +1005,7 @@
                     <pic:cNvPicPr/>
                   </pic:nvPicPr>
                   <pic:blipFill>
-                    <a:blip r:embed="rId9"/>
+                    <a:blip r:embed="rId10"/>
                     <a:stretch>
                       <a:fillRect/>
                     </a:stretch>
@@ -964,16 +1028,25 @@
     </w:p>
     <w:p>
       <w:pPr>
+        <w:jc w:val="both"/>
         <w:rPr>
           <w:noProof/>
         </w:rPr>
       </w:pPr>
-      <w:r>
-        <w:rPr>
-          <w:b/>
-          <w:bCs/>
+    </w:p>
+    <w:p>
+      <w:pPr>
+        <w:jc w:val="both"/>
+        <w:rPr>
           <w:noProof/>
         </w:rPr>
+      </w:pPr>
+      <w:r>
+        <w:rPr>
+          <w:b/>
+          <w:bCs/>
+          <w:noProof/>
+        </w:rPr>
         <w:t>3</w:t>
       </w:r>
       <w:r>
@@ -987,6 +1060,7 @@
     </w:p>
     <w:p>
       <w:pPr>
+        <w:jc w:val="both"/>
         <w:rPr>
           <w:noProof/>
         </w:rPr>
@@ -1008,6 +1082,7 @@
     </w:p>
     <w:p>
       <w:pPr>
+        <w:jc w:val="both"/>
         <w:rPr>
           <w:noProof/>
         </w:rPr>
@@ -1029,6 +1104,7 @@
     </w:p>
     <w:p>
       <w:pPr>
+        <w:jc w:val="both"/>
         <w:rPr>
           <w:noProof/>
         </w:rPr>
@@ -1050,6 +1126,7 @@
     </w:p>
     <w:p>
       <w:pPr>
+        <w:jc w:val="both"/>
         <w:rPr>
           <w:noProof/>
         </w:rPr>
@@ -1060,41 +1137,44 @@
           <w:bCs/>
           <w:noProof/>
         </w:rPr>
+        <w:t>Solución</w:t>
+      </w:r>
+      <w:r>
+        <w:rPr>
+          <w:noProof/>
+        </w:rPr>
+        <w:t xml:space="preserve"> Se simplificó la interfaz para que auditoria reciba solo el timestamp actual. El color anterior se deriva internamente con (- timestamp 1), y la función solo imprime cuando detecta un cambio real. Menos argumentos, misma información</w:t>
+      </w:r>
+    </w:p>
+    <w:p>
+      <w:pPr>
+        <w:jc w:val="both"/>
+        <w:rPr>
+          <w:b/>
+          <w:bCs/>
+          <w:noProof/>
+        </w:rPr>
+      </w:pPr>
+      <w:r>
+        <w:rPr>
+          <w:b/>
+          <w:bCs/>
+          <w:noProof/>
+        </w:rPr>
         <w:lastRenderedPageBreak/>
-        <w:t>Solución</w:t>
-      </w:r>
+        <w:t>Captura del Codigo Anterior y del Codigo Actual</w:t>
+      </w:r>
+    </w:p>
+    <w:p>
+      <w:pPr>
+        <w:jc w:val="both"/>
+        <w:rPr>
+          <w:lang w:val="es-ES"/>
+        </w:rPr>
+      </w:pPr>
       <w:r>
         <w:rPr>
           <w:noProof/>
-        </w:rPr>
-        <w:t xml:space="preserve"> Se simplificó la interfaz para que auditoria reciba solo el timestamp actual. El color anterior se deriva internamente con (- timestamp 1), y la función solo imprime cuando detecta un cambio real. Menos argumentos, misma información</w:t>
-      </w:r>
-    </w:p>
-    <w:p>
-      <w:pPr>
-        <w:rPr>
-          <w:b/>
-          <w:bCs/>
-          <w:noProof/>
-        </w:rPr>
-      </w:pPr>
-      <w:r>
-        <w:rPr>
-          <w:b/>
-          <w:bCs/>
-          <w:noProof/>
-        </w:rPr>
-        <w:t>Captura del Codigo Anterior y del Codigo Actual</w:t>
-      </w:r>
-    </w:p>
-    <w:p>
-      <w:pPr>
-        <w:rPr>
-          <w:lang w:val="es-ES"/>
-        </w:rPr>
-      </w:pPr>
-      <w:r>
-        <w:rPr>
           <w:lang w:val="es-ES"/>
         </w:rPr>
         <w:drawing>
@@ -1113,7 +1193,7 @@
                     <pic:cNvPicPr/>
                   </pic:nvPicPr>
                   <pic:blipFill>
-                    <a:blip r:embed="rId10"/>
+                    <a:blip r:embed="rId11"/>
                     <a:stretch>
                       <a:fillRect/>
                     </a:stretch>
@@ -1136,12 +1216,14 @@
     </w:p>
     <w:p>
       <w:pPr>
+        <w:jc w:val="both"/>
         <w:rPr>
           <w:lang w:val="es-ES"/>
         </w:rPr>
       </w:pPr>
       <w:r>
         <w:rPr>
+          <w:noProof/>
           <w:lang w:val="es-ES"/>
         </w:rPr>
         <w:drawing>
@@ -1160,7 +1242,7 @@
                     <pic:cNvPicPr/>
                   </pic:nvPicPr>
                   <pic:blipFill>
-                    <a:blip r:embed="rId11"/>
+                    <a:blip r:embed="rId12"/>
                     <a:stretch>
                       <a:fillRect/>
                     </a:stretch>
@@ -1183,7 +1265,1299 @@
     </w:p>
     <w:p>
       <w:pPr>
-        <w:rPr>
+        <w:jc w:val="both"/>
+        <w:rPr>
+          <w:b/>
+          <w:bCs/>
+        </w:rPr>
+      </w:pPr>
+      <w:r>
+        <w:rPr>
+          <w:b/>
+          <w:bCs/>
+        </w:rPr>
+        <w:t>4</w:t>
+      </w:r>
+      <w:r>
+        <w:rPr>
+          <w:b/>
+          <w:bCs/>
+        </w:rPr>
+        <w:t xml:space="preserve">. Incompatibilidad de CLISP con </w:t>
+      </w:r>
+      <w:proofErr w:type="spellStart"/>
+      <w:r>
+        <w:rPr>
+          <w:b/>
+          <w:bCs/>
+        </w:rPr>
+        <w:t>Quicklisp</w:t>
+      </w:r>
+      <w:proofErr w:type="spellEnd"/>
+    </w:p>
+    <w:p>
+      <w:pPr>
+        <w:jc w:val="both"/>
+        <w:rPr>
+          <w:b/>
+          <w:bCs/>
+        </w:rPr>
+      </w:pPr>
+      <w:r>
+        <w:rPr>
+          <w:b/>
+          <w:bCs/>
+        </w:rPr>
+        <w:t>Descripción del problema</w:t>
+      </w:r>
+    </w:p>
+    <w:p>
+      <w:pPr>
+        <w:jc w:val="both"/>
+      </w:pPr>
+      <w:r>
+        <w:t xml:space="preserve"> Para la integración de la librería local-time mediante </w:t>
+      </w:r>
+      <w:proofErr w:type="spellStart"/>
+      <w:r>
+        <w:t>Quicklisp</w:t>
+      </w:r>
+      <w:proofErr w:type="spellEnd"/>
+      <w:r>
+        <w:t xml:space="preserve">, se intentó instalar y ejecutar </w:t>
+      </w:r>
+      <w:proofErr w:type="spellStart"/>
+      <w:r>
+        <w:t>Quicklisp</w:t>
+      </w:r>
+      <w:proofErr w:type="spellEnd"/>
+      <w:r>
+        <w:t xml:space="preserve"> desde el entorno utilizado en la cátedra, CLISP 2.49, sin éxito.</w:t>
+      </w:r>
+    </w:p>
+    <w:p>
+      <w:pPr>
+        <w:jc w:val="both"/>
+      </w:pPr>
+      <w:r>
+        <w:t xml:space="preserve">Causa </w:t>
+      </w:r>
+      <w:proofErr w:type="spellStart"/>
+      <w:r>
+        <w:t>Quicklisp</w:t>
+      </w:r>
+      <w:proofErr w:type="spellEnd"/>
+      <w:r>
+        <w:t xml:space="preserve"> no es compatible con CLISP. Al intentar cargar el instalador desde PowerShell con distintos comandos, el proceso fallaba con el error ERROR_DIRECTORY: The </w:t>
+      </w:r>
+      <w:proofErr w:type="spellStart"/>
+      <w:r>
+        <w:t>directory</w:t>
+      </w:r>
+      <w:proofErr w:type="spellEnd"/>
+      <w:r>
+        <w:t xml:space="preserve"> </w:t>
+      </w:r>
+      <w:proofErr w:type="spellStart"/>
+      <w:r>
+        <w:t>name</w:t>
+      </w:r>
+      <w:proofErr w:type="spellEnd"/>
+      <w:r>
+        <w:t xml:space="preserve"> </w:t>
+      </w:r>
+      <w:proofErr w:type="spellStart"/>
+      <w:r>
+        <w:t>is</w:t>
+      </w:r>
+      <w:proofErr w:type="spellEnd"/>
+      <w:r>
+        <w:t xml:space="preserve"> </w:t>
+      </w:r>
+      <w:proofErr w:type="spellStart"/>
+      <w:r>
+        <w:t>invalid</w:t>
+      </w:r>
+      <w:proofErr w:type="spellEnd"/>
+      <w:r>
+        <w:t>, sin llegar a completar la instalación.</w:t>
+      </w:r>
+    </w:p>
+    <w:p>
+      <w:pPr>
+        <w:jc w:val="both"/>
+      </w:pPr>
+      <w:r>
+        <w:t xml:space="preserve">Proceso de depuración Se realizaron varias pruebas desde PowerShell intentando distintas formas de invocar CLISP con el archivo </w:t>
+      </w:r>
+      <w:proofErr w:type="spellStart"/>
+      <w:proofErr w:type="gramStart"/>
+      <w:r>
+        <w:t>quicklisp.lisp</w:t>
+      </w:r>
+      <w:proofErr w:type="spellEnd"/>
+      <w:proofErr w:type="gramEnd"/>
+      <w:r>
+        <w:t>, descargado desde la página oficial. Ninguna de las variantes probadas logró superar el error de compatibilidad.</w:t>
+      </w:r>
+    </w:p>
+    <w:p>
+      <w:pPr>
+        <w:jc w:val="both"/>
+      </w:pPr>
+      <w:r>
+        <w:rPr>
+          <w:b/>
+          <w:bCs/>
+        </w:rPr>
+        <w:t>Solución</w:t>
+      </w:r>
+    </w:p>
+    <w:p>
+      <w:pPr>
+        <w:jc w:val="both"/>
+      </w:pPr>
+      <w:r>
+        <w:t xml:space="preserve">Se descargó e instaló SBCL (Steel Bank Common Lisp), implementación de Common Lisp compatible con </w:t>
+      </w:r>
+      <w:proofErr w:type="spellStart"/>
+      <w:r>
+        <w:t>Quicklisp</w:t>
+      </w:r>
+      <w:proofErr w:type="spellEnd"/>
+      <w:r>
+        <w:t xml:space="preserve">. Para la integración con el entorno de desarrollo, se configuró </w:t>
+      </w:r>
+      <w:r>
+        <w:lastRenderedPageBreak/>
+        <w:t xml:space="preserve">Visual Studio Code con la extensión </w:t>
+      </w:r>
+      <w:proofErr w:type="spellStart"/>
+      <w:r>
+        <w:t>Alive</w:t>
+      </w:r>
+      <w:proofErr w:type="spellEnd"/>
+      <w:r>
+        <w:t xml:space="preserve">, que provee un REPL conectado directamente a SBCL. Desde ese entorno se pudo instalar </w:t>
+      </w:r>
+      <w:proofErr w:type="spellStart"/>
+      <w:r>
+        <w:t>Quicklisp</w:t>
+      </w:r>
+      <w:proofErr w:type="spellEnd"/>
+      <w:r>
+        <w:t xml:space="preserve"> correctamente, cargar la librería local-time y verificar su funcionamiento con éxito.</w:t>
+      </w:r>
+    </w:p>
+    <w:p>
+      <w:pPr>
+        <w:jc w:val="both"/>
+      </w:pPr>
+    </w:p>
+    <w:p>
+      <w:pPr>
+        <w:jc w:val="both"/>
+        <w:rPr>
+          <w:b/>
+          <w:bCs/>
+          <w:lang w:val="es-ES"/>
+        </w:rPr>
+      </w:pPr>
+      <w:r>
+        <w:rPr>
+          <w:b/>
+          <w:bCs/>
+          <w:lang w:val="es-ES"/>
+        </w:rPr>
+        <w:t xml:space="preserve">Captura de Pantalla de la instalación de QUICKLISP e Instalación de </w:t>
+      </w:r>
+      <w:proofErr w:type="spellStart"/>
+      <w:r>
+        <w:rPr>
+          <w:b/>
+          <w:bCs/>
+          <w:lang w:val="es-ES"/>
+        </w:rPr>
+        <w:t>LocalTime</w:t>
+      </w:r>
+      <w:proofErr w:type="spellEnd"/>
+    </w:p>
+    <w:p>
+      <w:pPr>
+        <w:jc w:val="both"/>
+        <w:rPr>
+          <w:lang w:val="es-ES"/>
+        </w:rPr>
+      </w:pPr>
+      <w:r>
+        <w:rPr>
+          <w:lang w:val="es-ES"/>
+        </w:rPr>
+        <w:drawing>
+          <wp:inline distT="0" distB="0" distL="0" distR="0" wp14:anchorId="33A80DFE" wp14:editId="1E3DD75A">
+            <wp:extent cx="5400040" cy="5661025"/>
+            <wp:effectExtent l="0" t="0" r="0" b="0"/>
+            <wp:docPr id="1474090531" name="Imagen 1"/>
+            <wp:cNvGraphicFramePr>
+              <a:graphicFrameLocks xmlns:a="http://schemas.openxmlformats.org/drawingml/2006/main" noChangeAspect="1"/>
+            </wp:cNvGraphicFramePr>
+            <a:graphic xmlns:a="http://schemas.openxmlformats.org/drawingml/2006/main">
+              <a:graphicData uri="http://schemas.openxmlformats.org/drawingml/2006/picture">
+                <pic:pic xmlns:pic="http://schemas.openxmlformats.org/drawingml/2006/picture">
+                  <pic:nvPicPr>
+                    <pic:cNvPr id="1474090531" name=""/>
+                    <pic:cNvPicPr/>
+                  </pic:nvPicPr>
+                  <pic:blipFill>
+                    <a:blip r:embed="rId13"/>
+                    <a:stretch>
+                      <a:fillRect/>
+                    </a:stretch>
+                  </pic:blipFill>
+                  <pic:spPr>
+                    <a:xfrm>
+                      <a:off x="0" y="0"/>
+                      <a:ext cx="5400040" cy="5661025"/>
+                    </a:xfrm>
+                    <a:prstGeom prst="rect">
+                      <a:avLst/>
+                    </a:prstGeom>
+                  </pic:spPr>
+                </pic:pic>
+              </a:graphicData>
+            </a:graphic>
+          </wp:inline>
+        </w:drawing>
+      </w:r>
+    </w:p>
+    <w:p>
+      <w:pPr>
+        <w:jc w:val="both"/>
+        <w:rPr>
+          <w:lang w:val="es-ES"/>
+        </w:rPr>
+      </w:pPr>
+      <w:r>
+        <w:rPr>
+          <w:lang w:val="es-ES"/>
+        </w:rPr>
+        <w:drawing>
+          <wp:inline distT="0" distB="0" distL="0" distR="0" wp14:anchorId="099CD0E0" wp14:editId="62EFA307">
+            <wp:extent cx="5400040" cy="1322705"/>
+            <wp:effectExtent l="0" t="0" r="0" b="0"/>
+            <wp:docPr id="1891051040" name="Imagen 1"/>
+            <wp:cNvGraphicFramePr>
+              <a:graphicFrameLocks xmlns:a="http://schemas.openxmlformats.org/drawingml/2006/main" noChangeAspect="1"/>
+            </wp:cNvGraphicFramePr>
+            <a:graphic xmlns:a="http://schemas.openxmlformats.org/drawingml/2006/main">
+              <a:graphicData uri="http://schemas.openxmlformats.org/drawingml/2006/picture">
+                <pic:pic xmlns:pic="http://schemas.openxmlformats.org/drawingml/2006/picture">
+                  <pic:nvPicPr>
+                    <pic:cNvPr id="1891051040" name=""/>
+                    <pic:cNvPicPr/>
+                  </pic:nvPicPr>
+                  <pic:blipFill>
+                    <a:blip r:embed="rId14"/>
+                    <a:stretch>
+                      <a:fillRect/>
+                    </a:stretch>
+                  </pic:blipFill>
+                  <pic:spPr>
+                    <a:xfrm>
+                      <a:off x="0" y="0"/>
+                      <a:ext cx="5400040" cy="1322705"/>
+                    </a:xfrm>
+                    <a:prstGeom prst="rect">
+                      <a:avLst/>
+                    </a:prstGeom>
+                  </pic:spPr>
+                </pic:pic>
+              </a:graphicData>
+            </a:graphic>
+          </wp:inline>
+        </w:drawing>
+      </w:r>
+    </w:p>
+    <w:p>
+      <w:pPr>
+        <w:jc w:val="both"/>
+        <w:rPr>
+          <w:b/>
+          <w:bCs/>
+          <w:lang w:val="es-ES"/>
+        </w:rPr>
+      </w:pPr>
+      <w:r>
+        <w:rPr>
+          <w:b/>
+          <w:bCs/>
+          <w:lang w:val="es-ES"/>
+        </w:rPr>
+        <w:t>ALIVE REPL en Visual Estudio Code</w:t>
+      </w:r>
+    </w:p>
+    <w:p>
+      <w:pPr>
+        <w:jc w:val="both"/>
+        <w:rPr>
+          <w:lang w:val="es-ES"/>
+        </w:rPr>
+      </w:pPr>
+      <w:r>
+        <w:rPr>
+          <w:lang w:val="es-ES"/>
+        </w:rPr>
+        <w:lastRenderedPageBreak/>
+        <w:drawing>
+          <wp:inline distT="0" distB="0" distL="0" distR="0" wp14:anchorId="59B2DC5F" wp14:editId="6CA7B277">
+            <wp:extent cx="5400040" cy="3606165"/>
+            <wp:effectExtent l="0" t="0" r="0" b="0"/>
+            <wp:docPr id="2059203853" name="Imagen 1"/>
+            <wp:cNvGraphicFramePr>
+              <a:graphicFrameLocks xmlns:a="http://schemas.openxmlformats.org/drawingml/2006/main" noChangeAspect="1"/>
+            </wp:cNvGraphicFramePr>
+            <a:graphic xmlns:a="http://schemas.openxmlformats.org/drawingml/2006/main">
+              <a:graphicData uri="http://schemas.openxmlformats.org/drawingml/2006/picture">
+                <pic:pic xmlns:pic="http://schemas.openxmlformats.org/drawingml/2006/picture">
+                  <pic:nvPicPr>
+                    <pic:cNvPr id="2059203853" name=""/>
+                    <pic:cNvPicPr/>
+                  </pic:nvPicPr>
+                  <pic:blipFill>
+                    <a:blip r:embed="rId15"/>
+                    <a:stretch>
+                      <a:fillRect/>
+                    </a:stretch>
+                  </pic:blipFill>
+                  <pic:spPr>
+                    <a:xfrm>
+                      <a:off x="0" y="0"/>
+                      <a:ext cx="5400040" cy="3606165"/>
+                    </a:xfrm>
+                    <a:prstGeom prst="rect">
+                      <a:avLst/>
+                    </a:prstGeom>
+                  </pic:spPr>
+                </pic:pic>
+              </a:graphicData>
+            </a:graphic>
+          </wp:inline>
+        </w:drawing>
+      </w:r>
+    </w:p>
+    <w:p>
+      <w:pPr>
+        <w:jc w:val="both"/>
+        <w:rPr>
+          <w:b/>
+          <w:bCs/>
+        </w:rPr>
+      </w:pPr>
+    </w:p>
+    <w:p>
+      <w:pPr>
+        <w:jc w:val="both"/>
+      </w:pPr>
+      <w:r>
+        <w:rPr>
+          <w:b/>
+          <w:bCs/>
+        </w:rPr>
+        <w:t>5</w:t>
+      </w:r>
+      <w:r>
+        <w:rPr>
+          <w:b/>
+          <w:bCs/>
+        </w:rPr>
+        <w:t xml:space="preserve">. Conflicto de nombre con </w:t>
+      </w:r>
+      <w:proofErr w:type="spellStart"/>
+      <w:r>
+        <w:rPr>
+          <w:b/>
+          <w:bCs/>
+        </w:rPr>
+        <w:t>timer</w:t>
+      </w:r>
+      <w:proofErr w:type="spellEnd"/>
+      <w:r>
+        <w:rPr>
+          <w:b/>
+          <w:bCs/>
+        </w:rPr>
+        <w:t xml:space="preserve"> en SBCL</w:t>
+      </w:r>
+    </w:p>
+    <w:p>
+      <w:pPr>
+        <w:jc w:val="both"/>
+        <w:rPr>
+          <w:b/>
+          <w:bCs/>
+        </w:rPr>
+      </w:pPr>
+      <w:r>
+        <w:rPr>
+          <w:b/>
+          <w:bCs/>
+        </w:rPr>
+        <w:t>Descripción del problema</w:t>
+      </w:r>
+    </w:p>
+    <w:p>
+      <w:pPr>
+        <w:jc w:val="both"/>
+      </w:pPr>
+      <w:r>
+        <w:t xml:space="preserve">Al trasladar el código al entorno SBCL para la integración con </w:t>
+      </w:r>
+      <w:proofErr w:type="spellStart"/>
+      <w:r>
+        <w:t>Quicklisp</w:t>
+      </w:r>
+      <w:proofErr w:type="spellEnd"/>
+      <w:r>
+        <w:t xml:space="preserve">, la definición de la función </w:t>
+      </w:r>
+      <w:proofErr w:type="spellStart"/>
+      <w:r>
+        <w:t>timer</w:t>
+      </w:r>
+      <w:proofErr w:type="spellEnd"/>
+      <w:r>
+        <w:t xml:space="preserve"> generaba el siguiente error:</w:t>
+      </w:r>
+    </w:p>
+    <w:p>
+      <w:pPr>
+        <w:jc w:val="both"/>
+      </w:pPr>
+      <w:r>
+        <w:rPr>
+          <w:i/>
+          <w:iCs/>
+        </w:rPr>
+        <w:t xml:space="preserve">"Lock </w:t>
+      </w:r>
+      <w:proofErr w:type="spellStart"/>
+      <w:r>
+        <w:rPr>
+          <w:i/>
+          <w:iCs/>
+        </w:rPr>
+        <w:t>on</w:t>
+      </w:r>
+      <w:proofErr w:type="spellEnd"/>
+      <w:r>
+        <w:rPr>
+          <w:i/>
+          <w:iCs/>
+        </w:rPr>
+        <w:t xml:space="preserve"> </w:t>
+      </w:r>
+      <w:proofErr w:type="spellStart"/>
+      <w:r>
+        <w:rPr>
+          <w:i/>
+          <w:iCs/>
+        </w:rPr>
+        <w:t>package</w:t>
+      </w:r>
+      <w:proofErr w:type="spellEnd"/>
+      <w:r>
+        <w:rPr>
+          <w:i/>
+          <w:iCs/>
+        </w:rPr>
+        <w:t xml:space="preserve"> SB-EXT </w:t>
+      </w:r>
+      <w:proofErr w:type="spellStart"/>
+      <w:r>
+        <w:rPr>
+          <w:i/>
+          <w:iCs/>
+        </w:rPr>
+        <w:t>violated</w:t>
+      </w:r>
+      <w:proofErr w:type="spellEnd"/>
+      <w:r>
+        <w:rPr>
+          <w:i/>
+          <w:iCs/>
+        </w:rPr>
+        <w:t xml:space="preserve"> </w:t>
+      </w:r>
+      <w:proofErr w:type="spellStart"/>
+      <w:r>
+        <w:rPr>
+          <w:i/>
+          <w:iCs/>
+        </w:rPr>
+        <w:t>when</w:t>
+      </w:r>
+      <w:proofErr w:type="spellEnd"/>
+      <w:r>
+        <w:rPr>
+          <w:i/>
+          <w:iCs/>
+        </w:rPr>
+        <w:t xml:space="preserve"> </w:t>
+      </w:r>
+      <w:proofErr w:type="spellStart"/>
+      <w:r>
+        <w:rPr>
+          <w:i/>
+          <w:iCs/>
+        </w:rPr>
+        <w:t>proclaiming</w:t>
+      </w:r>
+      <w:proofErr w:type="spellEnd"/>
+      <w:r>
+        <w:rPr>
+          <w:i/>
+          <w:iCs/>
+        </w:rPr>
+        <w:t xml:space="preserve"> TIMER as a </w:t>
+      </w:r>
+      <w:proofErr w:type="spellStart"/>
+      <w:r>
+        <w:rPr>
+          <w:i/>
+          <w:iCs/>
+        </w:rPr>
+        <w:t>function</w:t>
+      </w:r>
+      <w:proofErr w:type="spellEnd"/>
+      <w:r>
+        <w:rPr>
+          <w:i/>
+          <w:iCs/>
+        </w:rPr>
+        <w:t xml:space="preserve"> </w:t>
+      </w:r>
+      <w:proofErr w:type="spellStart"/>
+      <w:r>
+        <w:rPr>
+          <w:i/>
+          <w:iCs/>
+        </w:rPr>
+        <w:t>while</w:t>
+      </w:r>
+      <w:proofErr w:type="spellEnd"/>
+      <w:r>
+        <w:rPr>
+          <w:i/>
+          <w:iCs/>
+        </w:rPr>
+        <w:t xml:space="preserve"> in </w:t>
+      </w:r>
+      <w:proofErr w:type="spellStart"/>
+      <w:r>
+        <w:rPr>
+          <w:i/>
+          <w:iCs/>
+        </w:rPr>
+        <w:t>package</w:t>
+      </w:r>
+      <w:proofErr w:type="spellEnd"/>
+      <w:r>
+        <w:rPr>
+          <w:i/>
+          <w:iCs/>
+        </w:rPr>
+        <w:t xml:space="preserve"> COMMON-LISP-USER."</w:t>
+      </w:r>
+    </w:p>
+    <w:p>
+      <w:pPr>
+        <w:jc w:val="both"/>
+        <w:rPr>
+          <w:b/>
+          <w:bCs/>
+        </w:rPr>
+      </w:pPr>
+      <w:r>
+        <w:rPr>
+          <w:b/>
+          <w:bCs/>
+        </w:rPr>
+        <w:t>Causa</w:t>
+      </w:r>
+    </w:p>
+    <w:p>
+      <w:pPr>
+        <w:jc w:val="both"/>
+      </w:pPr>
+      <w:r>
+        <w:t xml:space="preserve">El nombre </w:t>
+      </w:r>
+      <w:proofErr w:type="spellStart"/>
+      <w:r>
+        <w:t>timer</w:t>
+      </w:r>
+      <w:proofErr w:type="spellEnd"/>
+      <w:r>
+        <w:t xml:space="preserve"> está asociado a un símbolo del paquete SB-EXT de SBCL, utilizado por su sistema de temporizadores. Debido al mecanismo de </w:t>
+      </w:r>
+      <w:proofErr w:type="spellStart"/>
+      <w:r>
+        <w:rPr>
+          <w:i/>
+          <w:iCs/>
+        </w:rPr>
+        <w:t>package</w:t>
+      </w:r>
+      <w:proofErr w:type="spellEnd"/>
+      <w:r>
+        <w:rPr>
+          <w:i/>
+          <w:iCs/>
+        </w:rPr>
+        <w:t xml:space="preserve"> </w:t>
+      </w:r>
+      <w:proofErr w:type="spellStart"/>
+      <w:r>
+        <w:rPr>
+          <w:i/>
+          <w:iCs/>
+        </w:rPr>
+        <w:t>locks</w:t>
+      </w:r>
+      <w:proofErr w:type="spellEnd"/>
+      <w:r>
+        <w:t>, SBCL impide redefinir accidentalmente símbolos pertenecientes a paquetes del sistema. En CLISP 2.49 este conflicto no se presenta, por lo que el código funcionaba correctamente en el entorno utilizado durante el desarrollo inicial.</w:t>
+      </w:r>
+    </w:p>
+    <w:p>
+      <w:pPr>
+        <w:jc w:val="both"/>
+        <w:rPr>
+          <w:b/>
+          <w:bCs/>
+        </w:rPr>
+      </w:pPr>
+      <w:r>
+        <w:rPr>
+          <w:b/>
+          <w:bCs/>
+        </w:rPr>
+        <w:t>Proceso de depuración</w:t>
+      </w:r>
+    </w:p>
+    <w:p>
+      <w:pPr>
+        <w:jc w:val="both"/>
+      </w:pPr>
+      <w:r>
+        <w:t xml:space="preserve">Se verificó que el error estaba relacionado con un conflicto de nombres y no con la lógica de la función. Posteriormente se consultó la documentación oficial de SBCL sobre el mecanismo de </w:t>
+      </w:r>
+      <w:proofErr w:type="spellStart"/>
+      <w:r>
+        <w:rPr>
+          <w:i/>
+          <w:iCs/>
+        </w:rPr>
+        <w:t>package</w:t>
+      </w:r>
+      <w:proofErr w:type="spellEnd"/>
+      <w:r>
+        <w:rPr>
+          <w:i/>
+          <w:iCs/>
+        </w:rPr>
+        <w:t xml:space="preserve"> </w:t>
+      </w:r>
+      <w:proofErr w:type="spellStart"/>
+      <w:r>
+        <w:rPr>
+          <w:i/>
+          <w:iCs/>
+        </w:rPr>
+        <w:t>locks</w:t>
+      </w:r>
+      <w:proofErr w:type="spellEnd"/>
+      <w:r>
+        <w:t xml:space="preserve">, confirmando que el símbolo </w:t>
+      </w:r>
+      <w:proofErr w:type="spellStart"/>
+      <w:r>
+        <w:t>timer</w:t>
+      </w:r>
+      <w:proofErr w:type="spellEnd"/>
+      <w:r>
+        <w:t xml:space="preserve"> pertenecía a un paquete protegido del sistema.</w:t>
+      </w:r>
+    </w:p>
+    <w:p>
+      <w:pPr>
+        <w:jc w:val="both"/>
+        <w:rPr>
+          <w:b/>
+          <w:bCs/>
+        </w:rPr>
+      </w:pPr>
+      <w:r>
+        <w:rPr>
+          <w:b/>
+          <w:bCs/>
+        </w:rPr>
+        <w:t>Solución</w:t>
+      </w:r>
+    </w:p>
+    <w:p>
+      <w:pPr>
+        <w:jc w:val="both"/>
+      </w:pPr>
+      <w:r>
+        <w:lastRenderedPageBreak/>
+        <w:t>Se agregó la instrucción:</w:t>
+      </w:r>
+      <w:r>
+        <w:t xml:space="preserve"> </w:t>
+      </w:r>
+      <w:r>
+        <w:t>(</w:t>
+      </w:r>
+      <w:proofErr w:type="spellStart"/>
+      <w:r>
+        <w:t>shadow</w:t>
+      </w:r>
+      <w:proofErr w:type="spellEnd"/>
+      <w:r>
+        <w:t xml:space="preserve"> '</w:t>
+      </w:r>
+      <w:proofErr w:type="spellStart"/>
+      <w:r>
+        <w:t>timer</w:t>
+      </w:r>
+      <w:proofErr w:type="spellEnd"/>
+      <w:r>
+        <w:t>)</w:t>
+      </w:r>
+    </w:p>
+    <w:p>
+      <w:pPr>
+        <w:jc w:val="both"/>
+      </w:pPr>
+      <w:r>
+        <w:t xml:space="preserve">antes de la definición de la función. Esto crea un símbolo local </w:t>
+      </w:r>
+      <w:proofErr w:type="spellStart"/>
+      <w:r>
+        <w:t>timer</w:t>
+      </w:r>
+      <w:proofErr w:type="spellEnd"/>
+      <w:r>
+        <w:t xml:space="preserve"> en el paquete actual, ocultando el símbolo homónimo de SB-EXT. De esta manera se resolvió el conflicto sin necesidad de renombrar la función ni modificar el resto del código.</w:t>
+      </w:r>
+    </w:p>
+    <w:p>
+      <w:pPr>
+        <w:jc w:val="both"/>
+        <w:rPr>
+          <w:lang w:val="es-ES"/>
+        </w:rPr>
+      </w:pPr>
+    </w:p>
+    <w:p>
+      <w:pPr>
+        <w:spacing w:before="100" w:beforeAutospacing="1" w:after="100" w:afterAutospacing="1" w:line="240" w:lineRule="auto"/>
+        <w:rPr>
+          <w:rFonts w:eastAsia="Times New Roman" w:cstheme="minorHAnsi"/>
+          <w:kern w:val="0"/>
+          <w:lang w:eastAsia="es-AR"/>
+          <w14:ligatures w14:val="none"/>
+        </w:rPr>
+      </w:pPr>
+      <w:r>
+        <w:rPr>
+          <w:rFonts w:eastAsia="Times New Roman" w:cstheme="minorHAnsi"/>
+          <w:b/>
+          <w:bCs/>
+          <w:kern w:val="0"/>
+          <w:lang w:eastAsia="es-AR"/>
+          <w14:ligatures w14:val="none"/>
+        </w:rPr>
+        <w:t>Bibliografía</w:t>
+      </w:r>
+    </w:p>
+    <w:p>
+      <w:pPr>
+        <w:spacing w:before="100" w:beforeAutospacing="1" w:after="100" w:afterAutospacing="1" w:line="240" w:lineRule="auto"/>
+        <w:rPr>
+          <w:rFonts w:eastAsia="Times New Roman" w:cstheme="minorHAnsi"/>
+          <w:kern w:val="0"/>
+          <w:lang w:eastAsia="es-AR"/>
+          <w14:ligatures w14:val="none"/>
+        </w:rPr>
+      </w:pPr>
+      <w:proofErr w:type="spellStart"/>
+      <w:r>
+        <w:rPr>
+          <w:rFonts w:eastAsia="Times New Roman" w:cstheme="minorHAnsi"/>
+          <w:kern w:val="0"/>
+          <w:lang w:eastAsia="es-AR"/>
+          <w14:ligatures w14:val="none"/>
+        </w:rPr>
+        <w:t>CaesarCipher</w:t>
+      </w:r>
+      <w:proofErr w:type="spellEnd"/>
+      <w:r>
+        <w:rPr>
+          <w:rFonts w:eastAsia="Times New Roman" w:cstheme="minorHAnsi"/>
+          <w:kern w:val="0"/>
+          <w:lang w:eastAsia="es-AR"/>
+          <w14:ligatures w14:val="none"/>
+        </w:rPr>
+        <w:t xml:space="preserve">. (s.f.). </w:t>
+      </w:r>
+      <w:r>
+        <w:rPr>
+          <w:rFonts w:eastAsia="Times New Roman" w:cstheme="minorHAnsi"/>
+          <w:i/>
+          <w:iCs/>
+          <w:kern w:val="0"/>
+          <w:lang w:eastAsia="es-AR"/>
+          <w14:ligatures w14:val="none"/>
+        </w:rPr>
+        <w:t xml:space="preserve">Unix </w:t>
+      </w:r>
+      <w:proofErr w:type="spellStart"/>
+      <w:r>
+        <w:rPr>
+          <w:rFonts w:eastAsia="Times New Roman" w:cstheme="minorHAnsi"/>
+          <w:i/>
+          <w:iCs/>
+          <w:kern w:val="0"/>
+          <w:lang w:eastAsia="es-AR"/>
+          <w14:ligatures w14:val="none"/>
+        </w:rPr>
+        <w:t>timestamp</w:t>
+      </w:r>
+      <w:proofErr w:type="spellEnd"/>
+      <w:r>
+        <w:rPr>
+          <w:rFonts w:eastAsia="Times New Roman" w:cstheme="minorHAnsi"/>
+          <w:i/>
+          <w:iCs/>
+          <w:kern w:val="0"/>
+          <w:lang w:eastAsia="es-AR"/>
+          <w14:ligatures w14:val="none"/>
+        </w:rPr>
+        <w:t xml:space="preserve"> / </w:t>
+      </w:r>
+      <w:proofErr w:type="spellStart"/>
+      <w:r>
+        <w:rPr>
+          <w:rFonts w:eastAsia="Times New Roman" w:cstheme="minorHAnsi"/>
+          <w:i/>
+          <w:iCs/>
+          <w:kern w:val="0"/>
+          <w:lang w:eastAsia="es-AR"/>
+          <w14:ligatures w14:val="none"/>
+        </w:rPr>
+        <w:t>Epoch</w:t>
+      </w:r>
+      <w:proofErr w:type="spellEnd"/>
+      <w:r>
+        <w:rPr>
+          <w:rFonts w:eastAsia="Times New Roman" w:cstheme="minorHAnsi"/>
+          <w:i/>
+          <w:iCs/>
+          <w:kern w:val="0"/>
+          <w:lang w:eastAsia="es-AR"/>
+          <w14:ligatures w14:val="none"/>
+        </w:rPr>
+        <w:t xml:space="preserve"> time </w:t>
+      </w:r>
+      <w:proofErr w:type="spellStart"/>
+      <w:r>
+        <w:rPr>
+          <w:rFonts w:eastAsia="Times New Roman" w:cstheme="minorHAnsi"/>
+          <w:i/>
+          <w:iCs/>
+          <w:kern w:val="0"/>
+          <w:lang w:eastAsia="es-AR"/>
+          <w14:ligatures w14:val="none"/>
+        </w:rPr>
+        <w:t>explained</w:t>
+      </w:r>
+      <w:proofErr w:type="spellEnd"/>
+      <w:r>
+        <w:rPr>
+          <w:rFonts w:eastAsia="Times New Roman" w:cstheme="minorHAnsi"/>
+          <w:kern w:val="0"/>
+          <w:lang w:eastAsia="es-AR"/>
+          <w14:ligatures w14:val="none"/>
+        </w:rPr>
+        <w:t xml:space="preserve">. </w:t>
+      </w:r>
+      <w:proofErr w:type="spellStart"/>
+      <w:r>
+        <w:rPr>
+          <w:rFonts w:eastAsia="Times New Roman" w:cstheme="minorHAnsi"/>
+          <w:kern w:val="0"/>
+          <w:lang w:eastAsia="es-AR"/>
+          <w14:ligatures w14:val="none"/>
+        </w:rPr>
+        <w:t>CaesarCipher</w:t>
+      </w:r>
+      <w:proofErr w:type="spellEnd"/>
+      <w:r>
+        <w:rPr>
+          <w:rFonts w:eastAsia="Times New Roman" w:cstheme="minorHAnsi"/>
+          <w:kern w:val="0"/>
+          <w:lang w:eastAsia="es-AR"/>
+          <w14:ligatures w14:val="none"/>
+        </w:rPr>
+        <w:t xml:space="preserve">. </w:t>
+      </w:r>
+      <w:hyperlink r:id="rId16" w:history="1">
+        <w:r>
+          <w:rPr>
+            <w:rFonts w:eastAsia="Times New Roman" w:cstheme="minorHAnsi"/>
+            <w:color w:val="0000FF"/>
+            <w:kern w:val="0"/>
+            <w:u w:val="single"/>
+            <w:lang w:eastAsia="es-AR"/>
+            <w14:ligatures w14:val="none"/>
+          </w:rPr>
+          <w:t>https://caesarcipher.org/learn/unix-timestamp-epoch-time-explained</w:t>
+        </w:r>
+      </w:hyperlink>
+    </w:p>
+    <w:p>
+      <w:pPr>
+        <w:spacing w:before="100" w:beforeAutospacing="1" w:after="100" w:afterAutospacing="1" w:line="240" w:lineRule="auto"/>
+        <w:rPr>
+          <w:rFonts w:eastAsia="Times New Roman" w:cstheme="minorHAnsi"/>
+          <w:kern w:val="0"/>
+          <w:lang w:eastAsia="es-AR"/>
+          <w14:ligatures w14:val="none"/>
+        </w:rPr>
+      </w:pPr>
+      <w:r>
+        <w:rPr>
+          <w:rFonts w:eastAsia="Times New Roman" w:cstheme="minorHAnsi"/>
+          <w:kern w:val="0"/>
+          <w:lang w:eastAsia="es-AR"/>
+          <w14:ligatures w14:val="none"/>
+        </w:rPr>
+        <w:t xml:space="preserve">Common Lisp </w:t>
+      </w:r>
+      <w:proofErr w:type="spellStart"/>
+      <w:r>
+        <w:rPr>
+          <w:rFonts w:eastAsia="Times New Roman" w:cstheme="minorHAnsi"/>
+          <w:kern w:val="0"/>
+          <w:lang w:eastAsia="es-AR"/>
+          <w14:ligatures w14:val="none"/>
+        </w:rPr>
+        <w:t>Libraries</w:t>
+      </w:r>
+      <w:proofErr w:type="spellEnd"/>
+      <w:r>
+        <w:rPr>
+          <w:rFonts w:eastAsia="Times New Roman" w:cstheme="minorHAnsi"/>
+          <w:kern w:val="0"/>
+          <w:lang w:eastAsia="es-AR"/>
+          <w14:ligatures w14:val="none"/>
+        </w:rPr>
+        <w:t xml:space="preserve">. (s.f.). </w:t>
+      </w:r>
+      <w:r>
+        <w:rPr>
+          <w:rFonts w:eastAsia="Times New Roman" w:cstheme="minorHAnsi"/>
+          <w:i/>
+          <w:iCs/>
+          <w:kern w:val="0"/>
+          <w:lang w:eastAsia="es-AR"/>
+          <w14:ligatures w14:val="none"/>
+        </w:rPr>
+        <w:t>local-time</w:t>
+      </w:r>
+      <w:r>
+        <w:rPr>
+          <w:rFonts w:eastAsia="Times New Roman" w:cstheme="minorHAnsi"/>
+          <w:kern w:val="0"/>
+          <w:lang w:eastAsia="es-AR"/>
+          <w14:ligatures w14:val="none"/>
+        </w:rPr>
+        <w:t xml:space="preserve">. Read </w:t>
+      </w:r>
+      <w:proofErr w:type="spellStart"/>
+      <w:r>
+        <w:rPr>
+          <w:rFonts w:eastAsia="Times New Roman" w:cstheme="minorHAnsi"/>
+          <w:kern w:val="0"/>
+          <w:lang w:eastAsia="es-AR"/>
+          <w14:ligatures w14:val="none"/>
+        </w:rPr>
+        <w:t>the</w:t>
+      </w:r>
+      <w:proofErr w:type="spellEnd"/>
+      <w:r>
+        <w:rPr>
+          <w:rFonts w:eastAsia="Times New Roman" w:cstheme="minorHAnsi"/>
+          <w:kern w:val="0"/>
+          <w:lang w:eastAsia="es-AR"/>
+          <w14:ligatures w14:val="none"/>
+        </w:rPr>
+        <w:t xml:space="preserve"> Docs. </w:t>
+      </w:r>
+      <w:hyperlink r:id="rId17" w:history="1">
+        <w:r>
+          <w:rPr>
+            <w:rFonts w:eastAsia="Times New Roman" w:cstheme="minorHAnsi"/>
+            <w:color w:val="0000FF"/>
+            <w:kern w:val="0"/>
+            <w:u w:val="single"/>
+            <w:lang w:eastAsia="es-AR"/>
+            <w14:ligatures w14:val="none"/>
+          </w:rPr>
+          <w:t>https://common-lisp-libraries.readthedocs.io/local-time/</w:t>
+        </w:r>
+      </w:hyperlink>
+    </w:p>
+    <w:p>
+      <w:pPr>
+        <w:spacing w:before="100" w:beforeAutospacing="1" w:after="100" w:afterAutospacing="1" w:line="240" w:lineRule="auto"/>
+        <w:rPr>
+          <w:rFonts w:eastAsia="Times New Roman" w:cstheme="minorHAnsi"/>
+          <w:kern w:val="0"/>
+          <w:lang w:eastAsia="es-AR"/>
+          <w14:ligatures w14:val="none"/>
+        </w:rPr>
+      </w:pPr>
+      <w:proofErr w:type="spellStart"/>
+      <w:r>
+        <w:rPr>
+          <w:rFonts w:eastAsia="Times New Roman" w:cstheme="minorHAnsi"/>
+          <w:kern w:val="0"/>
+          <w:lang w:eastAsia="es-AR"/>
+          <w14:ligatures w14:val="none"/>
+        </w:rPr>
+        <w:t>Quicklisp</w:t>
+      </w:r>
+      <w:proofErr w:type="spellEnd"/>
+      <w:r>
+        <w:rPr>
+          <w:rFonts w:eastAsia="Times New Roman" w:cstheme="minorHAnsi"/>
+          <w:kern w:val="0"/>
+          <w:lang w:eastAsia="es-AR"/>
+          <w14:ligatures w14:val="none"/>
+        </w:rPr>
+        <w:t xml:space="preserve"> Project. (s.f.). </w:t>
+      </w:r>
+      <w:proofErr w:type="spellStart"/>
+      <w:r>
+        <w:rPr>
+          <w:rFonts w:eastAsia="Times New Roman" w:cstheme="minorHAnsi"/>
+          <w:i/>
+          <w:iCs/>
+          <w:kern w:val="0"/>
+          <w:lang w:eastAsia="es-AR"/>
+          <w14:ligatures w14:val="none"/>
+        </w:rPr>
+        <w:t>Quicklisp</w:t>
+      </w:r>
+      <w:proofErr w:type="spellEnd"/>
+      <w:r>
+        <w:rPr>
+          <w:rFonts w:eastAsia="Times New Roman" w:cstheme="minorHAnsi"/>
+          <w:i/>
+          <w:iCs/>
+          <w:kern w:val="0"/>
+          <w:lang w:eastAsia="es-AR"/>
+          <w14:ligatures w14:val="none"/>
+        </w:rPr>
+        <w:t xml:space="preserve"> beta</w:t>
+      </w:r>
+      <w:r>
+        <w:rPr>
+          <w:rFonts w:eastAsia="Times New Roman" w:cstheme="minorHAnsi"/>
+          <w:kern w:val="0"/>
+          <w:lang w:eastAsia="es-AR"/>
+          <w14:ligatures w14:val="none"/>
+        </w:rPr>
+        <w:t xml:space="preserve">. </w:t>
+      </w:r>
+      <w:proofErr w:type="spellStart"/>
+      <w:r>
+        <w:rPr>
+          <w:rFonts w:eastAsia="Times New Roman" w:cstheme="minorHAnsi"/>
+          <w:kern w:val="0"/>
+          <w:lang w:eastAsia="es-AR"/>
+          <w14:ligatures w14:val="none"/>
+        </w:rPr>
+        <w:t>Quicklisp</w:t>
+      </w:r>
+      <w:proofErr w:type="spellEnd"/>
+      <w:r>
+        <w:rPr>
+          <w:rFonts w:eastAsia="Times New Roman" w:cstheme="minorHAnsi"/>
+          <w:kern w:val="0"/>
+          <w:lang w:eastAsia="es-AR"/>
+          <w14:ligatures w14:val="none"/>
+        </w:rPr>
+        <w:t xml:space="preserve">. </w:t>
+      </w:r>
+      <w:hyperlink r:id="rId18" w:history="1">
+        <w:r>
+          <w:rPr>
+            <w:rFonts w:eastAsia="Times New Roman" w:cstheme="minorHAnsi"/>
+            <w:color w:val="0000FF"/>
+            <w:kern w:val="0"/>
+            <w:u w:val="single"/>
+            <w:lang w:eastAsia="es-AR"/>
+            <w14:ligatures w14:val="none"/>
+          </w:rPr>
+          <w:t>https://www.quicklisp.org/beta/</w:t>
+        </w:r>
+      </w:hyperlink>
+    </w:p>
+    <w:p>
+      <w:pPr>
+        <w:spacing w:before="100" w:beforeAutospacing="1" w:after="100" w:afterAutospacing="1" w:line="240" w:lineRule="auto"/>
+        <w:rPr>
+          <w:rFonts w:eastAsia="Times New Roman" w:cstheme="minorHAnsi"/>
+          <w:kern w:val="0"/>
+          <w:lang w:eastAsia="es-AR"/>
+          <w14:ligatures w14:val="none"/>
+        </w:rPr>
+      </w:pPr>
+      <w:r>
+        <w:rPr>
+          <w:rFonts w:eastAsia="Times New Roman" w:cstheme="minorHAnsi"/>
+          <w:kern w:val="0"/>
+          <w:lang w:eastAsia="es-AR"/>
+          <w14:ligatures w14:val="none"/>
+        </w:rPr>
+        <w:t xml:space="preserve">Steel Bank Common Lisp. (s.f.). </w:t>
+      </w:r>
+      <w:r>
+        <w:rPr>
+          <w:rFonts w:eastAsia="Times New Roman" w:cstheme="minorHAnsi"/>
+          <w:i/>
+          <w:iCs/>
+          <w:kern w:val="0"/>
+          <w:lang w:eastAsia="es-AR"/>
+          <w14:ligatures w14:val="none"/>
+        </w:rPr>
+        <w:t xml:space="preserve">SBCL </w:t>
+      </w:r>
+      <w:proofErr w:type="spellStart"/>
+      <w:r>
+        <w:rPr>
+          <w:rFonts w:eastAsia="Times New Roman" w:cstheme="minorHAnsi"/>
+          <w:i/>
+          <w:iCs/>
+          <w:kern w:val="0"/>
+          <w:lang w:eastAsia="es-AR"/>
+          <w14:ligatures w14:val="none"/>
+        </w:rPr>
+        <w:t>User</w:t>
+      </w:r>
+      <w:proofErr w:type="spellEnd"/>
+      <w:r>
+        <w:rPr>
+          <w:rFonts w:eastAsia="Times New Roman" w:cstheme="minorHAnsi"/>
+          <w:i/>
+          <w:iCs/>
+          <w:kern w:val="0"/>
+          <w:lang w:eastAsia="es-AR"/>
+          <w14:ligatures w14:val="none"/>
+        </w:rPr>
+        <w:t xml:space="preserve"> Manual</w:t>
+      </w:r>
+      <w:r>
+        <w:rPr>
+          <w:rFonts w:eastAsia="Times New Roman" w:cstheme="minorHAnsi"/>
+          <w:kern w:val="0"/>
+          <w:lang w:eastAsia="es-AR"/>
+          <w14:ligatures w14:val="none"/>
+        </w:rPr>
+        <w:t xml:space="preserve">. Secciones consultadas: </w:t>
+      </w:r>
+      <w:proofErr w:type="spellStart"/>
+      <w:r>
+        <w:rPr>
+          <w:rFonts w:eastAsia="Times New Roman" w:cstheme="minorHAnsi"/>
+          <w:i/>
+          <w:iCs/>
+          <w:kern w:val="0"/>
+          <w:lang w:eastAsia="es-AR"/>
+          <w14:ligatures w14:val="none"/>
+        </w:rPr>
+        <w:t>Package</w:t>
+      </w:r>
+      <w:proofErr w:type="spellEnd"/>
+      <w:r>
+        <w:rPr>
+          <w:rFonts w:eastAsia="Times New Roman" w:cstheme="minorHAnsi"/>
+          <w:i/>
+          <w:iCs/>
+          <w:kern w:val="0"/>
+          <w:lang w:eastAsia="es-AR"/>
+          <w14:ligatures w14:val="none"/>
+        </w:rPr>
+        <w:t xml:space="preserve"> Locks</w:t>
+      </w:r>
+      <w:r>
+        <w:rPr>
+          <w:rFonts w:eastAsia="Times New Roman" w:cstheme="minorHAnsi"/>
+          <w:kern w:val="0"/>
+          <w:lang w:eastAsia="es-AR"/>
+          <w14:ligatures w14:val="none"/>
+        </w:rPr>
+        <w:t xml:space="preserve"> y </w:t>
+      </w:r>
+      <w:proofErr w:type="spellStart"/>
+      <w:r>
+        <w:rPr>
+          <w:rFonts w:eastAsia="Times New Roman" w:cstheme="minorHAnsi"/>
+          <w:i/>
+          <w:iCs/>
+          <w:kern w:val="0"/>
+          <w:lang w:eastAsia="es-AR"/>
+          <w14:ligatures w14:val="none"/>
+        </w:rPr>
+        <w:t>Timers</w:t>
+      </w:r>
+      <w:proofErr w:type="spellEnd"/>
+      <w:r>
+        <w:rPr>
+          <w:rFonts w:eastAsia="Times New Roman" w:cstheme="minorHAnsi"/>
+          <w:kern w:val="0"/>
+          <w:lang w:eastAsia="es-AR"/>
+          <w14:ligatures w14:val="none"/>
+        </w:rPr>
+        <w:t xml:space="preserve">. SBCL. </w:t>
+      </w:r>
+      <w:hyperlink r:id="rId19" w:history="1">
+        <w:r>
+          <w:rPr>
+            <w:rFonts w:eastAsia="Times New Roman" w:cstheme="minorHAnsi"/>
+            <w:color w:val="0000FF"/>
+            <w:kern w:val="0"/>
+            <w:u w:val="single"/>
+            <w:lang w:eastAsia="es-AR"/>
+            <w14:ligatures w14:val="none"/>
+          </w:rPr>
+          <w:t>https://www.sbcl.org/manual/index.html</w:t>
+        </w:r>
+      </w:hyperlink>
+    </w:p>
+    <w:p>
+      <w:pPr>
+        <w:jc w:val="both"/>
+        <w:rPr>
+          <w:rFonts w:cstheme="minorHAnsi"/>
+          <w:b/>
+          <w:bCs/>
+          <w:sz w:val="28"/>
+          <w:szCs w:val="28"/>
           <w:lang w:val="es-ES"/>
         </w:rPr>
       </w:pPr>
@@ -2115,6 +3489,29 @@
       <w:spacing w:val="5"/>
     </w:rPr>
   </w:style>
+  <w:style w:type="character" w:styleId="Hipervnculo">
+    <w:name w:val="Hyperlink"/>
+    <w:basedOn w:val="Fuentedeprrafopredeter"/>
+    <w:uiPriority w:val="99"/>
+    <w:unhideWhenUsed/>
+    <w:rsid w:val="00C324B1"/>
+    <w:rPr>
+      <w:color w:val="0563C1" w:themeColor="hyperlink"/>
+      <w:u w:val="single"/>
+    </w:rPr>
+  </w:style>
+  <w:style w:type="character" w:styleId="Mencinsinresolver">
+    <w:name w:val="Unresolved Mention"/>
+    <w:basedOn w:val="Fuentedeprrafopredeter"/>
+    <w:uiPriority w:val="99"/>
+    <w:semiHidden/>
+    <w:unhideWhenUsed/>
+    <w:rsid w:val="00C324B1"/>
+    <w:rPr>
+      <w:color w:val="605E5C"/>
+      <w:shd w:val="clear" w:color="auto" w:fill="E1DFDD"/>
+    </w:rPr>
+  </w:style>
 </w:styles>
 </file>
 
@@ -2411,4 +3808,16 @@
     </a:ext>
   </a:extLst>
 </a:theme>
+</file>
+
+<file path=customXml/item1.xml><?xml version="1.0" encoding="utf-8"?>
+<b:Sources xmlns:b="http://schemas.openxmlformats.org/officeDocument/2006/bibliography" xmlns="http://schemas.openxmlformats.org/officeDocument/2006/bibliography" SelectedStyle="\APASixthEditionOfficeOnline.xsl" StyleName="APA" Version="6"/>
+</file>
+
+<file path=customXml/itemProps1.xml><?xml version="1.0" encoding="utf-8"?>
+<ds:datastoreItem xmlns:ds="http://schemas.openxmlformats.org/officeDocument/2006/customXml" ds:itemID="{E46493C1-42DC-4F8B-A9E7-2D16634AF0E2}">
+  <ds:schemaRefs>
+    <ds:schemaRef ds:uri="http://schemas.openxmlformats.org/officeDocument/2006/bibliography"/>
+  </ds:schemaRefs>
+</ds:datastoreItem>
 </file>
</xml_diff>

<commit_message>
Formateo del Borrador del Informe
</commit_message>
<xml_diff>
--- a/docs/BorradorInforme(Convertir en PDF AL TERMINAR).docx
+++ b/docs/BorradorInforme(Convertir en PDF AL TERMINAR).docx
@@ -13,21 +13,1794 @@
       </w:pPr>
       <w:r>
         <w:rPr>
+          <w:rFonts w:ascii="Aptos" w:eastAsia="Aptos" w:hAnsi="Aptos" w:cs="Times New Roman"/>
+          <w:b/>
+          <w:noProof/>
+          <w:sz w:val="40"/>
+        </w:rPr>
+        <w:drawing>
+          <wp:anchor distT="0" distB="0" distL="114300" distR="114300" simplePos="0" relativeHeight="251662336" behindDoc="0" locked="0" layoutInCell="1" allowOverlap="1" wp14:anchorId="25CDE944" wp14:editId="73112440">
+            <wp:simplePos x="0" y="0"/>
+            <wp:positionH relativeFrom="column">
+              <wp:posOffset>-1319530</wp:posOffset>
+            </wp:positionH>
+            <wp:positionV relativeFrom="paragraph">
+              <wp:posOffset>-652145</wp:posOffset>
+            </wp:positionV>
+            <wp:extent cx="14632940" cy="762000"/>
+            <wp:effectExtent l="0" t="0" r="0" b="0"/>
+            <wp:wrapNone/>
+            <wp:docPr id="1861950538" name="Imagen 1861950538"/>
+            <wp:cNvGraphicFramePr>
+              <a:graphicFrameLocks xmlns:a="http://schemas.openxmlformats.org/drawingml/2006/main" noChangeAspect="1"/>
+            </wp:cNvGraphicFramePr>
+            <a:graphic xmlns:a="http://schemas.openxmlformats.org/drawingml/2006/main">
+              <a:graphicData uri="http://schemas.openxmlformats.org/drawingml/2006/picture">
+                <pic:pic xmlns:pic="http://schemas.openxmlformats.org/drawingml/2006/picture">
+                  <pic:nvPicPr>
+                    <pic:cNvPr id="1" name=""/>
+                    <pic:cNvPicPr/>
+                  </pic:nvPicPr>
+                  <pic:blipFill>
+                    <a:blip r:embed="rId8">
+                      <a:extLst>
+                        <a:ext uri="{28A0092B-C50C-407E-A947-70E740481C1C}">
+                          <a14:useLocalDpi xmlns:a14="http://schemas.microsoft.com/office/drawing/2010/main" val="0"/>
+                        </a:ext>
+                      </a:extLst>
+                    </a:blip>
+                    <a:stretch>
+                      <a:fillRect/>
+                    </a:stretch>
+                  </pic:blipFill>
+                  <pic:spPr>
+                    <a:xfrm>
+                      <a:off x="0" y="0"/>
+                      <a:ext cx="14632940" cy="762000"/>
+                    </a:xfrm>
+                    <a:prstGeom prst="rect">
+                      <a:avLst/>
+                    </a:prstGeom>
+                  </pic:spPr>
+                </pic:pic>
+              </a:graphicData>
+            </a:graphic>
+            <wp14:sizeRelH relativeFrom="page">
+              <wp14:pctWidth>0</wp14:pctWidth>
+            </wp14:sizeRelH>
+            <wp14:sizeRelV relativeFrom="page">
+              <wp14:pctHeight>0</wp14:pctHeight>
+            </wp14:sizeRelV>
+          </wp:anchor>
+        </w:drawing>
+      </w:r>
+    </w:p>
+    <w:p>
+      <w:pPr>
+        <w:spacing w:before="240"/>
+        <w:jc w:val="center"/>
+        <w:rPr>
+          <w:rFonts w:ascii="Aptos" w:eastAsia="Aptos" w:hAnsi="Aptos" w:cs="Times New Roman"/>
+          <w:u w:val="single"/>
+        </w:rPr>
+      </w:pPr>
+      <w:r>
+        <w:rPr>
+          <w:rFonts w:ascii="Aptos" w:eastAsia="Aptos" w:hAnsi="Aptos" w:cs="Times New Roman"/>
+          <w:b/>
+          <w:sz w:val="40"/>
+          <w:u w:val="single"/>
+        </w:rPr>
+        <w:t>Paradigmas y Lenguajes de Programación</w:t>
+      </w:r>
+    </w:p>
+    <w:p>
+      <w:pPr>
+        <w:jc w:val="center"/>
+        <w:rPr>
+          <w:rFonts w:ascii="Aptos" w:eastAsia="Aptos" w:hAnsi="Aptos" w:cs="Times New Roman"/>
+          <w:b/>
+          <w:sz w:val="32"/>
+          <w:szCs w:val="20"/>
+        </w:rPr>
+      </w:pPr>
+      <w:r>
+        <w:rPr>
+          <w:rFonts w:ascii="Aptos" w:eastAsia="Aptos" w:hAnsi="Aptos" w:cs="Times New Roman"/>
+          <w:b/>
+          <w:sz w:val="32"/>
+          <w:szCs w:val="20"/>
+        </w:rPr>
+        <w:t>INFORME: TRABAJO PRÁCTICO INTEGRADOR 2026</w:t>
+      </w:r>
+    </w:p>
+    <w:p>
+      <w:pPr>
+        <w:jc w:val="center"/>
+        <w:rPr>
+          <w:rFonts w:ascii="Aptos" w:eastAsia="Aptos" w:hAnsi="Aptos" w:cs="Times New Roman"/>
+          <w:b/>
+          <w:sz w:val="32"/>
+          <w:szCs w:val="20"/>
+        </w:rPr>
+      </w:pPr>
+      <w:r>
+        <w:rPr>
+          <w:rFonts w:ascii="Aptos" w:eastAsia="Aptos" w:hAnsi="Aptos" w:cs="Times New Roman"/>
+          <w:b/>
+          <w:sz w:val="32"/>
+          <w:szCs w:val="20"/>
+        </w:rPr>
+        <w:t>Sistema de Semáforos Inteligentes y Análisis Comparativo de Paradigmas</w:t>
+      </w:r>
+    </w:p>
+    <w:p>
+      <w:pPr>
+        <w:jc w:val="center"/>
+        <w:rPr>
+          <w:rFonts w:ascii="Aptos" w:eastAsia="Aptos" w:hAnsi="Aptos" w:cs="Times New Roman"/>
+          <w:b/>
+          <w:color w:val="C00000"/>
+          <w:sz w:val="32"/>
+          <w:szCs w:val="20"/>
+        </w:rPr>
+      </w:pPr>
+      <w:r>
+        <w:rPr>
+          <w:rFonts w:ascii="Aptos" w:eastAsia="Aptos" w:hAnsi="Aptos" w:cs="Times New Roman"/>
+          <w:b/>
+          <w:color w:val="C00000"/>
+          <w:sz w:val="32"/>
+          <w:szCs w:val="20"/>
+        </w:rPr>
+        <w:t>-----------------------------------------------------------------------------</w:t>
+      </w:r>
+    </w:p>
+    <w:p>
+      <w:pPr>
+        <w:jc w:val="center"/>
+        <w:rPr>
           <w:b/>
           <w:bCs/>
           <w:lang w:val="es-ES"/>
         </w:rPr>
-        <w:t>Borrador de Bitácora de Depuración:</w:t>
-      </w:r>
-    </w:p>
-    <w:p>
-      <w:pPr>
-        <w:jc w:val="both"/>
-        <w:rPr>
-          <w:b/>
-          <w:bCs/>
-        </w:rPr>
-      </w:pPr>
+      </w:pPr>
+      <w:r>
+        <w:rPr>
+          <w:noProof/>
+        </w:rPr>
+        <w:drawing>
+          <wp:inline distT="0" distB="0" distL="0" distR="0" wp14:anchorId="1552EBED" wp14:editId="2A2C8149">
+            <wp:extent cx="3200400" cy="3200400"/>
+            <wp:effectExtent l="0" t="0" r="0" b="0"/>
+            <wp:docPr id="1" name="Imagen 1" descr="Logotipo&#10;&#10;El contenido generado por IA puede ser incorrecto."/>
+            <wp:cNvGraphicFramePr>
+              <a:graphicFrameLocks xmlns:a="http://schemas.openxmlformats.org/drawingml/2006/main" noChangeAspect="1"/>
+            </wp:cNvGraphicFramePr>
+            <a:graphic xmlns:a="http://schemas.openxmlformats.org/drawingml/2006/main">
+              <a:graphicData uri="http://schemas.openxmlformats.org/drawingml/2006/picture">
+                <pic:pic xmlns:pic="http://schemas.openxmlformats.org/drawingml/2006/picture">
+                  <pic:nvPicPr>
+                    <pic:cNvPr id="1" name="Imagen 1" descr="Logotipo&#10;&#10;El contenido generado por IA puede ser incorrecto."/>
+                    <pic:cNvPicPr/>
+                  </pic:nvPicPr>
+                  <pic:blipFill>
+                    <a:blip r:embed="rId9">
+                      <a:extLst>
+                        <a:ext uri="{28A0092B-C50C-407E-A947-70E740481C1C}">
+                          <a14:useLocalDpi xmlns:a14="http://schemas.microsoft.com/office/drawing/2010/main" val="0"/>
+                        </a:ext>
+                      </a:extLst>
+                    </a:blip>
+                    <a:stretch>
+                      <a:fillRect/>
+                    </a:stretch>
+                  </pic:blipFill>
+                  <pic:spPr>
+                    <a:xfrm>
+                      <a:off x="0" y="0"/>
+                      <a:ext cx="3209214" cy="3209214"/>
+                    </a:xfrm>
+                    <a:prstGeom prst="rect">
+                      <a:avLst/>
+                    </a:prstGeom>
+                  </pic:spPr>
+                </pic:pic>
+              </a:graphicData>
+            </a:graphic>
+          </wp:inline>
+        </w:drawing>
+      </w:r>
+    </w:p>
+    <w:p>
+      <w:pPr>
+        <w:jc w:val="center"/>
+        <w:rPr>
+          <w:b/>
+          <w:bCs/>
+          <w:color w:val="C00000"/>
+          <w:sz w:val="44"/>
+          <w:szCs w:val="44"/>
+          <w:lang w:val="es-ES"/>
+        </w:rPr>
+      </w:pPr>
+      <w:r>
+        <w:rPr>
+          <w:b/>
+          <w:bCs/>
+          <w:color w:val="C00000"/>
+          <w:sz w:val="44"/>
+          <w:szCs w:val="44"/>
+          <w:lang w:val="es-ES"/>
+        </w:rPr>
+        <w:t xml:space="preserve">GRUPO 4: </w:t>
+      </w:r>
+      <w:proofErr w:type="spellStart"/>
+      <w:r>
+        <w:rPr>
+          <w:b/>
+          <w:bCs/>
+          <w:color w:val="C00000"/>
+          <w:sz w:val="44"/>
+          <w:szCs w:val="44"/>
+          <w:lang w:val="es-ES"/>
+        </w:rPr>
+        <w:t>OCaml</w:t>
+      </w:r>
+      <w:proofErr w:type="spellEnd"/>
+    </w:p>
+    <w:p>
+      <w:pPr>
+        <w:jc w:val="center"/>
+        <w:rPr>
+          <w:rFonts w:ascii="Aptos" w:eastAsia="Aptos" w:hAnsi="Aptos" w:cs="Times New Roman"/>
+          <w:b/>
+          <w:color w:val="C00000"/>
+          <w:sz w:val="32"/>
+          <w:szCs w:val="20"/>
+        </w:rPr>
+      </w:pPr>
+      <w:r>
+        <w:rPr>
+          <w:rFonts w:ascii="Aptos" w:eastAsia="Aptos" w:hAnsi="Aptos" w:cs="Times New Roman"/>
+          <w:b/>
+          <w:color w:val="C00000"/>
+          <w:sz w:val="32"/>
+          <w:szCs w:val="20"/>
+        </w:rPr>
+        <w:t>-----------------------------------------------------------------------------</w:t>
+      </w:r>
+    </w:p>
+    <w:p>
+      <w:pPr>
+        <w:spacing w:line="480" w:lineRule="auto"/>
+        <w:rPr>
+          <w:b/>
+          <w:bCs/>
+          <w:sz w:val="22"/>
+          <w:szCs w:val="22"/>
+        </w:rPr>
+      </w:pPr>
+      <w:r>
+        <w:rPr>
+          <w:b/>
+          <w:bCs/>
+          <w:sz w:val="28"/>
+          <w:szCs w:val="28"/>
+        </w:rPr>
+        <w:t>Integrantes</w:t>
+      </w:r>
+      <w:r>
+        <w:rPr>
+          <w:b/>
+          <w:bCs/>
+          <w:sz w:val="22"/>
+          <w:szCs w:val="22"/>
+        </w:rPr>
+        <w:t>:</w:t>
+      </w:r>
+    </w:p>
+    <w:tbl>
+      <w:tblPr>
+        <w:tblStyle w:val="Tablaconcuadrcula"/>
+        <w:tblW w:w="9640" w:type="dxa"/>
+        <w:tblInd w:w="-426" w:type="dxa"/>
+        <w:tblBorders>
+          <w:top w:val="none" w:sz="0" w:space="0" w:color="auto"/>
+          <w:left w:val="none" w:sz="0" w:space="0" w:color="auto"/>
+          <w:bottom w:val="none" w:sz="0" w:space="0" w:color="auto"/>
+          <w:right w:val="none" w:sz="0" w:space="0" w:color="auto"/>
+          <w:insideH w:val="none" w:sz="0" w:space="0" w:color="auto"/>
+          <w:insideV w:val="none" w:sz="0" w:space="0" w:color="auto"/>
+        </w:tblBorders>
+        <w:tblLook w:val="04A0" w:firstRow="1" w:lastRow="0" w:firstColumn="1" w:lastColumn="0" w:noHBand="0" w:noVBand="1"/>
+      </w:tblPr>
+      <w:tblGrid>
+        <w:gridCol w:w="4962"/>
+        <w:gridCol w:w="4678"/>
+      </w:tblGrid>
+      <w:tr>
+        <w:tc>
+          <w:tcPr>
+            <w:tcW w:w="4962" w:type="dxa"/>
+          </w:tcPr>
+          <w:p>
+            <w:pPr>
+              <w:pStyle w:val="Prrafodelista"/>
+              <w:numPr>
+                <w:ilvl w:val="0"/>
+                <w:numId w:val="1"/>
+              </w:numPr>
+              <w:spacing w:line="600" w:lineRule="auto"/>
+              <w:ind w:left="426"/>
+              <w:rPr>
+                <w:b/>
+                <w:bCs/>
+                <w:sz w:val="22"/>
+                <w:szCs w:val="22"/>
+              </w:rPr>
+            </w:pPr>
+            <w:r>
+              <w:rPr>
+                <w:b/>
+                <w:bCs/>
+                <w:sz w:val="22"/>
+                <w:szCs w:val="22"/>
+              </w:rPr>
+              <w:t>Torres Yleana Beatriz 44.982.909</w:t>
+            </w:r>
+          </w:p>
+          <w:p>
+            <w:pPr>
+              <w:pStyle w:val="Prrafodelista"/>
+              <w:numPr>
+                <w:ilvl w:val="0"/>
+                <w:numId w:val="1"/>
+              </w:numPr>
+              <w:tabs>
+                <w:tab w:val="left" w:pos="66"/>
+              </w:tabs>
+              <w:spacing w:line="600" w:lineRule="auto"/>
+              <w:ind w:left="426"/>
+              <w:rPr>
+                <w:b/>
+                <w:bCs/>
+                <w:sz w:val="22"/>
+                <w:szCs w:val="22"/>
+              </w:rPr>
+            </w:pPr>
+            <w:r>
+              <w:rPr>
+                <w:b/>
+                <w:bCs/>
+                <w:sz w:val="22"/>
+                <w:szCs w:val="22"/>
+              </w:rPr>
+              <w:t>Apellido Nombre</w:t>
+            </w:r>
+            <w:r>
+              <w:rPr>
+                <w:b/>
+                <w:bCs/>
+                <w:sz w:val="22"/>
+                <w:szCs w:val="22"/>
+              </w:rPr>
+              <w:t xml:space="preserve"> </w:t>
+            </w:r>
+            <w:r>
+              <w:rPr>
+                <w:b/>
+                <w:bCs/>
+                <w:sz w:val="22"/>
+                <w:szCs w:val="22"/>
+              </w:rPr>
+              <w:t>00</w:t>
+            </w:r>
+            <w:r>
+              <w:rPr>
+                <w:b/>
+                <w:bCs/>
+                <w:sz w:val="22"/>
+                <w:szCs w:val="22"/>
+              </w:rPr>
+              <w:t>.</w:t>
+            </w:r>
+            <w:r>
+              <w:rPr>
+                <w:b/>
+                <w:bCs/>
+                <w:sz w:val="22"/>
+                <w:szCs w:val="22"/>
+              </w:rPr>
+              <w:t>000</w:t>
+            </w:r>
+            <w:r>
+              <w:rPr>
+                <w:b/>
+                <w:bCs/>
+                <w:sz w:val="22"/>
+                <w:szCs w:val="22"/>
+              </w:rPr>
+              <w:t>.</w:t>
+            </w:r>
+            <w:r>
+              <w:rPr>
+                <w:b/>
+                <w:bCs/>
+                <w:sz w:val="22"/>
+                <w:szCs w:val="22"/>
+              </w:rPr>
+              <w:t>000</w:t>
+            </w:r>
+          </w:p>
+        </w:tc>
+        <w:tc>
+          <w:tcPr>
+            <w:tcW w:w="4678" w:type="dxa"/>
+          </w:tcPr>
+          <w:p>
+            <w:pPr>
+              <w:pStyle w:val="Prrafodelista"/>
+              <w:numPr>
+                <w:ilvl w:val="0"/>
+                <w:numId w:val="1"/>
+              </w:numPr>
+              <w:spacing w:line="600" w:lineRule="auto"/>
+              <w:rPr>
+                <w:b/>
+                <w:bCs/>
+                <w:sz w:val="22"/>
+                <w:szCs w:val="22"/>
+              </w:rPr>
+            </w:pPr>
+            <w:r>
+              <w:rPr>
+                <w:b/>
+                <w:bCs/>
+                <w:sz w:val="22"/>
+                <w:szCs w:val="22"/>
+              </w:rPr>
+              <w:t xml:space="preserve">Almiron </w:t>
+            </w:r>
+            <w:r>
+              <w:rPr>
+                <w:b/>
+                <w:bCs/>
+                <w:sz w:val="22"/>
+                <w:szCs w:val="22"/>
+              </w:rPr>
+              <w:t>José 46.602.154</w:t>
+            </w:r>
+          </w:p>
+          <w:p>
+            <w:pPr>
+              <w:pStyle w:val="Prrafodelista"/>
+              <w:numPr>
+                <w:ilvl w:val="0"/>
+                <w:numId w:val="1"/>
+              </w:numPr>
+              <w:spacing w:line="600" w:lineRule="auto"/>
+              <w:rPr>
+                <w:b/>
+                <w:bCs/>
+                <w:sz w:val="22"/>
+                <w:szCs w:val="22"/>
+              </w:rPr>
+            </w:pPr>
+            <w:r>
+              <w:rPr>
+                <w:b/>
+                <w:bCs/>
+                <w:sz w:val="22"/>
+                <w:szCs w:val="22"/>
+              </w:rPr>
+              <w:t>Apellido Nombre</w:t>
+            </w:r>
+            <w:r>
+              <w:rPr>
+                <w:b/>
+                <w:bCs/>
+                <w:sz w:val="22"/>
+                <w:szCs w:val="22"/>
+              </w:rPr>
+              <w:t xml:space="preserve"> </w:t>
+            </w:r>
+            <w:r>
+              <w:rPr>
+                <w:b/>
+                <w:bCs/>
+                <w:sz w:val="22"/>
+                <w:szCs w:val="22"/>
+              </w:rPr>
+              <w:t>00</w:t>
+            </w:r>
+            <w:r>
+              <w:rPr>
+                <w:b/>
+                <w:bCs/>
+                <w:sz w:val="22"/>
+                <w:szCs w:val="22"/>
+              </w:rPr>
+              <w:t>.</w:t>
+            </w:r>
+            <w:r>
+              <w:rPr>
+                <w:b/>
+                <w:bCs/>
+                <w:sz w:val="22"/>
+                <w:szCs w:val="22"/>
+              </w:rPr>
+              <w:t>000</w:t>
+            </w:r>
+            <w:r>
+              <w:rPr>
+                <w:b/>
+                <w:bCs/>
+                <w:sz w:val="22"/>
+                <w:szCs w:val="22"/>
+              </w:rPr>
+              <w:t>.</w:t>
+            </w:r>
+            <w:r>
+              <w:rPr>
+                <w:b/>
+                <w:bCs/>
+                <w:sz w:val="22"/>
+                <w:szCs w:val="22"/>
+              </w:rPr>
+              <w:t>000</w:t>
+            </w:r>
+          </w:p>
+        </w:tc>
+      </w:tr>
+    </w:tbl>
+    <w:p>
+      <w:pPr>
+        <w:spacing w:before="240"/>
+        <w:jc w:val="center"/>
+        <w:rPr>
+          <w:b/>
+          <w:bCs/>
+          <w:sz w:val="28"/>
+          <w:szCs w:val="28"/>
+        </w:rPr>
+      </w:pPr>
+    </w:p>
+    <w:p>
+      <w:pPr>
+        <w:spacing w:before="240"/>
+        <w:jc w:val="center"/>
+        <w:rPr>
+          <w:b/>
+          <w:bCs/>
+          <w:sz w:val="28"/>
+          <w:szCs w:val="28"/>
+        </w:rPr>
+      </w:pPr>
+      <w:r>
+        <w:rPr>
+          <w:rFonts w:asciiTheme="majorHAnsi" w:hAnsiTheme="majorHAnsi" w:cstheme="majorHAnsi"/>
+          <w:b/>
+          <w:noProof/>
+          <w:sz w:val="23"/>
+          <w:szCs w:val="23"/>
+        </w:rPr>
+        <mc:AlternateContent>
+          <mc:Choice Requires="wps">
+            <w:drawing>
+              <wp:anchor distT="0" distB="0" distL="114300" distR="114300" simplePos="0" relativeHeight="251664384" behindDoc="0" locked="0" layoutInCell="1" allowOverlap="1" wp14:anchorId="57F86847" wp14:editId="00C871B9">
+                <wp:simplePos x="0" y="0"/>
+                <wp:positionH relativeFrom="page">
+                  <wp:posOffset>-66675</wp:posOffset>
+                </wp:positionH>
+                <wp:positionV relativeFrom="paragraph">
+                  <wp:posOffset>722630</wp:posOffset>
+                </wp:positionV>
+                <wp:extent cx="7969250" cy="266700"/>
+                <wp:effectExtent l="0" t="0" r="0" b="0"/>
+                <wp:wrapNone/>
+                <wp:docPr id="1423024202" name="Rectángulo 1423024202"/>
+                <wp:cNvGraphicFramePr/>
+                <a:graphic xmlns:a="http://schemas.openxmlformats.org/drawingml/2006/main">
+                  <a:graphicData uri="http://schemas.microsoft.com/office/word/2010/wordprocessingShape">
+                    <wps:wsp>
+                      <wps:cNvSpPr/>
+                      <wps:spPr>
+                        <a:xfrm>
+                          <a:off x="0" y="0"/>
+                          <a:ext cx="7969250" cy="266700"/>
+                        </a:xfrm>
+                        <a:prstGeom prst="rect">
+                          <a:avLst/>
+                        </a:prstGeom>
+                        <a:solidFill>
+                          <a:srgbClr val="C00000"/>
+                        </a:solidFill>
+                        <a:ln>
+                          <a:noFill/>
+                        </a:ln>
+                        <a:effectLst/>
+                      </wps:spPr>
+                      <wps:style>
+                        <a:lnRef idx="1">
+                          <a:schemeClr val="accent1"/>
+                        </a:lnRef>
+                        <a:fillRef idx="3">
+                          <a:schemeClr val="accent1"/>
+                        </a:fillRef>
+                        <a:effectRef idx="2">
+                          <a:schemeClr val="accent1"/>
+                        </a:effectRef>
+                        <a:fontRef idx="minor">
+                          <a:schemeClr val="lt1"/>
+                        </a:fontRef>
+                      </wps:style>
+                      <wps:bodyPr rot="0" spcFirstLastPara="0" vertOverflow="overflow" horzOverflow="overflow" vert="horz" wrap="square" lIns="91440" tIns="45720" rIns="91440" bIns="45720" numCol="1" spcCol="0" rtlCol="0" fromWordArt="0" anchor="ctr" anchorCtr="0" forceAA="0" compatLnSpc="1">
+                        <a:prstTxWarp prst="textNoShape">
+                          <a:avLst/>
+                        </a:prstTxWarp>
+                        <a:noAutofit/>
+                      </wps:bodyPr>
+                    </wps:wsp>
+                  </a:graphicData>
+                </a:graphic>
+                <wp14:sizeRelH relativeFrom="margin">
+                  <wp14:pctWidth>0</wp14:pctWidth>
+                </wp14:sizeRelH>
+                <wp14:sizeRelV relativeFrom="margin">
+                  <wp14:pctHeight>0</wp14:pctHeight>
+                </wp14:sizeRelV>
+              </wp:anchor>
+            </w:drawing>
+          </mc:Choice>
+          <mc:Fallback>
+            <w:pict>
+              <v:rect w14:anchorId="7870D3F7" id="Rectángulo 1423024202" o:spid="_x0000_s1026" style="position:absolute;margin-left:-5.25pt;margin-top:56.9pt;width:627.5pt;height:21pt;z-index:251664384;visibility:visible;mso-wrap-style:square;mso-width-percent:0;mso-height-percent:0;mso-wrap-distance-left:9pt;mso-wrap-distance-top:0;mso-wrap-distance-right:9pt;mso-wrap-distance-bottom:0;mso-position-horizontal:absolute;mso-position-horizontal-relative:page;mso-position-vertical:absolute;mso-position-vertical-relative:text;mso-width-percent:0;mso-height-percent:0;mso-width-relative:margin;mso-height-relative:margin;v-text-anchor:middle" o:gfxdata="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" fillcolor="#c00000" stroked="f" strokeweight=".5pt">
+                <w10:wrap anchorx="page"/>
+              </v:rect>
+            </w:pict>
+          </mc:Fallback>
+        </mc:AlternateContent>
+      </w:r>
+      <w:r>
+        <w:rPr>
+          <w:b/>
+          <w:bCs/>
+          <w:sz w:val="28"/>
+          <w:szCs w:val="28"/>
+        </w:rPr>
+        <w:t>JUNIO</w:t>
+      </w:r>
+      <w:r>
+        <w:rPr>
+          <w:b/>
+          <w:bCs/>
+          <w:sz w:val="28"/>
+          <w:szCs w:val="28"/>
+        </w:rPr>
+        <w:t xml:space="preserve"> 202</w:t>
+      </w:r>
+      <w:r>
+        <w:rPr>
+          <w:b/>
+          <w:bCs/>
+          <w:sz w:val="28"/>
+          <w:szCs w:val="28"/>
+        </w:rPr>
+        <w:t>6</w:t>
+      </w:r>
+    </w:p>
+    <w:p>
+      <w:pPr>
+        <w:pStyle w:val="Ttulo1"/>
+      </w:pPr>
+      <w:bookmarkStart w:id="0" w:name="_Toc212909376"/>
+      <w:bookmarkStart w:id="1" w:name="_Toc231778452"/>
+      <w:r>
+        <w:lastRenderedPageBreak/>
+        <mc:AlternateContent>
+          <mc:Choice Requires="wps">
+            <w:drawing>
+              <wp:anchor distT="0" distB="0" distL="114300" distR="114300" simplePos="0" relativeHeight="251682816" behindDoc="0" locked="0" layoutInCell="1" allowOverlap="1" wp14:anchorId="3C5AA8DF" wp14:editId="52C2B776">
+                <wp:simplePos x="0" y="0"/>
+                <wp:positionH relativeFrom="page">
+                  <wp:posOffset>1888490</wp:posOffset>
+                </wp:positionH>
+                <wp:positionV relativeFrom="paragraph">
+                  <wp:posOffset>66675</wp:posOffset>
+                </wp:positionV>
+                <wp:extent cx="5652000" cy="108000"/>
+                <wp:effectExtent l="0" t="0" r="6350" b="6350"/>
+                <wp:wrapNone/>
+                <wp:docPr id="1954637155" name="Rectángulo 1954637155"/>
+                <wp:cNvGraphicFramePr/>
+                <a:graphic xmlns:a="http://schemas.openxmlformats.org/drawingml/2006/main">
+                  <a:graphicData uri="http://schemas.microsoft.com/office/word/2010/wordprocessingShape">
+                    <wps:wsp>
+                      <wps:cNvSpPr/>
+                      <wps:spPr>
+                        <a:xfrm>
+                          <a:off x="0" y="0"/>
+                          <a:ext cx="5652000" cy="108000"/>
+                        </a:xfrm>
+                        <a:prstGeom prst="rect">
+                          <a:avLst/>
+                        </a:prstGeom>
+                        <a:solidFill>
+                          <a:srgbClr val="C00000"/>
+                        </a:solidFill>
+                        <a:ln w="12700" cap="flat" cmpd="sng" algn="ctr">
+                          <a:noFill/>
+                          <a:prstDash val="solid"/>
+                          <a:miter lim="800000"/>
+                        </a:ln>
+                        <a:effectLst/>
+                      </wps:spPr>
+                      <wps:bodyPr rot="0" spcFirstLastPara="0" vertOverflow="overflow" horzOverflow="overflow" vert="horz" wrap="square" lIns="91440" tIns="45720" rIns="91440" bIns="45720" numCol="1" spcCol="0" rtlCol="0" fromWordArt="0" anchor="ctr" anchorCtr="0" forceAA="0" compatLnSpc="1">
+                        <a:prstTxWarp prst="textNoShape">
+                          <a:avLst/>
+                        </a:prstTxWarp>
+                        <a:noAutofit/>
+                      </wps:bodyPr>
+                    </wps:wsp>
+                  </a:graphicData>
+                </a:graphic>
+                <wp14:sizeRelH relativeFrom="margin">
+                  <wp14:pctWidth>0</wp14:pctWidth>
+                </wp14:sizeRelH>
+                <wp14:sizeRelV relativeFrom="margin">
+                  <wp14:pctHeight>0</wp14:pctHeight>
+                </wp14:sizeRelV>
+              </wp:anchor>
+            </w:drawing>
+          </mc:Choice>
+          <mc:Fallback>
+            <w:pict>
+              <v:rect w14:anchorId="4E177EB7" id="Rectángulo 1954637155" o:spid="_x0000_s1026" style="position:absolute;margin-left:148.7pt;margin-top:5.25pt;width:445.05pt;height:8.5pt;z-index:251682816;visibility:visible;mso-wrap-style:square;mso-width-percent:0;mso-height-percent:0;mso-wrap-distance-left:9pt;mso-wrap-distance-top:0;mso-wrap-distance-right:9pt;mso-wrap-distance-bottom:0;mso-position-horizontal:absolute;mso-position-horizontal-relative:page;mso-position-vertical:absolute;mso-position-vertical-relative:text;mso-width-percent:0;mso-height-percent:0;mso-width-relative:margin;mso-height-relative:margin;v-text-anchor:middle" o:gfxdata="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" fillcolor="#c00000" stroked="f" strokeweight="1pt">
+                <w10:wrap anchorx="page"/>
+              </v:rect>
+            </w:pict>
+          </mc:Fallback>
+        </mc:AlternateContent>
+      </w:r>
+      <w:r>
+        <w:t>IN</w:t>
+      </w:r>
+      <w:r>
+        <w:t>DICE</w:t>
+      </w:r>
+      <w:bookmarkEnd w:id="1"/>
+    </w:p>
+    <w:p/>
+    <w:p/>
+    <w:p/>
+    <w:sdt>
+      <w:sdtPr>
+        <w:rPr>
+          <w:lang w:val="es-ES"/>
+        </w:rPr>
+        <w:id w:val="-1863036746"/>
+        <w:docPartObj>
+          <w:docPartGallery w:val="Table of Contents"/>
+          <w:docPartUnique/>
+        </w:docPartObj>
+      </w:sdtPr>
+      <w:sdtEndPr>
+        <w:rPr>
+          <w:rFonts w:asciiTheme="minorHAnsi" w:eastAsiaTheme="minorHAnsi" w:hAnsiTheme="minorHAnsi" w:cstheme="minorBidi"/>
+          <w:b/>
+          <w:bCs/>
+          <w:color w:val="auto"/>
+          <w:kern w:val="2"/>
+          <w:sz w:val="24"/>
+          <w:szCs w:val="24"/>
+          <w:lang w:eastAsia="en-US"/>
+          <w14:ligatures w14:val="standardContextual"/>
+        </w:rPr>
+      </w:sdtEndPr>
+      <w:sdtContent>
+        <w:p>
+          <w:pPr>
+            <w:pStyle w:val="TtuloTDC"/>
+            <w:rPr>
+              <w:rFonts w:ascii="Aptos" w:hAnsi="Aptos"/>
+              <w:b/>
+              <w:bCs/>
+              <w:color w:val="C00000"/>
+              <w:sz w:val="36"/>
+              <w:szCs w:val="36"/>
+            </w:rPr>
+          </w:pPr>
+          <w:r>
+            <w:rPr>
+              <w:rFonts w:ascii="Aptos" w:hAnsi="Aptos"/>
+              <w:b/>
+              <w:bCs/>
+              <w:color w:val="C00000"/>
+              <w:sz w:val="36"/>
+              <w:szCs w:val="36"/>
+              <w:lang w:val="es-ES"/>
+            </w:rPr>
+            <w:t>Contenido</w:t>
+          </w:r>
+        </w:p>
+        <w:p>
+          <w:pPr>
+            <w:pStyle w:val="TDC1"/>
+            <w:tabs>
+              <w:tab w:val="right" w:leader="dot" w:pos="8494"/>
+            </w:tabs>
+            <w:rPr>
+              <w:rFonts w:eastAsiaTheme="minorEastAsia"/>
+              <w:noProof/>
+              <w:lang w:eastAsia="es-AR"/>
+            </w:rPr>
+          </w:pPr>
+          <w:r>
+            <w:fldChar w:fldCharType="begin"/>
+          </w:r>
+          <w:r>
+            <w:instrText xml:space="preserve"> TOC \o "1-3" \h \z \u </w:instrText>
+          </w:r>
+          <w:r>
+            <w:fldChar w:fldCharType="separate"/>
+          </w:r>
+          <w:hyperlink w:anchor="_Toc231778452" w:history="1">
+            <w:r>
+              <w:rPr>
+                <w:rStyle w:val="Hipervnculo"/>
+                <w:noProof/>
+              </w:rPr>
+              <w:t>INDICE</w:t>
+            </w:r>
+            <w:r>
+              <w:rPr>
+                <w:noProof/>
+                <w:webHidden/>
+              </w:rPr>
+              <w:tab/>
+            </w:r>
+            <w:r>
+              <w:rPr>
+                <w:noProof/>
+                <w:webHidden/>
+              </w:rPr>
+              <w:fldChar w:fldCharType="begin"/>
+            </w:r>
+            <w:r>
+              <w:rPr>
+                <w:noProof/>
+                <w:webHidden/>
+              </w:rPr>
+              <w:instrText xml:space="preserve"> PAGEREF _Toc231778452 \h </w:instrText>
+            </w:r>
+            <w:r>
+              <w:rPr>
+                <w:noProof/>
+                <w:webHidden/>
+              </w:rPr>
+            </w:r>
+            <w:r>
+              <w:rPr>
+                <w:noProof/>
+                <w:webHidden/>
+              </w:rPr>
+              <w:fldChar w:fldCharType="separate"/>
+            </w:r>
+            <w:r>
+              <w:rPr>
+                <w:noProof/>
+                <w:webHidden/>
+              </w:rPr>
+              <w:t>2</w:t>
+            </w:r>
+            <w:r>
+              <w:rPr>
+                <w:noProof/>
+                <w:webHidden/>
+              </w:rPr>
+              <w:fldChar w:fldCharType="end"/>
+            </w:r>
+          </w:hyperlink>
+        </w:p>
+        <w:p>
+          <w:pPr>
+            <w:pStyle w:val="TDC1"/>
+            <w:tabs>
+              <w:tab w:val="right" w:leader="dot" w:pos="8494"/>
+            </w:tabs>
+            <w:rPr>
+              <w:rFonts w:eastAsiaTheme="minorEastAsia"/>
+              <w:noProof/>
+              <w:lang w:eastAsia="es-AR"/>
+            </w:rPr>
+          </w:pPr>
+          <w:hyperlink w:anchor="_Toc231778453" w:history="1">
+            <w:r>
+              <w:rPr>
+                <w:rStyle w:val="Hipervnculo"/>
+                <w:noProof/>
+              </w:rPr>
+              <w:t>INTRODUCCIÓN</w:t>
+            </w:r>
+            <w:r>
+              <w:rPr>
+                <w:noProof/>
+                <w:webHidden/>
+              </w:rPr>
+              <w:tab/>
+            </w:r>
+            <w:r>
+              <w:rPr>
+                <w:noProof/>
+                <w:webHidden/>
+              </w:rPr>
+              <w:fldChar w:fldCharType="begin"/>
+            </w:r>
+            <w:r>
+              <w:rPr>
+                <w:noProof/>
+                <w:webHidden/>
+              </w:rPr>
+              <w:instrText xml:space="preserve"> PAGEREF _Toc231778453 \h </w:instrText>
+            </w:r>
+            <w:r>
+              <w:rPr>
+                <w:noProof/>
+                <w:webHidden/>
+              </w:rPr>
+            </w:r>
+            <w:r>
+              <w:rPr>
+                <w:noProof/>
+                <w:webHidden/>
+              </w:rPr>
+              <w:fldChar w:fldCharType="separate"/>
+            </w:r>
+            <w:r>
+              <w:rPr>
+                <w:noProof/>
+                <w:webHidden/>
+              </w:rPr>
+              <w:t>3</w:t>
+            </w:r>
+            <w:r>
+              <w:rPr>
+                <w:noProof/>
+                <w:webHidden/>
+              </w:rPr>
+              <w:fldChar w:fldCharType="end"/>
+            </w:r>
+          </w:hyperlink>
+        </w:p>
+        <w:p>
+          <w:pPr>
+            <w:pStyle w:val="TDC1"/>
+            <w:tabs>
+              <w:tab w:val="right" w:leader="dot" w:pos="8494"/>
+            </w:tabs>
+            <w:rPr>
+              <w:rFonts w:eastAsiaTheme="minorEastAsia"/>
+              <w:noProof/>
+              <w:lang w:eastAsia="es-AR"/>
+            </w:rPr>
+          </w:pPr>
+          <w:hyperlink w:anchor="_Toc231778454" w:history="1">
+            <w:r>
+              <w:rPr>
+                <w:rStyle w:val="Hipervnculo"/>
+                <w:noProof/>
+              </w:rPr>
+              <w:t>DESARROLLO</w:t>
+            </w:r>
+            <w:r>
+              <w:rPr>
+                <w:noProof/>
+                <w:webHidden/>
+              </w:rPr>
+              <w:tab/>
+            </w:r>
+            <w:r>
+              <w:rPr>
+                <w:noProof/>
+                <w:webHidden/>
+              </w:rPr>
+              <w:fldChar w:fldCharType="begin"/>
+            </w:r>
+            <w:r>
+              <w:rPr>
+                <w:noProof/>
+                <w:webHidden/>
+              </w:rPr>
+              <w:instrText xml:space="preserve"> PAGEREF _Toc231778454 \h </w:instrText>
+            </w:r>
+            <w:r>
+              <w:rPr>
+                <w:noProof/>
+                <w:webHidden/>
+              </w:rPr>
+            </w:r>
+            <w:r>
+              <w:rPr>
+                <w:noProof/>
+                <w:webHidden/>
+              </w:rPr>
+              <w:fldChar w:fldCharType="separate"/>
+            </w:r>
+            <w:r>
+              <w:rPr>
+                <w:noProof/>
+                <w:webHidden/>
+              </w:rPr>
+              <w:t>4</w:t>
+            </w:r>
+            <w:r>
+              <w:rPr>
+                <w:noProof/>
+                <w:webHidden/>
+              </w:rPr>
+              <w:fldChar w:fldCharType="end"/>
+            </w:r>
+          </w:hyperlink>
+        </w:p>
+        <w:p>
+          <w:pPr>
+            <w:pStyle w:val="TDC1"/>
+            <w:tabs>
+              <w:tab w:val="right" w:leader="dot" w:pos="8494"/>
+            </w:tabs>
+            <w:rPr>
+              <w:rFonts w:eastAsiaTheme="minorEastAsia"/>
+              <w:noProof/>
+              <w:lang w:eastAsia="es-AR"/>
+            </w:rPr>
+          </w:pPr>
+          <w:hyperlink w:anchor="_Toc231778455" w:history="1">
+            <w:r>
+              <w:rPr>
+                <w:rStyle w:val="Hipervnculo"/>
+                <w:noProof/>
+                <w:lang w:val="es-ES"/>
+              </w:rPr>
+              <w:t>BITÁCORA DE DEPURACIÓN</w:t>
+            </w:r>
+            <w:r>
+              <w:rPr>
+                <w:noProof/>
+                <w:webHidden/>
+              </w:rPr>
+              <w:tab/>
+            </w:r>
+            <w:r>
+              <w:rPr>
+                <w:noProof/>
+                <w:webHidden/>
+              </w:rPr>
+              <w:fldChar w:fldCharType="begin"/>
+            </w:r>
+            <w:r>
+              <w:rPr>
+                <w:noProof/>
+                <w:webHidden/>
+              </w:rPr>
+              <w:instrText xml:space="preserve"> PAGEREF _Toc231778455 \h </w:instrText>
+            </w:r>
+            <w:r>
+              <w:rPr>
+                <w:noProof/>
+                <w:webHidden/>
+              </w:rPr>
+            </w:r>
+            <w:r>
+              <w:rPr>
+                <w:noProof/>
+                <w:webHidden/>
+              </w:rPr>
+              <w:fldChar w:fldCharType="separate"/>
+            </w:r>
+            <w:r>
+              <w:rPr>
+                <w:noProof/>
+                <w:webHidden/>
+              </w:rPr>
+              <w:t>5</w:t>
+            </w:r>
+            <w:r>
+              <w:rPr>
+                <w:noProof/>
+                <w:webHidden/>
+              </w:rPr>
+              <w:fldChar w:fldCharType="end"/>
+            </w:r>
+          </w:hyperlink>
+        </w:p>
+        <w:p>
+          <w:pPr>
+            <w:pStyle w:val="TDC1"/>
+            <w:tabs>
+              <w:tab w:val="right" w:leader="dot" w:pos="8494"/>
+            </w:tabs>
+            <w:rPr>
+              <w:rFonts w:eastAsiaTheme="minorEastAsia"/>
+              <w:noProof/>
+              <w:lang w:eastAsia="es-AR"/>
+            </w:rPr>
+          </w:pPr>
+          <w:hyperlink w:anchor="_Toc231778456" w:history="1">
+            <w:r>
+              <w:rPr>
+                <w:rStyle w:val="Hipervnculo"/>
+                <w:noProof/>
+              </w:rPr>
+              <w:t>CONCLUSION</w:t>
+            </w:r>
+            <w:r>
+              <w:rPr>
+                <w:noProof/>
+                <w:webHidden/>
+              </w:rPr>
+              <w:tab/>
+            </w:r>
+            <w:r>
+              <w:rPr>
+                <w:noProof/>
+                <w:webHidden/>
+              </w:rPr>
+              <w:fldChar w:fldCharType="begin"/>
+            </w:r>
+            <w:r>
+              <w:rPr>
+                <w:noProof/>
+                <w:webHidden/>
+              </w:rPr>
+              <w:instrText xml:space="preserve"> PAGEREF _Toc231778456 \h </w:instrText>
+            </w:r>
+            <w:r>
+              <w:rPr>
+                <w:noProof/>
+                <w:webHidden/>
+              </w:rPr>
+            </w:r>
+            <w:r>
+              <w:rPr>
+                <w:noProof/>
+                <w:webHidden/>
+              </w:rPr>
+              <w:fldChar w:fldCharType="separate"/>
+            </w:r>
+            <w:r>
+              <w:rPr>
+                <w:noProof/>
+                <w:webHidden/>
+              </w:rPr>
+              <w:t>13</w:t>
+            </w:r>
+            <w:r>
+              <w:rPr>
+                <w:noProof/>
+                <w:webHidden/>
+              </w:rPr>
+              <w:fldChar w:fldCharType="end"/>
+            </w:r>
+          </w:hyperlink>
+        </w:p>
+        <w:p>
+          <w:pPr>
+            <w:pStyle w:val="TDC1"/>
+            <w:tabs>
+              <w:tab w:val="right" w:leader="dot" w:pos="8494"/>
+            </w:tabs>
+            <w:rPr>
+              <w:rFonts w:eastAsiaTheme="minorEastAsia"/>
+              <w:noProof/>
+              <w:lang w:eastAsia="es-AR"/>
+            </w:rPr>
+          </w:pPr>
+          <w:hyperlink w:anchor="_Toc231778457" w:history="1">
+            <w:r>
+              <w:rPr>
+                <w:rStyle w:val="Hipervnculo"/>
+                <w:noProof/>
+                <w:lang w:eastAsia="es-AR"/>
+              </w:rPr>
+              <w:t>BIBLIOGRAFÍA</w:t>
+            </w:r>
+            <w:r>
+              <w:rPr>
+                <w:noProof/>
+                <w:webHidden/>
+              </w:rPr>
+              <w:tab/>
+            </w:r>
+            <w:r>
+              <w:rPr>
+                <w:noProof/>
+                <w:webHidden/>
+              </w:rPr>
+              <w:fldChar w:fldCharType="begin"/>
+            </w:r>
+            <w:r>
+              <w:rPr>
+                <w:noProof/>
+                <w:webHidden/>
+              </w:rPr>
+              <w:instrText xml:space="preserve"> PAGEREF _Toc231778457 \h </w:instrText>
+            </w:r>
+            <w:r>
+              <w:rPr>
+                <w:noProof/>
+                <w:webHidden/>
+              </w:rPr>
+            </w:r>
+            <w:r>
+              <w:rPr>
+                <w:noProof/>
+                <w:webHidden/>
+              </w:rPr>
+              <w:fldChar w:fldCharType="separate"/>
+            </w:r>
+            <w:r>
+              <w:rPr>
+                <w:noProof/>
+                <w:webHidden/>
+              </w:rPr>
+              <w:t>13</w:t>
+            </w:r>
+            <w:r>
+              <w:rPr>
+                <w:noProof/>
+                <w:webHidden/>
+              </w:rPr>
+              <w:fldChar w:fldCharType="end"/>
+            </w:r>
+          </w:hyperlink>
+        </w:p>
+        <w:p>
+          <w:r>
+            <w:rPr>
+              <w:b/>
+              <w:bCs/>
+              <w:lang w:val="es-ES"/>
+            </w:rPr>
+            <w:fldChar w:fldCharType="end"/>
+          </w:r>
+        </w:p>
+      </w:sdtContent>
+    </w:sdt>
+    <w:p>
+      <w:pPr>
+        <w:rPr>
+          <w:rFonts w:ascii="Arial" w:eastAsia="Times New Roman" w:hAnsi="Arial" w:cs="Times New Roman"/>
+          <w:b/>
+          <w:color w:val="C00000"/>
+          <w:sz w:val="32"/>
+          <w:szCs w:val="40"/>
+        </w:rPr>
+      </w:pPr>
+    </w:p>
+    <w:p>
+      <w:pPr>
+        <w:rPr>
+          <w:rFonts w:ascii="Arial" w:eastAsia="Times New Roman" w:hAnsi="Arial" w:cs="Times New Roman"/>
+          <w:b/>
+          <w:color w:val="C00000"/>
+          <w:sz w:val="32"/>
+          <w:szCs w:val="40"/>
+        </w:rPr>
+      </w:pPr>
+      <w:r>
+        <w:br w:type="page"/>
+      </w:r>
+    </w:p>
+    <w:p>
+      <w:pPr>
+        <w:pStyle w:val="Ttulo1"/>
+      </w:pPr>
+      <w:bookmarkStart w:id="2" w:name="_Toc231778453"/>
+      <w:r>
+        <w:lastRenderedPageBreak/>
+        <mc:AlternateContent>
+          <mc:Choice Requires="wps">
+            <w:drawing>
+              <wp:anchor distT="0" distB="0" distL="114300" distR="114300" simplePos="0" relativeHeight="251678720" behindDoc="0" locked="0" layoutInCell="1" allowOverlap="1" wp14:anchorId="12061F3E" wp14:editId="0FE93A69">
+                <wp:simplePos x="0" y="0"/>
+                <wp:positionH relativeFrom="page">
+                  <wp:posOffset>2793365</wp:posOffset>
+                </wp:positionH>
+                <wp:positionV relativeFrom="paragraph">
+                  <wp:posOffset>38100</wp:posOffset>
+                </wp:positionV>
+                <wp:extent cx="4967605" cy="108000"/>
+                <wp:effectExtent l="0" t="0" r="4445" b="6350"/>
+                <wp:wrapNone/>
+                <wp:docPr id="523211353" name="Rectángulo 523211353"/>
+                <wp:cNvGraphicFramePr/>
+                <a:graphic xmlns:a="http://schemas.openxmlformats.org/drawingml/2006/main">
+                  <a:graphicData uri="http://schemas.microsoft.com/office/word/2010/wordprocessingShape">
+                    <wps:wsp>
+                      <wps:cNvSpPr/>
+                      <wps:spPr>
+                        <a:xfrm>
+                          <a:off x="0" y="0"/>
+                          <a:ext cx="4967605" cy="108000"/>
+                        </a:xfrm>
+                        <a:prstGeom prst="rect">
+                          <a:avLst/>
+                        </a:prstGeom>
+                        <a:solidFill>
+                          <a:srgbClr val="C00000"/>
+                        </a:solidFill>
+                        <a:ln w="12700" cap="flat" cmpd="sng" algn="ctr">
+                          <a:noFill/>
+                          <a:prstDash val="solid"/>
+                          <a:miter lim="800000"/>
+                        </a:ln>
+                        <a:effectLst/>
+                      </wps:spPr>
+                      <wps:bodyPr rot="0" spcFirstLastPara="0" vertOverflow="overflow" horzOverflow="overflow" vert="horz" wrap="square" lIns="91440" tIns="45720" rIns="91440" bIns="45720" numCol="1" spcCol="0" rtlCol="0" fromWordArt="0" anchor="ctr" anchorCtr="0" forceAA="0" compatLnSpc="1">
+                        <a:prstTxWarp prst="textNoShape">
+                          <a:avLst/>
+                        </a:prstTxWarp>
+                        <a:noAutofit/>
+                      </wps:bodyPr>
+                    </wps:wsp>
+                  </a:graphicData>
+                </a:graphic>
+                <wp14:sizeRelH relativeFrom="margin">
+                  <wp14:pctWidth>0</wp14:pctWidth>
+                </wp14:sizeRelH>
+                <wp14:sizeRelV relativeFrom="margin">
+                  <wp14:pctHeight>0</wp14:pctHeight>
+                </wp14:sizeRelV>
+              </wp:anchor>
+            </w:drawing>
+          </mc:Choice>
+          <mc:Fallback>
+            <w:pict>
+              <v:rect w14:anchorId="3A86B28E" id="Rectángulo 523211353" o:spid="_x0000_s1026" style="position:absolute;margin-left:219.95pt;margin-top:3pt;width:391.15pt;height:8.5pt;z-index:251678720;visibility:visible;mso-wrap-style:square;mso-width-percent:0;mso-height-percent:0;mso-wrap-distance-left:9pt;mso-wrap-distance-top:0;mso-wrap-distance-right:9pt;mso-wrap-distance-bottom:0;mso-position-horizontal:absolute;mso-position-horizontal-relative:page;mso-position-vertical:absolute;mso-position-vertical-relative:text;mso-width-percent:0;mso-height-percent:0;mso-width-relative:margin;mso-height-relative:margin;v-text-anchor:middle" o:gfxdata="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" fillcolor="#c00000" stroked="f" strokeweight="1pt">
+                <w10:wrap anchorx="page"/>
+              </v:rect>
+            </w:pict>
+          </mc:Fallback>
+        </mc:AlternateContent>
+      </w:r>
+      <w:r>
+        <w:t>INTRODUCCIÓN</w:t>
+      </w:r>
+      <w:bookmarkEnd w:id="0"/>
+      <w:bookmarkEnd w:id="2"/>
+    </w:p>
+    <w:p>
+      <w:pPr>
+        <w:spacing w:before="240"/>
+        <w:jc w:val="center"/>
+        <w:rPr>
+          <w:b/>
+          <w:bCs/>
+          <w:sz w:val="28"/>
+          <w:szCs w:val="28"/>
+        </w:rPr>
+      </w:pPr>
+    </w:p>
+    <w:p>
+      <w:pPr>
+        <w:rPr>
+          <w:b/>
+          <w:bCs/>
+          <w:lang w:val="es-ES"/>
+        </w:rPr>
+      </w:pPr>
+    </w:p>
+    <w:p>
+      <w:pPr>
+        <w:rPr>
+          <w:b/>
+          <w:bCs/>
+          <w:lang w:val="es-ES"/>
+        </w:rPr>
+      </w:pPr>
+    </w:p>
+    <w:p>
+      <w:pPr>
+        <w:rPr>
+          <w:b/>
+          <w:bCs/>
+          <w:lang w:val="es-ES"/>
+        </w:rPr>
+      </w:pPr>
+      <w:r>
+        <w:rPr>
+          <w:b/>
+          <w:bCs/>
+          <w:lang w:val="es-ES"/>
+        </w:rPr>
+        <w:br w:type="page"/>
+      </w:r>
+    </w:p>
+    <w:p>
+      <w:pPr>
+        <w:pStyle w:val="Ttulo1"/>
+      </w:pPr>
+      <w:bookmarkStart w:id="3" w:name="_Toc231778454"/>
+      <w:r>
+        <w:lastRenderedPageBreak/>
+        <mc:AlternateContent>
+          <mc:Choice Requires="wps">
+            <w:drawing>
+              <wp:anchor distT="0" distB="0" distL="114300" distR="114300" simplePos="0" relativeHeight="251684864" behindDoc="0" locked="0" layoutInCell="1" allowOverlap="1" wp14:anchorId="71DC369B" wp14:editId="1A82B2AB">
+                <wp:simplePos x="0" y="0"/>
+                <wp:positionH relativeFrom="page">
+                  <wp:posOffset>2574290</wp:posOffset>
+                </wp:positionH>
+                <wp:positionV relativeFrom="paragraph">
+                  <wp:posOffset>38100</wp:posOffset>
+                </wp:positionV>
+                <wp:extent cx="4967605" cy="108000"/>
+                <wp:effectExtent l="0" t="0" r="4445" b="6350"/>
+                <wp:wrapNone/>
+                <wp:docPr id="370797753" name="Rectángulo 370797753"/>
+                <wp:cNvGraphicFramePr/>
+                <a:graphic xmlns:a="http://schemas.openxmlformats.org/drawingml/2006/main">
+                  <a:graphicData uri="http://schemas.microsoft.com/office/word/2010/wordprocessingShape">
+                    <wps:wsp>
+                      <wps:cNvSpPr/>
+                      <wps:spPr>
+                        <a:xfrm>
+                          <a:off x="0" y="0"/>
+                          <a:ext cx="4967605" cy="108000"/>
+                        </a:xfrm>
+                        <a:prstGeom prst="rect">
+                          <a:avLst/>
+                        </a:prstGeom>
+                        <a:solidFill>
+                          <a:srgbClr val="C00000"/>
+                        </a:solidFill>
+                        <a:ln w="12700" cap="flat" cmpd="sng" algn="ctr">
+                          <a:noFill/>
+                          <a:prstDash val="solid"/>
+                          <a:miter lim="800000"/>
+                        </a:ln>
+                        <a:effectLst/>
+                      </wps:spPr>
+                      <wps:bodyPr rot="0" spcFirstLastPara="0" vertOverflow="overflow" horzOverflow="overflow" vert="horz" wrap="square" lIns="91440" tIns="45720" rIns="91440" bIns="45720" numCol="1" spcCol="0" rtlCol="0" fromWordArt="0" anchor="ctr" anchorCtr="0" forceAA="0" compatLnSpc="1">
+                        <a:prstTxWarp prst="textNoShape">
+                          <a:avLst/>
+                        </a:prstTxWarp>
+                        <a:noAutofit/>
+                      </wps:bodyPr>
+                    </wps:wsp>
+                  </a:graphicData>
+                </a:graphic>
+                <wp14:sizeRelH relativeFrom="margin">
+                  <wp14:pctWidth>0</wp14:pctWidth>
+                </wp14:sizeRelH>
+                <wp14:sizeRelV relativeFrom="margin">
+                  <wp14:pctHeight>0</wp14:pctHeight>
+                </wp14:sizeRelV>
+              </wp:anchor>
+            </w:drawing>
+          </mc:Choice>
+          <mc:Fallback>
+            <w:pict>
+              <v:rect w14:anchorId="12E53DAF" id="Rectángulo 370797753" o:spid="_x0000_s1026" style="position:absolute;margin-left:202.7pt;margin-top:3pt;width:391.15pt;height:8.5pt;z-index:251684864;visibility:visible;mso-wrap-style:square;mso-width-percent:0;mso-height-percent:0;mso-wrap-distance-left:9pt;mso-wrap-distance-top:0;mso-wrap-distance-right:9pt;mso-wrap-distance-bottom:0;mso-position-horizontal:absolute;mso-position-horizontal-relative:page;mso-position-vertical:absolute;mso-position-vertical-relative:text;mso-width-percent:0;mso-height-percent:0;mso-width-relative:margin;mso-height-relative:margin;v-text-anchor:middle" o:gfxdata="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" fillcolor="#c00000" stroked="f" strokeweight="1pt">
+                <w10:wrap anchorx="page"/>
+              </v:rect>
+            </w:pict>
+          </mc:Fallback>
+        </mc:AlternateContent>
+      </w:r>
+      <w:r>
+        <w:t>DESARROLLO</w:t>
+      </w:r>
+      <w:bookmarkEnd w:id="3"/>
+    </w:p>
+    <w:p>
+      <w:pPr>
+        <w:rPr>
+          <w:b/>
+          <w:bCs/>
+          <w:lang w:val="es-ES"/>
+        </w:rPr>
+      </w:pPr>
+    </w:p>
+    <w:p>
+      <w:pPr>
+        <w:rPr>
+          <w:b/>
+          <w:bCs/>
+          <w:lang w:val="es-ES"/>
+        </w:rPr>
+      </w:pPr>
+    </w:p>
+    <w:p>
+      <w:pPr>
+        <w:rPr>
+          <w:b/>
+          <w:bCs/>
+          <w:lang w:val="es-ES"/>
+        </w:rPr>
+      </w:pPr>
+    </w:p>
+    <w:p>
+      <w:pPr>
+        <w:rPr>
+          <w:b/>
+          <w:bCs/>
+          <w:lang w:val="es-ES"/>
+        </w:rPr>
+      </w:pPr>
+    </w:p>
+    <w:p>
+      <w:pPr>
+        <w:rPr>
+          <w:b/>
+          <w:bCs/>
+          <w:lang w:val="es-ES"/>
+        </w:rPr>
+      </w:pPr>
+    </w:p>
+    <w:p>
+      <w:pPr>
+        <w:rPr>
+          <w:b/>
+          <w:bCs/>
+          <w:lang w:val="es-ES"/>
+        </w:rPr>
+      </w:pPr>
+    </w:p>
+    <w:p>
+      <w:pPr>
+        <w:rPr>
+          <w:b/>
+          <w:bCs/>
+          <w:lang w:val="es-ES"/>
+        </w:rPr>
+      </w:pPr>
+    </w:p>
+    <w:p>
+      <w:pPr>
+        <w:rPr>
+          <w:b/>
+          <w:bCs/>
+          <w:lang w:val="es-ES"/>
+        </w:rPr>
+      </w:pPr>
+    </w:p>
+    <w:p>
+      <w:pPr>
+        <w:rPr>
+          <w:b/>
+          <w:bCs/>
+          <w:lang w:val="es-ES"/>
+        </w:rPr>
+      </w:pPr>
+    </w:p>
+    <w:p>
+      <w:pPr>
+        <w:rPr>
+          <w:b/>
+          <w:bCs/>
+          <w:lang w:val="es-ES"/>
+        </w:rPr>
+      </w:pPr>
+    </w:p>
+    <w:p>
+      <w:pPr>
+        <w:rPr>
+          <w:b/>
+          <w:bCs/>
+          <w:lang w:val="es-ES"/>
+        </w:rPr>
+      </w:pPr>
+      <w:r>
+        <w:rPr>
+          <w:b/>
+          <w:bCs/>
+          <w:lang w:val="es-ES"/>
+        </w:rPr>
+        <w:br w:type="page"/>
+      </w:r>
+    </w:p>
+    <w:p>
+      <w:pPr>
+        <w:pStyle w:val="Ttulo1"/>
+        <w:rPr>
+          <w:lang w:val="es-ES"/>
+        </w:rPr>
+      </w:pPr>
+      <w:bookmarkStart w:id="4" w:name="_Toc231778455"/>
+      <w:r>
+        <w:rPr>
+          <w:rFonts w:asciiTheme="majorHAnsi" w:hAnsiTheme="majorHAnsi" w:cstheme="majorHAnsi"/>
+          <w:noProof/>
+          <w:sz w:val="23"/>
+          <w:szCs w:val="23"/>
+        </w:rPr>
+        <w:lastRenderedPageBreak/>
+        <mc:AlternateContent>
+          <mc:Choice Requires="wps">
+            <w:drawing>
+              <wp:anchor distT="0" distB="0" distL="114300" distR="114300" simplePos="0" relativeHeight="251666432" behindDoc="0" locked="0" layoutInCell="1" allowOverlap="1" wp14:anchorId="24F90DE0" wp14:editId="43300874">
+                <wp:simplePos x="0" y="0"/>
+                <wp:positionH relativeFrom="page">
+                  <wp:posOffset>3993515</wp:posOffset>
+                </wp:positionH>
+                <wp:positionV relativeFrom="paragraph">
+                  <wp:posOffset>85725</wp:posOffset>
+                </wp:positionV>
+                <wp:extent cx="3672000" cy="72000"/>
+                <wp:effectExtent l="0" t="0" r="5080" b="4445"/>
+                <wp:wrapNone/>
+                <wp:docPr id="714368197" name="Rectángulo 714368197"/>
+                <wp:cNvGraphicFramePr/>
+                <a:graphic xmlns:a="http://schemas.openxmlformats.org/drawingml/2006/main">
+                  <a:graphicData uri="http://schemas.microsoft.com/office/word/2010/wordprocessingShape">
+                    <wps:wsp>
+                      <wps:cNvSpPr/>
+                      <wps:spPr>
+                        <a:xfrm>
+                          <a:off x="0" y="0"/>
+                          <a:ext cx="3672000" cy="72000"/>
+                        </a:xfrm>
+                        <a:prstGeom prst="rect">
+                          <a:avLst/>
+                        </a:prstGeom>
+                        <a:solidFill>
+                          <a:srgbClr val="C00000"/>
+                        </a:solidFill>
+                        <a:ln>
+                          <a:noFill/>
+                        </a:ln>
+                        <a:effectLst/>
+                      </wps:spPr>
+                      <wps:style>
+                        <a:lnRef idx="1">
+                          <a:schemeClr val="accent1"/>
+                        </a:lnRef>
+                        <a:fillRef idx="3">
+                          <a:schemeClr val="accent1"/>
+                        </a:fillRef>
+                        <a:effectRef idx="2">
+                          <a:schemeClr val="accent1"/>
+                        </a:effectRef>
+                        <a:fontRef idx="minor">
+                          <a:schemeClr val="lt1"/>
+                        </a:fontRef>
+                      </wps:style>
+                      <wps:bodyPr rot="0" spcFirstLastPara="0" vertOverflow="overflow" horzOverflow="overflow" vert="horz" wrap="square" lIns="91440" tIns="45720" rIns="91440" bIns="45720" numCol="1" spcCol="0" rtlCol="0" fromWordArt="0" anchor="ctr" anchorCtr="0" forceAA="0" compatLnSpc="1">
+                        <a:prstTxWarp prst="textNoShape">
+                          <a:avLst/>
+                        </a:prstTxWarp>
+                        <a:noAutofit/>
+                      </wps:bodyPr>
+                    </wps:wsp>
+                  </a:graphicData>
+                </a:graphic>
+                <wp14:sizeRelH relativeFrom="margin">
+                  <wp14:pctWidth>0</wp14:pctWidth>
+                </wp14:sizeRelH>
+                <wp14:sizeRelV relativeFrom="margin">
+                  <wp14:pctHeight>0</wp14:pctHeight>
+                </wp14:sizeRelV>
+              </wp:anchor>
+            </w:drawing>
+          </mc:Choice>
+          <mc:Fallback>
+            <w:pict>
+              <v:rect w14:anchorId="44855C97" id="Rectángulo 714368197" o:spid="_x0000_s1026" style="position:absolute;margin-left:314.45pt;margin-top:6.75pt;width:289.15pt;height:5.65pt;z-index:251666432;visibility:visible;mso-wrap-style:square;mso-width-percent:0;mso-height-percent:0;mso-wrap-distance-left:9pt;mso-wrap-distance-top:0;mso-wrap-distance-right:9pt;mso-wrap-distance-bottom:0;mso-position-horizontal:absolute;mso-position-horizontal-relative:page;mso-position-vertical:absolute;mso-position-vertical-relative:text;mso-width-percent:0;mso-height-percent:0;mso-width-relative:margin;mso-height-relative:margin;v-text-anchor:middle" o:gfxdata="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" fillcolor="#c00000" stroked="f" strokeweight=".5pt">
+                <w10:wrap anchorx="page"/>
+              </v:rect>
+            </w:pict>
+          </mc:Fallback>
+        </mc:AlternateContent>
+      </w:r>
+      <w:r>
+        <w:rPr>
+          <w:lang w:val="es-ES"/>
+        </w:rPr>
+        <w:t>B</w:t>
+      </w:r>
+      <w:r>
+        <w:rPr>
+          <w:lang w:val="es-ES"/>
+        </w:rPr>
+        <w:t>ITÁCORA DE DEPURACIÓN</w:t>
+      </w:r>
+      <w:bookmarkEnd w:id="4"/>
+    </w:p>
+    <w:p>
+      <w:pPr>
+        <w:jc w:val="both"/>
+        <w:rPr>
+          <w:b/>
+          <w:bCs/>
+        </w:rPr>
+      </w:pPr>
+      <w:r>
+        <w:rPr>
+          <w:rFonts w:asciiTheme="majorHAnsi" w:hAnsiTheme="majorHAnsi" w:cstheme="majorHAnsi"/>
+          <w:b/>
+          <w:noProof/>
+          <w:sz w:val="23"/>
+          <w:szCs w:val="23"/>
+        </w:rPr>
+        <mc:AlternateContent>
+          <mc:Choice Requires="wps">
+            <w:drawing>
+              <wp:anchor distT="0" distB="0" distL="114300" distR="114300" simplePos="0" relativeHeight="251668480" behindDoc="0" locked="0" layoutInCell="1" allowOverlap="1" wp14:anchorId="35B1AD11" wp14:editId="51A5FCB4">
+                <wp:simplePos x="0" y="0"/>
+                <wp:positionH relativeFrom="page">
+                  <wp:posOffset>5438775</wp:posOffset>
+                </wp:positionH>
+                <wp:positionV relativeFrom="paragraph">
+                  <wp:posOffset>71120</wp:posOffset>
+                </wp:positionV>
+                <wp:extent cx="7969250" cy="72000"/>
+                <wp:effectExtent l="0" t="0" r="0" b="4445"/>
+                <wp:wrapNone/>
+                <wp:docPr id="600346918" name="Rectángulo 600346918"/>
+                <wp:cNvGraphicFramePr/>
+                <a:graphic xmlns:a="http://schemas.openxmlformats.org/drawingml/2006/main">
+                  <a:graphicData uri="http://schemas.microsoft.com/office/word/2010/wordprocessingShape">
+                    <wps:wsp>
+                      <wps:cNvSpPr/>
+                      <wps:spPr>
+                        <a:xfrm>
+                          <a:off x="0" y="0"/>
+                          <a:ext cx="7969250" cy="72000"/>
+                        </a:xfrm>
+                        <a:prstGeom prst="rect">
+                          <a:avLst/>
+                        </a:prstGeom>
+                        <a:solidFill>
+                          <a:srgbClr val="C00000"/>
+                        </a:solidFill>
+                        <a:ln>
+                          <a:noFill/>
+                        </a:ln>
+                        <a:effectLst/>
+                      </wps:spPr>
+                      <wps:style>
+                        <a:lnRef idx="1">
+                          <a:schemeClr val="accent1"/>
+                        </a:lnRef>
+                        <a:fillRef idx="3">
+                          <a:schemeClr val="accent1"/>
+                        </a:fillRef>
+                        <a:effectRef idx="2">
+                          <a:schemeClr val="accent1"/>
+                        </a:effectRef>
+                        <a:fontRef idx="minor">
+                          <a:schemeClr val="lt1"/>
+                        </a:fontRef>
+                      </wps:style>
+                      <wps:bodyPr rot="0" spcFirstLastPara="0" vertOverflow="overflow" horzOverflow="overflow" vert="horz" wrap="square" lIns="91440" tIns="45720" rIns="91440" bIns="45720" numCol="1" spcCol="0" rtlCol="0" fromWordArt="0" anchor="ctr" anchorCtr="0" forceAA="0" compatLnSpc="1">
+                        <a:prstTxWarp prst="textNoShape">
+                          <a:avLst/>
+                        </a:prstTxWarp>
+                        <a:noAutofit/>
+                      </wps:bodyPr>
+                    </wps:wsp>
+                  </a:graphicData>
+                </a:graphic>
+                <wp14:sizeRelH relativeFrom="margin">
+                  <wp14:pctWidth>0</wp14:pctWidth>
+                </wp14:sizeRelH>
+                <wp14:sizeRelV relativeFrom="margin">
+                  <wp14:pctHeight>0</wp14:pctHeight>
+                </wp14:sizeRelV>
+              </wp:anchor>
+            </w:drawing>
+          </mc:Choice>
+          <mc:Fallback>
+            <w:pict>
+              <v:rect w14:anchorId="7529575A" id="Rectángulo 600346918" o:spid="_x0000_s1026" style="position:absolute;margin-left:428.25pt;margin-top:5.6pt;width:627.5pt;height:5.65pt;z-index:251668480;visibility:visible;mso-wrap-style:square;mso-width-percent:0;mso-height-percent:0;mso-wrap-distance-left:9pt;mso-wrap-distance-top:0;mso-wrap-distance-right:9pt;mso-wrap-distance-bottom:0;mso-position-horizontal:absolute;mso-position-horizontal-relative:page;mso-position-vertical:absolute;mso-position-vertical-relative:text;mso-width-percent:0;mso-height-percent:0;mso-width-relative:margin;mso-height-relative:margin;v-text-anchor:middle" o:gfxdata="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" fillcolor="#c00000" stroked="f" strokeweight=".5pt">
+                <w10:wrap anchorx="page"/>
+              </v:rect>
+            </w:pict>
+          </mc:Fallback>
+        </mc:AlternateContent>
+      </w:r>
       <w:r>
         <w:rPr>
           <w:b/>
@@ -370,17 +2143,9 @@
           <w:noProof/>
         </w:rPr>
         <w:drawing>
-          <wp:anchor distT="0" distB="0" distL="114300" distR="114300" simplePos="0" relativeHeight="251658240" behindDoc="1" locked="0" layoutInCell="1" allowOverlap="1" wp14:anchorId="29573EB2" wp14:editId="6113B40A">
-            <wp:simplePos x="0" y="0"/>
-            <wp:positionH relativeFrom="column">
-              <wp:posOffset>161925</wp:posOffset>
-            </wp:positionH>
-            <wp:positionV relativeFrom="paragraph">
-              <wp:posOffset>144145</wp:posOffset>
-            </wp:positionV>
+          <wp:inline distT="0" distB="0" distL="0" distR="0" wp14:anchorId="30830BE3" wp14:editId="7E9D2C4D">
             <wp:extent cx="5400040" cy="2820670"/>
             <wp:effectExtent l="19050" t="19050" r="10160" b="17780"/>
-            <wp:wrapTopAndBottom/>
             <wp:docPr id="601116526" name="Imagen 1"/>
             <wp:cNvGraphicFramePr>
               <a:graphicFrameLocks xmlns:a="http://schemas.openxmlformats.org/drawingml/2006/main" noChangeAspect="1"/>
@@ -393,7 +2158,7 @@
                     <pic:cNvPicPr/>
                   </pic:nvPicPr>
                   <pic:blipFill>
-                    <a:blip r:embed="rId5">
+                    <a:blip r:embed="rId10">
                       <a:extLst>
                         <a:ext uri="{28A0092B-C50C-407E-A947-70E740481C1C}">
                           <a14:useLocalDpi xmlns:a14="http://schemas.microsoft.com/office/drawing/2010/main" val="0"/>
@@ -421,9 +2186,18 @@
                 </pic:pic>
               </a:graphicData>
             </a:graphic>
-          </wp:anchor>
+          </wp:inline>
         </w:drawing>
       </w:r>
+    </w:p>
+    <w:p>
+      <w:pPr>
+        <w:jc w:val="both"/>
+        <w:rPr>
+          <w:b/>
+          <w:bCs/>
+        </w:rPr>
+      </w:pPr>
       <w:r>
         <w:rPr>
           <w:b/>
@@ -472,7 +2246,7 @@
                     <pic:cNvPicPr/>
                   </pic:nvPicPr>
                   <pic:blipFill rotWithShape="1">
-                    <a:blip r:embed="rId6"/>
+                    <a:blip r:embed="rId11"/>
                     <a:srcRect l="4112"/>
                     <a:stretch>
                       <a:fillRect/>
@@ -524,7 +2298,7 @@
                     <pic:cNvPicPr/>
                   </pic:nvPicPr>
                   <pic:blipFill rotWithShape="1">
-                    <a:blip r:embed="rId7"/>
+                    <a:blip r:embed="rId12"/>
                     <a:srcRect b="35193"/>
                     <a:stretch>
                       <a:fillRect/>
@@ -627,7 +2401,7 @@
                     <pic:cNvPicPr/>
                   </pic:nvPicPr>
                   <pic:blipFill>
-                    <a:blip r:embed="rId8"/>
+                    <a:blip r:embed="rId13"/>
                     <a:stretch>
                       <a:fillRect/>
                     </a:stretch>
@@ -652,18 +2426,95 @@
       <w:pPr>
         <w:jc w:val="both"/>
         <w:rPr>
-          <w:lang w:val="es-ES"/>
-        </w:rPr>
-      </w:pPr>
-    </w:p>
-    <w:p>
-      <w:pPr>
-        <w:jc w:val="both"/>
-        <w:rPr>
-          <w:b/>
-          <w:bCs/>
-        </w:rPr>
-      </w:pPr>
+          <w:b/>
+          <w:bCs/>
+        </w:rPr>
+      </w:pPr>
+      <w:r>
+        <w:rPr>
+          <w:rFonts w:asciiTheme="majorHAnsi" w:hAnsiTheme="majorHAnsi" w:cstheme="majorHAnsi"/>
+          <w:b/>
+          <w:noProof/>
+          <w:sz w:val="23"/>
+          <w:szCs w:val="23"/>
+        </w:rPr>
+        <mc:AlternateContent>
+          <mc:Choice Requires="wps">
+            <w:drawing>
+              <wp:anchor distT="0" distB="0" distL="114300" distR="114300" simplePos="0" relativeHeight="251670528" behindDoc="0" locked="0" layoutInCell="1" allowOverlap="1" wp14:anchorId="12DF29A2" wp14:editId="6C396941">
+                <wp:simplePos x="0" y="0"/>
+                <wp:positionH relativeFrom="page">
+                  <wp:posOffset>4937760</wp:posOffset>
+                </wp:positionH>
+                <wp:positionV relativeFrom="paragraph">
+                  <wp:posOffset>76200</wp:posOffset>
+                </wp:positionV>
+                <wp:extent cx="7969250" cy="72000"/>
+                <wp:effectExtent l="0" t="0" r="0" b="4445"/>
+                <wp:wrapNone/>
+                <wp:docPr id="841004455" name="Rectángulo 841004455"/>
+                <wp:cNvGraphicFramePr/>
+                <a:graphic xmlns:a="http://schemas.openxmlformats.org/drawingml/2006/main">
+                  <a:graphicData uri="http://schemas.microsoft.com/office/word/2010/wordprocessingShape">
+                    <wps:wsp>
+                      <wps:cNvSpPr/>
+                      <wps:spPr>
+                        <a:xfrm>
+                          <a:off x="0" y="0"/>
+                          <a:ext cx="7969250" cy="72000"/>
+                        </a:xfrm>
+                        <a:prstGeom prst="rect">
+                          <a:avLst/>
+                        </a:prstGeom>
+                        <a:solidFill>
+                          <a:srgbClr val="C00000"/>
+                        </a:solidFill>
+                        <a:ln>
+                          <a:noFill/>
+                        </a:ln>
+                        <a:effectLst/>
+                      </wps:spPr>
+                      <wps:style>
+                        <a:lnRef idx="1">
+                          <a:schemeClr val="accent1"/>
+                        </a:lnRef>
+                        <a:fillRef idx="3">
+                          <a:schemeClr val="accent1"/>
+                        </a:fillRef>
+                        <a:effectRef idx="2">
+                          <a:schemeClr val="accent1"/>
+                        </a:effectRef>
+                        <a:fontRef idx="minor">
+                          <a:schemeClr val="lt1"/>
+                        </a:fontRef>
+                      </wps:style>
+                      <wps:bodyPr rot="0" spcFirstLastPara="0" vertOverflow="overflow" horzOverflow="overflow" vert="horz" wrap="square" lIns="91440" tIns="45720" rIns="91440" bIns="45720" numCol="1" spcCol="0" rtlCol="0" fromWordArt="0" anchor="ctr" anchorCtr="0" forceAA="0" compatLnSpc="1">
+                        <a:prstTxWarp prst="textNoShape">
+                          <a:avLst/>
+                        </a:prstTxWarp>
+                        <a:noAutofit/>
+                      </wps:bodyPr>
+                    </wps:wsp>
+                  </a:graphicData>
+                </a:graphic>
+                <wp14:sizeRelH relativeFrom="margin">
+                  <wp14:pctWidth>0</wp14:pctWidth>
+                </wp14:sizeRelH>
+                <wp14:sizeRelV relativeFrom="margin">
+                  <wp14:pctHeight>0</wp14:pctHeight>
+                </wp14:sizeRelV>
+              </wp:anchor>
+            </w:drawing>
+          </mc:Choice>
+          <mc:Fallback>
+            <w:pict>
+              <v:rect w14:anchorId="1172F60D" id="Rectángulo 841004455" o:spid="_x0000_s1026" style="position:absolute;margin-left:388.8pt;margin-top:6pt;width:627.5pt;height:5.65pt;z-index:251670528;visibility:visible;mso-wrap-style:square;mso-width-percent:0;mso-height-percent:0;mso-wrap-distance-left:9pt;mso-wrap-distance-top:0;mso-wrap-distance-right:9pt;mso-wrap-distance-bottom:0;mso-position-horizontal:absolute;mso-position-horizontal-relative:page;mso-position-vertical:absolute;mso-position-vertical-relative:text;mso-width-percent:0;mso-height-percent:0;mso-width-relative:margin;mso-height-relative:margin;v-text-anchor:middle" o:gfxdata="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" fillcolor="#c00000" stroked="f" strokeweight=".5pt">
+                <w10:wrap anchorx="page"/>
+              </v:rect>
+            </w:pict>
+          </mc:Fallback>
+        </mc:AlternateContent>
+      </w:r>
       <w:r>
         <w:rPr>
           <w:b/>
@@ -882,15 +2733,15 @@
         <w:jc w:val="both"/>
       </w:pPr>
       <w:r>
+        <w:t>y no el orden en que los colores aparecían mencionados dentro de la consigna.</w:t>
+      </w:r>
+    </w:p>
+    <w:p>
+      <w:pPr>
+        <w:jc w:val="both"/>
+      </w:pPr>
+      <w:r>
         <w:lastRenderedPageBreak/>
-        <w:t>y no el orden en que los colores aparecían mencionados dentro de la consigna.</w:t>
-      </w:r>
-    </w:p>
-    <w:p>
-      <w:pPr>
-        <w:jc w:val="both"/>
-      </w:pPr>
-      <w:r>
         <w:t xml:space="preserve">De esta forma, el color correspondiente a cualquier </w:t>
       </w:r>
       <w:proofErr w:type="spellStart"/>
@@ -952,7 +2803,7 @@
                     <pic:cNvPicPr/>
                   </pic:nvPicPr>
                   <pic:blipFill>
-                    <a:blip r:embed="rId9"/>
+                    <a:blip r:embed="rId14"/>
                     <a:stretch>
                       <a:fillRect/>
                     </a:stretch>
@@ -1005,7 +2856,7 @@
                     <pic:cNvPicPr/>
                   </pic:nvPicPr>
                   <pic:blipFill>
-                    <a:blip r:embed="rId10"/>
+                    <a:blip r:embed="rId15"/>
                     <a:stretch>
                       <a:fillRect/>
                     </a:stretch>
@@ -1043,9 +2894,94 @@
       </w:pPr>
       <w:r>
         <w:rPr>
-          <w:b/>
-          <w:bCs/>
+          <w:rFonts w:asciiTheme="majorHAnsi" w:hAnsiTheme="majorHAnsi" w:cstheme="majorHAnsi"/>
+          <w:b/>
           <w:noProof/>
+          <w:sz w:val="23"/>
+          <w:szCs w:val="23"/>
+        </w:rPr>
+        <mc:AlternateContent>
+          <mc:Choice Requires="wps">
+            <w:drawing>
+              <wp:anchor distT="0" distB="0" distL="114300" distR="114300" simplePos="0" relativeHeight="251672576" behindDoc="0" locked="0" layoutInCell="1" allowOverlap="1" wp14:anchorId="48493F2C" wp14:editId="49B170C8">
+                <wp:simplePos x="0" y="0"/>
+                <wp:positionH relativeFrom="page">
+                  <wp:posOffset>4051935</wp:posOffset>
+                </wp:positionH>
+                <wp:positionV relativeFrom="paragraph">
+                  <wp:posOffset>46990</wp:posOffset>
+                </wp:positionV>
+                <wp:extent cx="7969250" cy="72000"/>
+                <wp:effectExtent l="0" t="0" r="0" b="4445"/>
+                <wp:wrapNone/>
+                <wp:docPr id="1969103064" name="Rectángulo 1969103064"/>
+                <wp:cNvGraphicFramePr/>
+                <a:graphic xmlns:a="http://schemas.openxmlformats.org/drawingml/2006/main">
+                  <a:graphicData uri="http://schemas.microsoft.com/office/word/2010/wordprocessingShape">
+                    <wps:wsp>
+                      <wps:cNvSpPr/>
+                      <wps:spPr>
+                        <a:xfrm>
+                          <a:off x="0" y="0"/>
+                          <a:ext cx="7969250" cy="72000"/>
+                        </a:xfrm>
+                        <a:prstGeom prst="rect">
+                          <a:avLst/>
+                        </a:prstGeom>
+                        <a:solidFill>
+                          <a:srgbClr val="C00000"/>
+                        </a:solidFill>
+                        <a:ln>
+                          <a:noFill/>
+                        </a:ln>
+                        <a:effectLst/>
+                      </wps:spPr>
+                      <wps:style>
+                        <a:lnRef idx="1">
+                          <a:schemeClr val="accent1"/>
+                        </a:lnRef>
+                        <a:fillRef idx="3">
+                          <a:schemeClr val="accent1"/>
+                        </a:fillRef>
+                        <a:effectRef idx="2">
+                          <a:schemeClr val="accent1"/>
+                        </a:effectRef>
+                        <a:fontRef idx="minor">
+                          <a:schemeClr val="lt1"/>
+                        </a:fontRef>
+                      </wps:style>
+                      <wps:bodyPr rot="0" spcFirstLastPara="0" vertOverflow="overflow" horzOverflow="overflow" vert="horz" wrap="square" lIns="91440" tIns="45720" rIns="91440" bIns="45720" numCol="1" spcCol="0" rtlCol="0" fromWordArt="0" anchor="ctr" anchorCtr="0" forceAA="0" compatLnSpc="1">
+                        <a:prstTxWarp prst="textNoShape">
+                          <a:avLst/>
+                        </a:prstTxWarp>
+                        <a:noAutofit/>
+                      </wps:bodyPr>
+                    </wps:wsp>
+                  </a:graphicData>
+                </a:graphic>
+                <wp14:sizeRelH relativeFrom="margin">
+                  <wp14:pctWidth>0</wp14:pctWidth>
+                </wp14:sizeRelH>
+                <wp14:sizeRelV relativeFrom="margin">
+                  <wp14:pctHeight>0</wp14:pctHeight>
+                </wp14:sizeRelV>
+              </wp:anchor>
+            </w:drawing>
+          </mc:Choice>
+          <mc:Fallback>
+            <w:pict>
+              <v:rect w14:anchorId="6AC26B0A" id="Rectángulo 1969103064" o:spid="_x0000_s1026" style="position:absolute;margin-left:319.05pt;margin-top:3.7pt;width:627.5pt;height:5.65pt;z-index:251672576;visibility:visible;mso-wrap-style:square;mso-width-percent:0;mso-height-percent:0;mso-wrap-distance-left:9pt;mso-wrap-distance-top:0;mso-wrap-distance-right:9pt;mso-wrap-distance-bottom:0;mso-position-horizontal:absolute;mso-position-horizontal-relative:page;mso-position-vertical:absolute;mso-position-vertical-relative:text;mso-width-percent:0;mso-height-percent:0;mso-width-relative:margin;mso-height-relative:margin;v-text-anchor:middle" o:gfxdata="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" fillcolor="#c00000" stroked="f" strokeweight=".5pt">
+                <w10:wrap anchorx="page"/>
+              </v:rect>
+            </w:pict>
+          </mc:Fallback>
+        </mc:AlternateContent>
+      </w:r>
+      <w:r>
+        <w:rPr>
+          <w:b/>
+          <w:bCs/>
+          <w:noProof/>
         </w:rPr>
         <w:t>3</w:t>
       </w:r>
@@ -1161,7 +3097,6 @@
           <w:bCs/>
           <w:noProof/>
         </w:rPr>
-        <w:lastRenderedPageBreak/>
         <w:t>Captura del Codigo Anterior y del Codigo Actual</w:t>
       </w:r>
     </w:p>
@@ -1177,6 +3112,7 @@
           <w:noProof/>
           <w:lang w:val="es-ES"/>
         </w:rPr>
+        <w:lastRenderedPageBreak/>
         <w:drawing>
           <wp:inline distT="0" distB="0" distL="0" distR="0" wp14:anchorId="4CE7FFC5" wp14:editId="5880E088">
             <wp:extent cx="5400040" cy="2731770"/>
@@ -1193,7 +3129,7 @@
                     <pic:cNvPicPr/>
                   </pic:nvPicPr>
                   <pic:blipFill>
-                    <a:blip r:embed="rId11"/>
+                    <a:blip r:embed="rId16"/>
                     <a:stretch>
                       <a:fillRect/>
                     </a:stretch>
@@ -1227,7 +3163,7 @@
           <w:lang w:val="es-ES"/>
         </w:rPr>
         <w:drawing>
-          <wp:inline distT="0" distB="0" distL="0" distR="0" wp14:anchorId="1EE84E77" wp14:editId="37829FBA">
+          <wp:inline distT="0" distB="0" distL="0" distR="0" wp14:anchorId="1EE84E77" wp14:editId="3CA1F876">
             <wp:extent cx="5400040" cy="1932940"/>
             <wp:effectExtent l="0" t="0" r="0" b="0"/>
             <wp:docPr id="2111855714" name="Imagen 1"/>
@@ -1242,7 +3178,7 @@
                     <pic:cNvPicPr/>
                   </pic:nvPicPr>
                   <pic:blipFill>
-                    <a:blip r:embed="rId12"/>
+                    <a:blip r:embed="rId17"/>
                     <a:stretch>
                       <a:fillRect/>
                     </a:stretch>
@@ -1273,6 +3209,91 @@
       </w:pPr>
       <w:r>
         <w:rPr>
+          <w:rFonts w:asciiTheme="majorHAnsi" w:hAnsiTheme="majorHAnsi" w:cstheme="majorHAnsi"/>
+          <w:b/>
+          <w:noProof/>
+          <w:sz w:val="23"/>
+          <w:szCs w:val="23"/>
+        </w:rPr>
+        <mc:AlternateContent>
+          <mc:Choice Requires="wps">
+            <w:drawing>
+              <wp:anchor distT="0" distB="0" distL="114300" distR="114300" simplePos="0" relativeHeight="251674624" behindDoc="0" locked="0" layoutInCell="1" allowOverlap="1" wp14:anchorId="75E57B39" wp14:editId="37D68AFB">
+                <wp:simplePos x="0" y="0"/>
+                <wp:positionH relativeFrom="page">
+                  <wp:posOffset>3861435</wp:posOffset>
+                </wp:positionH>
+                <wp:positionV relativeFrom="paragraph">
+                  <wp:posOffset>76835</wp:posOffset>
+                </wp:positionV>
+                <wp:extent cx="7969250" cy="72000"/>
+                <wp:effectExtent l="0" t="0" r="0" b="4445"/>
+                <wp:wrapNone/>
+                <wp:docPr id="1617741163" name="Rectángulo 1617741163"/>
+                <wp:cNvGraphicFramePr/>
+                <a:graphic xmlns:a="http://schemas.openxmlformats.org/drawingml/2006/main">
+                  <a:graphicData uri="http://schemas.microsoft.com/office/word/2010/wordprocessingShape">
+                    <wps:wsp>
+                      <wps:cNvSpPr/>
+                      <wps:spPr>
+                        <a:xfrm>
+                          <a:off x="0" y="0"/>
+                          <a:ext cx="7969250" cy="72000"/>
+                        </a:xfrm>
+                        <a:prstGeom prst="rect">
+                          <a:avLst/>
+                        </a:prstGeom>
+                        <a:solidFill>
+                          <a:srgbClr val="C00000"/>
+                        </a:solidFill>
+                        <a:ln>
+                          <a:noFill/>
+                        </a:ln>
+                        <a:effectLst/>
+                      </wps:spPr>
+                      <wps:style>
+                        <a:lnRef idx="1">
+                          <a:schemeClr val="accent1"/>
+                        </a:lnRef>
+                        <a:fillRef idx="3">
+                          <a:schemeClr val="accent1"/>
+                        </a:fillRef>
+                        <a:effectRef idx="2">
+                          <a:schemeClr val="accent1"/>
+                        </a:effectRef>
+                        <a:fontRef idx="minor">
+                          <a:schemeClr val="lt1"/>
+                        </a:fontRef>
+                      </wps:style>
+                      <wps:bodyPr rot="0" spcFirstLastPara="0" vertOverflow="overflow" horzOverflow="overflow" vert="horz" wrap="square" lIns="91440" tIns="45720" rIns="91440" bIns="45720" numCol="1" spcCol="0" rtlCol="0" fromWordArt="0" anchor="ctr" anchorCtr="0" forceAA="0" compatLnSpc="1">
+                        <a:prstTxWarp prst="textNoShape">
+                          <a:avLst/>
+                        </a:prstTxWarp>
+                        <a:noAutofit/>
+                      </wps:bodyPr>
+                    </wps:wsp>
+                  </a:graphicData>
+                </a:graphic>
+                <wp14:sizeRelH relativeFrom="margin">
+                  <wp14:pctWidth>0</wp14:pctWidth>
+                </wp14:sizeRelH>
+                <wp14:sizeRelV relativeFrom="margin">
+                  <wp14:pctHeight>0</wp14:pctHeight>
+                </wp14:sizeRelV>
+              </wp:anchor>
+            </w:drawing>
+          </mc:Choice>
+          <mc:Fallback>
+            <w:pict>
+              <v:rect w14:anchorId="5BEEBCB0" id="Rectángulo 1617741163" o:spid="_x0000_s1026" style="position:absolute;margin-left:304.05pt;margin-top:6.05pt;width:627.5pt;height:5.65pt;z-index:251674624;visibility:visible;mso-wrap-style:square;mso-width-percent:0;mso-height-percent:0;mso-wrap-distance-left:9pt;mso-wrap-distance-top:0;mso-wrap-distance-right:9pt;mso-wrap-distance-bottom:0;mso-position-horizontal:absolute;mso-position-horizontal-relative:page;mso-position-vertical:absolute;mso-position-vertical-relative:text;mso-width-percent:0;mso-height-percent:0;mso-width-relative:margin;mso-height-relative:margin;v-text-anchor:middle" o:gfxdata="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" fillcolor="#c00000" stroked="f" strokeweight=".5pt">
+                <w10:wrap anchorx="page"/>
+              </v:rect>
+            </w:pict>
+          </mc:Fallback>
+        </mc:AlternateContent>
+      </w:r>
+      <w:r>
+        <w:rPr>
           <w:b/>
           <w:bCs/>
         </w:rPr>
@@ -1426,71 +3447,72 @@
       </w:r>
       <w:proofErr w:type="spellEnd"/>
       <w:r>
-        <w:t xml:space="preserve">. Para la integración con el entorno de desarrollo, se configuró </w:t>
+        <w:t xml:space="preserve">. Para la integración con el entorno de desarrollo, se configuró Visual Studio Code con la extensión </w:t>
+      </w:r>
+      <w:proofErr w:type="spellStart"/>
+      <w:r>
+        <w:t>Alive</w:t>
+      </w:r>
+      <w:proofErr w:type="spellEnd"/>
+      <w:r>
+        <w:t xml:space="preserve">, que provee un REPL conectado directamente </w:t>
       </w:r>
       <w:r>
         <w:lastRenderedPageBreak/>
-        <w:t xml:space="preserve">Visual Studio Code con la extensión </w:t>
+        <w:t xml:space="preserve">a SBCL. Desde ese entorno se pudo instalar </w:t>
       </w:r>
       <w:proofErr w:type="spellStart"/>
       <w:r>
-        <w:t>Alive</w:t>
+        <w:t>Quicklisp</w:t>
       </w:r>
       <w:proofErr w:type="spellEnd"/>
       <w:r>
-        <w:t xml:space="preserve">, que provee un REPL conectado directamente a SBCL. Desde ese entorno se pudo instalar </w:t>
+        <w:t xml:space="preserve"> correctamente, cargar la librería local-time y verificar su funcionamiento con éxito.</w:t>
+      </w:r>
+    </w:p>
+    <w:p>
+      <w:pPr>
+        <w:jc w:val="both"/>
+      </w:pPr>
+    </w:p>
+    <w:p>
+      <w:pPr>
+        <w:jc w:val="both"/>
+        <w:rPr>
+          <w:b/>
+          <w:bCs/>
+          <w:lang w:val="es-ES"/>
+        </w:rPr>
+      </w:pPr>
+      <w:r>
+        <w:rPr>
+          <w:b/>
+          <w:bCs/>
+          <w:lang w:val="es-ES"/>
+        </w:rPr>
+        <w:t xml:space="preserve">Captura de Pantalla de la instalación de QUICKLISP e Instalación de </w:t>
       </w:r>
       <w:proofErr w:type="spellStart"/>
       <w:r>
-        <w:t>Quicklisp</w:t>
+        <w:rPr>
+          <w:b/>
+          <w:bCs/>
+          <w:lang w:val="es-ES"/>
+        </w:rPr>
+        <w:t>LocalTime</w:t>
       </w:r>
       <w:proofErr w:type="spellEnd"/>
-      <w:r>
-        <w:t xml:space="preserve"> correctamente, cargar la librería local-time y verificar su funcionamiento con éxito.</w:t>
-      </w:r>
-    </w:p>
-    <w:p>
-      <w:pPr>
-        <w:jc w:val="both"/>
-      </w:pPr>
-    </w:p>
-    <w:p>
-      <w:pPr>
-        <w:jc w:val="both"/>
-        <w:rPr>
-          <w:b/>
-          <w:bCs/>
+    </w:p>
+    <w:p>
+      <w:pPr>
+        <w:jc w:val="both"/>
+        <w:rPr>
           <w:lang w:val="es-ES"/>
         </w:rPr>
       </w:pPr>
       <w:r>
         <w:rPr>
-          <w:b/>
-          <w:bCs/>
-          <w:lang w:val="es-ES"/>
-        </w:rPr>
-        <w:t xml:space="preserve">Captura de Pantalla de la instalación de QUICKLISP e Instalación de </w:t>
-      </w:r>
-      <w:proofErr w:type="spellStart"/>
-      <w:r>
-        <w:rPr>
-          <w:b/>
-          <w:bCs/>
-          <w:lang w:val="es-ES"/>
-        </w:rPr>
-        <w:t>LocalTime</w:t>
-      </w:r>
-      <w:proofErr w:type="spellEnd"/>
-    </w:p>
-    <w:p>
-      <w:pPr>
-        <w:jc w:val="both"/>
-        <w:rPr>
-          <w:lang w:val="es-ES"/>
-        </w:rPr>
-      </w:pPr>
-      <w:r>
-        <w:rPr>
+          <w:noProof/>
           <w:lang w:val="es-ES"/>
         </w:rPr>
         <w:drawing>
@@ -1509,7 +3531,7 @@
                     <pic:cNvPicPr/>
                   </pic:nvPicPr>
                   <pic:blipFill>
-                    <a:blip r:embed="rId13"/>
+                    <a:blip r:embed="rId18"/>
                     <a:stretch>
                       <a:fillRect/>
                     </a:stretch>
@@ -1539,6 +3561,7 @@
       </w:pPr>
       <w:r>
         <w:rPr>
+          <w:noProof/>
           <w:lang w:val="es-ES"/>
         </w:rPr>
         <w:drawing>
@@ -1557,7 +3580,7 @@
                     <pic:cNvPicPr/>
                   </pic:nvPicPr>
                   <pic:blipFill>
-                    <a:blip r:embed="rId14"/>
+                    <a:blip r:embed="rId19"/>
                     <a:stretch>
                       <a:fillRect/>
                     </a:stretch>
@@ -1605,6 +3628,7 @@
       </w:pPr>
       <w:r>
         <w:rPr>
+          <w:noProof/>
           <w:lang w:val="es-ES"/>
         </w:rPr>
         <w:lastRenderedPageBreak/>
@@ -1624,7 +3648,7 @@
                     <pic:cNvPicPr/>
                   </pic:nvPicPr>
                   <pic:blipFill>
-                    <a:blip r:embed="rId15"/>
+                    <a:blip r:embed="rId20"/>
                     <a:stretch>
                       <a:fillRect/>
                     </a:stretch>
@@ -1660,6 +3684,91 @@
       </w:pPr>
       <w:r>
         <w:rPr>
+          <w:rFonts w:asciiTheme="majorHAnsi" w:hAnsiTheme="majorHAnsi" w:cstheme="majorHAnsi"/>
+          <w:b/>
+          <w:noProof/>
+          <w:sz w:val="23"/>
+          <w:szCs w:val="23"/>
+        </w:rPr>
+        <mc:AlternateContent>
+          <mc:Choice Requires="wps">
+            <w:drawing>
+              <wp:anchor distT="0" distB="0" distL="114300" distR="114300" simplePos="0" relativeHeight="251676672" behindDoc="0" locked="0" layoutInCell="1" allowOverlap="1" wp14:anchorId="10CC6459" wp14:editId="06525314">
+                <wp:simplePos x="0" y="0"/>
+                <wp:positionH relativeFrom="page">
+                  <wp:posOffset>3804285</wp:posOffset>
+                </wp:positionH>
+                <wp:positionV relativeFrom="paragraph">
+                  <wp:posOffset>42545</wp:posOffset>
+                </wp:positionV>
+                <wp:extent cx="7969250" cy="72000"/>
+                <wp:effectExtent l="0" t="0" r="0" b="4445"/>
+                <wp:wrapNone/>
+                <wp:docPr id="1294264187" name="Rectángulo 1294264187"/>
+                <wp:cNvGraphicFramePr/>
+                <a:graphic xmlns:a="http://schemas.openxmlformats.org/drawingml/2006/main">
+                  <a:graphicData uri="http://schemas.microsoft.com/office/word/2010/wordprocessingShape">
+                    <wps:wsp>
+                      <wps:cNvSpPr/>
+                      <wps:spPr>
+                        <a:xfrm>
+                          <a:off x="0" y="0"/>
+                          <a:ext cx="7969250" cy="72000"/>
+                        </a:xfrm>
+                        <a:prstGeom prst="rect">
+                          <a:avLst/>
+                        </a:prstGeom>
+                        <a:solidFill>
+                          <a:srgbClr val="C00000"/>
+                        </a:solidFill>
+                        <a:ln>
+                          <a:noFill/>
+                        </a:ln>
+                        <a:effectLst/>
+                      </wps:spPr>
+                      <wps:style>
+                        <a:lnRef idx="1">
+                          <a:schemeClr val="accent1"/>
+                        </a:lnRef>
+                        <a:fillRef idx="3">
+                          <a:schemeClr val="accent1"/>
+                        </a:fillRef>
+                        <a:effectRef idx="2">
+                          <a:schemeClr val="accent1"/>
+                        </a:effectRef>
+                        <a:fontRef idx="minor">
+                          <a:schemeClr val="lt1"/>
+                        </a:fontRef>
+                      </wps:style>
+                      <wps:bodyPr rot="0" spcFirstLastPara="0" vertOverflow="overflow" horzOverflow="overflow" vert="horz" wrap="square" lIns="91440" tIns="45720" rIns="91440" bIns="45720" numCol="1" spcCol="0" rtlCol="0" fromWordArt="0" anchor="ctr" anchorCtr="0" forceAA="0" compatLnSpc="1">
+                        <a:prstTxWarp prst="textNoShape">
+                          <a:avLst/>
+                        </a:prstTxWarp>
+                        <a:noAutofit/>
+                      </wps:bodyPr>
+                    </wps:wsp>
+                  </a:graphicData>
+                </a:graphic>
+                <wp14:sizeRelH relativeFrom="margin">
+                  <wp14:pctWidth>0</wp14:pctWidth>
+                </wp14:sizeRelH>
+                <wp14:sizeRelV relativeFrom="margin">
+                  <wp14:pctHeight>0</wp14:pctHeight>
+                </wp14:sizeRelV>
+              </wp:anchor>
+            </w:drawing>
+          </mc:Choice>
+          <mc:Fallback>
+            <w:pict>
+              <v:rect w14:anchorId="6985F42C" id="Rectángulo 1294264187" o:spid="_x0000_s1026" style="position:absolute;margin-left:299.55pt;margin-top:3.35pt;width:627.5pt;height:5.65pt;z-index:251676672;visibility:visible;mso-wrap-style:square;mso-width-percent:0;mso-height-percent:0;mso-wrap-distance-left:9pt;mso-wrap-distance-top:0;mso-wrap-distance-right:9pt;mso-wrap-distance-bottom:0;mso-position-horizontal:absolute;mso-position-horizontal-relative:page;mso-position-vertical:absolute;mso-position-vertical-relative:text;mso-width-percent:0;mso-height-percent:0;mso-width-relative:margin;mso-height-relative:margin;v-text-anchor:middle" o:gfxdata="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" fillcolor="#c00000" stroked="f" strokeweight=".5pt">
+                <w10:wrap anchorx="page"/>
+              </v:rect>
+            </w:pict>
+          </mc:Fallback>
+        </mc:AlternateContent>
+      </w:r>
+      <w:r>
+        <w:rPr>
           <w:b/>
           <w:bCs/>
         </w:rPr>
@@ -1687,6 +3796,13 @@
           <w:bCs/>
         </w:rPr>
         <w:t xml:space="preserve"> en SBCL</w:t>
+      </w:r>
+      <w:r>
+        <w:rPr>
+          <w:b/>
+          <w:bCs/>
+        </w:rPr>
+        <w:t xml:space="preserve"> </w:t>
       </w:r>
     </w:p>
     <w:p>
@@ -2011,28 +4127,45 @@
       </w:pPr>
       <w:r>
         <w:lastRenderedPageBreak/>
-        <w:t>Se agregó la instrucción:</w:t>
-      </w:r>
-      <w:r>
-        <w:t xml:space="preserve"> </w:t>
-      </w:r>
-      <w:r>
-        <w:t>(</w:t>
+        <w:t>Se agregó la instrucción</w:t>
+      </w:r>
+      <w:r>
+        <w:rPr>
+          <w:b/>
+          <w:bCs/>
+        </w:rPr>
+        <w:t>: (</w:t>
       </w:r>
       <w:proofErr w:type="spellStart"/>
       <w:r>
+        <w:rPr>
+          <w:b/>
+          <w:bCs/>
+        </w:rPr>
         <w:t>shadow</w:t>
       </w:r>
       <w:proofErr w:type="spellEnd"/>
       <w:r>
+        <w:rPr>
+          <w:b/>
+          <w:bCs/>
+        </w:rPr>
         <w:t xml:space="preserve"> '</w:t>
       </w:r>
       <w:proofErr w:type="spellStart"/>
       <w:r>
+        <w:rPr>
+          <w:b/>
+          <w:bCs/>
+        </w:rPr>
         <w:t>timer</w:t>
       </w:r>
       <w:proofErr w:type="spellEnd"/>
       <w:r>
+        <w:rPr>
+          <w:b/>
+          <w:bCs/>
+        </w:rPr>
         <w:t>)</w:t>
       </w:r>
     </w:p>
@@ -2056,31 +4189,310 @@
       <w:pPr>
         <w:jc w:val="both"/>
         <w:rPr>
+          <w:b/>
+          <w:bCs/>
+        </w:rPr>
+      </w:pPr>
+      <w:r>
+        <w:rPr>
+          <w:b/>
+          <w:bCs/>
+        </w:rPr>
+        <w:t>Captura del ERROR al no crear el símbolo local</w:t>
+      </w:r>
+    </w:p>
+    <w:p>
+      <w:pPr>
+        <w:jc w:val="both"/>
+        <w:rPr>
           <w:lang w:val="es-ES"/>
         </w:rPr>
       </w:pPr>
-    </w:p>
-    <w:p>
-      <w:pPr>
-        <w:spacing w:before="100" w:beforeAutospacing="1" w:after="100" w:afterAutospacing="1" w:line="240" w:lineRule="auto"/>
-        <w:rPr>
-          <w:rFonts w:eastAsia="Times New Roman" w:cstheme="minorHAnsi"/>
-          <w:kern w:val="0"/>
+      <w:r>
+        <w:rPr>
+          <w:lang w:val="es-ES"/>
+        </w:rPr>
+        <w:drawing>
+          <wp:inline distT="0" distB="0" distL="0" distR="0" wp14:anchorId="5E3C96DA" wp14:editId="04CBB9CE">
+            <wp:extent cx="5400040" cy="1844040"/>
+            <wp:effectExtent l="0" t="0" r="0" b="3810"/>
+            <wp:docPr id="483894412" name="Imagen 1"/>
+            <wp:cNvGraphicFramePr>
+              <a:graphicFrameLocks xmlns:a="http://schemas.openxmlformats.org/drawingml/2006/main" noChangeAspect="1"/>
+            </wp:cNvGraphicFramePr>
+            <a:graphic xmlns:a="http://schemas.openxmlformats.org/drawingml/2006/main">
+              <a:graphicData uri="http://schemas.openxmlformats.org/drawingml/2006/picture">
+                <pic:pic xmlns:pic="http://schemas.openxmlformats.org/drawingml/2006/picture">
+                  <pic:nvPicPr>
+                    <pic:cNvPr id="483894412" name=""/>
+                    <pic:cNvPicPr/>
+                  </pic:nvPicPr>
+                  <pic:blipFill>
+                    <a:blip r:embed="rId21"/>
+                    <a:stretch>
+                      <a:fillRect/>
+                    </a:stretch>
+                  </pic:blipFill>
+                  <pic:spPr>
+                    <a:xfrm>
+                      <a:off x="0" y="0"/>
+                      <a:ext cx="5400040" cy="1844040"/>
+                    </a:xfrm>
+                    <a:prstGeom prst="rect">
+                      <a:avLst/>
+                    </a:prstGeom>
+                  </pic:spPr>
+                </pic:pic>
+              </a:graphicData>
+            </a:graphic>
+          </wp:inline>
+        </w:drawing>
+      </w:r>
+    </w:p>
+    <w:p>
+      <w:pPr>
+        <w:jc w:val="both"/>
+        <w:rPr>
+          <w:lang w:val="es-ES"/>
+        </w:rPr>
+      </w:pPr>
+    </w:p>
+    <w:p>
+      <w:pPr>
+        <w:jc w:val="both"/>
+        <w:rPr>
+          <w:lang w:val="es-ES"/>
+        </w:rPr>
+      </w:pPr>
+    </w:p>
+    <w:p>
+      <w:pPr>
+        <w:jc w:val="both"/>
+        <w:rPr>
+          <w:lang w:val="es-ES"/>
+        </w:rPr>
+      </w:pPr>
+    </w:p>
+    <w:p>
+      <w:pPr>
+        <w:jc w:val="both"/>
+        <w:rPr>
+          <w:lang w:val="es-ES"/>
+        </w:rPr>
+      </w:pPr>
+    </w:p>
+    <w:p>
+      <w:pPr>
+        <w:jc w:val="both"/>
+        <w:rPr>
+          <w:lang w:val="es-ES"/>
+        </w:rPr>
+      </w:pPr>
+    </w:p>
+    <w:p>
+      <w:pPr>
+        <w:rPr>
+          <w:lang w:val="es-ES"/>
+        </w:rPr>
+      </w:pPr>
+      <w:r>
+        <w:rPr>
+          <w:lang w:val="es-ES"/>
+        </w:rPr>
+        <w:br w:type="page"/>
+      </w:r>
+    </w:p>
+    <w:p>
+      <w:pPr>
+        <w:pStyle w:val="Ttulo1"/>
+      </w:pPr>
+      <w:bookmarkStart w:id="5" w:name="_Toc231778456"/>
+      <w:r>
+        <w:lastRenderedPageBreak/>
+        <mc:AlternateContent>
+          <mc:Choice Requires="wps">
+            <w:drawing>
+              <wp:anchor distT="0" distB="0" distL="114300" distR="114300" simplePos="0" relativeHeight="251686912" behindDoc="0" locked="0" layoutInCell="1" allowOverlap="1" wp14:anchorId="587ECCB9" wp14:editId="1380B7BE">
+                <wp:simplePos x="0" y="0"/>
+                <wp:positionH relativeFrom="page">
+                  <wp:posOffset>2574290</wp:posOffset>
+                </wp:positionH>
+                <wp:positionV relativeFrom="paragraph">
+                  <wp:posOffset>38100</wp:posOffset>
+                </wp:positionV>
+                <wp:extent cx="4967605" cy="108000"/>
+                <wp:effectExtent l="0" t="0" r="4445" b="6350"/>
+                <wp:wrapNone/>
+                <wp:docPr id="1942224567" name="Rectángulo 1942224567"/>
+                <wp:cNvGraphicFramePr/>
+                <a:graphic xmlns:a="http://schemas.openxmlformats.org/drawingml/2006/main">
+                  <a:graphicData uri="http://schemas.microsoft.com/office/word/2010/wordprocessingShape">
+                    <wps:wsp>
+                      <wps:cNvSpPr/>
+                      <wps:spPr>
+                        <a:xfrm>
+                          <a:off x="0" y="0"/>
+                          <a:ext cx="4967605" cy="108000"/>
+                        </a:xfrm>
+                        <a:prstGeom prst="rect">
+                          <a:avLst/>
+                        </a:prstGeom>
+                        <a:solidFill>
+                          <a:srgbClr val="C00000"/>
+                        </a:solidFill>
+                        <a:ln w="12700" cap="flat" cmpd="sng" algn="ctr">
+                          <a:noFill/>
+                          <a:prstDash val="solid"/>
+                          <a:miter lim="800000"/>
+                        </a:ln>
+                        <a:effectLst/>
+                      </wps:spPr>
+                      <wps:bodyPr rot="0" spcFirstLastPara="0" vertOverflow="overflow" horzOverflow="overflow" vert="horz" wrap="square" lIns="91440" tIns="45720" rIns="91440" bIns="45720" numCol="1" spcCol="0" rtlCol="0" fromWordArt="0" anchor="ctr" anchorCtr="0" forceAA="0" compatLnSpc="1">
+                        <a:prstTxWarp prst="textNoShape">
+                          <a:avLst/>
+                        </a:prstTxWarp>
+                        <a:noAutofit/>
+                      </wps:bodyPr>
+                    </wps:wsp>
+                  </a:graphicData>
+                </a:graphic>
+                <wp14:sizeRelH relativeFrom="margin">
+                  <wp14:pctWidth>0</wp14:pctWidth>
+                </wp14:sizeRelH>
+                <wp14:sizeRelV relativeFrom="margin">
+                  <wp14:pctHeight>0</wp14:pctHeight>
+                </wp14:sizeRelV>
+              </wp:anchor>
+            </w:drawing>
+          </mc:Choice>
+          <mc:Fallback>
+            <w:pict>
+              <v:rect w14:anchorId="236EFCE0" id="Rectángulo 1942224567" o:spid="_x0000_s1026" style="position:absolute;margin-left:202.7pt;margin-top:3pt;width:391.15pt;height:8.5pt;z-index:251686912;visibility:visible;mso-wrap-style:square;mso-width-percent:0;mso-height-percent:0;mso-wrap-distance-left:9pt;mso-wrap-distance-top:0;mso-wrap-distance-right:9pt;mso-wrap-distance-bottom:0;mso-position-horizontal:absolute;mso-position-horizontal-relative:page;mso-position-vertical:absolute;mso-position-vertical-relative:text;mso-width-percent:0;mso-height-percent:0;mso-width-relative:margin;mso-height-relative:margin;v-text-anchor:middle" o:gfxdata="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" fillcolor="#c00000" stroked="f" strokeweight="1pt">
+                <w10:wrap anchorx="page"/>
+              </v:rect>
+            </w:pict>
+          </mc:Fallback>
+        </mc:AlternateContent>
+      </w:r>
+      <w:r>
+        <w:t>CONCLUSION</w:t>
+      </w:r>
+      <w:bookmarkEnd w:id="5"/>
+    </w:p>
+    <w:p>
+      <w:pPr>
+        <w:jc w:val="both"/>
+        <w:rPr>
+          <w:lang w:val="es-ES"/>
+        </w:rPr>
+      </w:pPr>
+    </w:p>
+    <w:p>
+      <w:pPr>
+        <w:pStyle w:val="Ttulo1"/>
+        <w:rPr>
           <w:lang w:eastAsia="es-AR"/>
-          <w14:ligatures w14:val="none"/>
-        </w:rPr>
-      </w:pPr>
-      <w:r>
-        <w:rPr>
-          <w:rFonts w:eastAsia="Times New Roman" w:cstheme="minorHAnsi"/>
-          <w:b/>
-          <w:bCs/>
-          <w:kern w:val="0"/>
+        </w:rPr>
+      </w:pPr>
+      <w:bookmarkStart w:id="6" w:name="_Toc231778457"/>
+      <w:r>
+        <w:rPr>
+          <w:rFonts w:asciiTheme="majorHAnsi" w:hAnsiTheme="majorHAnsi" w:cstheme="majorHAnsi"/>
+          <w:b w:val="0"/>
+          <w:noProof/>
+          <w:sz w:val="23"/>
+          <w:szCs w:val="23"/>
+        </w:rPr>
+        <mc:AlternateContent>
+          <mc:Choice Requires="wps">
+            <w:drawing>
+              <wp:anchor distT="0" distB="0" distL="114300" distR="114300" simplePos="0" relativeHeight="251680768" behindDoc="0" locked="0" layoutInCell="1" allowOverlap="1" wp14:anchorId="64351A6B" wp14:editId="186DE216">
+                <wp:simplePos x="0" y="0"/>
+                <wp:positionH relativeFrom="page">
+                  <wp:posOffset>2660741</wp:posOffset>
+                </wp:positionH>
+                <wp:positionV relativeFrom="paragraph">
+                  <wp:posOffset>209550</wp:posOffset>
+                </wp:positionV>
+                <wp:extent cx="5868000" cy="71755"/>
+                <wp:effectExtent l="0" t="0" r="0" b="4445"/>
+                <wp:wrapNone/>
+                <wp:docPr id="489707208" name="Rectángulo 489707208"/>
+                <wp:cNvGraphicFramePr/>
+                <a:graphic xmlns:a="http://schemas.openxmlformats.org/drawingml/2006/main">
+                  <a:graphicData uri="http://schemas.microsoft.com/office/word/2010/wordprocessingShape">
+                    <wps:wsp>
+                      <wps:cNvSpPr/>
+                      <wps:spPr>
+                        <a:xfrm>
+                          <a:off x="0" y="0"/>
+                          <a:ext cx="5868000" cy="71755"/>
+                        </a:xfrm>
+                        <a:prstGeom prst="rect">
+                          <a:avLst/>
+                        </a:prstGeom>
+                        <a:solidFill>
+                          <a:srgbClr val="C00000"/>
+                        </a:solidFill>
+                        <a:ln>
+                          <a:noFill/>
+                        </a:ln>
+                        <a:effectLst/>
+                      </wps:spPr>
+                      <wps:style>
+                        <a:lnRef idx="1">
+                          <a:schemeClr val="accent1"/>
+                        </a:lnRef>
+                        <a:fillRef idx="3">
+                          <a:schemeClr val="accent1"/>
+                        </a:fillRef>
+                        <a:effectRef idx="2">
+                          <a:schemeClr val="accent1"/>
+                        </a:effectRef>
+                        <a:fontRef idx="minor">
+                          <a:schemeClr val="lt1"/>
+                        </a:fontRef>
+                      </wps:style>
+                      <wps:bodyPr rot="0" spcFirstLastPara="0" vertOverflow="overflow" horzOverflow="overflow" vert="horz" wrap="square" lIns="91440" tIns="45720" rIns="91440" bIns="45720" numCol="1" spcCol="0" rtlCol="0" fromWordArt="0" anchor="ctr" anchorCtr="0" forceAA="0" compatLnSpc="1">
+                        <a:prstTxWarp prst="textNoShape">
+                          <a:avLst/>
+                        </a:prstTxWarp>
+                        <a:noAutofit/>
+                      </wps:bodyPr>
+                    </wps:wsp>
+                  </a:graphicData>
+                </a:graphic>
+                <wp14:sizeRelH relativeFrom="margin">
+                  <wp14:pctWidth>0</wp14:pctWidth>
+                </wp14:sizeRelH>
+                <wp14:sizeRelV relativeFrom="margin">
+                  <wp14:pctHeight>0</wp14:pctHeight>
+                </wp14:sizeRelV>
+              </wp:anchor>
+            </w:drawing>
+          </mc:Choice>
+          <mc:Fallback>
+            <w:pict>
+              <v:rect w14:anchorId="66BBF997" id="Rectángulo 489707208" o:spid="_x0000_s1026" style="position:absolute;margin-left:209.5pt;margin-top:16.5pt;width:462.05pt;height:5.65pt;z-index:251680768;visibility:visible;mso-wrap-style:square;mso-width-percent:0;mso-height-percent:0;mso-wrap-distance-left:9pt;mso-wrap-distance-top:0;mso-wrap-distance-right:9pt;mso-wrap-distance-bottom:0;mso-position-horizontal:absolute;mso-position-horizontal-relative:page;mso-position-vertical:absolute;mso-position-vertical-relative:text;mso-width-percent:0;mso-height-percent:0;mso-width-relative:margin;mso-height-relative:margin;v-text-anchor:middle" o:gfxdata="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" fillcolor="#c00000" stroked="f" strokeweight=".5pt">
+                <w10:wrap anchorx="page"/>
+              </v:rect>
+            </w:pict>
+          </mc:Fallback>
+        </mc:AlternateContent>
+      </w:r>
+      <w:r>
+        <w:rPr>
           <w:lang w:eastAsia="es-AR"/>
-          <w14:ligatures w14:val="none"/>
-        </w:rPr>
-        <w:t>Bibliografía</w:t>
-      </w:r>
+        </w:rPr>
+        <w:t>B</w:t>
+      </w:r>
+      <w:r>
+        <w:rPr>
+          <w:lang w:eastAsia="es-AR"/>
+        </w:rPr>
+        <w:t>IBLIOGRAFÍA</w:t>
+      </w:r>
+      <w:bookmarkEnd w:id="6"/>
     </w:p>
     <w:p>
       <w:pPr>
@@ -2213,7 +4625,7 @@
         </w:rPr>
         <w:t xml:space="preserve">. </w:t>
       </w:r>
-      <w:hyperlink r:id="rId16" w:history="1">
+      <w:hyperlink r:id="rId22" w:history="1">
         <w:r>
           <w:rPr>
             <w:rFonts w:eastAsia="Times New Roman" w:cstheme="minorHAnsi"/>
@@ -2306,7 +4718,7 @@
         </w:rPr>
         <w:t xml:space="preserve"> Docs. </w:t>
       </w:r>
-      <w:hyperlink r:id="rId17" w:history="1">
+      <w:hyperlink r:id="rId23" w:history="1">
         <w:r>
           <w:rPr>
             <w:rFonts w:eastAsia="Times New Roman" w:cstheme="minorHAnsi"/>
@@ -2403,7 +4815,7 @@
         </w:rPr>
         <w:t xml:space="preserve">. </w:t>
       </w:r>
-      <w:hyperlink r:id="rId18" w:history="1">
+      <w:hyperlink r:id="rId24" w:history="1">
         <w:r>
           <w:rPr>
             <w:rFonts w:eastAsia="Times New Roman" w:cstheme="minorHAnsi"/>
@@ -2535,7 +4947,7 @@
         </w:rPr>
         <w:t xml:space="preserve">. SBCL. </w:t>
       </w:r>
-      <w:hyperlink r:id="rId19" w:history="1">
+      <w:hyperlink r:id="rId25" w:history="1">
         <w:r>
           <w:rPr>
             <w:rFonts w:eastAsia="Times New Roman" w:cstheme="minorHAnsi"/>
@@ -2563,13 +4975,640 @@
       </w:pPr>
     </w:p>
     <w:sectPr>
+      <w:headerReference w:type="default" r:id="rId26"/>
+      <w:footerReference w:type="default" r:id="rId27"/>
       <w:pgSz w:w="11906" w:h="16838"/>
       <w:pgMar w:top="1417" w:right="1701" w:bottom="1417" w:left="1701" w:header="708" w:footer="708" w:gutter="0"/>
       <w:cols w:space="708"/>
+      <w:titlePg/>
       <w:docGrid w:linePitch="360"/>
     </w:sectPr>
   </w:body>
 </w:document>
+</file>
+
+<file path=word/endnotes.xml><?xml version="1.0" encoding="utf-8"?>
+<w:endnotes xmlns:wpc="http://schemas.microsoft.com/office/word/2010/wordprocessingCanvas" xmlns:cx="http://schemas.microsoft.com/office/drawing/2014/chartex" xmlns:cx1="http://schemas.microsoft.com/office/drawing/2015/9/8/chartex" xmlns:cx2="http://schemas.microsoft.com/office/drawing/2015/10/21/chartex" xmlns:cx3="http://schemas.microsoft.com/office/drawing/2016/5/9/chartex" xmlns:cx4="http://schemas.microsoft.com/office/drawing/2016/5/10/chartex" xmlns:cx5="http://schemas.microsoft.com/office/drawing/2016/5/11/chartex" xmlns:cx6="http://schemas.microsoft.com/office/drawing/2016/5/12/chartex" xmlns:cx7="http://schemas.microsoft.com/office/drawing/2016/5/13/chartex" xmlns:cx8="http://schemas.microsoft.com/office/drawing/2016/5/14/chartex" xmlns:mc="http://schemas.openxmlformats.org/markup-compatibility/2006" xmlns:aink="http://schemas.microsoft.com/office/drawing/2016/ink" xmlns:am3d="http://schemas.microsoft.com/office/drawing/2017/model3d" xmlns:o="urn:schemas-microsoft-com:office:office" xmlns:oel="http://schemas.microsoft.com/office/2019/extlst" xmlns:r="http://schemas.openxmlformats.org/officeDocument/2006/relationships" xmlns:m="http://schemas.openxmlformats.org/officeDocument/2006/math" xmlns:v="urn:schemas-microsoft-com:vml" xmlns:wp14="http://schemas.microsoft.com/office/word/2010/wordprocessingDrawing" xmlns:wp="http://schemas.openxmlformats.org/drawingml/2006/wordprocessingDrawing" xmlns:w10="urn:schemas-microsoft-com:office:word" xmlns:w="http://schemas.openxmlformats.org/wordprocessingml/2006/main" xmlns:w14="http://schemas.microsoft.com/office/word/2010/wordml" xmlns:w15="http://schemas.microsoft.com/office/word/2012/wordml" xmlns:w16cex="http://schemas.microsoft.com/office/word/2018/wordml/cex" xmlns:w16cid="http://schemas.microsoft.com/office/word/2016/wordml/cid" xmlns:w16="http://schemas.microsoft.com/office/word/2018/wordml" xmlns:w16du="http://schemas.microsoft.com/office/word/2023/wordml/word16du" xmlns:w16sdtdh="http://schemas.microsoft.com/office/word/2020/wordml/sdtdatahash" xmlns:w16sdtfl="http://schemas.microsoft.com/office/word/2024/wordml/sdtformatlock" xmlns:w16se="http://schemas.microsoft.com/office/word/2015/wordml/symex" xmlns:wpg="http://schemas.microsoft.com/office/word/2010/wordprocessingGroup" xmlns:wpi="http://schemas.microsoft.com/office/word/2010/wordprocessingInk" xmlns:wne="http://schemas.microsoft.com/office/word/2006/wordml" xmlns:wps="http://schemas.microsoft.com/office/word/2010/wordprocessingShape" mc:Ignorable="w14 w15 w16se w16cid w16 w16cex w16sdtdh w16sdtfl w16du wp14">
+  <w:endnote w:type="separator" w:id="-1">
+    <w:p>
+      <w:pPr>
+        <w:spacing w:after="0" w:line="240" w:lineRule="auto"/>
+      </w:pPr>
+      <w:r>
+        <w:separator/>
+      </w:r>
+    </w:p>
+  </w:endnote>
+  <w:endnote w:type="continuationSeparator" w:id="0">
+    <w:p>
+      <w:pPr>
+        <w:spacing w:after="0" w:line="240" w:lineRule="auto"/>
+      </w:pPr>
+      <w:r>
+        <w:continuationSeparator/>
+      </w:r>
+    </w:p>
+  </w:endnote>
+</w:endnotes>
+</file>
+
+<file path=word/footer1.xml><?xml version="1.0" encoding="utf-8"?>
+<w:ftr xmlns:wpc="http://schemas.microsoft.com/office/word/2010/wordprocessingCanvas" xmlns:cx="http://schemas.microsoft.com/office/drawing/2014/chartex" xmlns:cx1="http://schemas.microsoft.com/office/drawing/2015/9/8/chartex" xmlns:cx2="http://schemas.microsoft.com/office/drawing/2015/10/21/chartex" xmlns:cx3="http://schemas.microsoft.com/office/drawing/2016/5/9/chartex" xmlns:cx4="http://schemas.microsoft.com/office/drawing/2016/5/10/chartex" xmlns:cx5="http://schemas.microsoft.com/office/drawing/2016/5/11/chartex" xmlns:cx6="http://schemas.microsoft.com/office/drawing/2016/5/12/chartex" xmlns:cx7="http://schemas.microsoft.com/office/drawing/2016/5/13/chartex" xmlns:cx8="http://schemas.microsoft.com/office/drawing/2016/5/14/chartex" xmlns:mc="http://schemas.openxmlformats.org/markup-compatibility/2006" xmlns:aink="http://schemas.microsoft.com/office/drawing/2016/ink" xmlns:am3d="http://schemas.microsoft.com/office/drawing/2017/model3d" xmlns:o="urn:schemas-microsoft-com:office:office" xmlns:oel="http://schemas.microsoft.com/office/2019/extlst" xmlns:r="http://schemas.openxmlformats.org/officeDocument/2006/relationships" xmlns:m="http://schemas.openxmlformats.org/officeDocument/2006/math" xmlns:v="urn:schemas-microsoft-com:vml" xmlns:wp14="http://schemas.microsoft.com/office/word/2010/wordprocessingDrawing" xmlns:wp="http://schemas.openxmlformats.org/drawingml/2006/wordprocessingDrawing" xmlns:w10="urn:schemas-microsoft-com:office:word" xmlns:w="http://schemas.openxmlformats.org/wordprocessingml/2006/main" xmlns:w14="http://schemas.microsoft.com/office/word/2010/wordml" xmlns:w15="http://schemas.microsoft.com/office/word/2012/wordml" xmlns:w16cex="http://schemas.microsoft.com/office/word/2018/wordml/cex" xmlns:w16cid="http://schemas.microsoft.com/office/word/2016/wordml/cid" xmlns:w16="http://schemas.microsoft.com/office/word/2018/wordml" xmlns:w16du="http://schemas.microsoft.com/office/word/2023/wordml/word16du" xmlns:w16sdtdh="http://schemas.microsoft.com/office/word/2020/wordml/sdtdatahash" xmlns:w16sdtfl="http://schemas.microsoft.com/office/word/2024/wordml/sdtformatlock" xmlns:w16se="http://schemas.microsoft.com/office/word/2015/wordml/symex" xmlns:wpg="http://schemas.microsoft.com/office/word/2010/wordprocessingGroup" xmlns:wpi="http://schemas.microsoft.com/office/word/2010/wordprocessingInk" xmlns:wne="http://schemas.microsoft.com/office/word/2006/wordml" xmlns:wps="http://schemas.microsoft.com/office/word/2010/wordprocessingShape" mc:Ignorable="w14 w15 w16se w16cid w16 w16cex w16sdtdh w16sdtfl w16du wp14">
+  <w:p>
+    <w:pPr>
+      <w:pStyle w:val="Piedepgina"/>
+      <w:tabs>
+        <w:tab w:val="clear" w:pos="4252"/>
+        <w:tab w:val="clear" w:pos="8504"/>
+        <w:tab w:val="left" w:pos="3531"/>
+      </w:tabs>
+    </w:pPr>
+    <w:sdt>
+      <w:sdtPr>
+        <w:id w:val="1469554721"/>
+        <w:docPartObj>
+          <w:docPartGallery w:val="Page Numbers (Bottom of Page)"/>
+          <w:docPartUnique/>
+        </w:docPartObj>
+      </w:sdtPr>
+      <w:sdtContent>
+        <w:r>
+          <w:rPr>
+            <w:rFonts w:asciiTheme="majorHAnsi" w:hAnsiTheme="majorHAnsi" w:cstheme="majorHAnsi"/>
+            <w:b/>
+            <w:noProof/>
+            <w:sz w:val="23"/>
+            <w:szCs w:val="23"/>
+          </w:rPr>
+          <mc:AlternateContent>
+            <mc:Choice Requires="wps">
+              <w:drawing>
+                <wp:anchor distT="0" distB="0" distL="114300" distR="114300" simplePos="0" relativeHeight="251665408" behindDoc="1" locked="0" layoutInCell="1" allowOverlap="1" wp14:anchorId="097DF539" wp14:editId="4C80735C">
+                  <wp:simplePos x="0" y="0"/>
+                  <wp:positionH relativeFrom="page">
+                    <wp:posOffset>-76200</wp:posOffset>
+                  </wp:positionH>
+                  <wp:positionV relativeFrom="paragraph">
+                    <wp:posOffset>55880</wp:posOffset>
+                  </wp:positionV>
+                  <wp:extent cx="7969250" cy="266700"/>
+                  <wp:effectExtent l="0" t="0" r="0" b="0"/>
+                  <wp:wrapNone/>
+                  <wp:docPr id="1910209873" name="Rectángulo 1910209873"/>
+                  <wp:cNvGraphicFramePr/>
+                  <a:graphic xmlns:a="http://schemas.openxmlformats.org/drawingml/2006/main">
+                    <a:graphicData uri="http://schemas.microsoft.com/office/word/2010/wordprocessingShape">
+                      <wps:wsp>
+                        <wps:cNvSpPr/>
+                        <wps:spPr>
+                          <a:xfrm>
+                            <a:off x="0" y="0"/>
+                            <a:ext cx="7969250" cy="266700"/>
+                          </a:xfrm>
+                          <a:prstGeom prst="rect">
+                            <a:avLst/>
+                          </a:prstGeom>
+                          <a:solidFill>
+                            <a:srgbClr val="C00000"/>
+                          </a:solidFill>
+                          <a:ln>
+                            <a:noFill/>
+                          </a:ln>
+                          <a:effectLst/>
+                        </wps:spPr>
+                        <wps:style>
+                          <a:lnRef idx="1">
+                            <a:schemeClr val="accent1"/>
+                          </a:lnRef>
+                          <a:fillRef idx="3">
+                            <a:schemeClr val="accent1"/>
+                          </a:fillRef>
+                          <a:effectRef idx="2">
+                            <a:schemeClr val="accent1"/>
+                          </a:effectRef>
+                          <a:fontRef idx="minor">
+                            <a:schemeClr val="lt1"/>
+                          </a:fontRef>
+                        </wps:style>
+                        <wps:bodyPr rot="0" spcFirstLastPara="0" vertOverflow="overflow" horzOverflow="overflow" vert="horz" wrap="square" lIns="91440" tIns="45720" rIns="91440" bIns="45720" numCol="1" spcCol="0" rtlCol="0" fromWordArt="0" anchor="ctr" anchorCtr="0" forceAA="0" compatLnSpc="1">
+                          <a:prstTxWarp prst="textNoShape">
+                            <a:avLst/>
+                          </a:prstTxWarp>
+                          <a:noAutofit/>
+                        </wps:bodyPr>
+                      </wps:wsp>
+                    </a:graphicData>
+                  </a:graphic>
+                  <wp14:sizeRelH relativeFrom="margin">
+                    <wp14:pctWidth>0</wp14:pctWidth>
+                  </wp14:sizeRelH>
+                  <wp14:sizeRelV relativeFrom="margin">
+                    <wp14:pctHeight>0</wp14:pctHeight>
+                  </wp14:sizeRelV>
+                </wp:anchor>
+              </w:drawing>
+            </mc:Choice>
+            <mc:Fallback>
+              <w:pict>
+                <v:rect w14:anchorId="640D2F11" id="Rectángulo 1910209873" o:spid="_x0000_s1026" style="position:absolute;margin-left:-6pt;margin-top:4.4pt;width:627.5pt;height:21pt;z-index:-251651072;visibility:visible;mso-wrap-style:square;mso-width-percent:0;mso-height-percent:0;mso-wrap-distance-left:9pt;mso-wrap-distance-top:0;mso-wrap-distance-right:9pt;mso-wrap-distance-bottom:0;mso-position-horizontal:absolute;mso-position-horizontal-relative:page;mso-position-vertical:absolute;mso-position-vertical-relative:text;mso-width-percent:0;mso-height-percent:0;mso-width-relative:margin;mso-height-relative:margin;v-text-anchor:middle" o:gfxdata="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" fillcolor="#c00000" stroked="f" strokeweight=".5pt">
+                  <w10:wrap anchorx="page"/>
+                </v:rect>
+              </w:pict>
+            </mc:Fallback>
+          </mc:AlternateContent>
+        </w:r>
+        <w:r>
+          <w:rPr>
+            <w:rFonts w:asciiTheme="majorHAnsi" w:eastAsiaTheme="majorEastAsia" w:hAnsiTheme="majorHAnsi" w:cstheme="majorBidi"/>
+            <w:noProof/>
+            <w:sz w:val="28"/>
+            <w:szCs w:val="28"/>
+          </w:rPr>
+          <mc:AlternateContent>
+            <mc:Choice Requires="wps">
+              <w:drawing>
+                <wp:anchor distT="0" distB="0" distL="114300" distR="114300" simplePos="0" relativeHeight="251663360" behindDoc="0" locked="0" layoutInCell="1" allowOverlap="1" wp14:anchorId="1202ABC1" wp14:editId="23A2ED78">
+                  <wp:simplePos x="0" y="0"/>
+                  <wp:positionH relativeFrom="rightMargin">
+                    <wp:align>center</wp:align>
+                  </wp:positionH>
+                  <wp:positionV relativeFrom="bottomMargin">
+                    <wp:align>center</wp:align>
+                  </wp:positionV>
+                  <wp:extent cx="512445" cy="441325"/>
+                  <wp:effectExtent l="0" t="0" r="1905" b="0"/>
+                  <wp:wrapNone/>
+                  <wp:docPr id="1388247513" name="Diagrama de flujo: proceso alternativo 3"/>
+                  <wp:cNvGraphicFramePr>
+                    <a:graphicFrameLocks xmlns:a="http://schemas.openxmlformats.org/drawingml/2006/main"/>
+                  </wp:cNvGraphicFramePr>
+                  <a:graphic xmlns:a="http://schemas.openxmlformats.org/drawingml/2006/main">
+                    <a:graphicData uri="http://schemas.microsoft.com/office/word/2010/wordprocessingShape">
+                      <wps:wsp>
+                        <wps:cNvSpPr>
+                          <a:spLocks noChangeArrowheads="1"/>
+                        </wps:cNvSpPr>
+                        <wps:spPr bwMode="auto">
+                          <a:xfrm>
+                            <a:off x="0" y="0"/>
+                            <a:ext cx="512445" cy="441325"/>
+                          </a:xfrm>
+                          <a:prstGeom prst="flowChartAlternateProcess">
+                            <a:avLst/>
+                          </a:prstGeom>
+                          <a:noFill/>
+                          <a:ln>
+                            <a:noFill/>
+                          </a:ln>
+                          <a:extLst>
+                            <a:ext uri="{909E8E84-426E-40DD-AFC4-6F175D3DCCD1}">
+                              <a14:hiddenFill xmlns:a14="http://schemas.microsoft.com/office/drawing/2010/main">
+                                <a:solidFill>
+                                  <a:srgbClr val="5C83B4"/>
+                                </a:solidFill>
+                              </a14:hiddenFill>
+                            </a:ext>
+                            <a:ext uri="{91240B29-F687-4F45-9708-019B960494DF}">
+                              <a14:hiddenLine xmlns:a14="http://schemas.microsoft.com/office/drawing/2010/main" w="9525">
+                                <a:solidFill>
+                                  <a:srgbClr val="737373"/>
+                                </a:solidFill>
+                                <a:miter lim="800000"/>
+                                <a:headEnd/>
+                                <a:tailEnd/>
+                              </a14:hiddenLine>
+                            </a:ext>
+                          </a:extLst>
+                        </wps:spPr>
+                        <wps:txbx>
+                          <w:txbxContent>
+                            <w:p>
+                              <w:pPr>
+                                <w:pStyle w:val="Piedepgina"/>
+                                <w:pBdr>
+                                  <w:top w:val="single" w:sz="12" w:space="1" w:color="A5A5A5" w:themeColor="accent3"/>
+                                  <w:bottom w:val="single" w:sz="48" w:space="1" w:color="A5A5A5" w:themeColor="accent3"/>
+                                </w:pBdr>
+                                <w:jc w:val="center"/>
+                                <w:rPr>
+                                  <w:b/>
+                                  <w:bCs/>
+                                  <w:color w:val="FFFFFF" w:themeColor="background1"/>
+                                  <w:sz w:val="28"/>
+                                  <w:szCs w:val="28"/>
+                                </w:rPr>
+                              </w:pPr>
+                              <w:r>
+                                <w:rPr>
+                                  <w:b/>
+                                  <w:bCs/>
+                                  <w:color w:val="FFFFFF" w:themeColor="background1"/>
+                                  <w:sz w:val="22"/>
+                                  <w:szCs w:val="22"/>
+                                </w:rPr>
+                                <w:fldChar w:fldCharType="begin"/>
+                              </w:r>
+                              <w:r>
+                                <w:rPr>
+                                  <w:b/>
+                                  <w:bCs/>
+                                  <w:color w:val="FFFFFF" w:themeColor="background1"/>
+                                </w:rPr>
+                                <w:instrText>PAGE    \* MERGEFORMAT</w:instrText>
+                              </w:r>
+                              <w:r>
+                                <w:rPr>
+                                  <w:b/>
+                                  <w:bCs/>
+                                  <w:color w:val="FFFFFF" w:themeColor="background1"/>
+                                  <w:sz w:val="22"/>
+                                  <w:szCs w:val="22"/>
+                                </w:rPr>
+                                <w:fldChar w:fldCharType="separate"/>
+                              </w:r>
+                              <w:r>
+                                <w:rPr>
+                                  <w:b/>
+                                  <w:bCs/>
+                                  <w:color w:val="FFFFFF" w:themeColor="background1"/>
+                                  <w:sz w:val="28"/>
+                                  <w:szCs w:val="28"/>
+                                  <w:lang w:val="es-ES"/>
+                                </w:rPr>
+                                <w:t>2</w:t>
+                              </w:r>
+                              <w:r>
+                                <w:rPr>
+                                  <w:b/>
+                                  <w:bCs/>
+                                  <w:color w:val="FFFFFF" w:themeColor="background1"/>
+                                  <w:sz w:val="28"/>
+                                  <w:szCs w:val="28"/>
+                                </w:rPr>
+                                <w:fldChar w:fldCharType="end"/>
+                              </w:r>
+                            </w:p>
+                          </w:txbxContent>
+                        </wps:txbx>
+                        <wps:bodyPr rot="0" vert="horz" wrap="square" lIns="91440" tIns="45720" rIns="91440" bIns="45720" anchor="t" anchorCtr="0" upright="1">
+                          <a:noAutofit/>
+                        </wps:bodyPr>
+                      </wps:wsp>
+                    </a:graphicData>
+                  </a:graphic>
+                  <wp14:sizeRelH relativeFrom="page">
+                    <wp14:pctWidth>0</wp14:pctWidth>
+                  </wp14:sizeRelH>
+                  <wp14:sizeRelV relativeFrom="page">
+                    <wp14:pctHeight>0</wp14:pctHeight>
+                  </wp14:sizeRelV>
+                </wp:anchor>
+              </w:drawing>
+            </mc:Choice>
+            <mc:Fallback>
+              <w:pict>
+                <v:shapetype w14:anchorId="1202ABC1" id="_x0000_t176" coordsize="21600,21600" o:spt="176" adj="2700" path="m@0,qx0@0l0@2qy@0,21600l@1,21600qx21600@2l21600@0qy@1,xe">
+                  <v:stroke joinstyle="miter"/>
+                  <v:formulas>
+                    <v:f eqn="val #0"/>
+                    <v:f eqn="sum width 0 #0"/>
+                    <v:f eqn="sum height 0 #0"/>
+                    <v:f eqn="prod @0 2929 10000"/>
+                    <v:f eqn="sum width 0 @3"/>
+                    <v:f eqn="sum height 0 @3"/>
+                    <v:f eqn="val width"/>
+                    <v:f eqn="val height"/>
+                    <v:f eqn="prod width 1 2"/>
+                    <v:f eqn="prod height 1 2"/>
+                  </v:formulas>
+                  <v:path gradientshapeok="t" limo="10800,10800" o:connecttype="custom" o:connectlocs="@8,0;0,@9;@8,@7;@6,@9" textboxrect="@3,@3,@4,@5"/>
+                </v:shapetype>
+                <v:shape id="Diagrama de flujo: proceso alternativo 3" o:spid="_x0000_s1026" type="#_x0000_t176" style="position:absolute;margin-left:0;margin-top:0;width:40.35pt;height:34.75pt;z-index:251663360;visibility:visible;mso-wrap-style:square;mso-width-percent:0;mso-height-percent:0;mso-wrap-distance-left:9pt;mso-wrap-distance-top:0;mso-wrap-distance-right:9pt;mso-wrap-distance-bottom:0;mso-position-horizontal:center;mso-position-horizontal-relative:right-margin-area;mso-position-vertical:center;mso-position-vertical-relative:bottom-margin-area;mso-width-percent:0;mso-height-percent:0;mso-width-relative:page;mso-height-relative:page;v-text-anchor:top" o:gfxdata="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" filled="f" fillcolor="#5c83b4" stroked="f" strokecolor="#737373">
+                  <v:textbox>
+                    <w:txbxContent>
+                      <w:p>
+                        <w:pPr>
+                          <w:pStyle w:val="Piedepgina"/>
+                          <w:pBdr>
+                            <w:top w:val="single" w:sz="12" w:space="1" w:color="A5A5A5" w:themeColor="accent3"/>
+                            <w:bottom w:val="single" w:sz="48" w:space="1" w:color="A5A5A5" w:themeColor="accent3"/>
+                          </w:pBdr>
+                          <w:jc w:val="center"/>
+                          <w:rPr>
+                            <w:b/>
+                            <w:bCs/>
+                            <w:color w:val="FFFFFF" w:themeColor="background1"/>
+                            <w:sz w:val="28"/>
+                            <w:szCs w:val="28"/>
+                          </w:rPr>
+                        </w:pPr>
+                        <w:r>
+                          <w:rPr>
+                            <w:b/>
+                            <w:bCs/>
+                            <w:color w:val="FFFFFF" w:themeColor="background1"/>
+                            <w:sz w:val="22"/>
+                            <w:szCs w:val="22"/>
+                          </w:rPr>
+                          <w:fldChar w:fldCharType="begin"/>
+                        </w:r>
+                        <w:r>
+                          <w:rPr>
+                            <w:b/>
+                            <w:bCs/>
+                            <w:color w:val="FFFFFF" w:themeColor="background1"/>
+                          </w:rPr>
+                          <w:instrText>PAGE    \* MERGEFORMAT</w:instrText>
+                        </w:r>
+                        <w:r>
+                          <w:rPr>
+                            <w:b/>
+                            <w:bCs/>
+                            <w:color w:val="FFFFFF" w:themeColor="background1"/>
+                            <w:sz w:val="22"/>
+                            <w:szCs w:val="22"/>
+                          </w:rPr>
+                          <w:fldChar w:fldCharType="separate"/>
+                        </w:r>
+                        <w:r>
+                          <w:rPr>
+                            <w:b/>
+                            <w:bCs/>
+                            <w:color w:val="FFFFFF" w:themeColor="background1"/>
+                            <w:sz w:val="28"/>
+                            <w:szCs w:val="28"/>
+                            <w:lang w:val="es-ES"/>
+                          </w:rPr>
+                          <w:t>2</w:t>
+                        </w:r>
+                        <w:r>
+                          <w:rPr>
+                            <w:b/>
+                            <w:bCs/>
+                            <w:color w:val="FFFFFF" w:themeColor="background1"/>
+                            <w:sz w:val="28"/>
+                            <w:szCs w:val="28"/>
+                          </w:rPr>
+                          <w:fldChar w:fldCharType="end"/>
+                        </w:r>
+                      </w:p>
+                    </w:txbxContent>
+                  </v:textbox>
+                  <w10:wrap anchorx="margin" anchory="margin"/>
+                </v:shape>
+              </w:pict>
+            </mc:Fallback>
+          </mc:AlternateContent>
+        </w:r>
+      </w:sdtContent>
+    </w:sdt>
+    <w:r>
+      <w:tab/>
+    </w:r>
+  </w:p>
+</w:ftr>
+</file>
+
+<file path=word/footnotes.xml><?xml version="1.0" encoding="utf-8"?>
+<w:footnotes xmlns:wpc="http://schemas.microsoft.com/office/word/2010/wordprocessingCanvas" xmlns:cx="http://schemas.microsoft.com/office/drawing/2014/chartex" xmlns:cx1="http://schemas.microsoft.com/office/drawing/2015/9/8/chartex" xmlns:cx2="http://schemas.microsoft.com/office/drawing/2015/10/21/chartex" xmlns:cx3="http://schemas.microsoft.com/office/drawing/2016/5/9/chartex" xmlns:cx4="http://schemas.microsoft.com/office/drawing/2016/5/10/chartex" xmlns:cx5="http://schemas.microsoft.com/office/drawing/2016/5/11/chartex" xmlns:cx6="http://schemas.microsoft.com/office/drawing/2016/5/12/chartex" xmlns:cx7="http://schemas.microsoft.com/office/drawing/2016/5/13/chartex" xmlns:cx8="http://schemas.microsoft.com/office/drawing/2016/5/14/chartex" xmlns:mc="http://schemas.openxmlformats.org/markup-compatibility/2006" xmlns:aink="http://schemas.microsoft.com/office/drawing/2016/ink" xmlns:am3d="http://schemas.microsoft.com/office/drawing/2017/model3d" xmlns:o="urn:schemas-microsoft-com:office:office" xmlns:oel="http://schemas.microsoft.com/office/2019/extlst" xmlns:r="http://schemas.openxmlformats.org/officeDocument/2006/relationships" xmlns:m="http://schemas.openxmlformats.org/officeDocument/2006/math" xmlns:v="urn:schemas-microsoft-com:vml" xmlns:wp14="http://schemas.microsoft.com/office/word/2010/wordprocessingDrawing" xmlns:wp="http://schemas.openxmlformats.org/drawingml/2006/wordprocessingDrawing" xmlns:w10="urn:schemas-microsoft-com:office:word" xmlns:w="http://schemas.openxmlformats.org/wordprocessingml/2006/main" xmlns:w14="http://schemas.microsoft.com/office/word/2010/wordml" xmlns:w15="http://schemas.microsoft.com/office/word/2012/wordml" xmlns:w16cex="http://schemas.microsoft.com/office/word/2018/wordml/cex" xmlns:w16cid="http://schemas.microsoft.com/office/word/2016/wordml/cid" xmlns:w16="http://schemas.microsoft.com/office/word/2018/wordml" xmlns:w16du="http://schemas.microsoft.com/office/word/2023/wordml/word16du" xmlns:w16sdtdh="http://schemas.microsoft.com/office/word/2020/wordml/sdtdatahash" xmlns:w16sdtfl="http://schemas.microsoft.com/office/word/2024/wordml/sdtformatlock" xmlns:w16se="http://schemas.microsoft.com/office/word/2015/wordml/symex" xmlns:wpg="http://schemas.microsoft.com/office/word/2010/wordprocessingGroup" xmlns:wpi="http://schemas.microsoft.com/office/word/2010/wordprocessingInk" xmlns:wne="http://schemas.microsoft.com/office/word/2006/wordml" xmlns:wps="http://schemas.microsoft.com/office/word/2010/wordprocessingShape" mc:Ignorable="w14 w15 w16se w16cid w16 w16cex w16sdtdh w16sdtfl w16du wp14">
+  <w:footnote w:type="separator" w:id="-1">
+    <w:p>
+      <w:pPr>
+        <w:spacing w:after="0" w:line="240" w:lineRule="auto"/>
+      </w:pPr>
+      <w:r>
+        <w:separator/>
+      </w:r>
+    </w:p>
+  </w:footnote>
+  <w:footnote w:type="continuationSeparator" w:id="0">
+    <w:p>
+      <w:pPr>
+        <w:spacing w:after="0" w:line="240" w:lineRule="auto"/>
+      </w:pPr>
+      <w:r>
+        <w:continuationSeparator/>
+      </w:r>
+    </w:p>
+  </w:footnote>
+</w:footnotes>
+</file>
+
+<file path=word/header1.xml><?xml version="1.0" encoding="utf-8"?>
+<w:hdr xmlns:wpc="http://schemas.microsoft.com/office/word/2010/wordprocessingCanvas" xmlns:cx="http://schemas.microsoft.com/office/drawing/2014/chartex" xmlns:cx1="http://schemas.microsoft.com/office/drawing/2015/9/8/chartex" xmlns:cx2="http://schemas.microsoft.com/office/drawing/2015/10/21/chartex" xmlns:cx3="http://schemas.microsoft.com/office/drawing/2016/5/9/chartex" xmlns:cx4="http://schemas.microsoft.com/office/drawing/2016/5/10/chartex" xmlns:cx5="http://schemas.microsoft.com/office/drawing/2016/5/11/chartex" xmlns:cx6="http://schemas.microsoft.com/office/drawing/2016/5/12/chartex" xmlns:cx7="http://schemas.microsoft.com/office/drawing/2016/5/13/chartex" xmlns:cx8="http://schemas.microsoft.com/office/drawing/2016/5/14/chartex" xmlns:mc="http://schemas.openxmlformats.org/markup-compatibility/2006" xmlns:aink="http://schemas.microsoft.com/office/drawing/2016/ink" xmlns:am3d="http://schemas.microsoft.com/office/drawing/2017/model3d" xmlns:o="urn:schemas-microsoft-com:office:office" xmlns:oel="http://schemas.microsoft.com/office/2019/extlst" xmlns:r="http://schemas.openxmlformats.org/officeDocument/2006/relationships" xmlns:m="http://schemas.openxmlformats.org/officeDocument/2006/math" xmlns:v="urn:schemas-microsoft-com:vml" xmlns:wp14="http://schemas.microsoft.com/office/word/2010/wordprocessingDrawing" xmlns:wp="http://schemas.openxmlformats.org/drawingml/2006/wordprocessingDrawing" xmlns:w10="urn:schemas-microsoft-com:office:word" xmlns:w="http://schemas.openxmlformats.org/wordprocessingml/2006/main" xmlns:w14="http://schemas.microsoft.com/office/word/2010/wordml" xmlns:w15="http://schemas.microsoft.com/office/word/2012/wordml" xmlns:w16cex="http://schemas.microsoft.com/office/word/2018/wordml/cex" xmlns:w16cid="http://schemas.microsoft.com/office/word/2016/wordml/cid" xmlns:w16="http://schemas.microsoft.com/office/word/2018/wordml" xmlns:w16du="http://schemas.microsoft.com/office/word/2023/wordml/word16du" xmlns:w16sdtdh="http://schemas.microsoft.com/office/word/2020/wordml/sdtdatahash" xmlns:w16sdtfl="http://schemas.microsoft.com/office/word/2024/wordml/sdtformatlock" xmlns:w16se="http://schemas.microsoft.com/office/word/2015/wordml/symex" xmlns:wpg="http://schemas.microsoft.com/office/word/2010/wordprocessingGroup" xmlns:wpi="http://schemas.microsoft.com/office/word/2010/wordprocessingInk" xmlns:wne="http://schemas.microsoft.com/office/word/2006/wordml" xmlns:wps="http://schemas.microsoft.com/office/word/2010/wordprocessingShape" mc:Ignorable="w14 w15 w16se w16cid w16 w16cex w16sdtdh w16sdtfl w16du wp14">
+  <w:p>
+    <w:pPr>
+      <w:pStyle w:val="Encabezado"/>
+    </w:pPr>
+    <w:r>
+      <w:rPr>
+        <w:rFonts w:asciiTheme="majorHAnsi" w:hAnsiTheme="majorHAnsi" w:cstheme="majorHAnsi"/>
+        <w:b/>
+        <w:noProof/>
+        <w:sz w:val="23"/>
+        <w:szCs w:val="23"/>
+      </w:rPr>
+      <mc:AlternateContent>
+        <mc:Choice Requires="wps">
+          <w:drawing>
+            <wp:anchor distT="0" distB="0" distL="114300" distR="114300" simplePos="0" relativeHeight="251661312" behindDoc="0" locked="0" layoutInCell="1" allowOverlap="1" wp14:anchorId="417C3272" wp14:editId="32ACDD55">
+              <wp:simplePos x="0" y="0"/>
+              <wp:positionH relativeFrom="page">
+                <wp:align>left</wp:align>
+              </wp:positionH>
+              <wp:positionV relativeFrom="paragraph">
+                <wp:posOffset>46990</wp:posOffset>
+              </wp:positionV>
+              <wp:extent cx="7969250" cy="266700"/>
+              <wp:effectExtent l="0" t="0" r="0" b="0"/>
+              <wp:wrapNone/>
+              <wp:docPr id="58332760" name="Rectángulo 58332760"/>
+              <wp:cNvGraphicFramePr/>
+              <a:graphic xmlns:a="http://schemas.openxmlformats.org/drawingml/2006/main">
+                <a:graphicData uri="http://schemas.microsoft.com/office/word/2010/wordprocessingShape">
+                  <wps:wsp>
+                    <wps:cNvSpPr/>
+                    <wps:spPr>
+                      <a:xfrm>
+                        <a:off x="0" y="0"/>
+                        <a:ext cx="7969250" cy="266700"/>
+                      </a:xfrm>
+                      <a:prstGeom prst="rect">
+                        <a:avLst/>
+                      </a:prstGeom>
+                      <a:solidFill>
+                        <a:srgbClr val="C00000"/>
+                      </a:solidFill>
+                      <a:ln>
+                        <a:noFill/>
+                      </a:ln>
+                      <a:effectLst/>
+                    </wps:spPr>
+                    <wps:style>
+                      <a:lnRef idx="1">
+                        <a:schemeClr val="accent1"/>
+                      </a:lnRef>
+                      <a:fillRef idx="3">
+                        <a:schemeClr val="accent1"/>
+                      </a:fillRef>
+                      <a:effectRef idx="2">
+                        <a:schemeClr val="accent1"/>
+                      </a:effectRef>
+                      <a:fontRef idx="minor">
+                        <a:schemeClr val="lt1"/>
+                      </a:fontRef>
+                    </wps:style>
+                    <wps:bodyPr rot="0" spcFirstLastPara="0" vertOverflow="overflow" horzOverflow="overflow" vert="horz" wrap="square" lIns="91440" tIns="45720" rIns="91440" bIns="45720" numCol="1" spcCol="0" rtlCol="0" fromWordArt="0" anchor="ctr" anchorCtr="0" forceAA="0" compatLnSpc="1">
+                      <a:prstTxWarp prst="textNoShape">
+                        <a:avLst/>
+                      </a:prstTxWarp>
+                      <a:noAutofit/>
+                    </wps:bodyPr>
+                  </wps:wsp>
+                </a:graphicData>
+              </a:graphic>
+              <wp14:sizeRelH relativeFrom="margin">
+                <wp14:pctWidth>0</wp14:pctWidth>
+              </wp14:sizeRelH>
+              <wp14:sizeRelV relativeFrom="margin">
+                <wp14:pctHeight>0</wp14:pctHeight>
+              </wp14:sizeRelV>
+            </wp:anchor>
+          </w:drawing>
+        </mc:Choice>
+        <mc:Fallback>
+          <w:pict>
+            <v:rect w14:anchorId="71908D9B" id="Rectángulo 58332760" o:spid="_x0000_s1026" style="position:absolute;margin-left:0;margin-top:3.7pt;width:627.5pt;height:21pt;z-index:251661312;visibility:visible;mso-wrap-style:square;mso-width-percent:0;mso-height-percent:0;mso-wrap-distance-left:9pt;mso-wrap-distance-top:0;mso-wrap-distance-right:9pt;mso-wrap-distance-bottom:0;mso-position-horizontal:left;mso-position-horizontal-relative:page;mso-position-vertical:absolute;mso-position-vertical-relative:text;mso-width-percent:0;mso-height-percent:0;mso-width-relative:margin;mso-height-relative:margin;v-text-anchor:middle" o:gfxdata="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" fillcolor="#c00000" stroked="f" strokeweight=".5pt">
+              <w10:wrap anchorx="page"/>
+            </v:rect>
+          </w:pict>
+        </mc:Fallback>
+      </mc:AlternateContent>
+    </w:r>
+  </w:p>
+</w:hdr>
+</file>
+
+<file path=word/numbering.xml><?xml version="1.0" encoding="utf-8"?>
+<w:numbering xmlns:wpc="http://schemas.microsoft.com/office/word/2010/wordprocessingCanvas" xmlns:cx="http://schemas.microsoft.com/office/drawing/2014/chartex" xmlns:cx1="http://schemas.microsoft.com/office/drawing/2015/9/8/chartex" xmlns:cx2="http://schemas.microsoft.com/office/drawing/2015/10/21/chartex" xmlns:cx3="http://schemas.microsoft.com/office/drawing/2016/5/9/chartex" xmlns:cx4="http://schemas.microsoft.com/office/drawing/2016/5/10/chartex" xmlns:cx5="http://schemas.microsoft.com/office/drawing/2016/5/11/chartex" xmlns:cx6="http://schemas.microsoft.com/office/drawing/2016/5/12/chartex" xmlns:cx7="http://schemas.microsoft.com/office/drawing/2016/5/13/chartex" xmlns:cx8="http://schemas.microsoft.com/office/drawing/2016/5/14/chartex" xmlns:mc="http://schemas.openxmlformats.org/markup-compatibility/2006" xmlns:aink="http://schemas.microsoft.com/office/drawing/2016/ink" xmlns:am3d="http://schemas.microsoft.com/office/drawing/2017/model3d" xmlns:o="urn:schemas-microsoft-com:office:office" xmlns:oel="http://schemas.microsoft.com/office/2019/extlst" xmlns:r="http://schemas.openxmlformats.org/officeDocument/2006/relationships" xmlns:m="http://schemas.openxmlformats.org/officeDocument/2006/math" xmlns:v="urn:schemas-microsoft-com:vml" xmlns:wp14="http://schemas.microsoft.com/office/word/2010/wordprocessingDrawing" xmlns:wp="http://schemas.openxmlformats.org/drawingml/2006/wordprocessingDrawing" xmlns:w10="urn:schemas-microsoft-com:office:word" xmlns:w="http://schemas.openxmlformats.org/wordprocessingml/2006/main" xmlns:w14="http://schemas.microsoft.com/office/word/2010/wordml" xmlns:w15="http://schemas.microsoft.com/office/word/2012/wordml" xmlns:w16cex="http://schemas.microsoft.com/office/word/2018/wordml/cex" xmlns:w16cid="http://schemas.microsoft.com/office/word/2016/wordml/cid" xmlns:w16="http://schemas.microsoft.com/office/word/2018/wordml" xmlns:w16du="http://schemas.microsoft.com/office/word/2023/wordml/word16du" xmlns:w16sdtdh="http://schemas.microsoft.com/office/word/2020/wordml/sdtdatahash" xmlns:w16sdtfl="http://schemas.microsoft.com/office/word/2024/wordml/sdtformatlock" xmlns:w16se="http://schemas.microsoft.com/office/word/2015/wordml/symex" xmlns:wpg="http://schemas.microsoft.com/office/word/2010/wordprocessingGroup" xmlns:wpi="http://schemas.microsoft.com/office/word/2010/wordprocessingInk" xmlns:wne="http://schemas.microsoft.com/office/word/2006/wordml" xmlns:wps="http://schemas.microsoft.com/office/word/2010/wordprocessingShape" mc:Ignorable="w14 w15 w16se w16cid w16 w16cex w16sdtdh w16sdtfl w16du wp14">
+  <w:abstractNum w:abstractNumId="0" w15:restartNumberingAfterBreak="0">
+    <w:nsid w:val="44FC4A9C"/>
+    <w:multiLevelType w:val="hybridMultilevel"/>
+    <w:tmpl w:val="F6C44854"/>
+    <w:lvl w:ilvl="0" w:tplc="32928AF8">
+      <w:start w:val="1"/>
+      <w:numFmt w:val="bullet"/>
+      <w:lvlText w:val=""/>
+      <w:lvlJc w:val="left"/>
+      <w:pPr>
+        <w:ind w:left="720" w:hanging="360"/>
+      </w:pPr>
+      <w:rPr>
+        <w:rFonts w:ascii="Symbol" w:hAnsi="Symbol" w:hint="default"/>
+        <w:color w:val="C00000"/>
+      </w:rPr>
+    </w:lvl>
+    <w:lvl w:ilvl="1" w:tplc="2C0A0003" w:tentative="1">
+      <w:start w:val="1"/>
+      <w:numFmt w:val="bullet"/>
+      <w:lvlText w:val="o"/>
+      <w:lvlJc w:val="left"/>
+      <w:pPr>
+        <w:ind w:left="1440" w:hanging="360"/>
+      </w:pPr>
+      <w:rPr>
+        <w:rFonts w:ascii="Courier New" w:hAnsi="Courier New" w:cs="Courier New" w:hint="default"/>
+      </w:rPr>
+    </w:lvl>
+    <w:lvl w:ilvl="2" w:tplc="2C0A0005" w:tentative="1">
+      <w:start w:val="1"/>
+      <w:numFmt w:val="bullet"/>
+      <w:lvlText w:val=""/>
+      <w:lvlJc w:val="left"/>
+      <w:pPr>
+        <w:ind w:left="2160" w:hanging="360"/>
+      </w:pPr>
+      <w:rPr>
+        <w:rFonts w:ascii="Wingdings" w:hAnsi="Wingdings" w:hint="default"/>
+      </w:rPr>
+    </w:lvl>
+    <w:lvl w:ilvl="3" w:tplc="2C0A0001" w:tentative="1">
+      <w:start w:val="1"/>
+      <w:numFmt w:val="bullet"/>
+      <w:lvlText w:val=""/>
+      <w:lvlJc w:val="left"/>
+      <w:pPr>
+        <w:ind w:left="2880" w:hanging="360"/>
+      </w:pPr>
+      <w:rPr>
+        <w:rFonts w:ascii="Symbol" w:hAnsi="Symbol" w:hint="default"/>
+      </w:rPr>
+    </w:lvl>
+    <w:lvl w:ilvl="4" w:tplc="2C0A0003" w:tentative="1">
+      <w:start w:val="1"/>
+      <w:numFmt w:val="bullet"/>
+      <w:lvlText w:val="o"/>
+      <w:lvlJc w:val="left"/>
+      <w:pPr>
+        <w:ind w:left="3600" w:hanging="360"/>
+      </w:pPr>
+      <w:rPr>
+        <w:rFonts w:ascii="Courier New" w:hAnsi="Courier New" w:cs="Courier New" w:hint="default"/>
+      </w:rPr>
+    </w:lvl>
+    <w:lvl w:ilvl="5" w:tplc="2C0A0005" w:tentative="1">
+      <w:start w:val="1"/>
+      <w:numFmt w:val="bullet"/>
+      <w:lvlText w:val=""/>
+      <w:lvlJc w:val="left"/>
+      <w:pPr>
+        <w:ind w:left="4320" w:hanging="360"/>
+      </w:pPr>
+      <w:rPr>
+        <w:rFonts w:ascii="Wingdings" w:hAnsi="Wingdings" w:hint="default"/>
+      </w:rPr>
+    </w:lvl>
+    <w:lvl w:ilvl="6" w:tplc="2C0A0001" w:tentative="1">
+      <w:start w:val="1"/>
+      <w:numFmt w:val="bullet"/>
+      <w:lvlText w:val=""/>
+      <w:lvlJc w:val="left"/>
+      <w:pPr>
+        <w:ind w:left="5040" w:hanging="360"/>
+      </w:pPr>
+      <w:rPr>
+        <w:rFonts w:ascii="Symbol" w:hAnsi="Symbol" w:hint="default"/>
+      </w:rPr>
+    </w:lvl>
+    <w:lvl w:ilvl="7" w:tplc="2C0A0003" w:tentative="1">
+      <w:start w:val="1"/>
+      <w:numFmt w:val="bullet"/>
+      <w:lvlText w:val="o"/>
+      <w:lvlJc w:val="left"/>
+      <w:pPr>
+        <w:ind w:left="5760" w:hanging="360"/>
+      </w:pPr>
+      <w:rPr>
+        <w:rFonts w:ascii="Courier New" w:hAnsi="Courier New" w:cs="Courier New" w:hint="default"/>
+      </w:rPr>
+    </w:lvl>
+    <w:lvl w:ilvl="8" w:tplc="2C0A0005" w:tentative="1">
+      <w:start w:val="1"/>
+      <w:numFmt w:val="bullet"/>
+      <w:lvlText w:val=""/>
+      <w:lvlJc w:val="left"/>
+      <w:pPr>
+        <w:ind w:left="6480" w:hanging="360"/>
+      </w:pPr>
+      <w:rPr>
+        <w:rFonts w:ascii="Wingdings" w:hAnsi="Wingdings" w:hint="default"/>
+      </w:rPr>
+    </w:lvl>
+  </w:abstractNum>
+  <w:num w:numId="1" w16cid:durableId="807670739">
+    <w:abstractNumId w:val="0"/>
+  </w:num>
+</w:numbering>
 </file>
 
 <file path=word/styles.xml><?xml version="1.0" encoding="utf-8"?>
@@ -2972,7 +6011,7 @@
   <w:style w:type="paragraph" w:default="1" w:styleId="Normal">
     <w:name w:val="Normal"/>
     <w:qFormat/>
-    <w:rsid w:val="00EA7386"/>
+    <w:rsid w:val="00A455AC"/>
   </w:style>
   <w:style w:type="paragraph" w:styleId="Ttulo1">
     <w:name w:val="heading 1"/>
@@ -2981,17 +6020,18 @@
     <w:link w:val="Ttulo1Car"/>
     <w:uiPriority w:val="9"/>
     <w:qFormat/>
-    <w:rsid w:val="00D90F17"/>
+    <w:rsid w:val="004A7B28"/>
     <w:pPr>
       <w:keepNext/>
       <w:keepLines/>
-      <w:spacing w:before="360" w:after="80"/>
+      <w:spacing w:before="360" w:after="80" w:line="360" w:lineRule="auto"/>
       <w:outlineLvl w:val="0"/>
     </w:pPr>
     <w:rPr>
-      <w:rFonts w:asciiTheme="majorHAnsi" w:eastAsiaTheme="majorEastAsia" w:hAnsiTheme="majorHAnsi" w:cstheme="majorBidi"/>
-      <w:color w:val="2F5496" w:themeColor="accent1" w:themeShade="BF"/>
-      <w:sz w:val="40"/>
+      <w:rFonts w:ascii="Arial" w:eastAsia="Times New Roman" w:hAnsi="Arial" w:cs="Times New Roman"/>
+      <w:b/>
+      <w:color w:val="C00000"/>
+      <w:sz w:val="32"/>
       <w:szCs w:val="40"/>
     </w:rPr>
   </w:style>
@@ -3176,6 +6216,7 @@
   <w:style w:type="character" w:default="1" w:styleId="Fuentedeprrafopredeter">
     <w:name w:val="Default Paragraph Font"/>
     <w:uiPriority w:val="1"/>
+    <w:semiHidden/>
     <w:unhideWhenUsed/>
   </w:style>
   <w:style w:type="table" w:default="1" w:styleId="Tablanormal">
@@ -3204,11 +6245,12 @@
     <w:basedOn w:val="Fuentedeprrafopredeter"/>
     <w:link w:val="Ttulo1"/>
     <w:uiPriority w:val="9"/>
-    <w:rsid w:val="00D90F17"/>
+    <w:rsid w:val="004A7B28"/>
     <w:rPr>
-      <w:rFonts w:asciiTheme="majorHAnsi" w:eastAsiaTheme="majorEastAsia" w:hAnsiTheme="majorHAnsi" w:cstheme="majorBidi"/>
-      <w:color w:val="2F5496" w:themeColor="accent1" w:themeShade="BF"/>
-      <w:sz w:val="40"/>
+      <w:rFonts w:ascii="Arial" w:eastAsia="Times New Roman" w:hAnsi="Arial" w:cs="Times New Roman"/>
+      <w:b/>
+      <w:color w:val="C00000"/>
+      <w:sz w:val="32"/>
       <w:szCs w:val="40"/>
     </w:rPr>
   </w:style>
@@ -3510,6 +6552,145 @@
     <w:rPr>
       <w:color w:val="605E5C"/>
       <w:shd w:val="clear" w:color="auto" w:fill="E1DFDD"/>
+    </w:rPr>
+  </w:style>
+  <w:style w:type="table" w:styleId="Tablaconcuadrcula">
+    <w:name w:val="Table Grid"/>
+    <w:basedOn w:val="Tablanormal"/>
+    <w:uiPriority w:val="39"/>
+    <w:rsid w:val="00A455AC"/>
+    <w:pPr>
+      <w:spacing w:after="0" w:line="240" w:lineRule="auto"/>
+    </w:pPr>
+    <w:tblPr>
+      <w:tblBorders>
+        <w:top w:val="single" w:sz="4" w:space="0" w:color="auto"/>
+        <w:left w:val="single" w:sz="4" w:space="0" w:color="auto"/>
+        <w:bottom w:val="single" w:sz="4" w:space="0" w:color="auto"/>
+        <w:right w:val="single" w:sz="4" w:space="0" w:color="auto"/>
+        <w:insideH w:val="single" w:sz="4" w:space="0" w:color="auto"/>
+        <w:insideV w:val="single" w:sz="4" w:space="0" w:color="auto"/>
+      </w:tblBorders>
+    </w:tblPr>
+  </w:style>
+  <w:style w:type="paragraph" w:styleId="Encabezado">
+    <w:name w:val="header"/>
+    <w:basedOn w:val="Normal"/>
+    <w:link w:val="EncabezadoCar"/>
+    <w:uiPriority w:val="99"/>
+    <w:unhideWhenUsed/>
+    <w:rsid w:val="00DE7E9B"/>
+    <w:pPr>
+      <w:tabs>
+        <w:tab w:val="center" w:pos="4252"/>
+        <w:tab w:val="right" w:pos="8504"/>
+      </w:tabs>
+      <w:spacing w:after="0" w:line="240" w:lineRule="auto"/>
+    </w:pPr>
+  </w:style>
+  <w:style w:type="character" w:customStyle="1" w:styleId="EncabezadoCar">
+    <w:name w:val="Encabezado Car"/>
+    <w:basedOn w:val="Fuentedeprrafopredeter"/>
+    <w:link w:val="Encabezado"/>
+    <w:uiPriority w:val="99"/>
+    <w:rsid w:val="00DE7E9B"/>
+  </w:style>
+  <w:style w:type="paragraph" w:styleId="Piedepgina">
+    <w:name w:val="footer"/>
+    <w:basedOn w:val="Normal"/>
+    <w:link w:val="PiedepginaCar"/>
+    <w:uiPriority w:val="99"/>
+    <w:unhideWhenUsed/>
+    <w:rsid w:val="00DE7E9B"/>
+    <w:pPr>
+      <w:tabs>
+        <w:tab w:val="center" w:pos="4252"/>
+        <w:tab w:val="right" w:pos="8504"/>
+      </w:tabs>
+      <w:spacing w:after="0" w:line="240" w:lineRule="auto"/>
+    </w:pPr>
+  </w:style>
+  <w:style w:type="character" w:customStyle="1" w:styleId="PiedepginaCar">
+    <w:name w:val="Pie de página Car"/>
+    <w:basedOn w:val="Fuentedeprrafopredeter"/>
+    <w:link w:val="Piedepgina"/>
+    <w:uiPriority w:val="99"/>
+    <w:rsid w:val="00DE7E9B"/>
+  </w:style>
+  <w:style w:type="paragraph" w:styleId="TtuloTDC">
+    <w:name w:val="TOC Heading"/>
+    <w:basedOn w:val="Ttulo1"/>
+    <w:next w:val="Normal"/>
+    <w:uiPriority w:val="39"/>
+    <w:unhideWhenUsed/>
+    <w:qFormat/>
+    <w:rsid w:val="008D6284"/>
+    <w:pPr>
+      <w:spacing w:before="240" w:after="0" w:line="259" w:lineRule="auto"/>
+      <w:outlineLvl w:val="9"/>
+    </w:pPr>
+    <w:rPr>
+      <w:rFonts w:asciiTheme="majorHAnsi" w:eastAsiaTheme="majorEastAsia" w:hAnsiTheme="majorHAnsi" w:cstheme="majorBidi"/>
+      <w:b w:val="0"/>
+      <w:color w:val="2F5496" w:themeColor="accent1" w:themeShade="BF"/>
+      <w:kern w:val="0"/>
+      <w:szCs w:val="32"/>
+      <w:lang w:eastAsia="es-AR"/>
+      <w14:ligatures w14:val="none"/>
+    </w:rPr>
+  </w:style>
+  <w:style w:type="paragraph" w:styleId="TDC1">
+    <w:name w:val="toc 1"/>
+    <w:basedOn w:val="Normal"/>
+    <w:next w:val="Normal"/>
+    <w:autoRedefine/>
+    <w:uiPriority w:val="39"/>
+    <w:unhideWhenUsed/>
+    <w:rsid w:val="008D6284"/>
+    <w:pPr>
+      <w:spacing w:after="100"/>
+    </w:pPr>
+  </w:style>
+  <w:style w:type="paragraph" w:styleId="TDC2">
+    <w:name w:val="toc 2"/>
+    <w:basedOn w:val="Normal"/>
+    <w:next w:val="Normal"/>
+    <w:autoRedefine/>
+    <w:uiPriority w:val="39"/>
+    <w:unhideWhenUsed/>
+    <w:rsid w:val="008D6284"/>
+    <w:pPr>
+      <w:spacing w:after="100" w:line="259" w:lineRule="auto"/>
+      <w:ind w:left="220"/>
+    </w:pPr>
+    <w:rPr>
+      <w:rFonts w:eastAsiaTheme="minorEastAsia" w:cs="Times New Roman"/>
+      <w:kern w:val="0"/>
+      <w:sz w:val="22"/>
+      <w:szCs w:val="22"/>
+      <w:lang w:eastAsia="es-AR"/>
+      <w14:ligatures w14:val="none"/>
+    </w:rPr>
+  </w:style>
+  <w:style w:type="paragraph" w:styleId="TDC3">
+    <w:name w:val="toc 3"/>
+    <w:basedOn w:val="Normal"/>
+    <w:next w:val="Normal"/>
+    <w:autoRedefine/>
+    <w:uiPriority w:val="39"/>
+    <w:unhideWhenUsed/>
+    <w:rsid w:val="008D6284"/>
+    <w:pPr>
+      <w:spacing w:after="100" w:line="259" w:lineRule="auto"/>
+      <w:ind w:left="440"/>
+    </w:pPr>
+    <w:rPr>
+      <w:rFonts w:eastAsiaTheme="minorEastAsia" w:cs="Times New Roman"/>
+      <w:kern w:val="0"/>
+      <w:sz w:val="22"/>
+      <w:szCs w:val="22"/>
+      <w:lang w:eastAsia="es-AR"/>
+      <w14:ligatures w14:val="none"/>
     </w:rPr>
   </w:style>
 </w:styles>

</xml_diff>

<commit_message>
Incorporacion de la Introduccion al Informe
</commit_message>
<xml_diff>
--- a/docs/BorradorInforme(Convertir en PDF AL TERMINAR).docx
+++ b/docs/BorradorInforme(Convertir en PDF AL TERMINAR).docx
@@ -664,7 +664,7 @@
       </w:r>
     </w:p>
     <w:bookmarkStart w:id="0" w:name="_Toc212909376"/>
-    <w:bookmarkStart w:id="1" w:name="_Toc231937821"/>
+    <w:bookmarkStart w:id="1" w:name="_Toc232187676"/>
     <w:p>
       <w:pPr>
         <w:pStyle w:val="Ttulo1"/>
@@ -820,7 +820,7 @@
           <w:r>
             <w:fldChar w:fldCharType="separate"/>
           </w:r>
-          <w:hyperlink w:anchor="_Toc231937821" w:history="1">
+          <w:hyperlink w:anchor="_Toc232187676" w:history="1">
             <w:r>
               <w:rPr>
                 <w:rStyle w:val="Hipervnculo"/>
@@ -847,7 +847,7 @@
                 <w:noProof/>
                 <w:webHidden/>
               </w:rPr>
-              <w:instrText xml:space="preserve"> PAGEREF _Toc231937821 \h </w:instrText>
+              <w:instrText xml:space="preserve"> PAGEREF _Toc232187676 \h </w:instrText>
             </w:r>
             <w:r>
               <w:rPr>
@@ -890,7 +890,7 @@
               <w:lang w:eastAsia="es-AR"/>
             </w:rPr>
           </w:pPr>
-          <w:hyperlink w:anchor="_Toc231937822" w:history="1">
+          <w:hyperlink w:anchor="_Toc232187677" w:history="1">
             <w:r>
               <w:rPr>
                 <w:rStyle w:val="Hipervnculo"/>
@@ -917,7 +917,7 @@
                 <w:noProof/>
                 <w:webHidden/>
               </w:rPr>
-              <w:instrText xml:space="preserve"> PAGEREF _Toc231937822 \h </w:instrText>
+              <w:instrText xml:space="preserve"> PAGEREF _Toc232187677 \h </w:instrText>
             </w:r>
             <w:r>
               <w:rPr>
@@ -960,7 +960,7 @@
               <w:lang w:eastAsia="es-AR"/>
             </w:rPr>
           </w:pPr>
-          <w:hyperlink w:anchor="_Toc231937823" w:history="1">
+          <w:hyperlink w:anchor="_Toc232187678" w:history="1">
             <w:r>
               <w:rPr>
                 <w:rStyle w:val="Hipervnculo"/>
@@ -987,7 +987,7 @@
                 <w:noProof/>
                 <w:webHidden/>
               </w:rPr>
-              <w:instrText xml:space="preserve"> PAGEREF _Toc231937823 \h </w:instrText>
+              <w:instrText xml:space="preserve"> PAGEREF _Toc232187678 \h </w:instrText>
             </w:r>
             <w:r>
               <w:rPr>
@@ -1033,7 +1033,7 @@
               <w14:ligatures w14:val="standardContextual"/>
             </w:rPr>
           </w:pPr>
-          <w:hyperlink w:anchor="_Toc231937824" w:history="1">
+          <w:hyperlink w:anchor="_Toc232187679" w:history="1">
             <w:r>
               <w:rPr>
                 <w:rStyle w:val="Hipervnculo"/>
@@ -1060,7 +1060,7 @@
                 <w:noProof/>
                 <w:webHidden/>
               </w:rPr>
-              <w:instrText xml:space="preserve"> PAGEREF _Toc231937824 \h </w:instrText>
+              <w:instrText xml:space="preserve"> PAGEREF _Toc232187679 \h </w:instrText>
             </w:r>
             <w:r>
               <w:rPr>
@@ -1103,7 +1103,7 @@
               <w:lang w:eastAsia="es-AR"/>
             </w:rPr>
           </w:pPr>
-          <w:hyperlink w:anchor="_Toc231937825" w:history="1">
+          <w:hyperlink w:anchor="_Toc232187680" w:history="1">
             <w:r>
               <w:rPr>
                 <w:rStyle w:val="Hipervnculo"/>
@@ -1132,7 +1132,7 @@
                 <w:noProof/>
                 <w:webHidden/>
               </w:rPr>
-              <w:instrText xml:space="preserve"> PAGEREF _Toc231937825 \h </w:instrText>
+              <w:instrText xml:space="preserve"> PAGEREF _Toc232187680 \h </w:instrText>
             </w:r>
             <w:r>
               <w:rPr>
@@ -1175,7 +1175,7 @@
               <w:lang w:eastAsia="es-AR"/>
             </w:rPr>
           </w:pPr>
-          <w:hyperlink w:anchor="_Toc231937826" w:history="1">
+          <w:hyperlink w:anchor="_Toc232187681" w:history="1">
             <w:r>
               <w:rPr>
                 <w:rStyle w:val="Hipervnculo"/>
@@ -1203,7 +1203,7 @@
                 <w:noProof/>
                 <w:webHidden/>
               </w:rPr>
-              <w:instrText xml:space="preserve"> PAGEREF _Toc231937826 \h </w:instrText>
+              <w:instrText xml:space="preserve"> PAGEREF _Toc232187681 \h </w:instrText>
             </w:r>
             <w:r>
               <w:rPr>
@@ -1249,7 +1249,7 @@
               <w14:ligatures w14:val="standardContextual"/>
             </w:rPr>
           </w:pPr>
-          <w:hyperlink w:anchor="_Toc231937827" w:history="1">
+          <w:hyperlink w:anchor="_Toc232187682" w:history="1">
             <w:r>
               <w:rPr>
                 <w:rStyle w:val="Hipervnculo"/>
@@ -1276,7 +1276,7 @@
                 <w:noProof/>
                 <w:webHidden/>
               </w:rPr>
-              <w:instrText xml:space="preserve"> PAGEREF _Toc231937827 \h </w:instrText>
+              <w:instrText xml:space="preserve"> PAGEREF _Toc232187682 \h </w:instrText>
             </w:r>
             <w:r>
               <w:rPr>
@@ -1322,7 +1322,7 @@
               <w14:ligatures w14:val="standardContextual"/>
             </w:rPr>
           </w:pPr>
-          <w:hyperlink w:anchor="_Toc231937828" w:history="1">
+          <w:hyperlink w:anchor="_Toc232187683" w:history="1">
             <w:r>
               <w:rPr>
                 <w:rStyle w:val="Hipervnculo"/>
@@ -1349,7 +1349,7 @@
                 <w:noProof/>
                 <w:webHidden/>
               </w:rPr>
-              <w:instrText xml:space="preserve"> PAGEREF _Toc231937828 \h </w:instrText>
+              <w:instrText xml:space="preserve"> PAGEREF _Toc232187683 \h </w:instrText>
             </w:r>
             <w:r>
               <w:rPr>
@@ -1392,7 +1392,7 @@
               <w:lang w:eastAsia="es-AR"/>
             </w:rPr>
           </w:pPr>
-          <w:hyperlink w:anchor="_Toc231937829" w:history="1">
+          <w:hyperlink w:anchor="_Toc232187684" w:history="1">
             <w:r>
               <w:rPr>
                 <w:rStyle w:val="Hipervnculo"/>
@@ -1421,7 +1421,7 @@
                 <w:noProof/>
                 <w:webHidden/>
               </w:rPr>
-              <w:instrText xml:space="preserve"> PAGEREF _Toc231937829 \h </w:instrText>
+              <w:instrText xml:space="preserve"> PAGEREF _Toc232187684 \h </w:instrText>
             </w:r>
             <w:r>
               <w:rPr>
@@ -1489,7 +1489,7 @@
         <w:br w:type="page"/>
       </w:r>
     </w:p>
-    <w:bookmarkStart w:id="2" w:name="_Toc231937822"/>
+    <w:bookmarkStart w:id="2" w:name="_Toc232187677"/>
     <w:p>
       <w:pPr>
         <w:pStyle w:val="Ttulo1"/>
@@ -1573,7 +1573,321 @@
     <w:p>
       <w:pPr>
         <w:spacing w:before="240"/>
-        <w:jc w:val="center"/>
+        <w:rPr>
+          <w:rFonts w:eastAsia="Times New Roman" w:cstheme="minorHAnsi"/>
+          <w:kern w:val="0"/>
+          <w:lang w:eastAsia="es-AR"/>
+          <w14:ligatures w14:val="none"/>
+        </w:rPr>
+      </w:pPr>
+      <w:r>
+        <w:rPr>
+          <w:rFonts w:eastAsia="Times New Roman" w:cstheme="minorHAnsi"/>
+          <w:kern w:val="0"/>
+          <w:lang w:eastAsia="es-AR"/>
+          <w14:ligatures w14:val="none"/>
+        </w:rPr>
+        <w:t xml:space="preserve">El presente informe documenta el desarrollo del </w:t>
+      </w:r>
+      <w:r>
+        <w:rPr>
+          <w:rFonts w:eastAsia="Times New Roman" w:cstheme="minorHAnsi"/>
+          <w:b/>
+          <w:bCs/>
+          <w:kern w:val="0"/>
+          <w:lang w:eastAsia="es-AR"/>
+          <w14:ligatures w14:val="none"/>
+        </w:rPr>
+        <w:t>Trabajo Práctico Integrador 2026</w:t>
+      </w:r>
+      <w:r>
+        <w:rPr>
+          <w:rFonts w:eastAsia="Times New Roman" w:cstheme="minorHAnsi"/>
+          <w:kern w:val="0"/>
+          <w:lang w:eastAsia="es-AR"/>
+          <w14:ligatures w14:val="none"/>
+        </w:rPr>
+        <w:t xml:space="preserve"> de la cátedra de </w:t>
+      </w:r>
+      <w:r>
+        <w:rPr>
+          <w:rFonts w:eastAsia="Times New Roman" w:cstheme="minorHAnsi"/>
+          <w:b/>
+          <w:bCs/>
+          <w:kern w:val="0"/>
+          <w:lang w:eastAsia="es-AR"/>
+          <w14:ligatures w14:val="none"/>
+        </w:rPr>
+        <w:t>Paradigmas y Lenguajes de Programación</w:t>
+      </w:r>
+      <w:r>
+        <w:rPr>
+          <w:rFonts w:eastAsia="Times New Roman" w:cstheme="minorHAnsi"/>
+          <w:kern w:val="0"/>
+          <w:lang w:eastAsia="es-AR"/>
+          <w14:ligatures w14:val="none"/>
+        </w:rPr>
+        <w:t xml:space="preserve"> de la carrera Licenciatura en Sistemas de Información de la </w:t>
+      </w:r>
+      <w:proofErr w:type="spellStart"/>
+      <w:r>
+        <w:rPr>
+          <w:rFonts w:eastAsia="Times New Roman" w:cstheme="minorHAnsi"/>
+          <w:b/>
+          <w:bCs/>
+          <w:kern w:val="0"/>
+          <w:lang w:eastAsia="es-AR"/>
+          <w14:ligatures w14:val="none"/>
+        </w:rPr>
+        <w:t>FaCENA</w:t>
+      </w:r>
+      <w:proofErr w:type="spellEnd"/>
+      <w:r>
+        <w:rPr>
+          <w:rFonts w:eastAsia="Times New Roman" w:cstheme="minorHAnsi"/>
+          <w:b/>
+          <w:bCs/>
+          <w:kern w:val="0"/>
+          <w:lang w:eastAsia="es-AR"/>
+          <w14:ligatures w14:val="none"/>
+        </w:rPr>
+        <w:t xml:space="preserve"> – UNNE</w:t>
+      </w:r>
+      <w:r>
+        <w:rPr>
+          <w:rFonts w:eastAsia="Times New Roman" w:cstheme="minorHAnsi"/>
+          <w:kern w:val="0"/>
+          <w:lang w:eastAsia="es-AR"/>
+          <w14:ligatures w14:val="none"/>
+        </w:rPr>
+        <w:t>.</w:t>
+      </w:r>
+    </w:p>
+    <w:p>
+      <w:pPr>
+        <w:spacing w:before="240"/>
+        <w:rPr>
+          <w:rFonts w:eastAsia="Times New Roman" w:cstheme="minorHAnsi"/>
+          <w:kern w:val="0"/>
+          <w:lang w:eastAsia="es-AR"/>
+          <w14:ligatures w14:val="none"/>
+        </w:rPr>
+      </w:pPr>
+      <w:r>
+        <w:rPr>
+          <w:rFonts w:eastAsia="Times New Roman" w:cstheme="minorHAnsi"/>
+          <w:kern w:val="0"/>
+          <w:lang w:eastAsia="es-AR"/>
+          <w14:ligatures w14:val="none"/>
+        </w:rPr>
+        <w:t xml:space="preserve">El trabajo consiste en el modelado de un </w:t>
+      </w:r>
+      <w:r>
+        <w:rPr>
+          <w:rFonts w:eastAsia="Times New Roman" w:cstheme="minorHAnsi"/>
+          <w:b/>
+          <w:bCs/>
+          <w:kern w:val="0"/>
+          <w:lang w:eastAsia="es-AR"/>
+          <w14:ligatures w14:val="none"/>
+        </w:rPr>
+        <w:t>Sistema de Semáforos Inteligentes</w:t>
+      </w:r>
+      <w:r>
+        <w:rPr>
+          <w:rFonts w:eastAsia="Times New Roman" w:cstheme="minorHAnsi"/>
+          <w:kern w:val="0"/>
+          <w:lang w:eastAsia="es-AR"/>
+          <w14:ligatures w14:val="none"/>
+        </w:rPr>
+        <w:t xml:space="preserve"> implementado en </w:t>
+      </w:r>
+      <w:r>
+        <w:rPr>
+          <w:rFonts w:eastAsia="Times New Roman" w:cstheme="minorHAnsi"/>
+          <w:b/>
+          <w:bCs/>
+          <w:kern w:val="0"/>
+          <w:lang w:eastAsia="es-AR"/>
+          <w14:ligatures w14:val="none"/>
+        </w:rPr>
+        <w:t>Common Lisp</w:t>
+      </w:r>
+      <w:r>
+        <w:rPr>
+          <w:rFonts w:eastAsia="Times New Roman" w:cstheme="minorHAnsi"/>
+          <w:kern w:val="0"/>
+          <w:lang w:eastAsia="es-AR"/>
+          <w14:ligatures w14:val="none"/>
+        </w:rPr>
+        <w:t xml:space="preserve">, con un análisis comparativo paralelo en </w:t>
+      </w:r>
+      <w:proofErr w:type="spellStart"/>
+      <w:r>
+        <w:rPr>
+          <w:rFonts w:eastAsia="Times New Roman" w:cstheme="minorHAnsi"/>
+          <w:b/>
+          <w:bCs/>
+          <w:kern w:val="0"/>
+          <w:lang w:eastAsia="es-AR"/>
+          <w14:ligatures w14:val="none"/>
+        </w:rPr>
+        <w:t>OCaml</w:t>
+      </w:r>
+      <w:proofErr w:type="spellEnd"/>
+      <w:r>
+        <w:rPr>
+          <w:rFonts w:eastAsia="Times New Roman" w:cstheme="minorHAnsi"/>
+          <w:kern w:val="0"/>
+          <w:lang w:eastAsia="es-AR"/>
+          <w14:ligatures w14:val="none"/>
+        </w:rPr>
+        <w:t xml:space="preserve">, lenguaje asignado al grupo por sorteo entre diversas alternativas funcionales. Los grupos de trabajo fueron conformados de manera aleatoria, lo que sumó al desafío técnico la experiencia de coordinar y colaborar con compañeros no elegidos previamente. En él se incorporan y profundizan los conceptos trabajados a lo largo de la cursada sobre </w:t>
+      </w:r>
+      <w:r>
+        <w:rPr>
+          <w:rFonts w:eastAsia="Times New Roman" w:cstheme="minorHAnsi"/>
+          <w:b/>
+          <w:bCs/>
+          <w:kern w:val="0"/>
+          <w:lang w:eastAsia="es-AR"/>
+          <w14:ligatures w14:val="none"/>
+        </w:rPr>
+        <w:t>recursividad</w:t>
+      </w:r>
+      <w:r>
+        <w:rPr>
+          <w:rFonts w:eastAsia="Times New Roman" w:cstheme="minorHAnsi"/>
+          <w:kern w:val="0"/>
+          <w:lang w:eastAsia="es-AR"/>
+          <w14:ligatures w14:val="none"/>
+        </w:rPr>
+        <w:t xml:space="preserve"> y el </w:t>
+      </w:r>
+      <w:r>
+        <w:rPr>
+          <w:rFonts w:eastAsia="Times New Roman" w:cstheme="minorHAnsi"/>
+          <w:b/>
+          <w:bCs/>
+          <w:kern w:val="0"/>
+          <w:lang w:eastAsia="es-AR"/>
+          <w14:ligatures w14:val="none"/>
+        </w:rPr>
+        <w:t>paradigma funcional</w:t>
+      </w:r>
+      <w:r>
+        <w:rPr>
+          <w:rFonts w:eastAsia="Times New Roman" w:cstheme="minorHAnsi"/>
+          <w:kern w:val="0"/>
+          <w:lang w:eastAsia="es-AR"/>
+          <w14:ligatures w14:val="none"/>
+        </w:rPr>
+        <w:t xml:space="preserve">, aplicándolos sobre un problema concreto que exigió explorar con mayor detalle aspectos como la </w:t>
+      </w:r>
+      <w:r>
+        <w:rPr>
+          <w:rFonts w:eastAsia="Times New Roman" w:cstheme="minorHAnsi"/>
+          <w:b/>
+          <w:bCs/>
+          <w:kern w:val="0"/>
+          <w:lang w:eastAsia="es-AR"/>
+          <w14:ligatures w14:val="none"/>
+        </w:rPr>
+        <w:t>pureza de funciones</w:t>
+      </w:r>
+      <w:r>
+        <w:rPr>
+          <w:rFonts w:eastAsia="Times New Roman" w:cstheme="minorHAnsi"/>
+          <w:kern w:val="0"/>
+          <w:lang w:eastAsia="es-AR"/>
+          <w14:ligatures w14:val="none"/>
+        </w:rPr>
+        <w:t xml:space="preserve">, la </w:t>
+      </w:r>
+      <w:r>
+        <w:rPr>
+          <w:rFonts w:eastAsia="Times New Roman" w:cstheme="minorHAnsi"/>
+          <w:b/>
+          <w:bCs/>
+          <w:kern w:val="0"/>
+          <w:lang w:eastAsia="es-AR"/>
+          <w14:ligatures w14:val="none"/>
+        </w:rPr>
+        <w:t>inmutabilidad</w:t>
+      </w:r>
+      <w:r>
+        <w:rPr>
+          <w:rFonts w:eastAsia="Times New Roman" w:cstheme="minorHAnsi"/>
+          <w:kern w:val="0"/>
+          <w:lang w:eastAsia="es-AR"/>
+          <w14:ligatures w14:val="none"/>
+        </w:rPr>
+        <w:t xml:space="preserve"> y el manejo de </w:t>
+      </w:r>
+      <w:r>
+        <w:rPr>
+          <w:rFonts w:eastAsia="Times New Roman" w:cstheme="minorHAnsi"/>
+          <w:b/>
+          <w:bCs/>
+          <w:kern w:val="0"/>
+          <w:lang w:eastAsia="es-AR"/>
+          <w14:ligatures w14:val="none"/>
+        </w:rPr>
+        <w:t>efectos secundarios</w:t>
+      </w:r>
+      <w:r>
+        <w:rPr>
+          <w:rFonts w:eastAsia="Times New Roman" w:cstheme="minorHAnsi"/>
+          <w:kern w:val="0"/>
+          <w:lang w:eastAsia="es-AR"/>
+          <w14:ligatures w14:val="none"/>
+        </w:rPr>
+        <w:t>.</w:t>
+      </w:r>
+    </w:p>
+    <w:p>
+      <w:pPr>
+        <w:spacing w:before="240"/>
+        <w:rPr>
+          <w:rFonts w:eastAsia="Times New Roman" w:cstheme="minorHAnsi"/>
+          <w:kern w:val="0"/>
+          <w:lang w:eastAsia="es-AR"/>
+          <w14:ligatures w14:val="none"/>
+        </w:rPr>
+      </w:pPr>
+      <w:r>
+        <w:rPr>
+          <w:rFonts w:eastAsia="Times New Roman" w:cstheme="minorHAnsi"/>
+          <w:kern w:val="0"/>
+          <w:lang w:eastAsia="es-AR"/>
+          <w14:ligatures w14:val="none"/>
+        </w:rPr>
+        <w:t xml:space="preserve">Como herramienta de trabajo colaborativo se utilizó </w:t>
+      </w:r>
+      <w:r>
+        <w:rPr>
+          <w:rFonts w:eastAsia="Times New Roman" w:cstheme="minorHAnsi"/>
+          <w:b/>
+          <w:bCs/>
+          <w:kern w:val="0"/>
+          <w:lang w:eastAsia="es-AR"/>
+          <w14:ligatures w14:val="none"/>
+        </w:rPr>
+        <w:t>GitHub</w:t>
+      </w:r>
+      <w:r>
+        <w:rPr>
+          <w:rFonts w:eastAsia="Times New Roman" w:cstheme="minorHAnsi"/>
+          <w:kern w:val="0"/>
+          <w:lang w:eastAsia="es-AR"/>
+          <w14:ligatures w14:val="none"/>
+        </w:rPr>
+        <w:t>, donde se encuentra disponible no solo el código fuente de ambas implementaciones, sino también toda la documentación asociada al proyecto, reflejando el proceso de desarrollo y toma de decisiones del grupo a lo largo del trabajo.</w:t>
+      </w:r>
+    </w:p>
+    <w:p>
+      <w:pPr>
+        <w:spacing w:before="240"/>
         <w:rPr>
           <w:b/>
           <w:bCs/>
@@ -1617,7 +1931,7 @@
         <w:br w:type="page"/>
       </w:r>
     </w:p>
-    <w:bookmarkStart w:id="3" w:name="_Toc231937823"/>
+    <w:bookmarkStart w:id="3" w:name="_Toc232187678"/>
     <w:p>
       <w:pPr>
         <w:pStyle w:val="Ttulo1"/>
@@ -1697,7 +2011,8 @@
       </w:r>
       <w:bookmarkEnd w:id="3"/>
     </w:p>
-    <w:bookmarkStart w:id="4" w:name="_Toc231937824"/>
+    <w:p/>
+    <w:bookmarkStart w:id="4" w:name="_Toc232187679"/>
     <w:p>
       <w:pPr>
         <w:pStyle w:val="Ttulo2"/>
@@ -1785,12 +2100,26 @@
           <w:bCs/>
         </w:rPr>
       </w:pPr>
-      <w:proofErr w:type="spellStart"/>
-      <w:r>
-        <w:rPr>
-          <w:rFonts w:ascii="Calibri" w:hAnsi="Calibri" w:cs="Calibri"/>
-          <w:b/>
-          <w:bCs/>
+      <w:r>
+        <w:rPr>
+          <w:rFonts w:ascii="Calibri" w:hAnsi="Calibri" w:cs="Calibri"/>
+          <w:b/>
+          <w:bCs/>
+        </w:rPr>
+        <w:t>Presentación del lenguaje</w:t>
+      </w:r>
+    </w:p>
+    <w:p>
+      <w:pPr>
+        <w:jc w:val="both"/>
+        <w:rPr>
+          <w:rFonts w:ascii="Calibri" w:hAnsi="Calibri" w:cs="Calibri"/>
+        </w:rPr>
+      </w:pPr>
+      <w:proofErr w:type="spellStart"/>
+      <w:r>
+        <w:rPr>
+          <w:rFonts w:ascii="Calibri" w:hAnsi="Calibri" w:cs="Calibri"/>
         </w:rPr>
         <w:t>OCaml</w:t>
       </w:r>
@@ -1798,10 +2127,8 @@
       <w:r>
         <w:rPr>
           <w:rFonts w:ascii="Calibri" w:hAnsi="Calibri" w:cs="Calibri"/>
-          <w:b/>
-          <w:bCs/>
-        </w:rPr>
-        <w:t>: Presentación del lenguaje</w:t>
+        </w:rPr>
+        <w:t xml:space="preserve"> es un lenguaje de programación funcional, de tipado estático y maduro que combina potencia y pragmatismo, siendo ideal para construir sistemas de software complejos. Fue creado en 1996 por Xavier Leroy, Jérôme Vouillon, Damien Doligez y Didier Rémy en el instituto de investigación INRIA, en Francia.</w:t>
       </w:r>
     </w:p>
     <w:p>
@@ -1811,56 +2138,12 @@
           <w:rFonts w:ascii="Calibri" w:hAnsi="Calibri" w:cs="Calibri"/>
         </w:rPr>
       </w:pPr>
-      <w:proofErr w:type="spellStart"/>
-      <w:r>
-        <w:rPr>
-          <w:rFonts w:ascii="Calibri" w:hAnsi="Calibri" w:cs="Calibri"/>
-        </w:rPr>
-        <w:t>OCaml</w:t>
-      </w:r>
-      <w:proofErr w:type="spellEnd"/>
-      <w:r>
-        <w:rPr>
-          <w:rFonts w:ascii="Calibri" w:hAnsi="Calibri" w:cs="Calibri"/>
-        </w:rPr>
-        <w:t xml:space="preserve"> es un lenguaje de programación funcional, de tipado estático y maduro que combina potencia y pragmatismo, siendo ideal para construir sistemas de software complejos. Fue creado en 1996 por Xavier Leroy, Jérôme Vouillon, Damien Doligez y Didier Rémy en el instituto de investigación INRIA, en Francia. </w:t>
-      </w:r>
-      <w:hyperlink r:id="rId10" w:tgtFrame="_blank" w:history="1">
-        <w:proofErr w:type="spellStart"/>
-        <w:r>
-          <w:rPr>
-            <w:rStyle w:val="Hipervnculo"/>
-            <w:rFonts w:ascii="Calibri" w:hAnsi="Calibri" w:cs="Calibri"/>
-          </w:rPr>
-          <w:t>ocaml</w:t>
-        </w:r>
-        <w:proofErr w:type="spellEnd"/>
-      </w:hyperlink>
-    </w:p>
-    <w:p>
-      <w:pPr>
-        <w:jc w:val="both"/>
-        <w:rPr>
-          <w:rFonts w:ascii="Calibri" w:hAnsi="Calibri" w:cs="Calibri"/>
-        </w:rPr>
-      </w:pPr>
-      <w:r>
-        <w:rPr>
-          <w:rFonts w:ascii="Calibri" w:hAnsi="Calibri" w:cs="Calibri"/>
-        </w:rPr>
-        <w:t xml:space="preserve">Entre sus características principales se destacan la recolección de basura generacional para la gestión automática de memoria, funciones de primera clase, verificación estática de tipos, inferencia de tipos, polimorfismo paramétrico, programación inmutable, tipos de datos algebraicos y coincidencia de patrones. </w:t>
-      </w:r>
-      <w:hyperlink r:id="rId11" w:tgtFrame="_blank" w:history="1">
-        <w:proofErr w:type="spellStart"/>
-        <w:r>
-          <w:rPr>
-            <w:rStyle w:val="Hipervnculo"/>
-            <w:rFonts w:ascii="Calibri" w:hAnsi="Calibri" w:cs="Calibri"/>
-          </w:rPr>
-          <w:t>ocaml</w:t>
-        </w:r>
-        <w:proofErr w:type="spellEnd"/>
-      </w:hyperlink>
+      <w:r>
+        <w:rPr>
+          <w:rFonts w:ascii="Calibri" w:hAnsi="Calibri" w:cs="Calibri"/>
+        </w:rPr>
+        <w:t>Entre sus características principales se destacan la recolección de basura generacional para la gestión automática de memoria, funciones de primera clase, verificación estática de tipos, inferencia de tipos, polimorfismo paramétrico, programación inmutable, tipos de datos algebraicos y coincidencia de patrones.</w:t>
+      </w:r>
     </w:p>
     <w:p>
       <w:pPr>
@@ -2381,6 +2664,7 @@
           <w:lang w:eastAsia="es-AR"/>
           <w14:ligatures w14:val="none"/>
         </w:rPr>
+        <w:lastRenderedPageBreak/>
         <w:t xml:space="preserve">Esto demuestra que </w:t>
       </w:r>
       <w:proofErr w:type="spellStart"/>
@@ -2741,7 +3025,7 @@
         </w:rPr>
         <w:t xml:space="preserve">, puede accederse al sitio oficial del lenguaje en la sección dedicada a usuarios industriales: </w:t>
       </w:r>
-      <w:hyperlink r:id="rId12" w:history="1">
+      <w:hyperlink r:id="rId10" w:history="1">
         <w:r>
           <w:rPr>
             <w:rStyle w:val="Hipervnculo"/>
@@ -2824,7 +3108,7 @@
                     <pic:cNvPicPr/>
                   </pic:nvPicPr>
                   <pic:blipFill>
-                    <a:blip r:embed="rId13"/>
+                    <a:blip r:embed="rId11"/>
                     <a:stretch>
                       <a:fillRect/>
                     </a:stretch>
@@ -2961,6 +3245,7 @@
           <w:b/>
           <w:bCs/>
         </w:rPr>
+        <w:lastRenderedPageBreak/>
         <w:t>OCaml</w:t>
       </w:r>
       <w:proofErr w:type="spellEnd"/>
@@ -3025,7 +3310,6 @@
           <w:bCs/>
           <w:color w:val="C00000"/>
         </w:rPr>
-        <w:lastRenderedPageBreak/>
         <w:t>Pregunta 1</w:t>
       </w:r>
     </w:p>
@@ -3098,7 +3382,7 @@
                     <pic:cNvPicPr/>
                   </pic:nvPicPr>
                   <pic:blipFill>
-                    <a:blip r:embed="rId14" cstate="print">
+                    <a:blip r:embed="rId12" cstate="print">
                       <a:extLst>
                         <a:ext uri="{28A0092B-C50C-407E-A947-70E740481C1C}">
                           <a14:useLocalDpi xmlns:a14="http://schemas.microsoft.com/office/drawing/2010/main" val="0"/>
@@ -3470,6 +3754,7 @@
         <w:rPr>
           <w:rFonts w:ascii="Calibri" w:hAnsi="Calibri" w:cs="Calibri"/>
         </w:rPr>
+        <w:lastRenderedPageBreak/>
         <w:t xml:space="preserve">Este comportamiento es similar al de Lisp, donde construcciones como </w:t>
       </w:r>
       <w:proofErr w:type="spellStart"/>
@@ -3511,7 +3796,6 @@
         <w:rPr>
           <w:rFonts w:ascii="Calibri" w:hAnsi="Calibri" w:cs="Calibri"/>
         </w:rPr>
-        <w:lastRenderedPageBreak/>
         <w:t>(</w:t>
       </w:r>
       <w:proofErr w:type="spellStart"/>
@@ -3642,7 +3926,7 @@
         <w:br w:type="page"/>
       </w:r>
     </w:p>
-    <w:bookmarkStart w:id="5" w:name="_Toc231937825"/>
+    <w:bookmarkStart w:id="5" w:name="_Toc232187680"/>
     <w:p>
       <w:pPr>
         <w:pStyle w:val="Ttulo1"/>
@@ -4337,7 +4621,7 @@
                     <pic:cNvPicPr/>
                   </pic:nvPicPr>
                   <pic:blipFill>
-                    <a:blip r:embed="rId15">
+                    <a:blip r:embed="rId13">
                       <a:extLst>
                         <a:ext uri="{28A0092B-C50C-407E-A947-70E740481C1C}">
                           <a14:useLocalDpi xmlns:a14="http://schemas.microsoft.com/office/drawing/2010/main" val="0"/>
@@ -4433,7 +4717,7 @@
                     <pic:cNvPicPr/>
                   </pic:nvPicPr>
                   <pic:blipFill rotWithShape="1">
-                    <a:blip r:embed="rId16"/>
+                    <a:blip r:embed="rId14"/>
                     <a:srcRect l="4112"/>
                     <a:stretch>
                       <a:fillRect/>
@@ -4489,7 +4773,7 @@
                     <pic:cNvPicPr/>
                   </pic:nvPicPr>
                   <pic:blipFill rotWithShape="1">
-                    <a:blip r:embed="rId17"/>
+                    <a:blip r:embed="rId15"/>
                     <a:srcRect b="35193"/>
                     <a:stretch>
                       <a:fillRect/>
@@ -4568,7 +4852,7 @@
                     <pic:cNvPicPr/>
                   </pic:nvPicPr>
                   <pic:blipFill>
-                    <a:blip r:embed="rId18"/>
+                    <a:blip r:embed="rId16"/>
                     <a:stretch>
                       <a:fillRect/>
                     </a:stretch>
@@ -5078,7 +5362,7 @@
                     <pic:cNvPicPr/>
                   </pic:nvPicPr>
                   <pic:blipFill>
-                    <a:blip r:embed="rId19"/>
+                    <a:blip r:embed="rId17"/>
                     <a:stretch>
                       <a:fillRect/>
                     </a:stretch>
@@ -5134,7 +5418,7 @@
                     <pic:cNvPicPr/>
                   </pic:nvPicPr>
                   <pic:blipFill>
-                    <a:blip r:embed="rId20"/>
+                    <a:blip r:embed="rId18"/>
                     <a:stretch>
                       <a:fillRect/>
                     </a:stretch>
@@ -5418,7 +5702,7 @@
                     <pic:cNvPicPr/>
                   </pic:nvPicPr>
                   <pic:blipFill>
-                    <a:blip r:embed="rId21"/>
+                    <a:blip r:embed="rId19"/>
                     <a:stretch>
                       <a:fillRect/>
                     </a:stretch>
@@ -5469,7 +5753,7 @@
                     <pic:cNvPicPr/>
                   </pic:nvPicPr>
                   <pic:blipFill>
-                    <a:blip r:embed="rId22"/>
+                    <a:blip r:embed="rId20"/>
                     <a:stretch>
                       <a:fillRect/>
                     </a:stretch>
@@ -5933,7 +6217,7 @@
                     <pic:cNvPicPr/>
                   </pic:nvPicPr>
                   <pic:blipFill>
-                    <a:blip r:embed="rId23"/>
+                    <a:blip r:embed="rId21"/>
                     <a:stretch>
                       <a:fillRect/>
                     </a:stretch>
@@ -5984,7 +6268,7 @@
                     <pic:cNvPicPr/>
                   </pic:nvPicPr>
                   <pic:blipFill>
-                    <a:blip r:embed="rId24"/>
+                    <a:blip r:embed="rId22"/>
                     <a:stretch>
                       <a:fillRect/>
                     </a:stretch>
@@ -6056,7 +6340,7 @@
                     <pic:cNvPicPr/>
                   </pic:nvPicPr>
                   <pic:blipFill>
-                    <a:blip r:embed="rId25"/>
+                    <a:blip r:embed="rId23"/>
                     <a:stretch>
                       <a:fillRect/>
                     </a:stretch>
@@ -6279,6 +6563,7 @@
         <w:jc w:val="both"/>
         <w:rPr>
           <w:rFonts w:ascii="Calibri" w:hAnsi="Calibri" w:cs="Calibri"/>
+          <w:lang w:val="en-US"/>
         </w:rPr>
       </w:pPr>
       <w:r>
@@ -6286,152 +6571,9 @@
           <w:rFonts w:ascii="Calibri" w:hAnsi="Calibri" w:cs="Calibri"/>
           <w:i/>
           <w:iCs/>
-        </w:rPr>
-        <w:t xml:space="preserve">"Lock </w:t>
-      </w:r>
-      <w:proofErr w:type="spellStart"/>
-      <w:r>
-        <w:rPr>
-          <w:rFonts w:ascii="Calibri" w:hAnsi="Calibri" w:cs="Calibri"/>
-          <w:i/>
-          <w:iCs/>
-        </w:rPr>
-        <w:t>on</w:t>
-      </w:r>
-      <w:proofErr w:type="spellEnd"/>
-      <w:r>
-        <w:rPr>
-          <w:rFonts w:ascii="Calibri" w:hAnsi="Calibri" w:cs="Calibri"/>
-          <w:i/>
-          <w:iCs/>
-        </w:rPr>
-        <w:t xml:space="preserve"> </w:t>
-      </w:r>
-      <w:proofErr w:type="spellStart"/>
-      <w:r>
-        <w:rPr>
-          <w:rFonts w:ascii="Calibri" w:hAnsi="Calibri" w:cs="Calibri"/>
-          <w:i/>
-          <w:iCs/>
-        </w:rPr>
-        <w:t>package</w:t>
-      </w:r>
-      <w:proofErr w:type="spellEnd"/>
-      <w:r>
-        <w:rPr>
-          <w:rFonts w:ascii="Calibri" w:hAnsi="Calibri" w:cs="Calibri"/>
-          <w:i/>
-          <w:iCs/>
-        </w:rPr>
-        <w:t xml:space="preserve"> SB-EXT </w:t>
-      </w:r>
-      <w:proofErr w:type="spellStart"/>
-      <w:r>
-        <w:rPr>
-          <w:rFonts w:ascii="Calibri" w:hAnsi="Calibri" w:cs="Calibri"/>
-          <w:i/>
-          <w:iCs/>
-        </w:rPr>
-        <w:t>violated</w:t>
-      </w:r>
-      <w:proofErr w:type="spellEnd"/>
-      <w:r>
-        <w:rPr>
-          <w:rFonts w:ascii="Calibri" w:hAnsi="Calibri" w:cs="Calibri"/>
-          <w:i/>
-          <w:iCs/>
-        </w:rPr>
-        <w:t xml:space="preserve"> </w:t>
-      </w:r>
-      <w:proofErr w:type="spellStart"/>
-      <w:r>
-        <w:rPr>
-          <w:rFonts w:ascii="Calibri" w:hAnsi="Calibri" w:cs="Calibri"/>
-          <w:i/>
-          <w:iCs/>
-        </w:rPr>
-        <w:t>when</w:t>
-      </w:r>
-      <w:proofErr w:type="spellEnd"/>
-      <w:r>
-        <w:rPr>
-          <w:rFonts w:ascii="Calibri" w:hAnsi="Calibri" w:cs="Calibri"/>
-          <w:i/>
-          <w:iCs/>
-        </w:rPr>
-        <w:t xml:space="preserve"> </w:t>
-      </w:r>
-      <w:proofErr w:type="spellStart"/>
-      <w:r>
-        <w:rPr>
-          <w:rFonts w:ascii="Calibri" w:hAnsi="Calibri" w:cs="Calibri"/>
-          <w:i/>
-          <w:iCs/>
-        </w:rPr>
-        <w:t>proclaiming</w:t>
-      </w:r>
-      <w:proofErr w:type="spellEnd"/>
-      <w:r>
-        <w:rPr>
-          <w:rFonts w:ascii="Calibri" w:hAnsi="Calibri" w:cs="Calibri"/>
-          <w:i/>
-          <w:iCs/>
-        </w:rPr>
-        <w:t xml:space="preserve"> TIMER as a </w:t>
-      </w:r>
-      <w:proofErr w:type="spellStart"/>
-      <w:r>
-        <w:rPr>
-          <w:rFonts w:ascii="Calibri" w:hAnsi="Calibri" w:cs="Calibri"/>
-          <w:i/>
-          <w:iCs/>
-        </w:rPr>
-        <w:t>function</w:t>
-      </w:r>
-      <w:proofErr w:type="spellEnd"/>
-      <w:r>
-        <w:rPr>
-          <w:rFonts w:ascii="Calibri" w:hAnsi="Calibri" w:cs="Calibri"/>
-          <w:i/>
-          <w:iCs/>
-        </w:rPr>
-        <w:t xml:space="preserve"> </w:t>
-      </w:r>
-      <w:proofErr w:type="spellStart"/>
-      <w:r>
-        <w:rPr>
-          <w:rFonts w:ascii="Calibri" w:hAnsi="Calibri" w:cs="Calibri"/>
-          <w:i/>
-          <w:iCs/>
-        </w:rPr>
-        <w:t>while</w:t>
-      </w:r>
-      <w:proofErr w:type="spellEnd"/>
-      <w:r>
-        <w:rPr>
-          <w:rFonts w:ascii="Calibri" w:hAnsi="Calibri" w:cs="Calibri"/>
-          <w:i/>
-          <w:iCs/>
-        </w:rPr>
-        <w:t xml:space="preserve"> in </w:t>
-      </w:r>
-      <w:proofErr w:type="spellStart"/>
-      <w:r>
-        <w:rPr>
-          <w:rFonts w:ascii="Calibri" w:hAnsi="Calibri" w:cs="Calibri"/>
-          <w:i/>
-          <w:iCs/>
-        </w:rPr>
-        <w:t>package</w:t>
-      </w:r>
-      <w:proofErr w:type="spellEnd"/>
-      <w:r>
-        <w:rPr>
-          <w:rFonts w:ascii="Calibri" w:hAnsi="Calibri" w:cs="Calibri"/>
-          <w:i/>
-          <w:iCs/>
-        </w:rPr>
-        <w:t xml:space="preserve"> COMMON-LISP-USER."</w:t>
+          <w:lang w:val="en-US"/>
+        </w:rPr>
+        <w:t>"Lock on package SB-EXT violated when proclaiming TIMER as a function while in package COMMON-LISP-USER."</w:t>
       </w:r>
     </w:p>
     <w:p>
@@ -6747,7 +6889,7 @@
                     <pic:cNvPicPr/>
                   </pic:nvPicPr>
                   <pic:blipFill>
-                    <a:blip r:embed="rId26"/>
+                    <a:blip r:embed="rId24"/>
                     <a:stretch>
                       <a:fillRect/>
                     </a:stretch>
@@ -7163,7 +7305,7 @@
                     <pic:cNvPicPr/>
                   </pic:nvPicPr>
                   <pic:blipFill>
-                    <a:blip r:embed="rId27"/>
+                    <a:blip r:embed="rId25"/>
                     <a:stretch>
                       <a:fillRect/>
                     </a:stretch>
@@ -7232,7 +7374,7 @@
                     <pic:cNvPicPr/>
                   </pic:nvPicPr>
                   <pic:blipFill>
-                    <a:blip r:embed="rId28"/>
+                    <a:blip r:embed="rId26"/>
                     <a:stretch>
                       <a:fillRect/>
                     </a:stretch>
@@ -7268,7 +7410,7 @@
         <w:br w:type="page"/>
       </w:r>
     </w:p>
-    <w:bookmarkStart w:id="6" w:name="_Toc231937826"/>
+    <w:bookmarkStart w:id="6" w:name="_Toc232187681"/>
     <w:p>
       <w:pPr>
         <w:pStyle w:val="Ttulo1"/>
@@ -7359,7 +7501,7 @@
       <w:pPr>
         <w:pStyle w:val="Ttulo2"/>
       </w:pPr>
-      <w:bookmarkStart w:id="7" w:name="_Toc231937827"/>
+      <w:bookmarkStart w:id="7" w:name="_Toc232187682"/>
       <w:r>
         <w:t xml:space="preserve">Sobre </w:t>
       </w:r>
@@ -7463,7 +7605,7 @@
       <w:pPr>
         <w:pStyle w:val="Ttulo2"/>
       </w:pPr>
-      <w:bookmarkStart w:id="8" w:name="_Toc231937828"/>
+      <w:bookmarkStart w:id="8" w:name="_Toc232187683"/>
       <w:r>
         <w:lastRenderedPageBreak/>
         <w:t>Sobre el proyecto en general</w:t>
@@ -7517,7 +7659,7 @@
         <w:br w:type="page"/>
       </w:r>
     </w:p>
-    <w:bookmarkStart w:id="9" w:name="_Toc231937829"/>
+    <w:bookmarkStart w:id="9" w:name="_Toc232187684"/>
     <w:p>
       <w:pPr>
         <w:pStyle w:val="Ttulo1"/>
@@ -7643,12 +7785,62 @@
         <w:rPr>
           <w:rFonts w:ascii="Calibri" w:eastAsia="Times New Roman" w:hAnsi="Calibri" w:cs="Calibri"/>
           <w:kern w:val="0"/>
-          <w:lang w:eastAsia="es-AR"/>
+          <w:lang w:val="en-US" w:eastAsia="es-AR"/>
           <w14:ligatures w14:val="none"/>
         </w:rPr>
         <w:t>CaesarCipher</w:t>
       </w:r>
       <w:proofErr w:type="spellEnd"/>
+      <w:r>
+        <w:rPr>
+          <w:rFonts w:ascii="Calibri" w:eastAsia="Times New Roman" w:hAnsi="Calibri" w:cs="Calibri"/>
+          <w:kern w:val="0"/>
+          <w:lang w:val="en-US" w:eastAsia="es-AR"/>
+          <w14:ligatures w14:val="none"/>
+        </w:rPr>
+        <w:t>. (</w:t>
+      </w:r>
+      <w:proofErr w:type="spellStart"/>
+      <w:r>
+        <w:rPr>
+          <w:rFonts w:ascii="Calibri" w:eastAsia="Times New Roman" w:hAnsi="Calibri" w:cs="Calibri"/>
+          <w:kern w:val="0"/>
+          <w:lang w:val="en-US" w:eastAsia="es-AR"/>
+          <w14:ligatures w14:val="none"/>
+        </w:rPr>
+        <w:t>s.f.</w:t>
+      </w:r>
+      <w:proofErr w:type="spellEnd"/>
+      <w:r>
+        <w:rPr>
+          <w:rFonts w:ascii="Calibri" w:eastAsia="Times New Roman" w:hAnsi="Calibri" w:cs="Calibri"/>
+          <w:kern w:val="0"/>
+          <w:lang w:val="en-US" w:eastAsia="es-AR"/>
+          <w14:ligatures w14:val="none"/>
+        </w:rPr>
+        <w:t xml:space="preserve">). </w:t>
+      </w:r>
+      <w:r>
+        <w:rPr>
+          <w:rFonts w:ascii="Calibri" w:eastAsia="Times New Roman" w:hAnsi="Calibri" w:cs="Calibri"/>
+          <w:i/>
+          <w:iCs/>
+          <w:kern w:val="0"/>
+          <w:lang w:val="en-US" w:eastAsia="es-AR"/>
+          <w14:ligatures w14:val="none"/>
+        </w:rPr>
+        <w:t>Unix timestamp / Epoch time explained</w:t>
+      </w:r>
+      <w:r>
+        <w:rPr>
+          <w:rFonts w:ascii="Calibri" w:eastAsia="Times New Roman" w:hAnsi="Calibri" w:cs="Calibri"/>
+          <w:kern w:val="0"/>
+          <w:lang w:val="en-US" w:eastAsia="es-AR"/>
+          <w14:ligatures w14:val="none"/>
+        </w:rPr>
+        <w:t xml:space="preserve">. </w:t>
+      </w:r>
+      <w:proofErr w:type="spellStart"/>
       <w:r>
         <w:rPr>
           <w:rFonts w:ascii="Calibri" w:eastAsia="Times New Roman" w:hAnsi="Calibri" w:cs="Calibri"/>
@@ -7656,78 +7848,7 @@
           <w:lang w:eastAsia="es-AR"/>
           <w14:ligatures w14:val="none"/>
         </w:rPr>
-        <w:t xml:space="preserve">. (s.f.). </w:t>
-      </w:r>
-      <w:r>
-        <w:rPr>
-          <w:rFonts w:ascii="Calibri" w:eastAsia="Times New Roman" w:hAnsi="Calibri" w:cs="Calibri"/>
-          <w:i/>
-          <w:iCs/>
-          <w:kern w:val="0"/>
-          <w:lang w:eastAsia="es-AR"/>
-          <w14:ligatures w14:val="none"/>
-        </w:rPr>
-        <w:t xml:space="preserve">Unix </w:t>
-      </w:r>
-      <w:proofErr w:type="spellStart"/>
-      <w:r>
-        <w:rPr>
-          <w:rFonts w:ascii="Calibri" w:eastAsia="Times New Roman" w:hAnsi="Calibri" w:cs="Calibri"/>
-          <w:i/>
-          <w:iCs/>
-          <w:kern w:val="0"/>
-          <w:lang w:eastAsia="es-AR"/>
-          <w14:ligatures w14:val="none"/>
-        </w:rPr>
-        <w:t>timestamp</w:t>
-      </w:r>
-      <w:proofErr w:type="spellEnd"/>
-      <w:r>
-        <w:rPr>
-          <w:rFonts w:ascii="Calibri" w:eastAsia="Times New Roman" w:hAnsi="Calibri" w:cs="Calibri"/>
-          <w:i/>
-          <w:iCs/>
-          <w:kern w:val="0"/>
-          <w:lang w:eastAsia="es-AR"/>
-          <w14:ligatures w14:val="none"/>
-        </w:rPr>
-        <w:t xml:space="preserve"> / </w:t>
-      </w:r>
-      <w:proofErr w:type="spellStart"/>
-      <w:r>
-        <w:rPr>
-          <w:rFonts w:ascii="Calibri" w:eastAsia="Times New Roman" w:hAnsi="Calibri" w:cs="Calibri"/>
-          <w:i/>
-          <w:iCs/>
-          <w:kern w:val="0"/>
-          <w:lang w:eastAsia="es-AR"/>
-          <w14:ligatures w14:val="none"/>
-        </w:rPr>
-        <w:t>Epoch</w:t>
-      </w:r>
-      <w:proofErr w:type="spellEnd"/>
-      <w:r>
-        <w:rPr>
-          <w:rFonts w:ascii="Calibri" w:eastAsia="Times New Roman" w:hAnsi="Calibri" w:cs="Calibri"/>
-          <w:i/>
-          <w:iCs/>
-          <w:kern w:val="0"/>
-          <w:lang w:eastAsia="es-AR"/>
-          <w14:ligatures w14:val="none"/>
-        </w:rPr>
-        <w:t xml:space="preserve"> time </w:t>
-      </w:r>
-      <w:proofErr w:type="spellStart"/>
-      <w:r>
-        <w:rPr>
-          <w:rFonts w:ascii="Calibri" w:eastAsia="Times New Roman" w:hAnsi="Calibri" w:cs="Calibri"/>
-          <w:i/>
-          <w:iCs/>
-          <w:kern w:val="0"/>
-          <w:lang w:eastAsia="es-AR"/>
-          <w14:ligatures w14:val="none"/>
-        </w:rPr>
-        <w:t>explained</w:t>
+        <w:t>CaesarCipher</w:t>
       </w:r>
       <w:proofErr w:type="spellEnd"/>
       <w:r>
@@ -7739,27 +7860,7 @@
         </w:rPr>
         <w:t xml:space="preserve">. </w:t>
       </w:r>
-      <w:proofErr w:type="spellStart"/>
-      <w:r>
-        <w:rPr>
-          <w:rFonts w:ascii="Calibri" w:eastAsia="Times New Roman" w:hAnsi="Calibri" w:cs="Calibri"/>
-          <w:kern w:val="0"/>
-          <w:lang w:eastAsia="es-AR"/>
-          <w14:ligatures w14:val="none"/>
-        </w:rPr>
-        <w:t>CaesarCipher</w:t>
-      </w:r>
-      <w:proofErr w:type="spellEnd"/>
-      <w:r>
-        <w:rPr>
-          <w:rFonts w:ascii="Calibri" w:eastAsia="Times New Roman" w:hAnsi="Calibri" w:cs="Calibri"/>
-          <w:kern w:val="0"/>
-          <w:lang w:eastAsia="es-AR"/>
-          <w14:ligatures w14:val="none"/>
-        </w:rPr>
-        <w:t xml:space="preserve">. </w:t>
-      </w:r>
-      <w:hyperlink r:id="rId29" w:history="1">
+      <w:hyperlink r:id="rId27" w:history="1">
         <w:r>
           <w:rPr>
             <w:rFonts w:ascii="Calibri" w:eastAsia="Times New Roman" w:hAnsi="Calibri" w:cs="Calibri"/>
@@ -7779,10 +7880,251 @@
         <w:rPr>
           <w:rFonts w:ascii="Calibri" w:eastAsia="Times New Roman" w:hAnsi="Calibri" w:cs="Calibri"/>
           <w:kern w:val="0"/>
-          <w:lang w:eastAsia="es-AR"/>
+          <w:lang w:val="en-US" w:eastAsia="es-AR"/>
           <w14:ligatures w14:val="none"/>
         </w:rPr>
       </w:pPr>
+      <w:r>
+        <w:rPr>
+          <w:rFonts w:ascii="Calibri" w:eastAsia="Times New Roman" w:hAnsi="Calibri" w:cs="Calibri"/>
+          <w:kern w:val="0"/>
+          <w:lang w:val="en-US" w:eastAsia="es-AR"/>
+          <w14:ligatures w14:val="none"/>
+        </w:rPr>
+        <w:t>Common Lisp Libraries. (</w:t>
+      </w:r>
+      <w:proofErr w:type="spellStart"/>
+      <w:r>
+        <w:rPr>
+          <w:rFonts w:ascii="Calibri" w:eastAsia="Times New Roman" w:hAnsi="Calibri" w:cs="Calibri"/>
+          <w:kern w:val="0"/>
+          <w:lang w:val="en-US" w:eastAsia="es-AR"/>
+          <w14:ligatures w14:val="none"/>
+        </w:rPr>
+        <w:t>s.f.</w:t>
+      </w:r>
+      <w:proofErr w:type="spellEnd"/>
+      <w:r>
+        <w:rPr>
+          <w:rFonts w:ascii="Calibri" w:eastAsia="Times New Roman" w:hAnsi="Calibri" w:cs="Calibri"/>
+          <w:kern w:val="0"/>
+          <w:lang w:val="en-US" w:eastAsia="es-AR"/>
+          <w14:ligatures w14:val="none"/>
+        </w:rPr>
+        <w:t xml:space="preserve">). </w:t>
+      </w:r>
+      <w:proofErr w:type="gramStart"/>
+      <w:r>
+        <w:rPr>
+          <w:rFonts w:ascii="Calibri" w:eastAsia="Times New Roman" w:hAnsi="Calibri" w:cs="Calibri"/>
+          <w:i/>
+          <w:iCs/>
+          <w:kern w:val="0"/>
+          <w:lang w:val="en-US" w:eastAsia="es-AR"/>
+          <w14:ligatures w14:val="none"/>
+        </w:rPr>
+        <w:t>local-time</w:t>
+      </w:r>
+      <w:proofErr w:type="gramEnd"/>
+      <w:r>
+        <w:rPr>
+          <w:rFonts w:ascii="Calibri" w:eastAsia="Times New Roman" w:hAnsi="Calibri" w:cs="Calibri"/>
+          <w:kern w:val="0"/>
+          <w:lang w:val="en-US" w:eastAsia="es-AR"/>
+          <w14:ligatures w14:val="none"/>
+        </w:rPr>
+        <w:t xml:space="preserve">. Read the Docs. </w:t>
+      </w:r>
+      <w:hyperlink r:id="rId28" w:history="1">
+        <w:r>
+          <w:rPr>
+            <w:rFonts w:ascii="Calibri" w:eastAsia="Times New Roman" w:hAnsi="Calibri" w:cs="Calibri"/>
+            <w:color w:val="0000FF"/>
+            <w:kern w:val="0"/>
+            <w:u w:val="single"/>
+            <w:lang w:val="en-US" w:eastAsia="es-AR"/>
+            <w14:ligatures w14:val="none"/>
+          </w:rPr>
+          <w:t>https://common-lisp-libraries.readthedocs.io/local-time/</w:t>
+        </w:r>
+      </w:hyperlink>
+    </w:p>
+    <w:p>
+      <w:pPr>
+        <w:spacing w:before="100" w:beforeAutospacing="1" w:after="100" w:afterAutospacing="1" w:line="240" w:lineRule="auto"/>
+        <w:rPr>
+          <w:rFonts w:ascii="Calibri" w:eastAsia="Times New Roman" w:hAnsi="Calibri" w:cs="Calibri"/>
+          <w:kern w:val="0"/>
+          <w:lang w:val="en-US" w:eastAsia="es-AR"/>
+          <w14:ligatures w14:val="none"/>
+        </w:rPr>
+      </w:pPr>
+      <w:proofErr w:type="spellStart"/>
+      <w:r>
+        <w:rPr>
+          <w:rFonts w:ascii="Calibri" w:eastAsia="Times New Roman" w:hAnsi="Calibri" w:cs="Calibri"/>
+          <w:kern w:val="0"/>
+          <w:lang w:val="en-US" w:eastAsia="es-AR"/>
+          <w14:ligatures w14:val="none"/>
+        </w:rPr>
+        <w:t>Quicklisp</w:t>
+      </w:r>
+      <w:proofErr w:type="spellEnd"/>
+      <w:r>
+        <w:rPr>
+          <w:rFonts w:ascii="Calibri" w:eastAsia="Times New Roman" w:hAnsi="Calibri" w:cs="Calibri"/>
+          <w:kern w:val="0"/>
+          <w:lang w:val="en-US" w:eastAsia="es-AR"/>
+          <w14:ligatures w14:val="none"/>
+        </w:rPr>
+        <w:t xml:space="preserve"> Project. (</w:t>
+      </w:r>
+      <w:proofErr w:type="spellStart"/>
+      <w:r>
+        <w:rPr>
+          <w:rFonts w:ascii="Calibri" w:eastAsia="Times New Roman" w:hAnsi="Calibri" w:cs="Calibri"/>
+          <w:kern w:val="0"/>
+          <w:lang w:val="en-US" w:eastAsia="es-AR"/>
+          <w14:ligatures w14:val="none"/>
+        </w:rPr>
+        <w:t>s.f.</w:t>
+      </w:r>
+      <w:proofErr w:type="spellEnd"/>
+      <w:r>
+        <w:rPr>
+          <w:rFonts w:ascii="Calibri" w:eastAsia="Times New Roman" w:hAnsi="Calibri" w:cs="Calibri"/>
+          <w:kern w:val="0"/>
+          <w:lang w:val="en-US" w:eastAsia="es-AR"/>
+          <w14:ligatures w14:val="none"/>
+        </w:rPr>
+        <w:t xml:space="preserve">). </w:t>
+      </w:r>
+      <w:proofErr w:type="spellStart"/>
+      <w:r>
+        <w:rPr>
+          <w:rFonts w:ascii="Calibri" w:eastAsia="Times New Roman" w:hAnsi="Calibri" w:cs="Calibri"/>
+          <w:i/>
+          <w:iCs/>
+          <w:kern w:val="0"/>
+          <w:lang w:val="en-US" w:eastAsia="es-AR"/>
+          <w14:ligatures w14:val="none"/>
+        </w:rPr>
+        <w:t>Quicklisp</w:t>
+      </w:r>
+      <w:proofErr w:type="spellEnd"/>
+      <w:r>
+        <w:rPr>
+          <w:rFonts w:ascii="Calibri" w:eastAsia="Times New Roman" w:hAnsi="Calibri" w:cs="Calibri"/>
+          <w:i/>
+          <w:iCs/>
+          <w:kern w:val="0"/>
+          <w:lang w:val="en-US" w:eastAsia="es-AR"/>
+          <w14:ligatures w14:val="none"/>
+        </w:rPr>
+        <w:t xml:space="preserve"> beta</w:t>
+      </w:r>
+      <w:r>
+        <w:rPr>
+          <w:rFonts w:ascii="Calibri" w:eastAsia="Times New Roman" w:hAnsi="Calibri" w:cs="Calibri"/>
+          <w:kern w:val="0"/>
+          <w:lang w:val="en-US" w:eastAsia="es-AR"/>
+          <w14:ligatures w14:val="none"/>
+        </w:rPr>
+        <w:t xml:space="preserve">. </w:t>
+      </w:r>
+      <w:proofErr w:type="spellStart"/>
+      <w:r>
+        <w:rPr>
+          <w:rFonts w:ascii="Calibri" w:eastAsia="Times New Roman" w:hAnsi="Calibri" w:cs="Calibri"/>
+          <w:kern w:val="0"/>
+          <w:lang w:val="en-US" w:eastAsia="es-AR"/>
+          <w14:ligatures w14:val="none"/>
+        </w:rPr>
+        <w:t>Quicklisp</w:t>
+      </w:r>
+      <w:proofErr w:type="spellEnd"/>
+      <w:r>
+        <w:rPr>
+          <w:rFonts w:ascii="Calibri" w:eastAsia="Times New Roman" w:hAnsi="Calibri" w:cs="Calibri"/>
+          <w:kern w:val="0"/>
+          <w:lang w:val="en-US" w:eastAsia="es-AR"/>
+          <w14:ligatures w14:val="none"/>
+        </w:rPr>
+        <w:t xml:space="preserve">. </w:t>
+      </w:r>
+      <w:hyperlink r:id="rId29" w:history="1">
+        <w:r>
+          <w:rPr>
+            <w:rFonts w:ascii="Calibri" w:eastAsia="Times New Roman" w:hAnsi="Calibri" w:cs="Calibri"/>
+            <w:color w:val="0000FF"/>
+            <w:kern w:val="0"/>
+            <w:u w:val="single"/>
+            <w:lang w:val="en-US" w:eastAsia="es-AR"/>
+            <w14:ligatures w14:val="none"/>
+          </w:rPr>
+          <w:t>https://www.quicklisp.org/beta/</w:t>
+        </w:r>
+      </w:hyperlink>
+    </w:p>
+    <w:p>
+      <w:pPr>
+        <w:spacing w:before="100" w:beforeAutospacing="1" w:after="100" w:afterAutospacing="1" w:line="240" w:lineRule="auto"/>
+        <w:rPr>
+          <w:rFonts w:ascii="Calibri" w:eastAsia="Times New Roman" w:hAnsi="Calibri" w:cs="Calibri"/>
+          <w:kern w:val="0"/>
+          <w:lang w:val="en-US" w:eastAsia="es-AR"/>
+          <w14:ligatures w14:val="none"/>
+        </w:rPr>
+      </w:pPr>
+      <w:r>
+        <w:rPr>
+          <w:rFonts w:ascii="Calibri" w:eastAsia="Times New Roman" w:hAnsi="Calibri" w:cs="Calibri"/>
+          <w:kern w:val="0"/>
+          <w:lang w:val="en-US" w:eastAsia="es-AR"/>
+          <w14:ligatures w14:val="none"/>
+        </w:rPr>
+        <w:t>Steel Bank Common Lisp. (</w:t>
+      </w:r>
+      <w:proofErr w:type="spellStart"/>
+      <w:r>
+        <w:rPr>
+          <w:rFonts w:ascii="Calibri" w:eastAsia="Times New Roman" w:hAnsi="Calibri" w:cs="Calibri"/>
+          <w:kern w:val="0"/>
+          <w:lang w:val="en-US" w:eastAsia="es-AR"/>
+          <w14:ligatures w14:val="none"/>
+        </w:rPr>
+        <w:t>s.f.</w:t>
+      </w:r>
+      <w:proofErr w:type="spellEnd"/>
+      <w:r>
+        <w:rPr>
+          <w:rFonts w:ascii="Calibri" w:eastAsia="Times New Roman" w:hAnsi="Calibri" w:cs="Calibri"/>
+          <w:kern w:val="0"/>
+          <w:lang w:val="en-US" w:eastAsia="es-AR"/>
+          <w14:ligatures w14:val="none"/>
+        </w:rPr>
+        <w:t xml:space="preserve">). </w:t>
+      </w:r>
+      <w:r>
+        <w:rPr>
+          <w:rFonts w:ascii="Calibri" w:eastAsia="Times New Roman" w:hAnsi="Calibri" w:cs="Calibri"/>
+          <w:i/>
+          <w:iCs/>
+          <w:kern w:val="0"/>
+          <w:lang w:val="en-US" w:eastAsia="es-AR"/>
+          <w14:ligatures w14:val="none"/>
+        </w:rPr>
+        <w:t>SBCL User Manual</w:t>
+      </w:r>
+      <w:r>
+        <w:rPr>
+          <w:rFonts w:ascii="Calibri" w:eastAsia="Times New Roman" w:hAnsi="Calibri" w:cs="Calibri"/>
+          <w:kern w:val="0"/>
+          <w:lang w:val="en-US" w:eastAsia="es-AR"/>
+          <w14:ligatures w14:val="none"/>
+        </w:rPr>
+        <w:t xml:space="preserve">. </w:t>
+      </w:r>
       <w:r>
         <w:rPr>
           <w:rFonts w:ascii="Calibri" w:eastAsia="Times New Roman" w:hAnsi="Calibri" w:cs="Calibri"/>
@@ -7790,28 +8132,9 @@
           <w:lang w:eastAsia="es-AR"/>
           <w14:ligatures w14:val="none"/>
         </w:rPr>
-        <w:t xml:space="preserve">Common Lisp </w:t>
-      </w:r>
-      <w:proofErr w:type="spellStart"/>
-      <w:r>
-        <w:rPr>
-          <w:rFonts w:ascii="Calibri" w:eastAsia="Times New Roman" w:hAnsi="Calibri" w:cs="Calibri"/>
-          <w:kern w:val="0"/>
-          <w:lang w:eastAsia="es-AR"/>
-          <w14:ligatures w14:val="none"/>
-        </w:rPr>
-        <w:t>Libraries</w:t>
-      </w:r>
-      <w:proofErr w:type="spellEnd"/>
-      <w:r>
-        <w:rPr>
-          <w:rFonts w:ascii="Calibri" w:eastAsia="Times New Roman" w:hAnsi="Calibri" w:cs="Calibri"/>
-          <w:kern w:val="0"/>
-          <w:lang w:eastAsia="es-AR"/>
-          <w14:ligatures w14:val="none"/>
-        </w:rPr>
-        <w:t xml:space="preserve">. (s.f.). </w:t>
-      </w:r>
+        <w:t xml:space="preserve">Secciones consultadas: </w:t>
+      </w:r>
+      <w:proofErr w:type="spellStart"/>
       <w:r>
         <w:rPr>
           <w:rFonts w:ascii="Calibri" w:eastAsia="Times New Roman" w:hAnsi="Calibri" w:cs="Calibri"/>
@@ -7821,7 +8144,19 @@
           <w:lang w:eastAsia="es-AR"/>
           <w14:ligatures w14:val="none"/>
         </w:rPr>
-        <w:t>local-time</w:t>
+        <w:t>Package</w:t>
+      </w:r>
+      <w:proofErr w:type="spellEnd"/>
+      <w:r>
+        <w:rPr>
+          <w:rFonts w:ascii="Calibri" w:eastAsia="Times New Roman" w:hAnsi="Calibri" w:cs="Calibri"/>
+          <w:i/>
+          <w:iCs/>
+          <w:kern w:val="0"/>
+          <w:lang w:eastAsia="es-AR"/>
+          <w14:ligatures w14:val="none"/>
+        </w:rPr>
+        <w:t xml:space="preserve"> Locks</w:t>
       </w:r>
       <w:r>
         <w:rPr>
@@ -7830,9 +8165,21 @@
           <w:lang w:eastAsia="es-AR"/>
           <w14:ligatures w14:val="none"/>
         </w:rPr>
-        <w:t xml:space="preserve">. Read </w:t>
-      </w:r>
-      <w:proofErr w:type="spellStart"/>
+        <w:t xml:space="preserve"> y </w:t>
+      </w:r>
+      <w:proofErr w:type="spellStart"/>
+      <w:r>
+        <w:rPr>
+          <w:rFonts w:ascii="Calibri" w:eastAsia="Times New Roman" w:hAnsi="Calibri" w:cs="Calibri"/>
+          <w:i/>
+          <w:iCs/>
+          <w:kern w:val="0"/>
+          <w:lang w:eastAsia="es-AR"/>
+          <w14:ligatures w14:val="none"/>
+        </w:rPr>
+        <w:t>Timers</w:t>
+      </w:r>
+      <w:proofErr w:type="spellEnd"/>
       <w:r>
         <w:rPr>
           <w:rFonts w:ascii="Calibri" w:eastAsia="Times New Roman" w:hAnsi="Calibri" w:cs="Calibri"/>
@@ -7840,17 +8187,16 @@
           <w:lang w:eastAsia="es-AR"/>
           <w14:ligatures w14:val="none"/>
         </w:rPr>
-        <w:t>the</w:t>
-      </w:r>
-      <w:proofErr w:type="spellEnd"/>
+        <w:t xml:space="preserve">. </w:t>
+      </w:r>
       <w:r>
         <w:rPr>
           <w:rFonts w:ascii="Calibri" w:eastAsia="Times New Roman" w:hAnsi="Calibri" w:cs="Calibri"/>
           <w:kern w:val="0"/>
-          <w:lang w:eastAsia="es-AR"/>
+          <w:lang w:val="en-US" w:eastAsia="es-AR"/>
           <w14:ligatures w14:val="none"/>
         </w:rPr>
-        <w:t xml:space="preserve"> Docs. </w:t>
+        <w:t xml:space="preserve">SBCL. </w:t>
       </w:r>
       <w:hyperlink r:id="rId30" w:history="1">
         <w:r>
@@ -7859,236 +8205,7 @@
             <w:color w:val="0000FF"/>
             <w:kern w:val="0"/>
             <w:u w:val="single"/>
-            <w:lang w:eastAsia="es-AR"/>
-            <w14:ligatures w14:val="none"/>
-          </w:rPr>
-          <w:t>https://common-lisp-libraries.readthedocs.io/local-time/</w:t>
-        </w:r>
-      </w:hyperlink>
-    </w:p>
-    <w:p>
-      <w:pPr>
-        <w:spacing w:before="100" w:beforeAutospacing="1" w:after="100" w:afterAutospacing="1" w:line="240" w:lineRule="auto"/>
-        <w:rPr>
-          <w:rFonts w:ascii="Calibri" w:eastAsia="Times New Roman" w:hAnsi="Calibri" w:cs="Calibri"/>
-          <w:kern w:val="0"/>
-          <w:lang w:eastAsia="es-AR"/>
-          <w14:ligatures w14:val="none"/>
-        </w:rPr>
-      </w:pPr>
-      <w:proofErr w:type="spellStart"/>
-      <w:r>
-        <w:rPr>
-          <w:rFonts w:ascii="Calibri" w:eastAsia="Times New Roman" w:hAnsi="Calibri" w:cs="Calibri"/>
-          <w:kern w:val="0"/>
-          <w:lang w:eastAsia="es-AR"/>
-          <w14:ligatures w14:val="none"/>
-        </w:rPr>
-        <w:t>Quicklisp</w:t>
-      </w:r>
-      <w:proofErr w:type="spellEnd"/>
-      <w:r>
-        <w:rPr>
-          <w:rFonts w:ascii="Calibri" w:eastAsia="Times New Roman" w:hAnsi="Calibri" w:cs="Calibri"/>
-          <w:kern w:val="0"/>
-          <w:lang w:eastAsia="es-AR"/>
-          <w14:ligatures w14:val="none"/>
-        </w:rPr>
-        <w:t xml:space="preserve"> Project. (s.f.). </w:t>
-      </w:r>
-      <w:proofErr w:type="spellStart"/>
-      <w:r>
-        <w:rPr>
-          <w:rFonts w:ascii="Calibri" w:eastAsia="Times New Roman" w:hAnsi="Calibri" w:cs="Calibri"/>
-          <w:i/>
-          <w:iCs/>
-          <w:kern w:val="0"/>
-          <w:lang w:eastAsia="es-AR"/>
-          <w14:ligatures w14:val="none"/>
-        </w:rPr>
-        <w:t>Quicklisp</w:t>
-      </w:r>
-      <w:proofErr w:type="spellEnd"/>
-      <w:r>
-        <w:rPr>
-          <w:rFonts w:ascii="Calibri" w:eastAsia="Times New Roman" w:hAnsi="Calibri" w:cs="Calibri"/>
-          <w:i/>
-          <w:iCs/>
-          <w:kern w:val="0"/>
-          <w:lang w:eastAsia="es-AR"/>
-          <w14:ligatures w14:val="none"/>
-        </w:rPr>
-        <w:t xml:space="preserve"> beta</w:t>
-      </w:r>
-      <w:r>
-        <w:rPr>
-          <w:rFonts w:ascii="Calibri" w:eastAsia="Times New Roman" w:hAnsi="Calibri" w:cs="Calibri"/>
-          <w:kern w:val="0"/>
-          <w:lang w:eastAsia="es-AR"/>
-          <w14:ligatures w14:val="none"/>
-        </w:rPr>
-        <w:t xml:space="preserve">. </w:t>
-      </w:r>
-      <w:proofErr w:type="spellStart"/>
-      <w:r>
-        <w:rPr>
-          <w:rFonts w:ascii="Calibri" w:eastAsia="Times New Roman" w:hAnsi="Calibri" w:cs="Calibri"/>
-          <w:kern w:val="0"/>
-          <w:lang w:eastAsia="es-AR"/>
-          <w14:ligatures w14:val="none"/>
-        </w:rPr>
-        <w:t>Quicklisp</w:t>
-      </w:r>
-      <w:proofErr w:type="spellEnd"/>
-      <w:r>
-        <w:rPr>
-          <w:rFonts w:ascii="Calibri" w:eastAsia="Times New Roman" w:hAnsi="Calibri" w:cs="Calibri"/>
-          <w:kern w:val="0"/>
-          <w:lang w:eastAsia="es-AR"/>
-          <w14:ligatures w14:val="none"/>
-        </w:rPr>
-        <w:t xml:space="preserve">. </w:t>
-      </w:r>
-      <w:hyperlink r:id="rId31" w:history="1">
-        <w:r>
-          <w:rPr>
-            <w:rFonts w:ascii="Calibri" w:eastAsia="Times New Roman" w:hAnsi="Calibri" w:cs="Calibri"/>
-            <w:color w:val="0000FF"/>
-            <w:kern w:val="0"/>
-            <w:u w:val="single"/>
-            <w:lang w:eastAsia="es-AR"/>
-            <w14:ligatures w14:val="none"/>
-          </w:rPr>
-          <w:t>https://www.quicklisp.org/beta/</w:t>
-        </w:r>
-      </w:hyperlink>
-    </w:p>
-    <w:p>
-      <w:pPr>
-        <w:spacing w:before="100" w:beforeAutospacing="1" w:after="100" w:afterAutospacing="1" w:line="240" w:lineRule="auto"/>
-        <w:rPr>
-          <w:rFonts w:ascii="Calibri" w:eastAsia="Times New Roman" w:hAnsi="Calibri" w:cs="Calibri"/>
-          <w:kern w:val="0"/>
-          <w:lang w:eastAsia="es-AR"/>
-          <w14:ligatures w14:val="none"/>
-        </w:rPr>
-      </w:pPr>
-      <w:r>
-        <w:rPr>
-          <w:rFonts w:ascii="Calibri" w:eastAsia="Times New Roman" w:hAnsi="Calibri" w:cs="Calibri"/>
-          <w:kern w:val="0"/>
-          <w:lang w:eastAsia="es-AR"/>
-          <w14:ligatures w14:val="none"/>
-        </w:rPr>
-        <w:t xml:space="preserve">Steel Bank Common Lisp. (s.f.). </w:t>
-      </w:r>
-      <w:r>
-        <w:rPr>
-          <w:rFonts w:ascii="Calibri" w:eastAsia="Times New Roman" w:hAnsi="Calibri" w:cs="Calibri"/>
-          <w:i/>
-          <w:iCs/>
-          <w:kern w:val="0"/>
-          <w:lang w:eastAsia="es-AR"/>
-          <w14:ligatures w14:val="none"/>
-        </w:rPr>
-        <w:t xml:space="preserve">SBCL </w:t>
-      </w:r>
-      <w:proofErr w:type="spellStart"/>
-      <w:r>
-        <w:rPr>
-          <w:rFonts w:ascii="Calibri" w:eastAsia="Times New Roman" w:hAnsi="Calibri" w:cs="Calibri"/>
-          <w:i/>
-          <w:iCs/>
-          <w:kern w:val="0"/>
-          <w:lang w:eastAsia="es-AR"/>
-          <w14:ligatures w14:val="none"/>
-        </w:rPr>
-        <w:t>User</w:t>
-      </w:r>
-      <w:proofErr w:type="spellEnd"/>
-      <w:r>
-        <w:rPr>
-          <w:rFonts w:ascii="Calibri" w:eastAsia="Times New Roman" w:hAnsi="Calibri" w:cs="Calibri"/>
-          <w:i/>
-          <w:iCs/>
-          <w:kern w:val="0"/>
-          <w:lang w:eastAsia="es-AR"/>
-          <w14:ligatures w14:val="none"/>
-        </w:rPr>
-        <w:t xml:space="preserve"> Manual</w:t>
-      </w:r>
-      <w:r>
-        <w:rPr>
-          <w:rFonts w:ascii="Calibri" w:eastAsia="Times New Roman" w:hAnsi="Calibri" w:cs="Calibri"/>
-          <w:kern w:val="0"/>
-          <w:lang w:eastAsia="es-AR"/>
-          <w14:ligatures w14:val="none"/>
-        </w:rPr>
-        <w:t xml:space="preserve">. Secciones consultadas: </w:t>
-      </w:r>
-      <w:proofErr w:type="spellStart"/>
-      <w:r>
-        <w:rPr>
-          <w:rFonts w:ascii="Calibri" w:eastAsia="Times New Roman" w:hAnsi="Calibri" w:cs="Calibri"/>
-          <w:i/>
-          <w:iCs/>
-          <w:kern w:val="0"/>
-          <w:lang w:eastAsia="es-AR"/>
-          <w14:ligatures w14:val="none"/>
-        </w:rPr>
-        <w:t>Package</w:t>
-      </w:r>
-      <w:proofErr w:type="spellEnd"/>
-      <w:r>
-        <w:rPr>
-          <w:rFonts w:ascii="Calibri" w:eastAsia="Times New Roman" w:hAnsi="Calibri" w:cs="Calibri"/>
-          <w:i/>
-          <w:iCs/>
-          <w:kern w:val="0"/>
-          <w:lang w:eastAsia="es-AR"/>
-          <w14:ligatures w14:val="none"/>
-        </w:rPr>
-        <w:t xml:space="preserve"> Locks</w:t>
-      </w:r>
-      <w:r>
-        <w:rPr>
-          <w:rFonts w:ascii="Calibri" w:eastAsia="Times New Roman" w:hAnsi="Calibri" w:cs="Calibri"/>
-          <w:kern w:val="0"/>
-          <w:lang w:eastAsia="es-AR"/>
-          <w14:ligatures w14:val="none"/>
-        </w:rPr>
-        <w:t xml:space="preserve"> y </w:t>
-      </w:r>
-      <w:proofErr w:type="spellStart"/>
-      <w:r>
-        <w:rPr>
-          <w:rFonts w:ascii="Calibri" w:eastAsia="Times New Roman" w:hAnsi="Calibri" w:cs="Calibri"/>
-          <w:i/>
-          <w:iCs/>
-          <w:kern w:val="0"/>
-          <w:lang w:eastAsia="es-AR"/>
-          <w14:ligatures w14:val="none"/>
-        </w:rPr>
-        <w:t>Timers</w:t>
-      </w:r>
-      <w:proofErr w:type="spellEnd"/>
-      <w:r>
-        <w:rPr>
-          <w:rFonts w:ascii="Calibri" w:eastAsia="Times New Roman" w:hAnsi="Calibri" w:cs="Calibri"/>
-          <w:kern w:val="0"/>
-          <w:lang w:eastAsia="es-AR"/>
-          <w14:ligatures w14:val="none"/>
-        </w:rPr>
-        <w:t xml:space="preserve">. SBCL. </w:t>
-      </w:r>
-      <w:hyperlink r:id="rId32" w:history="1">
-        <w:r>
-          <w:rPr>
-            <w:rFonts w:ascii="Calibri" w:eastAsia="Times New Roman" w:hAnsi="Calibri" w:cs="Calibri"/>
-            <w:color w:val="0000FF"/>
-            <w:kern w:val="0"/>
-            <w:u w:val="single"/>
-            <w:lang w:eastAsia="es-AR"/>
+            <w:lang w:val="en-US" w:eastAsia="es-AR"/>
             <w14:ligatures w14:val="none"/>
           </w:rPr>
           <w:t>https://www.sbcl.org/manual/index.html</w:t>
@@ -8106,6 +8223,7 @@
       <w:r>
         <w:rPr>
           <w:rFonts w:ascii="Calibri" w:hAnsi="Calibri" w:cs="Calibri"/>
+          <w:lang w:val="en-US"/>
         </w:rPr>
         <w:t>OCaml</w:t>
       </w:r>
@@ -8113,8 +8231,25 @@
       <w:r>
         <w:rPr>
           <w:rFonts w:ascii="Calibri" w:hAnsi="Calibri" w:cs="Calibri"/>
-        </w:rPr>
-        <w:t xml:space="preserve">. (s.f.). </w:t>
+          <w:lang w:val="en-US"/>
+        </w:rPr>
+        <w:t>. (</w:t>
+      </w:r>
+      <w:proofErr w:type="spellStart"/>
+      <w:r>
+        <w:rPr>
+          <w:rFonts w:ascii="Calibri" w:hAnsi="Calibri" w:cs="Calibri"/>
+          <w:lang w:val="en-US"/>
+        </w:rPr>
+        <w:t>s.f.</w:t>
+      </w:r>
+      <w:proofErr w:type="spellEnd"/>
+      <w:r>
+        <w:rPr>
+          <w:rFonts w:ascii="Calibri" w:hAnsi="Calibri" w:cs="Calibri"/>
+          <w:lang w:val="en-US"/>
+        </w:rPr>
+        <w:t xml:space="preserve">). </w:t>
       </w:r>
       <w:proofErr w:type="spellStart"/>
       <w:r>
@@ -8122,6 +8257,7 @@
           <w:rFonts w:ascii="Calibri" w:hAnsi="Calibri" w:cs="Calibri"/>
           <w:i/>
           <w:iCs/>
+          <w:lang w:val="en-US"/>
         </w:rPr>
         <w:t>OCaml</w:t>
       </w:r>
@@ -8131,22 +8267,14 @@
           <w:rFonts w:ascii="Calibri" w:hAnsi="Calibri" w:cs="Calibri"/>
           <w:i/>
           <w:iCs/>
-        </w:rPr>
-        <w:t xml:space="preserve"> in </w:t>
-      </w:r>
-      <w:proofErr w:type="spellStart"/>
-      <w:r>
-        <w:rPr>
-          <w:rFonts w:ascii="Calibri" w:hAnsi="Calibri" w:cs="Calibri"/>
-          <w:i/>
-          <w:iCs/>
-        </w:rPr>
-        <w:t>Industry</w:t>
-      </w:r>
-      <w:proofErr w:type="spellEnd"/>
-      <w:r>
-        <w:rPr>
-          <w:rFonts w:ascii="Calibri" w:hAnsi="Calibri" w:cs="Calibri"/>
+          <w:lang w:val="en-US"/>
+        </w:rPr>
+        <w:t xml:space="preserve"> in Industry</w:t>
+      </w:r>
+      <w:r>
+        <w:rPr>
+          <w:rFonts w:ascii="Calibri" w:hAnsi="Calibri" w:cs="Calibri"/>
+          <w:lang w:val="en-US"/>
         </w:rPr>
         <w:t xml:space="preserve">. </w:t>
       </w:r>
@@ -8164,7 +8292,7 @@
         </w:rPr>
         <w:t xml:space="preserve">. </w:t>
       </w:r>
-      <w:hyperlink r:id="rId33" w:history="1">
+      <w:hyperlink r:id="rId31" w:history="1">
         <w:r>
           <w:rPr>
             <w:rFonts w:ascii="Calibri" w:hAnsi="Calibri" w:cs="Calibri"/>
@@ -8191,6 +8319,7 @@
       <w:r>
         <w:rPr>
           <w:rFonts w:ascii="Calibri" w:hAnsi="Calibri" w:cs="Calibri"/>
+          <w:lang w:val="en-US"/>
         </w:rPr>
         <w:t>OCaml</w:t>
       </w:r>
@@ -8198,14 +8327,32 @@
       <w:r>
         <w:rPr>
           <w:rFonts w:ascii="Calibri" w:hAnsi="Calibri" w:cs="Calibri"/>
-        </w:rPr>
-        <w:t xml:space="preserve">. (s.f.). </w:t>
+          <w:lang w:val="en-US"/>
+        </w:rPr>
+        <w:t>. (</w:t>
+      </w:r>
+      <w:proofErr w:type="spellStart"/>
+      <w:r>
+        <w:rPr>
+          <w:rFonts w:ascii="Calibri" w:hAnsi="Calibri" w:cs="Calibri"/>
+          <w:lang w:val="en-US"/>
+        </w:rPr>
+        <w:t>s.f.</w:t>
+      </w:r>
+      <w:proofErr w:type="spellEnd"/>
+      <w:r>
+        <w:rPr>
+          <w:rFonts w:ascii="Calibri" w:hAnsi="Calibri" w:cs="Calibri"/>
+          <w:lang w:val="en-US"/>
+        </w:rPr>
+        <w:t xml:space="preserve">). </w:t>
       </w:r>
       <w:r>
         <w:rPr>
           <w:rFonts w:ascii="Calibri" w:hAnsi="Calibri" w:cs="Calibri"/>
           <w:i/>
           <w:iCs/>
+          <w:lang w:val="en-US"/>
         </w:rPr>
         <w:t xml:space="preserve">Why </w:t>
       </w:r>
@@ -8215,6 +8362,7 @@
           <w:rFonts w:ascii="Calibri" w:hAnsi="Calibri" w:cs="Calibri"/>
           <w:i/>
           <w:iCs/>
+          <w:lang w:val="en-US"/>
         </w:rPr>
         <w:t>OCaml</w:t>
       </w:r>
@@ -8224,12 +8372,14 @@
           <w:rFonts w:ascii="Calibri" w:hAnsi="Calibri" w:cs="Calibri"/>
           <w:i/>
           <w:iCs/>
+          <w:lang w:val="en-US"/>
         </w:rPr>
         <w:t>?</w:t>
       </w:r>
       <w:r>
         <w:rPr>
           <w:rFonts w:ascii="Calibri" w:hAnsi="Calibri" w:cs="Calibri"/>
+          <w:lang w:val="en-US"/>
         </w:rPr>
         <w:t xml:space="preserve"> </w:t>
       </w:r>
@@ -8247,7 +8397,7 @@
         </w:rPr>
         <w:t xml:space="preserve">. </w:t>
       </w:r>
-      <w:hyperlink r:id="rId34" w:history="1">
+      <w:hyperlink r:id="rId32" w:history="1">
         <w:r>
           <w:rPr>
             <w:rFonts w:ascii="Calibri" w:hAnsi="Calibri" w:cs="Calibri"/>
@@ -8259,8 +8409,8 @@
       </w:hyperlink>
     </w:p>
     <w:sectPr>
-      <w:headerReference w:type="default" r:id="rId35"/>
-      <w:footerReference w:type="default" r:id="rId36"/>
+      <w:headerReference w:type="default" r:id="rId33"/>
+      <w:footerReference w:type="default" r:id="rId34"/>
       <w:pgSz w:w="11906" w:h="16838"/>
       <w:pgMar w:top="1417" w:right="1701" w:bottom="1417" w:left="1701" w:header="708" w:footer="708" w:gutter="0"/>
       <w:cols w:space="708"/>

</xml_diff>

<commit_message>
Cambios en funciones y avances en iteracion 2
</commit_message>
<xml_diff>
--- a/docs/BorradorInforme(Convertir en PDF AL TERMINAR).docx
+++ b/docs/BorradorInforme(Convertir en PDF AL TERMINAR).docx
@@ -663,8 +663,8 @@
         <w:t>JUNIO 2026</w:t>
       </w:r>
     </w:p>
-    <w:bookmarkStart w:id="0" w:name="_Toc212909376"/>
-    <w:bookmarkStart w:id="1" w:name="_Toc232187676"/>
+    <w:bookmarkStart w:id="0" w:name="_Toc232187676"/>
+    <w:bookmarkStart w:id="1" w:name="_Toc212909376"/>
     <w:p>
       <w:pPr>
         <w:pStyle w:val="Ttulo1"/>
@@ -745,7 +745,7 @@
       <w:r>
         <w:t>DICE</w:t>
       </w:r>
-      <w:bookmarkEnd w:id="1"/>
+      <w:bookmarkEnd w:id="0"/>
     </w:p>
     <w:p/>
     <w:p/>
@@ -1567,7 +1567,7 @@
       <w:r>
         <w:t>INTRODUCCIÓN</w:t>
       </w:r>
-      <w:bookmarkEnd w:id="0"/>
+      <w:bookmarkEnd w:id="1"/>
       <w:bookmarkEnd w:id="2"/>
     </w:p>
     <w:p>
@@ -4436,24 +4436,7 @@
           <w:bCs/>
         </w:rPr>
         <w:br/>
-      </w:r>
-      <w:proofErr w:type="spellStart"/>
-      <w:r>
-        <w:rPr>
-          <w:rFonts w:ascii="Calibri" w:hAnsi="Calibri" w:cs="Calibri"/>
-          <w:b/>
-          <w:bCs/>
-        </w:rPr>
-        <w:t>verde</w:t>
-      </w:r>
-      <w:proofErr w:type="spellEnd"/>
-      <w:r>
-        <w:rPr>
-          <w:rFonts w:ascii="Calibri" w:hAnsi="Calibri" w:cs="Calibri"/>
-          <w:b/>
-          <w:bCs/>
-        </w:rPr>
-        <w:t xml:space="preserve"> -&gt; amarillo</w:t>
+        <w:t>verde -&gt; amarillo</w:t>
       </w:r>
       <w:r>
         <w:rPr>
@@ -4462,24 +4445,7 @@
           <w:bCs/>
         </w:rPr>
         <w:br/>
-      </w:r>
-      <w:proofErr w:type="spellStart"/>
-      <w:r>
-        <w:rPr>
-          <w:rFonts w:ascii="Calibri" w:hAnsi="Calibri" w:cs="Calibri"/>
-          <w:b/>
-          <w:bCs/>
-        </w:rPr>
-        <w:t>amarillo</w:t>
-      </w:r>
-      <w:proofErr w:type="spellEnd"/>
-      <w:r>
-        <w:rPr>
-          <w:rFonts w:ascii="Calibri" w:hAnsi="Calibri" w:cs="Calibri"/>
-          <w:b/>
-          <w:bCs/>
-        </w:rPr>
-        <w:t xml:space="preserve"> -&gt; rojo</w:t>
+        <w:t>amarillo -&gt; rojo</w:t>
       </w:r>
     </w:p>
     <w:p>
@@ -5226,24 +5192,7 @@
           <w:bCs/>
         </w:rPr>
         <w:br/>
-      </w:r>
-      <w:proofErr w:type="spellStart"/>
-      <w:r>
-        <w:rPr>
-          <w:rFonts w:ascii="Calibri" w:hAnsi="Calibri" w:cs="Calibri"/>
-          <w:b/>
-          <w:bCs/>
-        </w:rPr>
-        <w:t>verde</w:t>
-      </w:r>
-      <w:proofErr w:type="spellEnd"/>
-      <w:r>
-        <w:rPr>
-          <w:rFonts w:ascii="Calibri" w:hAnsi="Calibri" w:cs="Calibri"/>
-          <w:b/>
-          <w:bCs/>
-        </w:rPr>
-        <w:t xml:space="preserve"> -&gt; amarillo</w:t>
+        <w:t>verde -&gt; amarillo</w:t>
       </w:r>
       <w:r>
         <w:rPr>
@@ -5252,24 +5201,7 @@
           <w:bCs/>
         </w:rPr>
         <w:br/>
-      </w:r>
-      <w:proofErr w:type="spellStart"/>
-      <w:r>
-        <w:rPr>
-          <w:rFonts w:ascii="Calibri" w:hAnsi="Calibri" w:cs="Calibri"/>
-          <w:b/>
-          <w:bCs/>
-        </w:rPr>
-        <w:t>amarillo</w:t>
-      </w:r>
-      <w:proofErr w:type="spellEnd"/>
-      <w:r>
-        <w:rPr>
-          <w:rFonts w:ascii="Calibri" w:hAnsi="Calibri" w:cs="Calibri"/>
-          <w:b/>
-          <w:bCs/>
-        </w:rPr>
-        <w:t xml:space="preserve"> -&gt; rojo</w:t>
+        <w:t>amarillo -&gt; rojo</w:t>
       </w:r>
     </w:p>
     <w:p>
@@ -7359,7 +7291,7 @@
           <w:lang w:val="es-ES"/>
         </w:rPr>
         <w:drawing>
-          <wp:inline distT="0" distB="0" distL="0" distR="0" wp14:anchorId="602E021A" wp14:editId="235C6A00">
+          <wp:inline distT="0" distB="0" distL="0" distR="0" wp14:anchorId="602E021A" wp14:editId="267CEF04">
             <wp:extent cx="5400040" cy="1748155"/>
             <wp:effectExtent l="0" t="0" r="0" b="4445"/>
             <wp:docPr id="2135590588" name="Imagen 1"/>
@@ -7399,16 +7331,1036 @@
       <w:pPr>
         <w:rPr>
           <w:rFonts w:ascii="Calibri" w:hAnsi="Calibri" w:cs="Calibri"/>
-          <w:lang w:val="es-ES"/>
-        </w:rPr>
-      </w:pPr>
-      <w:r>
-        <w:rPr>
-          <w:rFonts w:ascii="Calibri" w:hAnsi="Calibri" w:cs="Calibri"/>
-          <w:lang w:val="es-ES"/>
-        </w:rPr>
-        <w:br w:type="page"/>
-      </w:r>
+        </w:rPr>
+      </w:pPr>
+      <w:r>
+        <w:rPr>
+          <w:rFonts w:ascii="Calibri" w:hAnsi="Calibri" w:cs="Calibri"/>
+          <w:b/>
+          <w:noProof/>
+          <w:sz w:val="23"/>
+          <w:szCs w:val="23"/>
+        </w:rPr>
+        <mc:AlternateContent>
+          <mc:Choice Requires="wps">
+            <w:drawing>
+              <wp:anchor distT="0" distB="0" distL="114300" distR="114300" simplePos="0" relativeHeight="251693056" behindDoc="0" locked="0" layoutInCell="1" allowOverlap="1" wp14:anchorId="0BB341C1" wp14:editId="0CDCAAE2">
+                <wp:simplePos x="0" y="0"/>
+                <wp:positionH relativeFrom="page">
+                  <wp:posOffset>5438775</wp:posOffset>
+                </wp:positionH>
+                <wp:positionV relativeFrom="paragraph">
+                  <wp:posOffset>79375</wp:posOffset>
+                </wp:positionV>
+                <wp:extent cx="3995420" cy="71755"/>
+                <wp:effectExtent l="0" t="0" r="5080" b="4445"/>
+                <wp:wrapNone/>
+                <wp:docPr id="1682314453" name="Rectángulo 1682314453"/>
+                <wp:cNvGraphicFramePr/>
+                <a:graphic xmlns:a="http://schemas.openxmlformats.org/drawingml/2006/main">
+                  <a:graphicData uri="http://schemas.microsoft.com/office/word/2010/wordprocessingShape">
+                    <wps:wsp>
+                      <wps:cNvSpPr/>
+                      <wps:spPr>
+                        <a:xfrm>
+                          <a:off x="0" y="0"/>
+                          <a:ext cx="3995420" cy="71755"/>
+                        </a:xfrm>
+                        <a:prstGeom prst="rect">
+                          <a:avLst/>
+                        </a:prstGeom>
+                        <a:solidFill>
+                          <a:srgbClr val="C00000"/>
+                        </a:solidFill>
+                        <a:ln>
+                          <a:noFill/>
+                        </a:ln>
+                        <a:effectLst/>
+                      </wps:spPr>
+                      <wps:style>
+                        <a:lnRef idx="1">
+                          <a:schemeClr val="accent1"/>
+                        </a:lnRef>
+                        <a:fillRef idx="3">
+                          <a:schemeClr val="accent1"/>
+                        </a:fillRef>
+                        <a:effectRef idx="2">
+                          <a:schemeClr val="accent1"/>
+                        </a:effectRef>
+                        <a:fontRef idx="minor">
+                          <a:schemeClr val="lt1"/>
+                        </a:fontRef>
+                      </wps:style>
+                      <wps:bodyPr rot="0" spcFirstLastPara="0" vertOverflow="overflow" horzOverflow="overflow" vert="horz" wrap="square" lIns="91440" tIns="45720" rIns="91440" bIns="45720" numCol="1" spcCol="0" rtlCol="0" fromWordArt="0" anchor="ctr" anchorCtr="0" forceAA="0" compatLnSpc="1">
+                        <a:prstTxWarp prst="textNoShape">
+                          <a:avLst/>
+                        </a:prstTxWarp>
+                        <a:noAutofit/>
+                      </wps:bodyPr>
+                    </wps:wsp>
+                  </a:graphicData>
+                </a:graphic>
+                <wp14:sizeRelH relativeFrom="margin">
+                  <wp14:pctWidth>0</wp14:pctWidth>
+                </wp14:sizeRelH>
+                <wp14:sizeRelV relativeFrom="margin">
+                  <wp14:pctHeight>0</wp14:pctHeight>
+                </wp14:sizeRelV>
+              </wp:anchor>
+            </w:drawing>
+          </mc:Choice>
+          <mc:Fallback>
+            <w:pict>
+              <v:rect w14:anchorId="1356D173" id="Rectángulo 1682314453" o:spid="_x0000_s1026" style="position:absolute;margin-left:428.25pt;margin-top:6.25pt;width:314.6pt;height:5.65pt;z-index:251693056;visibility:visible;mso-wrap-style:square;mso-width-percent:0;mso-height-percent:0;mso-wrap-distance-left:9pt;mso-wrap-distance-top:0;mso-wrap-distance-right:9pt;mso-wrap-distance-bottom:0;mso-position-horizontal:absolute;mso-position-horizontal-relative:page;mso-position-vertical:absolute;mso-position-vertical-relative:text;mso-width-percent:0;mso-height-percent:0;mso-width-relative:margin;mso-height-relative:margin;v-text-anchor:middle" o:gfxdata="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" fillcolor="#c00000" stroked="f" strokeweight=".5pt">
+                <w10:wrap anchorx="page"/>
+              </v:rect>
+            </w:pict>
+          </mc:Fallback>
+        </mc:AlternateContent>
+      </w:r>
+      <w:r>
+        <w:rPr>
+          <w:rFonts w:ascii="Calibri" w:hAnsi="Calibri" w:cs="Calibri"/>
+          <w:b/>
+          <w:bCs/>
+        </w:rPr>
+        <w:t>7</w:t>
+      </w:r>
+      <w:r>
+        <w:rPr>
+          <w:rFonts w:ascii="Calibri" w:hAnsi="Calibri" w:cs="Calibri"/>
+          <w:b/>
+          <w:bCs/>
+        </w:rPr>
+        <w:t xml:space="preserve">. Cálculo incorrecto de la distribución horaria en </w:t>
+      </w:r>
+      <w:proofErr w:type="spellStart"/>
+      <w:r>
+        <w:rPr>
+          <w:rFonts w:ascii="Calibri" w:hAnsi="Calibri" w:cs="Calibri"/>
+          <w:b/>
+          <w:bCs/>
+        </w:rPr>
+        <w:t>distribucion</w:t>
+      </w:r>
+      <w:proofErr w:type="spellEnd"/>
+      <w:r>
+        <w:rPr>
+          <w:rFonts w:ascii="Calibri" w:hAnsi="Calibri" w:cs="Calibri"/>
+          <w:b/>
+          <w:bCs/>
+        </w:rPr>
+        <w:t>-hora</w:t>
+      </w:r>
+    </w:p>
+    <w:p>
+      <w:pPr>
+        <w:rPr>
+          <w:rFonts w:ascii="Calibri" w:hAnsi="Calibri" w:cs="Calibri"/>
+          <w:b/>
+          <w:bCs/>
+        </w:rPr>
+      </w:pPr>
+      <w:r>
+        <w:rPr>
+          <w:rFonts w:ascii="Calibri" w:hAnsi="Calibri" w:cs="Calibri"/>
+          <w:b/>
+          <w:bCs/>
+        </w:rPr>
+        <w:t>Descripción del problema</w:t>
+      </w:r>
+      <w:r>
+        <w:rPr>
+          <w:rFonts w:ascii="Calibri" w:hAnsi="Calibri" w:cs="Calibri"/>
+          <w:b/>
+          <w:bCs/>
+        </w:rPr>
+        <w:br/>
+      </w:r>
+      <w:r>
+        <w:rPr>
+          <w:rFonts w:ascii="Calibri" w:hAnsi="Calibri" w:cs="Calibri"/>
+        </w:rPr>
+        <w:t xml:space="preserve">Al implementar </w:t>
+      </w:r>
+      <w:proofErr w:type="spellStart"/>
+      <w:r>
+        <w:rPr>
+          <w:rFonts w:ascii="Calibri" w:hAnsi="Calibri" w:cs="Calibri"/>
+        </w:rPr>
+        <w:t>distribucion</w:t>
+      </w:r>
+      <w:proofErr w:type="spellEnd"/>
+      <w:r>
+        <w:rPr>
+          <w:rFonts w:ascii="Calibri" w:hAnsi="Calibri" w:cs="Calibri"/>
+        </w:rPr>
+        <w:t xml:space="preserve">-hora, la función calculaba los porcentajes de tiempo en rojo, verde y amarillo durante una hora, pero presentaba dos problemas: por un </w:t>
+      </w:r>
+      <w:proofErr w:type="gramStart"/>
+      <w:r>
+        <w:rPr>
+          <w:rFonts w:ascii="Calibri" w:hAnsi="Calibri" w:cs="Calibri"/>
+        </w:rPr>
+        <w:t>lado</w:t>
+      </w:r>
+      <w:proofErr w:type="gramEnd"/>
+      <w:r>
+        <w:rPr>
+          <w:rFonts w:ascii="Calibri" w:hAnsi="Calibri" w:cs="Calibri"/>
+        </w:rPr>
+        <w:t xml:space="preserve"> los resultados no se correspondían con la realidad del semáforo, y por otro la función no era reutilizable para distintas reglas de negocio.</w:t>
+      </w:r>
+    </w:p>
+    <w:p>
+      <w:pPr>
+        <w:rPr>
+          <w:rFonts w:ascii="Calibri" w:hAnsi="Calibri" w:cs="Calibri"/>
+        </w:rPr>
+      </w:pPr>
+      <w:r>
+        <w:rPr>
+          <w:rFonts w:ascii="Calibri" w:hAnsi="Calibri" w:cs="Calibri"/>
+          <w:b/>
+          <w:bCs/>
+        </w:rPr>
+        <w:t>Causa</w:t>
+      </w:r>
+      <w:r>
+        <w:rPr>
+          <w:rFonts w:ascii="Calibri" w:hAnsi="Calibri" w:cs="Calibri"/>
+          <w:b/>
+          <w:bCs/>
+        </w:rPr>
+        <w:br/>
+      </w:r>
+      <w:r>
+        <w:rPr>
+          <w:rFonts w:ascii="Calibri" w:hAnsi="Calibri" w:cs="Calibri"/>
+        </w:rPr>
+        <w:t xml:space="preserve">La primera versión definía rojo, verde y amarillo como valores fijos dentro de un </w:t>
+      </w:r>
+      <w:proofErr w:type="spellStart"/>
+      <w:r>
+        <w:rPr>
+          <w:rFonts w:ascii="Calibri" w:hAnsi="Calibri" w:cs="Calibri"/>
+        </w:rPr>
+        <w:t>let</w:t>
+      </w:r>
+      <w:proofErr w:type="spellEnd"/>
+      <w:r>
+        <w:rPr>
+          <w:rFonts w:ascii="Calibri" w:hAnsi="Calibri" w:cs="Calibri"/>
+        </w:rPr>
+        <w:t>* (90, 120 y 6 segundos respectivamente), en lugar de recibirlos como parámetros. Esto hacía que la función solo sirviera para las reglas de negocio actuales, cuando la consigna pide que funcione "dadas ciertas reglas de negocio" o "según las reglas actuales", es decir, que los tiempos de cada fase sean variables de entrada. Además, calculaba el porcentaje de cada fase directamente sobre la duración de un solo ciclo ((/ rojo total) * 100, etc.), asumiendo que esa proporción se mantenía igual a lo largo de toda la hora.</w:t>
+      </w:r>
+    </w:p>
+    <w:p>
+      <w:pPr>
+        <w:rPr>
+          <w:rFonts w:ascii="Calibri" w:hAnsi="Calibri" w:cs="Calibri"/>
+        </w:rPr>
+      </w:pPr>
+      <w:r>
+        <w:rPr>
+          <w:rFonts w:ascii="Calibri" w:hAnsi="Calibri" w:cs="Calibri"/>
+          <w:b/>
+          <w:bCs/>
+        </w:rPr>
+        <w:t>Proceso de depuración</w:t>
+      </w:r>
+      <w:r>
+        <w:rPr>
+          <w:rFonts w:ascii="Calibri" w:hAnsi="Calibri" w:cs="Calibri"/>
+          <w:b/>
+          <w:bCs/>
+        </w:rPr>
+        <w:br/>
+      </w:r>
+      <w:r>
+        <w:rPr>
+          <w:rFonts w:ascii="Calibri" w:hAnsi="Calibri" w:cs="Calibri"/>
+        </w:rPr>
+        <w:t>Primero se identificó que al fijar los valores adentro de la función, cualquier cambio en las reglas de negocio (por ejemplo, otros tiempos de rojo/verde/amarillo) obligaría a reescribir la función en lugar de simplemente pasarle otros argumentos. Por eso se decidió convertir rojo, verde y amarillo en parámetros de la función.</w:t>
+      </w:r>
+    </w:p>
+    <w:p>
+      <w:pPr>
+        <w:rPr>
+          <w:rFonts w:ascii="Calibri" w:hAnsi="Calibri" w:cs="Calibri"/>
+        </w:rPr>
+      </w:pPr>
+      <w:r>
+        <w:rPr>
+          <w:rFonts w:ascii="Calibri" w:hAnsi="Calibri" w:cs="Calibri"/>
+        </w:rPr>
+        <w:lastRenderedPageBreak/>
+        <w:t>Resuelto eso, se pensó en el segundo problema: una hora (3600 segundos) no es necesariamente un múltiplo exacto de la duración del ciclo. Con rojo=90, verde=120, amarillo=6 (valores de ejemplo según las reglas actuales), el ciclo dura 216 segundos, y en una hora entran 16 ciclos completos (3456 segundos), quedando 144 segundos sobrantes que no completan un ciclo entero. Esos segundos sobrantes también forman parte de la hora y deben repartirse según el orden real del ciclo (primero rojo, luego verde, luego amarillo), no de forma proporcional.</w:t>
+      </w:r>
+    </w:p>
+    <w:p>
+      <w:pPr>
+        <w:rPr>
+          <w:rFonts w:ascii="Calibri" w:hAnsi="Calibri" w:cs="Calibri"/>
+        </w:rPr>
+      </w:pPr>
+      <w:r>
+        <w:rPr>
+          <w:rFonts w:ascii="Calibri" w:hAnsi="Calibri" w:cs="Calibri"/>
+        </w:rPr>
+        <w:t xml:space="preserve">Para obtener la cantidad de ciclos completos en la hora se consideró reutilizar ciclos-por-tiempo, pero esa función tiene </w:t>
+      </w:r>
+      <w:proofErr w:type="spellStart"/>
+      <w:r>
+        <w:rPr>
+          <w:rFonts w:ascii="Calibri" w:hAnsi="Calibri" w:cs="Calibri"/>
+        </w:rPr>
+        <w:t>hardcodeado</w:t>
+      </w:r>
+      <w:proofErr w:type="spellEnd"/>
+      <w:r>
+        <w:rPr>
+          <w:rFonts w:ascii="Calibri" w:hAnsi="Calibri" w:cs="Calibri"/>
+        </w:rPr>
+        <w:t xml:space="preserve"> el valor 216 (la duración del ciclo según las reglas actuales), por lo que su resultado dejaría de ser correcto si se la llamara con otras reglas de negocio. Como </w:t>
+      </w:r>
+      <w:proofErr w:type="spellStart"/>
+      <w:r>
+        <w:rPr>
+          <w:rFonts w:ascii="Calibri" w:hAnsi="Calibri" w:cs="Calibri"/>
+        </w:rPr>
+        <w:t>distribucion</w:t>
+      </w:r>
+      <w:proofErr w:type="spellEnd"/>
+      <w:r>
+        <w:rPr>
+          <w:rFonts w:ascii="Calibri" w:hAnsi="Calibri" w:cs="Calibri"/>
+        </w:rPr>
+        <w:t xml:space="preserve">-hora ya recibe rojo, verde y amarillo como parámetros, se optó por calcular la duración del ciclo en base a esos parámetros (reutilizando </w:t>
+      </w:r>
+      <w:proofErr w:type="spellStart"/>
+      <w:r>
+        <w:rPr>
+          <w:rFonts w:ascii="Calibri" w:hAnsi="Calibri" w:cs="Calibri"/>
+        </w:rPr>
+        <w:t>duracion</w:t>
+      </w:r>
+      <w:proofErr w:type="spellEnd"/>
+      <w:r>
+        <w:rPr>
+          <w:rFonts w:ascii="Calibri" w:hAnsi="Calibri" w:cs="Calibri"/>
+        </w:rPr>
+        <w:t>-ciclo) y obtener la cantidad de ciclos completos dividiendo 3600 por esa duración.</w:t>
+      </w:r>
+    </w:p>
+    <w:p>
+      <w:pPr>
+        <w:rPr>
+          <w:rFonts w:ascii="Calibri" w:hAnsi="Calibri" w:cs="Calibri"/>
+        </w:rPr>
+      </w:pPr>
+      <w:r>
+        <w:rPr>
+          <w:rFonts w:ascii="Calibri" w:hAnsi="Calibri" w:cs="Calibri"/>
+          <w:b/>
+          <w:bCs/>
+        </w:rPr>
+        <w:t>Solución</w:t>
+      </w:r>
+      <w:r>
+        <w:rPr>
+          <w:rFonts w:ascii="Calibri" w:hAnsi="Calibri" w:cs="Calibri"/>
+          <w:b/>
+          <w:bCs/>
+        </w:rPr>
+        <w:br/>
+      </w:r>
+      <w:r>
+        <w:rPr>
+          <w:rFonts w:ascii="Calibri" w:hAnsi="Calibri" w:cs="Calibri"/>
+        </w:rPr>
+        <w:t xml:space="preserve">Se reformuló </w:t>
+      </w:r>
+      <w:proofErr w:type="spellStart"/>
+      <w:r>
+        <w:rPr>
+          <w:rFonts w:ascii="Calibri" w:hAnsi="Calibri" w:cs="Calibri"/>
+        </w:rPr>
+        <w:t>distribucion</w:t>
+      </w:r>
+      <w:proofErr w:type="spellEnd"/>
+      <w:r>
+        <w:rPr>
+          <w:rFonts w:ascii="Calibri" w:hAnsi="Calibri" w:cs="Calibri"/>
+        </w:rPr>
+        <w:t xml:space="preserve">-hora para que reciba rojo, verde y amarillo como parámetros (volviéndola válida para cualquier conjunto de reglas de negocio, no solo las actuales). La duración del ciclo se obtiene reutilizando </w:t>
+      </w:r>
+      <w:proofErr w:type="spellStart"/>
+      <w:r>
+        <w:rPr>
+          <w:rFonts w:ascii="Calibri" w:hAnsi="Calibri" w:cs="Calibri"/>
+        </w:rPr>
+        <w:t>duracion</w:t>
+      </w:r>
+      <w:proofErr w:type="spellEnd"/>
+      <w:r>
+        <w:rPr>
+          <w:rFonts w:ascii="Calibri" w:hAnsi="Calibri" w:cs="Calibri"/>
+        </w:rPr>
+        <w:t>-ciclo, y a partir de ella se calcula directamente la cantidad de ciclos completos en una hora ((</w:t>
+      </w:r>
+      <w:proofErr w:type="spellStart"/>
+      <w:r>
+        <w:rPr>
+          <w:rFonts w:ascii="Calibri" w:hAnsi="Calibri" w:cs="Calibri"/>
+        </w:rPr>
+        <w:t>truncate</w:t>
+      </w:r>
+      <w:proofErr w:type="spellEnd"/>
+      <w:r>
+        <w:rPr>
+          <w:rFonts w:ascii="Calibri" w:hAnsi="Calibri" w:cs="Calibri"/>
+        </w:rPr>
+        <w:t xml:space="preserve"> (/ 3600 </w:t>
+      </w:r>
+      <w:proofErr w:type="spellStart"/>
+      <w:r>
+        <w:rPr>
+          <w:rFonts w:ascii="Calibri" w:hAnsi="Calibri" w:cs="Calibri"/>
+        </w:rPr>
+        <w:t>duracion</w:t>
+      </w:r>
+      <w:proofErr w:type="spellEnd"/>
+      <w:r>
+        <w:rPr>
+          <w:rFonts w:ascii="Calibri" w:hAnsi="Calibri" w:cs="Calibri"/>
+        </w:rPr>
+        <w:t>))). Con eso se calcula el tiempo acumulado de cada fase en esos ciclos completos, se obtiene el tiempo sobrante (3600 menos lo ya cubierto), y ese sobrante se reparte secuencialmente entre rojo, verde y amarillo según el orden del ciclo. Recién con esos totales reales se calculan los porcentajes sobre 3600 segundos, en lugar de sobre la duración de un solo ciclo.</w:t>
+      </w:r>
+    </w:p>
+    <w:p>
+      <w:pPr>
+        <w:rPr>
+          <w:rFonts w:ascii="Calibri" w:hAnsi="Calibri" w:cs="Calibri"/>
+          <w:b/>
+          <w:bCs/>
+        </w:rPr>
+      </w:pPr>
+      <w:r>
+        <w:rPr>
+          <w:rFonts w:ascii="Calibri" w:hAnsi="Calibri" w:cs="Calibri"/>
+          <w:b/>
+          <w:bCs/>
+        </w:rPr>
+        <w:t>Captura del Código Anterior y del Código Actual</w:t>
+      </w:r>
+    </w:p>
+    <w:p>
+      <w:pPr>
+        <w:rPr>
+          <w:rFonts w:ascii="Calibri" w:hAnsi="Calibri" w:cs="Calibri"/>
+          <w:b/>
+          <w:bCs/>
+        </w:rPr>
+      </w:pPr>
+      <w:r>
+        <w:rPr>
+          <w:rFonts w:ascii="Calibri" w:hAnsi="Calibri" w:cs="Calibri"/>
+          <w:b/>
+          <w:bCs/>
+        </w:rPr>
+        <w:drawing>
+          <wp:inline distT="0" distB="0" distL="0" distR="0" wp14:anchorId="1CC020D6" wp14:editId="640BD2E7">
+            <wp:extent cx="5400040" cy="2499360"/>
+            <wp:effectExtent l="0" t="0" r="0" b="0"/>
+            <wp:docPr id="1882942229" name="Imagen 1"/>
+            <wp:cNvGraphicFramePr>
+              <a:graphicFrameLocks xmlns:a="http://schemas.openxmlformats.org/drawingml/2006/main" noChangeAspect="1"/>
+            </wp:cNvGraphicFramePr>
+            <a:graphic xmlns:a="http://schemas.openxmlformats.org/drawingml/2006/main">
+              <a:graphicData uri="http://schemas.openxmlformats.org/drawingml/2006/picture">
+                <pic:pic xmlns:pic="http://schemas.openxmlformats.org/drawingml/2006/picture">
+                  <pic:nvPicPr>
+                    <pic:cNvPr id="1882942229" name=""/>
+                    <pic:cNvPicPr/>
+                  </pic:nvPicPr>
+                  <pic:blipFill>
+                    <a:blip r:embed="rId27"/>
+                    <a:stretch>
+                      <a:fillRect/>
+                    </a:stretch>
+                  </pic:blipFill>
+                  <pic:spPr>
+                    <a:xfrm>
+                      <a:off x="0" y="0"/>
+                      <a:ext cx="5400040" cy="2499360"/>
+                    </a:xfrm>
+                    <a:prstGeom prst="rect">
+                      <a:avLst/>
+                    </a:prstGeom>
+                  </pic:spPr>
+                </pic:pic>
+              </a:graphicData>
+            </a:graphic>
+          </wp:inline>
+        </w:drawing>
+      </w:r>
+    </w:p>
+    <w:p>
+      <w:pPr>
+        <w:rPr>
+          <w:rFonts w:ascii="Calibri" w:hAnsi="Calibri" w:cs="Calibri"/>
+          <w:b/>
+          <w:bCs/>
+        </w:rPr>
+      </w:pPr>
+      <w:r>
+        <w:rPr>
+          <w:rFonts w:ascii="Calibri" w:hAnsi="Calibri" w:cs="Calibri"/>
+          <w:b/>
+          <w:bCs/>
+        </w:rPr>
+        <w:lastRenderedPageBreak/>
+        <w:drawing>
+          <wp:inline distT="0" distB="0" distL="0" distR="0" wp14:anchorId="5362302C" wp14:editId="26764BDE">
+            <wp:extent cx="5400040" cy="4197350"/>
+            <wp:effectExtent l="0" t="0" r="0" b="0"/>
+            <wp:docPr id="1070920964" name="Imagen 1"/>
+            <wp:cNvGraphicFramePr>
+              <a:graphicFrameLocks xmlns:a="http://schemas.openxmlformats.org/drawingml/2006/main" noChangeAspect="1"/>
+            </wp:cNvGraphicFramePr>
+            <a:graphic xmlns:a="http://schemas.openxmlformats.org/drawingml/2006/main">
+              <a:graphicData uri="http://schemas.openxmlformats.org/drawingml/2006/picture">
+                <pic:pic xmlns:pic="http://schemas.openxmlformats.org/drawingml/2006/picture">
+                  <pic:nvPicPr>
+                    <pic:cNvPr id="1070920964" name=""/>
+                    <pic:cNvPicPr/>
+                  </pic:nvPicPr>
+                  <pic:blipFill>
+                    <a:blip r:embed="rId28"/>
+                    <a:stretch>
+                      <a:fillRect/>
+                    </a:stretch>
+                  </pic:blipFill>
+                  <pic:spPr>
+                    <a:xfrm>
+                      <a:off x="0" y="0"/>
+                      <a:ext cx="5400040" cy="4197350"/>
+                    </a:xfrm>
+                    <a:prstGeom prst="rect">
+                      <a:avLst/>
+                    </a:prstGeom>
+                  </pic:spPr>
+                </pic:pic>
+              </a:graphicData>
+            </a:graphic>
+          </wp:inline>
+        </w:drawing>
+      </w:r>
+    </w:p>
+    <w:p>
+      <w:pPr>
+        <w:rPr>
+          <w:rFonts w:ascii="Calibri" w:hAnsi="Calibri" w:cs="Calibri"/>
+          <w:b/>
+          <w:bCs/>
+        </w:rPr>
+      </w:pPr>
+    </w:p>
+    <w:p>
+      <w:pPr>
+        <w:rPr>
+          <w:rFonts w:ascii="Calibri" w:hAnsi="Calibri" w:cs="Calibri"/>
+          <w:b/>
+          <w:bCs/>
+        </w:rPr>
+      </w:pPr>
+      <w:r>
+        <w:rPr>
+          <w:rFonts w:ascii="Calibri" w:hAnsi="Calibri" w:cs="Calibri"/>
+          <w:b/>
+          <w:noProof/>
+          <w:sz w:val="23"/>
+          <w:szCs w:val="23"/>
+        </w:rPr>
+        <mc:AlternateContent>
+          <mc:Choice Requires="wps">
+            <w:drawing>
+              <wp:anchor distT="0" distB="0" distL="114300" distR="114300" simplePos="0" relativeHeight="251695104" behindDoc="0" locked="0" layoutInCell="1" allowOverlap="1" wp14:anchorId="778B10CB" wp14:editId="4660A1B3">
+                <wp:simplePos x="0" y="0"/>
+                <wp:positionH relativeFrom="page">
+                  <wp:posOffset>3716655</wp:posOffset>
+                </wp:positionH>
+                <wp:positionV relativeFrom="paragraph">
+                  <wp:posOffset>71120</wp:posOffset>
+                </wp:positionV>
+                <wp:extent cx="3995420" cy="71755"/>
+                <wp:effectExtent l="0" t="0" r="5080" b="4445"/>
+                <wp:wrapNone/>
+                <wp:docPr id="952928182" name="Rectángulo 952928182"/>
+                <wp:cNvGraphicFramePr/>
+                <a:graphic xmlns:a="http://schemas.openxmlformats.org/drawingml/2006/main">
+                  <a:graphicData uri="http://schemas.microsoft.com/office/word/2010/wordprocessingShape">
+                    <wps:wsp>
+                      <wps:cNvSpPr/>
+                      <wps:spPr>
+                        <a:xfrm>
+                          <a:off x="0" y="0"/>
+                          <a:ext cx="3995420" cy="71755"/>
+                        </a:xfrm>
+                        <a:prstGeom prst="rect">
+                          <a:avLst/>
+                        </a:prstGeom>
+                        <a:solidFill>
+                          <a:srgbClr val="C00000"/>
+                        </a:solidFill>
+                        <a:ln>
+                          <a:noFill/>
+                        </a:ln>
+                        <a:effectLst/>
+                      </wps:spPr>
+                      <wps:style>
+                        <a:lnRef idx="1">
+                          <a:schemeClr val="accent1"/>
+                        </a:lnRef>
+                        <a:fillRef idx="3">
+                          <a:schemeClr val="accent1"/>
+                        </a:fillRef>
+                        <a:effectRef idx="2">
+                          <a:schemeClr val="accent1"/>
+                        </a:effectRef>
+                        <a:fontRef idx="minor">
+                          <a:schemeClr val="lt1"/>
+                        </a:fontRef>
+                      </wps:style>
+                      <wps:bodyPr rot="0" spcFirstLastPara="0" vertOverflow="overflow" horzOverflow="overflow" vert="horz" wrap="square" lIns="91440" tIns="45720" rIns="91440" bIns="45720" numCol="1" spcCol="0" rtlCol="0" fromWordArt="0" anchor="ctr" anchorCtr="0" forceAA="0" compatLnSpc="1">
+                        <a:prstTxWarp prst="textNoShape">
+                          <a:avLst/>
+                        </a:prstTxWarp>
+                        <a:noAutofit/>
+                      </wps:bodyPr>
+                    </wps:wsp>
+                  </a:graphicData>
+                </a:graphic>
+                <wp14:sizeRelH relativeFrom="margin">
+                  <wp14:pctWidth>0</wp14:pctWidth>
+                </wp14:sizeRelH>
+                <wp14:sizeRelV relativeFrom="margin">
+                  <wp14:pctHeight>0</wp14:pctHeight>
+                </wp14:sizeRelV>
+              </wp:anchor>
+            </w:drawing>
+          </mc:Choice>
+          <mc:Fallback>
+            <w:pict>
+              <v:rect w14:anchorId="53E520F9" id="Rectángulo 952928182" o:spid="_x0000_s1026" style="position:absolute;margin-left:292.65pt;margin-top:5.6pt;width:314.6pt;height:5.65pt;z-index:251695104;visibility:visible;mso-wrap-style:square;mso-width-percent:0;mso-height-percent:0;mso-wrap-distance-left:9pt;mso-wrap-distance-top:0;mso-wrap-distance-right:9pt;mso-wrap-distance-bottom:0;mso-position-horizontal:absolute;mso-position-horizontal-relative:page;mso-position-vertical:absolute;mso-position-vertical-relative:text;mso-width-percent:0;mso-height-percent:0;mso-width-relative:margin;mso-height-relative:margin;v-text-anchor:middle" o:gfxdata="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" fillcolor="#c00000" stroked="f" strokeweight=".5pt">
+                <w10:wrap anchorx="page"/>
+              </v:rect>
+            </w:pict>
+          </mc:Fallback>
+        </mc:AlternateContent>
+      </w:r>
+      <w:r>
+        <w:rPr>
+          <w:rFonts w:ascii="Calibri" w:hAnsi="Calibri" w:cs="Calibri"/>
+          <w:b/>
+          <w:bCs/>
+        </w:rPr>
+        <w:t>8. Refactorización de distribución-hora</w:t>
+      </w:r>
+      <w:r>
+        <w:rPr>
+          <w:rFonts w:ascii="Calibri" w:hAnsi="Calibri" w:cs="Calibri"/>
+          <w:b/>
+          <w:bCs/>
+        </w:rPr>
+        <w:t xml:space="preserve"> </w:t>
+      </w:r>
+    </w:p>
+    <w:p>
+      <w:pPr>
+        <w:rPr>
+          <w:rFonts w:ascii="Calibri" w:hAnsi="Calibri" w:cs="Calibri"/>
+        </w:rPr>
+      </w:pPr>
+      <w:r>
+        <w:rPr>
+          <w:rFonts w:ascii="Calibri" w:hAnsi="Calibri" w:cs="Calibri"/>
+          <w:b/>
+          <w:bCs/>
+        </w:rPr>
+        <w:t>Descripción del problema</w:t>
+      </w:r>
+      <w:r>
+        <w:rPr>
+          <w:rFonts w:ascii="Calibri" w:hAnsi="Calibri" w:cs="Calibri"/>
+          <w:b/>
+          <w:bCs/>
+        </w:rPr>
+        <w:br/>
+      </w:r>
+      <w:r>
+        <w:rPr>
+          <w:rFonts w:ascii="Calibri" w:hAnsi="Calibri" w:cs="Calibri"/>
+        </w:rPr>
+        <w:t xml:space="preserve">La implementación de </w:t>
+      </w:r>
+      <w:proofErr w:type="spellStart"/>
+      <w:r>
+        <w:rPr>
+          <w:rFonts w:ascii="Calibri" w:hAnsi="Calibri" w:cs="Calibri"/>
+        </w:rPr>
+        <w:t>distribucion</w:t>
+      </w:r>
+      <w:proofErr w:type="spellEnd"/>
+      <w:r>
+        <w:rPr>
+          <w:rFonts w:ascii="Calibri" w:hAnsi="Calibri" w:cs="Calibri"/>
+        </w:rPr>
+        <w:t xml:space="preserve">-hora (y su versión distribucion-hora2 para la segunda iteración, con 6 fases en vez de 3) repetía manualmente, por cada fase, el mismo patrón: calcular *-extra con min, restar ese extra del resto para obtener el siguiente resto, y luego sumar (* ciclos </w:t>
+      </w:r>
+      <w:proofErr w:type="spellStart"/>
+      <w:r>
+        <w:rPr>
+          <w:rFonts w:ascii="Calibri" w:hAnsi="Calibri" w:cs="Calibri"/>
+        </w:rPr>
+        <w:t>duracion</w:t>
+      </w:r>
+      <w:proofErr w:type="spellEnd"/>
+      <w:r>
+        <w:rPr>
+          <w:rFonts w:ascii="Calibri" w:hAnsi="Calibri" w:cs="Calibri"/>
+        </w:rPr>
+        <w:t xml:space="preserve">-fase) + extra para obtener el total. Con 3 fases (rojo, verde, amarillo) esto ya generaba 9 variables intermedias (rojo-extra, resto-verde, verde-extra, resto-amarillo, amarillo-extra, rojo-total, verde-total, amarillo-total, más </w:t>
+      </w:r>
+      <w:proofErr w:type="spellStart"/>
+      <w:r>
+        <w:rPr>
+          <w:rFonts w:ascii="Calibri" w:hAnsi="Calibri" w:cs="Calibri"/>
+        </w:rPr>
+        <w:t>duracion</w:t>
+      </w:r>
+      <w:proofErr w:type="spellEnd"/>
+      <w:r>
+        <w:rPr>
+          <w:rFonts w:ascii="Calibri" w:hAnsi="Calibri" w:cs="Calibri"/>
+        </w:rPr>
+        <w:t>/ciclos/resto). Al pasar a distribucion-hora2, donde timer2 agrega los 3 estados intermitentes (6 fases en total: rojo, rojo-intermitente, verde, verde-intermitente, amarillo, amarillo-intermitente), el mismo patrón hubiese duplicado la cantidad de variables a casi 20, haciendo la función excesivamente larga y repetitiva.</w:t>
+      </w:r>
+    </w:p>
+    <w:p>
+      <w:pPr>
+        <w:rPr>
+          <w:rFonts w:ascii="Calibri" w:hAnsi="Calibri" w:cs="Calibri"/>
+        </w:rPr>
+      </w:pPr>
+      <w:r>
+        <w:rPr>
+          <w:rFonts w:ascii="Calibri" w:hAnsi="Calibri" w:cs="Calibri"/>
+          <w:b/>
+          <w:bCs/>
+        </w:rPr>
+        <w:t>Causa</w:t>
+      </w:r>
+      <w:r>
+        <w:rPr>
+          <w:rFonts w:ascii="Calibri" w:hAnsi="Calibri" w:cs="Calibri"/>
+          <w:b/>
+          <w:bCs/>
+        </w:rPr>
+        <w:br/>
+      </w:r>
+      <w:r>
+        <w:rPr>
+          <w:rFonts w:ascii="Calibri" w:hAnsi="Calibri" w:cs="Calibri"/>
+        </w:rPr>
+        <w:t xml:space="preserve">El reparto secuencial del tiempo sobrante entre las fases era, en esencia, la misma operación repetida N veces (una por fase), pero estaba escrita de forma completamente manual y desenrollada, sin abstraer el patrón común. Esto hacía que la </w:t>
+      </w:r>
+      <w:r>
+        <w:rPr>
+          <w:rFonts w:ascii="Calibri" w:hAnsi="Calibri" w:cs="Calibri"/>
+        </w:rPr>
+        <w:lastRenderedPageBreak/>
+        <w:t>función no escalara: agregar o quitar fases (como pasó al pasar de 3 a 6 fases en la segunda iteración) implicaba reescribir gran parte del cuerpo de la función.</w:t>
+      </w:r>
+    </w:p>
+    <w:p>
+      <w:pPr>
+        <w:rPr>
+          <w:rFonts w:ascii="Calibri" w:hAnsi="Calibri" w:cs="Calibri"/>
+        </w:rPr>
+      </w:pPr>
+      <w:r>
+        <w:rPr>
+          <w:rFonts w:ascii="Calibri" w:hAnsi="Calibri" w:cs="Calibri"/>
+          <w:b/>
+          <w:bCs/>
+        </w:rPr>
+        <w:t>Proceso de depuración</w:t>
+      </w:r>
+      <w:r>
+        <w:rPr>
+          <w:rFonts w:ascii="Calibri" w:hAnsi="Calibri" w:cs="Calibri"/>
+          <w:b/>
+          <w:bCs/>
+        </w:rPr>
+        <w:br/>
+      </w:r>
+      <w:r>
+        <w:rPr>
+          <w:rFonts w:ascii="Calibri" w:hAnsi="Calibri" w:cs="Calibri"/>
+        </w:rPr>
+        <w:t xml:space="preserve">Se identificó que el patrón extra = (min resto </w:t>
+      </w:r>
+      <w:proofErr w:type="spellStart"/>
+      <w:r>
+        <w:rPr>
+          <w:rFonts w:ascii="Calibri" w:hAnsi="Calibri" w:cs="Calibri"/>
+        </w:rPr>
+        <w:t>duracion</w:t>
+      </w:r>
+      <w:proofErr w:type="spellEnd"/>
+      <w:r>
+        <w:rPr>
+          <w:rFonts w:ascii="Calibri" w:hAnsi="Calibri" w:cs="Calibri"/>
+        </w:rPr>
+        <w:t>-fase) seguido de resto = resto - extra, aplicado secuencialmente sobre una lista ordenada de duraciones, es exactamente una recursión: se procesa la primera duración de la lista, se calcula su extra, y se llama recursivamente con el resto actualizado y el resto de la lista. Esto permitió extraer esa lógica a una función auxiliar pura, repartir-resto, que recibe el resto inicial y la lista de duraciones (en el orden real del ciclo) y devuelve la lista de extras correspondientes, sin importar cuántas fases tenga la lista.</w:t>
+      </w:r>
+    </w:p>
+    <w:p>
+      <w:pPr>
+        <w:rPr>
+          <w:rFonts w:ascii="Calibri" w:hAnsi="Calibri" w:cs="Calibri"/>
+        </w:rPr>
+      </w:pPr>
+      <w:r>
+        <w:rPr>
+          <w:rFonts w:ascii="Calibri" w:hAnsi="Calibri" w:cs="Calibri"/>
+        </w:rPr>
+        <w:t xml:space="preserve">Una vez separados los extras, faltaba combinar cada extra con su </w:t>
+      </w:r>
+      <w:proofErr w:type="spellStart"/>
+      <w:r>
+        <w:rPr>
+          <w:rFonts w:ascii="Calibri" w:hAnsi="Calibri" w:cs="Calibri"/>
+        </w:rPr>
+        <w:t>duracion</w:t>
+      </w:r>
+      <w:proofErr w:type="spellEnd"/>
+      <w:r>
+        <w:rPr>
+          <w:rFonts w:ascii="Calibri" w:hAnsi="Calibri" w:cs="Calibri"/>
+        </w:rPr>
+        <w:t xml:space="preserve"> correspondiente para obtener el total de cada fase ((* ciclos </w:t>
+      </w:r>
+      <w:proofErr w:type="spellStart"/>
+      <w:r>
+        <w:rPr>
+          <w:rFonts w:ascii="Calibri" w:hAnsi="Calibri" w:cs="Calibri"/>
+        </w:rPr>
+        <w:t>duracion</w:t>
+      </w:r>
+      <w:proofErr w:type="spellEnd"/>
+      <w:r>
+        <w:rPr>
+          <w:rFonts w:ascii="Calibri" w:hAnsi="Calibri" w:cs="Calibri"/>
+        </w:rPr>
+        <w:t xml:space="preserve">) + extra), y luego combinar cada total con su nombre para imprimirlo. Ambas operaciones son "aplicar la misma función a cada par de elementos de dos listas en paralelo", que es exactamente lo que hace </w:t>
+      </w:r>
+      <w:proofErr w:type="spellStart"/>
+      <w:r>
+        <w:rPr>
+          <w:rFonts w:ascii="Calibri" w:hAnsi="Calibri" w:cs="Calibri"/>
+        </w:rPr>
+        <w:t>mapcar</w:t>
+      </w:r>
+      <w:proofErr w:type="spellEnd"/>
+      <w:r>
+        <w:rPr>
+          <w:rFonts w:ascii="Calibri" w:hAnsi="Calibri" w:cs="Calibri"/>
+        </w:rPr>
+        <w:t xml:space="preserve"> con múltiples listas.</w:t>
+      </w:r>
+    </w:p>
+    <w:p>
+      <w:pPr>
+        <w:rPr>
+          <w:rFonts w:ascii="Calibri" w:hAnsi="Calibri" w:cs="Calibri"/>
+        </w:rPr>
+      </w:pPr>
+      <w:r>
+        <w:rPr>
+          <w:rFonts w:ascii="Calibri" w:hAnsi="Calibri" w:cs="Calibri"/>
+          <w:b/>
+          <w:bCs/>
+        </w:rPr>
+        <w:t>Solución</w:t>
+      </w:r>
+      <w:r>
+        <w:rPr>
+          <w:rFonts w:ascii="Calibri" w:hAnsi="Calibri" w:cs="Calibri"/>
+          <w:b/>
+          <w:bCs/>
+        </w:rPr>
+        <w:br/>
+      </w:r>
+      <w:r>
+        <w:rPr>
+          <w:rFonts w:ascii="Calibri" w:hAnsi="Calibri" w:cs="Calibri"/>
+        </w:rPr>
+        <w:t xml:space="preserve">Se extrajo el reparto secuencial a una función auxiliar repartir-resto, pura y recursiva, que generaliza el encadenado de min/resta para una lista de cualquier longitud. </w:t>
+      </w:r>
+      <w:proofErr w:type="spellStart"/>
+      <w:r>
+        <w:rPr>
+          <w:rFonts w:ascii="Calibri" w:hAnsi="Calibri" w:cs="Calibri"/>
+        </w:rPr>
+        <w:t>distribucion</w:t>
+      </w:r>
+      <w:proofErr w:type="spellEnd"/>
+      <w:r>
+        <w:rPr>
+          <w:rFonts w:ascii="Calibri" w:hAnsi="Calibri" w:cs="Calibri"/>
+        </w:rPr>
+        <w:t xml:space="preserve">-hora quedó reducida a: armar la lista de duraciones de las fases en orden, llamar a repartir-resto para obtener los extras, y usar </w:t>
+      </w:r>
+      <w:proofErr w:type="spellStart"/>
+      <w:r>
+        <w:rPr>
+          <w:rFonts w:ascii="Calibri" w:hAnsi="Calibri" w:cs="Calibri"/>
+        </w:rPr>
+        <w:t>mapcar</w:t>
+      </w:r>
+      <w:proofErr w:type="spellEnd"/>
+      <w:r>
+        <w:rPr>
+          <w:rFonts w:ascii="Calibri" w:hAnsi="Calibri" w:cs="Calibri"/>
+        </w:rPr>
+        <w:t xml:space="preserve"> dos veces (una para calcular los totales combinando duraciones y extras, y otra para imprimir combinando nombres y totales). Esto eliminó las variables intermedias nombradas a mano, y permite que distribucion-hora2 (6 fases) reutilice exactamente el mismo repartir-resto, sin duplicar lógica: solo cambia la lista de duraciones y la lista de nombres que se le pasan.</w:t>
+      </w:r>
+    </w:p>
+    <w:p>
+      <w:pPr>
+        <w:rPr>
+          <w:rFonts w:ascii="Calibri" w:hAnsi="Calibri" w:cs="Calibri"/>
+          <w:b/>
+          <w:bCs/>
+        </w:rPr>
+      </w:pPr>
+      <w:r>
+        <w:rPr>
+          <w:rFonts w:ascii="Calibri" w:hAnsi="Calibri" w:cs="Calibri"/>
+          <w:b/>
+          <w:bCs/>
+        </w:rPr>
+        <w:t>Código anterior y Código nuevo</w:t>
+      </w:r>
+    </w:p>
+    <w:p>
+      <w:pPr>
+        <w:rPr>
+          <w:rFonts w:ascii="Calibri" w:hAnsi="Calibri" w:cs="Calibri"/>
+        </w:rPr>
+      </w:pPr>
+      <w:r>
+        <w:rPr>
+          <w:rFonts w:ascii="Calibri" w:hAnsi="Calibri" w:cs="Calibri"/>
+          <w:b/>
+          <w:bCs/>
+        </w:rPr>
+        <w:drawing>
+          <wp:inline distT="0" distB="0" distL="0" distR="0" wp14:anchorId="13A3174C" wp14:editId="17783D47">
+            <wp:extent cx="3342960" cy="2598420"/>
+            <wp:effectExtent l="0" t="0" r="0" b="0"/>
+            <wp:docPr id="516941537" name="Imagen 1"/>
+            <wp:cNvGraphicFramePr>
+              <a:graphicFrameLocks xmlns:a="http://schemas.openxmlformats.org/drawingml/2006/main" noChangeAspect="1"/>
+            </wp:cNvGraphicFramePr>
+            <a:graphic xmlns:a="http://schemas.openxmlformats.org/drawingml/2006/main">
+              <a:graphicData uri="http://schemas.openxmlformats.org/drawingml/2006/picture">
+                <pic:pic xmlns:pic="http://schemas.openxmlformats.org/drawingml/2006/picture">
+                  <pic:nvPicPr>
+                    <pic:cNvPr id="1070920964" name=""/>
+                    <pic:cNvPicPr/>
+                  </pic:nvPicPr>
+                  <pic:blipFill>
+                    <a:blip r:embed="rId28"/>
+                    <a:stretch>
+                      <a:fillRect/>
+                    </a:stretch>
+                  </pic:blipFill>
+                  <pic:spPr>
+                    <a:xfrm>
+                      <a:off x="0" y="0"/>
+                      <a:ext cx="3350548" cy="2604318"/>
+                    </a:xfrm>
+                    <a:prstGeom prst="rect">
+                      <a:avLst/>
+                    </a:prstGeom>
+                  </pic:spPr>
+                </pic:pic>
+              </a:graphicData>
+            </a:graphic>
+          </wp:inline>
+        </w:drawing>
+      </w:r>
+    </w:p>
+    <w:p>
+      <w:pPr>
+        <w:rPr>
+          <w:rFonts w:ascii="Calibri" w:hAnsi="Calibri" w:cs="Calibri"/>
+        </w:rPr>
+      </w:pPr>
+      <w:r>
+        <w:rPr>
+          <w:rFonts w:ascii="Calibri" w:hAnsi="Calibri" w:cs="Calibri"/>
+        </w:rPr>
+        <w:lastRenderedPageBreak/>
+        <w:drawing>
+          <wp:inline distT="0" distB="0" distL="0" distR="0" wp14:anchorId="142305A2" wp14:editId="226ED2DA">
+            <wp:extent cx="3372352" cy="3505200"/>
+            <wp:effectExtent l="0" t="0" r="0" b="0"/>
+            <wp:docPr id="1317152448" name="Imagen 1"/>
+            <wp:cNvGraphicFramePr>
+              <a:graphicFrameLocks xmlns:a="http://schemas.openxmlformats.org/drawingml/2006/main" noChangeAspect="1"/>
+            </wp:cNvGraphicFramePr>
+            <a:graphic xmlns:a="http://schemas.openxmlformats.org/drawingml/2006/main">
+              <a:graphicData uri="http://schemas.openxmlformats.org/drawingml/2006/picture">
+                <pic:pic xmlns:pic="http://schemas.openxmlformats.org/drawingml/2006/picture">
+                  <pic:nvPicPr>
+                    <pic:cNvPr id="1317152448" name=""/>
+                    <pic:cNvPicPr/>
+                  </pic:nvPicPr>
+                  <pic:blipFill>
+                    <a:blip r:embed="rId29"/>
+                    <a:stretch>
+                      <a:fillRect/>
+                    </a:stretch>
+                  </pic:blipFill>
+                  <pic:spPr>
+                    <a:xfrm>
+                      <a:off x="0" y="0"/>
+                      <a:ext cx="3374314" cy="3507240"/>
+                    </a:xfrm>
+                    <a:prstGeom prst="rect">
+                      <a:avLst/>
+                    </a:prstGeom>
+                  </pic:spPr>
+                </pic:pic>
+              </a:graphicData>
+            </a:graphic>
+          </wp:inline>
+        </w:drawing>
+      </w:r>
+    </w:p>
+    <w:p>
+      <w:pPr>
+        <w:rPr>
+          <w:rFonts w:ascii="Calibri" w:hAnsi="Calibri" w:cs="Calibri"/>
+          <w:b/>
+          <w:bCs/>
+        </w:rPr>
+      </w:pPr>
     </w:p>
     <w:bookmarkStart w:id="6" w:name="_Toc232187681"/>
     <w:p>
@@ -7423,7 +8375,6 @@
           <w:rFonts w:ascii="Calibri" w:hAnsi="Calibri" w:cs="Calibri"/>
           <w:noProof/>
         </w:rPr>
-        <w:lastRenderedPageBreak/>
         <mc:AlternateContent>
           <mc:Choice Requires="wps">
             <w:drawing>
@@ -7551,7 +8502,11 @@
       </w:r>
       <w:proofErr w:type="spellEnd"/>
       <w:r>
-        <w:t xml:space="preserve"> fue bastante directa, ya que ambos comparten muchas ideas fundamentales relacionadas con la programación funcional y el uso de expresiones que retornan resultados.</w:t>
+        <w:t xml:space="preserve"> fue bastante directa, ya que ambos comparten muchas ideas </w:t>
+      </w:r>
+      <w:r>
+        <w:lastRenderedPageBreak/>
+        <w:t>fundamentales relacionadas con la programación funcional y el uso de expresiones que retornan resultados.</w:t>
       </w:r>
     </w:p>
     <w:p>
@@ -7607,7 +8562,6 @@
       </w:pPr>
       <w:bookmarkStart w:id="8" w:name="_Toc232187683"/>
       <w:r>
-        <w:lastRenderedPageBreak/>
         <w:t>Sobre el proyecto en general</w:t>
       </w:r>
       <w:bookmarkEnd w:id="8"/>
@@ -7860,7 +8814,7 @@
         </w:rPr>
         <w:t xml:space="preserve">. </w:t>
       </w:r>
-      <w:hyperlink r:id="rId27" w:history="1">
+      <w:hyperlink r:id="rId30" w:history="1">
         <w:r>
           <w:rPr>
             <w:rFonts w:ascii="Calibri" w:eastAsia="Times New Roman" w:hAnsi="Calibri" w:cs="Calibri"/>
@@ -7935,7 +8889,7 @@
         </w:rPr>
         <w:t xml:space="preserve">. Read the Docs. </w:t>
       </w:r>
-      <w:hyperlink r:id="rId28" w:history="1">
+      <w:hyperlink r:id="rId31" w:history="1">
         <w:r>
           <w:rPr>
             <w:rFonts w:ascii="Calibri" w:eastAsia="Times New Roman" w:hAnsi="Calibri" w:cs="Calibri"/>
@@ -8052,7 +9006,7 @@
         </w:rPr>
         <w:t xml:space="preserve">. </w:t>
       </w:r>
-      <w:hyperlink r:id="rId29" w:history="1">
+      <w:hyperlink r:id="rId32" w:history="1">
         <w:r>
           <w:rPr>
             <w:rFonts w:ascii="Calibri" w:eastAsia="Times New Roman" w:hAnsi="Calibri" w:cs="Calibri"/>
@@ -8198,7 +9152,7 @@
         </w:rPr>
         <w:t xml:space="preserve">SBCL. </w:t>
       </w:r>
-      <w:hyperlink r:id="rId30" w:history="1">
+      <w:hyperlink r:id="rId33" w:history="1">
         <w:r>
           <w:rPr>
             <w:rFonts w:ascii="Calibri" w:eastAsia="Times New Roman" w:hAnsi="Calibri" w:cs="Calibri"/>
@@ -8292,7 +9246,7 @@
         </w:rPr>
         <w:t xml:space="preserve">. </w:t>
       </w:r>
-      <w:hyperlink r:id="rId31" w:history="1">
+      <w:hyperlink r:id="rId34" w:history="1">
         <w:r>
           <w:rPr>
             <w:rFonts w:ascii="Calibri" w:hAnsi="Calibri" w:cs="Calibri"/>
@@ -8397,7 +9351,7 @@
         </w:rPr>
         <w:t xml:space="preserve">. </w:t>
       </w:r>
-      <w:hyperlink r:id="rId32" w:history="1">
+      <w:hyperlink r:id="rId35" w:history="1">
         <w:r>
           <w:rPr>
             <w:rFonts w:ascii="Calibri" w:hAnsi="Calibri" w:cs="Calibri"/>
@@ -8409,8 +9363,8 @@
       </w:hyperlink>
     </w:p>
     <w:sectPr>
-      <w:headerReference w:type="default" r:id="rId33"/>
-      <w:footerReference w:type="default" r:id="rId34"/>
+      <w:headerReference w:type="default" r:id="rId36"/>
+      <w:footerReference w:type="default" r:id="rId37"/>
       <w:pgSz w:w="11906" w:h="16838"/>
       <w:pgMar w:top="1417" w:right="1701" w:bottom="1417" w:left="1701" w:header="708" w:footer="708" w:gutter="0"/>
       <w:cols w:space="708"/>

</xml_diff>